<commit_message>
Update FT-817/818 manual and related docs
- Manual: troubleshooting chapter (remove the battery once when the
  radio can no longer be powered off), screenshots of the connected
  radio for tuning steps and the F-1/F-2/F-3 soft key pages
- README: FT-817/818 section with a screenshot of the window; copyright
  wording for the wfview-win additions
- Link the FT-817 manual from the general manual and the wiring table

Co-Authored-By: Claude Opus 5.5 <noreply@anthropic.com>
</commit_message>
<xml_diff>
--- a/docs/FT-817_操作説明書.docx
+++ b/docs/FT-817_操作説明書.docx
@@ -63,7 +63,7 @@
           <w:noProof/>
         </w:rPr>
         <w:drawing>
-          <wp:inline distT="0" distB="0" distL="0" distR="0" wp14:anchorId="5834FC90" wp14:editId="03C9F5F6">
+          <wp:inline distT="0" distB="0" distL="0" distR="0" wp14:anchorId="1CBCC641" wp14:editId="110E7B44">
             <wp:extent cx="5334000" cy="2714625"/>
             <wp:effectExtent l="0" t="0" r="0" b="0"/>
             <wp:docPr id="1" name="図 1"/>
@@ -215,7 +215,7 @@
     <w:sdt>
       <w:sdtPr>
         <w:alias w:val="目次"/>
-        <w:id w:val="-409777046"/>
+        <w:id w:val="-75817938"/>
       </w:sdtPr>
       <w:sdtEndPr>
         <w:rPr>
@@ -252,7 +252,7 @@
           <w:r>
             <w:fldChar w:fldCharType="separate"/>
           </w:r>
-          <w:hyperlink w:anchor="_Toc243496231" w:history="1">
+          <w:hyperlink w:anchor="_Toc243497785" w:history="1">
             <w:r>
               <w:rPr>
                 <w:rStyle w:val="a5"/>
@@ -276,7 +276,7 @@
               <w:rPr>
                 <w:noProof/>
               </w:rPr>
-              <w:instrText xml:space="preserve"> PAGEREF _Toc243496231 \h </w:instrText>
+              <w:instrText xml:space="preserve"> PAGEREF _Toc243497785 \h </w:instrText>
             </w:r>
             <w:r>
               <w:rPr>
@@ -318,7 +318,7 @@
               <w14:ligatures w14:val="standardContextual"/>
             </w:rPr>
           </w:pPr>
-          <w:hyperlink w:anchor="_Toc243496232" w:history="1">
+          <w:hyperlink w:anchor="_Toc243497786" w:history="1">
             <w:r>
               <w:rPr>
                 <w:rStyle w:val="a5"/>
@@ -342,7 +342,7 @@
               <w:rPr>
                 <w:noProof/>
               </w:rPr>
-              <w:instrText xml:space="preserve"> PAGEREF _Toc243496232 \h </w:instrText>
+              <w:instrText xml:space="preserve"> PAGEREF _Toc243497786 \h </w:instrText>
             </w:r>
             <w:r>
               <w:rPr>
@@ -384,7 +384,7 @@
               <w14:ligatures w14:val="standardContextual"/>
             </w:rPr>
           </w:pPr>
-          <w:hyperlink w:anchor="_Toc243496233" w:history="1">
+          <w:hyperlink w:anchor="_Toc243497787" w:history="1">
             <w:r>
               <w:rPr>
                 <w:rStyle w:val="a5"/>
@@ -408,7 +408,7 @@
               <w:rPr>
                 <w:noProof/>
               </w:rPr>
-              <w:instrText xml:space="preserve"> PAGEREF _Toc243496233 \h </w:instrText>
+              <w:instrText xml:space="preserve"> PAGEREF _Toc243497787 \h </w:instrText>
             </w:r>
             <w:r>
               <w:rPr>
@@ -452,7 +452,7 @@
               <w14:ligatures w14:val="standardContextual"/>
             </w:rPr>
           </w:pPr>
-          <w:hyperlink w:anchor="_Toc243496234" w:history="1">
+          <w:hyperlink w:anchor="_Toc243497788" w:history="1">
             <w:r>
               <w:rPr>
                 <w:rStyle w:val="a5"/>
@@ -476,7 +476,7 @@
               <w:rPr>
                 <w:noProof/>
               </w:rPr>
-              <w:instrText xml:space="preserve"> PAGEREF _Toc243496234 \h </w:instrText>
+              <w:instrText xml:space="preserve"> PAGEREF _Toc243497788 \h </w:instrText>
             </w:r>
             <w:r>
               <w:rPr>
@@ -518,7 +518,7 @@
               <w14:ligatures w14:val="standardContextual"/>
             </w:rPr>
           </w:pPr>
-          <w:hyperlink w:anchor="_Toc243496235" w:history="1">
+          <w:hyperlink w:anchor="_Toc243497789" w:history="1">
             <w:r>
               <w:rPr>
                 <w:rStyle w:val="a5"/>
@@ -542,7 +542,7 @@
               <w:rPr>
                 <w:noProof/>
               </w:rPr>
-              <w:instrText xml:space="preserve"> PAGEREF _Toc243496235 \h </w:instrText>
+              <w:instrText xml:space="preserve"> PAGEREF _Toc243497789 \h </w:instrText>
             </w:r>
             <w:r>
               <w:rPr>
@@ -584,7 +584,7 @@
               <w14:ligatures w14:val="standardContextual"/>
             </w:rPr>
           </w:pPr>
-          <w:hyperlink w:anchor="_Toc243496236" w:history="1">
+          <w:hyperlink w:anchor="_Toc243497790" w:history="1">
             <w:r>
               <w:rPr>
                 <w:rStyle w:val="a5"/>
@@ -608,7 +608,7 @@
               <w:rPr>
                 <w:noProof/>
               </w:rPr>
-              <w:instrText xml:space="preserve"> PAGEREF _Toc243496236 \h </w:instrText>
+              <w:instrText xml:space="preserve"> PAGEREF _Toc243497790 \h </w:instrText>
             </w:r>
             <w:r>
               <w:rPr>
@@ -650,7 +650,7 @@
               <w14:ligatures w14:val="standardContextual"/>
             </w:rPr>
           </w:pPr>
-          <w:hyperlink w:anchor="_Toc243496237" w:history="1">
+          <w:hyperlink w:anchor="_Toc243497791" w:history="1">
             <w:r>
               <w:rPr>
                 <w:rStyle w:val="a5"/>
@@ -674,7 +674,7 @@
               <w:rPr>
                 <w:noProof/>
               </w:rPr>
-              <w:instrText xml:space="preserve"> PAGEREF _Toc243496237 \h </w:instrText>
+              <w:instrText xml:space="preserve"> PAGEREF _Toc243497791 \h </w:instrText>
             </w:r>
             <w:r>
               <w:rPr>
@@ -716,7 +716,7 @@
               <w14:ligatures w14:val="standardContextual"/>
             </w:rPr>
           </w:pPr>
-          <w:hyperlink w:anchor="_Toc243496238" w:history="1">
+          <w:hyperlink w:anchor="_Toc243497792" w:history="1">
             <w:r>
               <w:rPr>
                 <w:rStyle w:val="a5"/>
@@ -740,7 +740,7 @@
               <w:rPr>
                 <w:noProof/>
               </w:rPr>
-              <w:instrText xml:space="preserve"> PAGEREF _Toc243496238 \h </w:instrText>
+              <w:instrText xml:space="preserve"> PAGEREF _Toc243497792 \h </w:instrText>
             </w:r>
             <w:r>
               <w:rPr>
@@ -784,7 +784,7 @@
               <w14:ligatures w14:val="standardContextual"/>
             </w:rPr>
           </w:pPr>
-          <w:hyperlink w:anchor="_Toc243496239" w:history="1">
+          <w:hyperlink w:anchor="_Toc243497793" w:history="1">
             <w:r>
               <w:rPr>
                 <w:rStyle w:val="a5"/>
@@ -808,7 +808,7 @@
               <w:rPr>
                 <w:noProof/>
               </w:rPr>
-              <w:instrText xml:space="preserve"> PAGEREF _Toc243496239 \h </w:instrText>
+              <w:instrText xml:space="preserve"> PAGEREF _Toc243497793 \h </w:instrText>
             </w:r>
             <w:r>
               <w:rPr>
@@ -852,7 +852,7 @@
               <w14:ligatures w14:val="standardContextual"/>
             </w:rPr>
           </w:pPr>
-          <w:hyperlink w:anchor="_Toc243496240" w:history="1">
+          <w:hyperlink w:anchor="_Toc243497794" w:history="1">
             <w:r>
               <w:rPr>
                 <w:rStyle w:val="a5"/>
@@ -876,7 +876,7 @@
               <w:rPr>
                 <w:noProof/>
               </w:rPr>
-              <w:instrText xml:space="preserve"> PAGEREF _Toc243496240 \h </w:instrText>
+              <w:instrText xml:space="preserve"> PAGEREF _Toc243497794 \h </w:instrText>
             </w:r>
             <w:r>
               <w:rPr>
@@ -918,7 +918,7 @@
               <w14:ligatures w14:val="standardContextual"/>
             </w:rPr>
           </w:pPr>
-          <w:hyperlink w:anchor="_Toc243496241" w:history="1">
+          <w:hyperlink w:anchor="_Toc243497795" w:history="1">
             <w:r>
               <w:rPr>
                 <w:rStyle w:val="a5"/>
@@ -942,7 +942,7 @@
               <w:rPr>
                 <w:noProof/>
               </w:rPr>
-              <w:instrText xml:space="preserve"> PAGEREF _Toc243496241 \h </w:instrText>
+              <w:instrText xml:space="preserve"> PAGEREF _Toc243497795 \h </w:instrText>
             </w:r>
             <w:r>
               <w:rPr>
@@ -984,7 +984,7 @@
               <w14:ligatures w14:val="standardContextual"/>
             </w:rPr>
           </w:pPr>
-          <w:hyperlink w:anchor="_Toc243496242" w:history="1">
+          <w:hyperlink w:anchor="_Toc243497796" w:history="1">
             <w:r>
               <w:rPr>
                 <w:rStyle w:val="a5"/>
@@ -1008,7 +1008,7 @@
               <w:rPr>
                 <w:noProof/>
               </w:rPr>
-              <w:instrText xml:space="preserve"> PAGEREF _Toc243496242 \h </w:instrText>
+              <w:instrText xml:space="preserve"> PAGEREF _Toc243497796 \h </w:instrText>
             </w:r>
             <w:r>
               <w:rPr>
@@ -1050,7 +1050,7 @@
               <w14:ligatures w14:val="standardContextual"/>
             </w:rPr>
           </w:pPr>
-          <w:hyperlink w:anchor="_Toc243496243" w:history="1">
+          <w:hyperlink w:anchor="_Toc243497797" w:history="1">
             <w:r>
               <w:rPr>
                 <w:rStyle w:val="a5"/>
@@ -1074,7 +1074,7 @@
               <w:rPr>
                 <w:noProof/>
               </w:rPr>
-              <w:instrText xml:space="preserve"> PAGEREF _Toc243496243 \h </w:instrText>
+              <w:instrText xml:space="preserve"> PAGEREF _Toc243497797 \h </w:instrText>
             </w:r>
             <w:r>
               <w:rPr>
@@ -1116,7 +1116,7 @@
               <w14:ligatures w14:val="standardContextual"/>
             </w:rPr>
           </w:pPr>
-          <w:hyperlink w:anchor="_Toc243496244" w:history="1">
+          <w:hyperlink w:anchor="_Toc243497798" w:history="1">
             <w:r>
               <w:rPr>
                 <w:rStyle w:val="a5"/>
@@ -1140,7 +1140,7 @@
               <w:rPr>
                 <w:noProof/>
               </w:rPr>
-              <w:instrText xml:space="preserve"> PAGEREF _Toc243496244 \h </w:instrText>
+              <w:instrText xml:space="preserve"> PAGEREF _Toc243497798 \h </w:instrText>
             </w:r>
             <w:r>
               <w:rPr>
@@ -1182,7 +1182,7 @@
               <w14:ligatures w14:val="standardContextual"/>
             </w:rPr>
           </w:pPr>
-          <w:hyperlink w:anchor="_Toc243496245" w:history="1">
+          <w:hyperlink w:anchor="_Toc243497799" w:history="1">
             <w:r>
               <w:rPr>
                 <w:rStyle w:val="a5"/>
@@ -1206,7 +1206,7 @@
               <w:rPr>
                 <w:noProof/>
               </w:rPr>
-              <w:instrText xml:space="preserve"> PAGEREF _Toc243496245 \h </w:instrText>
+              <w:instrText xml:space="preserve"> PAGEREF _Toc243497799 \h </w:instrText>
             </w:r>
             <w:r>
               <w:rPr>
@@ -1250,7 +1250,7 @@
               <w14:ligatures w14:val="standardContextual"/>
             </w:rPr>
           </w:pPr>
-          <w:hyperlink w:anchor="_Toc243496246" w:history="1">
+          <w:hyperlink w:anchor="_Toc243497800" w:history="1">
             <w:r>
               <w:rPr>
                 <w:rStyle w:val="a5"/>
@@ -1274,7 +1274,7 @@
               <w:rPr>
                 <w:noProof/>
               </w:rPr>
-              <w:instrText xml:space="preserve"> PAGEREF _Toc243496246 \h </w:instrText>
+              <w:instrText xml:space="preserve"> PAGEREF _Toc243497800 \h </w:instrText>
             </w:r>
             <w:r>
               <w:rPr>
@@ -1318,7 +1318,7 @@
               <w14:ligatures w14:val="standardContextual"/>
             </w:rPr>
           </w:pPr>
-          <w:hyperlink w:anchor="_Toc243496247" w:history="1">
+          <w:hyperlink w:anchor="_Toc243497801" w:history="1">
             <w:r>
               <w:rPr>
                 <w:rStyle w:val="a5"/>
@@ -1342,7 +1342,7 @@
               <w:rPr>
                 <w:noProof/>
               </w:rPr>
-              <w:instrText xml:space="preserve"> PAGEREF _Toc243496247 \h </w:instrText>
+              <w:instrText xml:space="preserve"> PAGEREF _Toc243497801 \h </w:instrText>
             </w:r>
             <w:r>
               <w:rPr>
@@ -1384,7 +1384,7 @@
               <w14:ligatures w14:val="standardContextual"/>
             </w:rPr>
           </w:pPr>
-          <w:hyperlink w:anchor="_Toc243496248" w:history="1">
+          <w:hyperlink w:anchor="_Toc243497802" w:history="1">
             <w:r>
               <w:rPr>
                 <w:rStyle w:val="a5"/>
@@ -1408,7 +1408,7 @@
               <w:rPr>
                 <w:noProof/>
               </w:rPr>
-              <w:instrText xml:space="preserve"> PAGEREF _Toc243496248 \h </w:instrText>
+              <w:instrText xml:space="preserve"> PAGEREF _Toc243497802 \h </w:instrText>
             </w:r>
             <w:r>
               <w:rPr>
@@ -1450,7 +1450,7 @@
               <w14:ligatures w14:val="standardContextual"/>
             </w:rPr>
           </w:pPr>
-          <w:hyperlink w:anchor="_Toc243496249" w:history="1">
+          <w:hyperlink w:anchor="_Toc243497803" w:history="1">
             <w:r>
               <w:rPr>
                 <w:rStyle w:val="a5"/>
@@ -1474,7 +1474,7 @@
               <w:rPr>
                 <w:noProof/>
               </w:rPr>
-              <w:instrText xml:space="preserve"> PAGEREF _Toc243496249 \h </w:instrText>
+              <w:instrText xml:space="preserve"> PAGEREF _Toc243497803 \h </w:instrText>
             </w:r>
             <w:r>
               <w:rPr>
@@ -1516,7 +1516,7 @@
               <w14:ligatures w14:val="standardContextual"/>
             </w:rPr>
           </w:pPr>
-          <w:hyperlink w:anchor="_Toc243496250" w:history="1">
+          <w:hyperlink w:anchor="_Toc243497804" w:history="1">
             <w:r>
               <w:rPr>
                 <w:rStyle w:val="a5"/>
@@ -1540,7 +1540,7 @@
               <w:rPr>
                 <w:noProof/>
               </w:rPr>
-              <w:instrText xml:space="preserve"> PAGEREF _Toc243496250 \h </w:instrText>
+              <w:instrText xml:space="preserve"> PAGEREF _Toc243497804 \h </w:instrText>
             </w:r>
             <w:r>
               <w:rPr>
@@ -1557,7 +1557,7 @@
               <w:rPr>
                 <w:noProof/>
               </w:rPr>
-              <w:t>10</w:t>
+              <w:t>11</w:t>
             </w:r>
             <w:r>
               <w:rPr>
@@ -1582,7 +1582,7 @@
               <w14:ligatures w14:val="standardContextual"/>
             </w:rPr>
           </w:pPr>
-          <w:hyperlink w:anchor="_Toc243496251" w:history="1">
+          <w:hyperlink w:anchor="_Toc243497805" w:history="1">
             <w:r>
               <w:rPr>
                 <w:rStyle w:val="a5"/>
@@ -1606,7 +1606,7 @@
               <w:rPr>
                 <w:noProof/>
               </w:rPr>
-              <w:instrText xml:space="preserve"> PAGEREF _Toc243496251 \h </w:instrText>
+              <w:instrText xml:space="preserve"> PAGEREF _Toc243497805 \h </w:instrText>
             </w:r>
             <w:r>
               <w:rPr>
@@ -1623,7 +1623,7 @@
               <w:rPr>
                 <w:noProof/>
               </w:rPr>
-              <w:t>10</w:t>
+              <w:t>11</w:t>
             </w:r>
             <w:r>
               <w:rPr>
@@ -1648,7 +1648,7 @@
               <w14:ligatures w14:val="standardContextual"/>
             </w:rPr>
           </w:pPr>
-          <w:hyperlink w:anchor="_Toc243496252" w:history="1">
+          <w:hyperlink w:anchor="_Toc243497806" w:history="1">
             <w:r>
               <w:rPr>
                 <w:rStyle w:val="a5"/>
@@ -1672,7 +1672,7 @@
               <w:rPr>
                 <w:noProof/>
               </w:rPr>
-              <w:instrText xml:space="preserve"> PAGEREF _Toc243496252 \h </w:instrText>
+              <w:instrText xml:space="preserve"> PAGEREF _Toc243497806 \h </w:instrText>
             </w:r>
             <w:r>
               <w:rPr>
@@ -1714,7 +1714,7 @@
               <w14:ligatures w14:val="standardContextual"/>
             </w:rPr>
           </w:pPr>
-          <w:hyperlink w:anchor="_Toc243496253" w:history="1">
+          <w:hyperlink w:anchor="_Toc243497807" w:history="1">
             <w:r>
               <w:rPr>
                 <w:rStyle w:val="a5"/>
@@ -1738,7 +1738,7 @@
               <w:rPr>
                 <w:noProof/>
               </w:rPr>
-              <w:instrText xml:space="preserve"> PAGEREF _Toc243496253 \h </w:instrText>
+              <w:instrText xml:space="preserve"> PAGEREF _Toc243497807 \h </w:instrText>
             </w:r>
             <w:r>
               <w:rPr>
@@ -1780,7 +1780,7 @@
               <w14:ligatures w14:val="standardContextual"/>
             </w:rPr>
           </w:pPr>
-          <w:hyperlink w:anchor="_Toc243496254" w:history="1">
+          <w:hyperlink w:anchor="_Toc243497808" w:history="1">
             <w:r>
               <w:rPr>
                 <w:rStyle w:val="a5"/>
@@ -1804,7 +1804,7 @@
               <w:rPr>
                 <w:noProof/>
               </w:rPr>
-              <w:instrText xml:space="preserve"> PAGEREF _Toc243496254 \h </w:instrText>
+              <w:instrText xml:space="preserve"> PAGEREF _Toc243497808 \h </w:instrText>
             </w:r>
             <w:r>
               <w:rPr>
@@ -1846,7 +1846,7 @@
               <w14:ligatures w14:val="standardContextual"/>
             </w:rPr>
           </w:pPr>
-          <w:hyperlink w:anchor="_Toc243496255" w:history="1">
+          <w:hyperlink w:anchor="_Toc243497809" w:history="1">
             <w:r>
               <w:rPr>
                 <w:rStyle w:val="a5"/>
@@ -1870,7 +1870,7 @@
               <w:rPr>
                 <w:noProof/>
               </w:rPr>
-              <w:instrText xml:space="preserve"> PAGEREF _Toc243496255 \h </w:instrText>
+              <w:instrText xml:space="preserve"> PAGEREF _Toc243497809 \h </w:instrText>
             </w:r>
             <w:r>
               <w:rPr>
@@ -1914,7 +1914,7 @@
               <w14:ligatures w14:val="standardContextual"/>
             </w:rPr>
           </w:pPr>
-          <w:hyperlink w:anchor="_Toc243496256" w:history="1">
+          <w:hyperlink w:anchor="_Toc243497810" w:history="1">
             <w:r>
               <w:rPr>
                 <w:rStyle w:val="a5"/>
@@ -1938,7 +1938,7 @@
               <w:rPr>
                 <w:noProof/>
               </w:rPr>
-              <w:instrText xml:space="preserve"> PAGEREF _Toc243496256 \h </w:instrText>
+              <w:instrText xml:space="preserve"> PAGEREF _Toc243497810 \h </w:instrText>
             </w:r>
             <w:r>
               <w:rPr>
@@ -1980,7 +1980,7 @@
               <w14:ligatures w14:val="standardContextual"/>
             </w:rPr>
           </w:pPr>
-          <w:hyperlink w:anchor="_Toc243496257" w:history="1">
+          <w:hyperlink w:anchor="_Toc243497811" w:history="1">
             <w:r>
               <w:rPr>
                 <w:rStyle w:val="a5"/>
@@ -2004,7 +2004,7 @@
               <w:rPr>
                 <w:noProof/>
               </w:rPr>
-              <w:instrText xml:space="preserve"> PAGEREF _Toc243496257 \h </w:instrText>
+              <w:instrText xml:space="preserve"> PAGEREF _Toc243497811 \h </w:instrText>
             </w:r>
             <w:r>
               <w:rPr>
@@ -2046,7 +2046,7 @@
               <w14:ligatures w14:val="standardContextual"/>
             </w:rPr>
           </w:pPr>
-          <w:hyperlink w:anchor="_Toc243496258" w:history="1">
+          <w:hyperlink w:anchor="_Toc243497812" w:history="1">
             <w:r>
               <w:rPr>
                 <w:rStyle w:val="a5"/>
@@ -2070,7 +2070,7 @@
               <w:rPr>
                 <w:noProof/>
               </w:rPr>
-              <w:instrText xml:space="preserve"> PAGEREF _Toc243496258 \h </w:instrText>
+              <w:instrText xml:space="preserve"> PAGEREF _Toc243497812 \h </w:instrText>
             </w:r>
             <w:r>
               <w:rPr>
@@ -2112,7 +2112,7 @@
               <w14:ligatures w14:val="standardContextual"/>
             </w:rPr>
           </w:pPr>
-          <w:hyperlink w:anchor="_Toc243496259" w:history="1">
+          <w:hyperlink w:anchor="_Toc243497813" w:history="1">
             <w:r>
               <w:rPr>
                 <w:rStyle w:val="a5"/>
@@ -2136,7 +2136,7 @@
               <w:rPr>
                 <w:noProof/>
               </w:rPr>
-              <w:instrText xml:space="preserve"> PAGEREF _Toc243496259 \h </w:instrText>
+              <w:instrText xml:space="preserve"> PAGEREF _Toc243497813 \h </w:instrText>
             </w:r>
             <w:r>
               <w:rPr>
@@ -2178,7 +2178,7 @@
               <w14:ligatures w14:val="standardContextual"/>
             </w:rPr>
           </w:pPr>
-          <w:hyperlink w:anchor="_Toc243496260" w:history="1">
+          <w:hyperlink w:anchor="_Toc243497814" w:history="1">
             <w:r>
               <w:rPr>
                 <w:rStyle w:val="a5"/>
@@ -2202,7 +2202,7 @@
               <w:rPr>
                 <w:noProof/>
               </w:rPr>
-              <w:instrText xml:space="preserve"> PAGEREF _Toc243496260 \h </w:instrText>
+              <w:instrText xml:space="preserve"> PAGEREF _Toc243497814 \h </w:instrText>
             </w:r>
             <w:r>
               <w:rPr>
@@ -2244,7 +2244,7 @@
               <w14:ligatures w14:val="standardContextual"/>
             </w:rPr>
           </w:pPr>
-          <w:hyperlink w:anchor="_Toc243496261" w:history="1">
+          <w:hyperlink w:anchor="_Toc243497815" w:history="1">
             <w:r>
               <w:rPr>
                 <w:rStyle w:val="a5"/>
@@ -2268,7 +2268,7 @@
               <w:rPr>
                 <w:noProof/>
               </w:rPr>
-              <w:instrText xml:space="preserve"> PAGEREF _Toc243496261 \h </w:instrText>
+              <w:instrText xml:space="preserve"> PAGEREF _Toc243497815 \h </w:instrText>
             </w:r>
             <w:r>
               <w:rPr>
@@ -2312,7 +2312,7 @@
               <w14:ligatures w14:val="standardContextual"/>
             </w:rPr>
           </w:pPr>
-          <w:hyperlink w:anchor="_Toc243496262" w:history="1">
+          <w:hyperlink w:anchor="_Toc243497816" w:history="1">
             <w:r>
               <w:rPr>
                 <w:rStyle w:val="a5"/>
@@ -2336,7 +2336,7 @@
               <w:rPr>
                 <w:noProof/>
               </w:rPr>
-              <w:instrText xml:space="preserve"> PAGEREF _Toc243496262 \h </w:instrText>
+              <w:instrText xml:space="preserve"> PAGEREF _Toc243497816 \h </w:instrText>
             </w:r>
             <w:r>
               <w:rPr>
@@ -2378,7 +2378,7 @@
               <w14:ligatures w14:val="standardContextual"/>
             </w:rPr>
           </w:pPr>
-          <w:hyperlink w:anchor="_Toc243496263" w:history="1">
+          <w:hyperlink w:anchor="_Toc243497817" w:history="1">
             <w:r>
               <w:rPr>
                 <w:rStyle w:val="a5"/>
@@ -2402,7 +2402,7 @@
               <w:rPr>
                 <w:noProof/>
               </w:rPr>
-              <w:instrText xml:space="preserve"> PAGEREF _Toc243496263 \h </w:instrText>
+              <w:instrText xml:space="preserve"> PAGEREF _Toc243497817 \h </w:instrText>
             </w:r>
             <w:r>
               <w:rPr>
@@ -2444,7 +2444,7 @@
               <w14:ligatures w14:val="standardContextual"/>
             </w:rPr>
           </w:pPr>
-          <w:hyperlink w:anchor="_Toc243496264" w:history="1">
+          <w:hyperlink w:anchor="_Toc243497818" w:history="1">
             <w:r>
               <w:rPr>
                 <w:rStyle w:val="a5"/>
@@ -2468,7 +2468,7 @@
               <w:rPr>
                 <w:noProof/>
               </w:rPr>
-              <w:instrText xml:space="preserve"> PAGEREF _Toc243496264 \h </w:instrText>
+              <w:instrText xml:space="preserve"> PAGEREF _Toc243497818 \h </w:instrText>
             </w:r>
             <w:r>
               <w:rPr>
@@ -2510,7 +2510,7 @@
               <w14:ligatures w14:val="standardContextual"/>
             </w:rPr>
           </w:pPr>
-          <w:hyperlink w:anchor="_Toc243496265" w:history="1">
+          <w:hyperlink w:anchor="_Toc243497819" w:history="1">
             <w:r>
               <w:rPr>
                 <w:rStyle w:val="a5"/>
@@ -2534,7 +2534,7 @@
               <w:rPr>
                 <w:noProof/>
               </w:rPr>
-              <w:instrText xml:space="preserve"> PAGEREF _Toc243496265 \h </w:instrText>
+              <w:instrText xml:space="preserve"> PAGEREF _Toc243497819 \h </w:instrText>
             </w:r>
             <w:r>
               <w:rPr>
@@ -2578,13 +2578,13 @@
               <w14:ligatures w14:val="standardContextual"/>
             </w:rPr>
           </w:pPr>
-          <w:hyperlink w:anchor="_Toc243496266" w:history="1">
+          <w:hyperlink w:anchor="_Toc243497820" w:history="1">
             <w:r>
               <w:rPr>
                 <w:rStyle w:val="a5"/>
                 <w:noProof/>
               </w:rPr>
-              <w:t>9. 困ったとき</w:t>
+              <w:t>9. トラブルシューティング</w:t>
             </w:r>
             <w:r>
               <w:rPr>
@@ -2602,7 +2602,7 @@
               <w:rPr>
                 <w:noProof/>
               </w:rPr>
-              <w:instrText xml:space="preserve"> PAGEREF _Toc243496266 \h </w:instrText>
+              <w:instrText xml:space="preserve"> PAGEREF _Toc243497820 \h </w:instrText>
             </w:r>
             <w:r>
               <w:rPr>
@@ -2644,13 +2644,13 @@
               <w14:ligatures w14:val="standardContextual"/>
             </w:rPr>
           </w:pPr>
-          <w:hyperlink w:anchor="_Toc243496267" w:history="1">
+          <w:hyperlink w:anchor="_Toc243497821" w:history="1">
             <w:r>
               <w:rPr>
                 <w:rStyle w:val="a5"/>
                 <w:noProof/>
               </w:rPr>
-              <w:t>9.1 プログラムが異常終了したとき</w:t>
+              <w:t>9.1 無線機の電源を切れなくなったとき</w:t>
             </w:r>
             <w:r>
               <w:rPr>
@@ -2668,7 +2668,7 @@
               <w:rPr>
                 <w:noProof/>
               </w:rPr>
-              <w:instrText xml:space="preserve"> PAGEREF _Toc243496267 \h </w:instrText>
+              <w:instrText xml:space="preserve"> PAGEREF _Toc243497821 \h </w:instrText>
             </w:r>
             <w:r>
               <w:rPr>
@@ -2686,6 +2686,138 @@
                 <w:noProof/>
               </w:rPr>
               <w:t>16</w:t>
+            </w:r>
+            <w:r>
+              <w:rPr>
+                <w:noProof/>
+              </w:rPr>
+              <w:fldChar w:fldCharType="end"/>
+            </w:r>
+          </w:hyperlink>
+        </w:p>
+        <w:p>
+          <w:pPr>
+            <w:pStyle w:val="20"/>
+            <w:tabs>
+              <w:tab w:val="right" w:leader="dot" w:pos="9628"/>
+            </w:tabs>
+            <w:rPr>
+              <w:rFonts w:asciiTheme="minorHAnsi" w:eastAsiaTheme="minorEastAsia" w:hAnsiTheme="minorHAnsi" w:cstheme="minorBidi"/>
+              <w:noProof/>
+              <w:kern w:val="2"/>
+              <w:sz w:val="21"/>
+              <w:szCs w:val="24"/>
+              <w14:ligatures w14:val="standardContextual"/>
+            </w:rPr>
+          </w:pPr>
+          <w:hyperlink w:anchor="_Toc243497822" w:history="1">
+            <w:r>
+              <w:rPr>
+                <w:rStyle w:val="a5"/>
+                <w:noProof/>
+              </w:rPr>
+              <w:t>9.2 症状と対処</w:t>
+            </w:r>
+            <w:r>
+              <w:rPr>
+                <w:noProof/>
+              </w:rPr>
+              <w:tab/>
+            </w:r>
+            <w:r>
+              <w:rPr>
+                <w:noProof/>
+              </w:rPr>
+              <w:fldChar w:fldCharType="begin"/>
+            </w:r>
+            <w:r>
+              <w:rPr>
+                <w:noProof/>
+              </w:rPr>
+              <w:instrText xml:space="preserve"> PAGEREF _Toc243497822 \h </w:instrText>
+            </w:r>
+            <w:r>
+              <w:rPr>
+                <w:noProof/>
+              </w:rPr>
+            </w:r>
+            <w:r>
+              <w:rPr>
+                <w:noProof/>
+              </w:rPr>
+              <w:fldChar w:fldCharType="separate"/>
+            </w:r>
+            <w:r>
+              <w:rPr>
+                <w:noProof/>
+              </w:rPr>
+              <w:t>16</w:t>
+            </w:r>
+            <w:r>
+              <w:rPr>
+                <w:noProof/>
+              </w:rPr>
+              <w:fldChar w:fldCharType="end"/>
+            </w:r>
+          </w:hyperlink>
+        </w:p>
+        <w:p>
+          <w:pPr>
+            <w:pStyle w:val="20"/>
+            <w:tabs>
+              <w:tab w:val="right" w:leader="dot" w:pos="9628"/>
+            </w:tabs>
+            <w:rPr>
+              <w:rFonts w:asciiTheme="minorHAnsi" w:eastAsiaTheme="minorEastAsia" w:hAnsiTheme="minorHAnsi" w:cstheme="minorBidi"/>
+              <w:noProof/>
+              <w:kern w:val="2"/>
+              <w:sz w:val="21"/>
+              <w:szCs w:val="24"/>
+              <w14:ligatures w14:val="standardContextual"/>
+            </w:rPr>
+          </w:pPr>
+          <w:hyperlink w:anchor="_Toc243497823" w:history="1">
+            <w:r>
+              <w:rPr>
+                <w:rStyle w:val="a5"/>
+                <w:noProof/>
+              </w:rPr>
+              <w:t>9.3 プログラムが異常終了したとき</w:t>
+            </w:r>
+            <w:r>
+              <w:rPr>
+                <w:noProof/>
+              </w:rPr>
+              <w:tab/>
+            </w:r>
+            <w:r>
+              <w:rPr>
+                <w:noProof/>
+              </w:rPr>
+              <w:fldChar w:fldCharType="begin"/>
+            </w:r>
+            <w:r>
+              <w:rPr>
+                <w:noProof/>
+              </w:rPr>
+              <w:instrText xml:space="preserve"> PAGEREF _Toc243497823 \h </w:instrText>
+            </w:r>
+            <w:r>
+              <w:rPr>
+                <w:noProof/>
+              </w:rPr>
+            </w:r>
+            <w:r>
+              <w:rPr>
+                <w:noProof/>
+              </w:rPr>
+              <w:fldChar w:fldCharType="separate"/>
+            </w:r>
+            <w:r>
+              <w:rPr>
+                <w:noProof/>
+              </w:rPr>
+              <w:t>17</w:t>
             </w:r>
             <w:r>
               <w:rPr>
@@ -2712,7 +2844,7 @@
               <w14:ligatures w14:val="standardContextual"/>
             </w:rPr>
           </w:pPr>
-          <w:hyperlink w:anchor="_Toc243496268" w:history="1">
+          <w:hyperlink w:anchor="_Toc243497824" w:history="1">
             <w:r>
               <w:rPr>
                 <w:rStyle w:val="a5"/>
@@ -2736,7 +2868,7 @@
               <w:rPr>
                 <w:noProof/>
               </w:rPr>
-              <w:instrText xml:space="preserve"> PAGEREF _Toc243496268 \h </w:instrText>
+              <w:instrText xml:space="preserve"> PAGEREF _Toc243497824 \h </w:instrText>
             </w:r>
             <w:r>
               <w:rPr>
@@ -2753,7 +2885,7 @@
               <w:rPr>
                 <w:noProof/>
               </w:rPr>
-              <w:t>17</w:t>
+              <w:t>18</w:t>
             </w:r>
             <w:r>
               <w:rPr>
@@ -2778,7 +2910,7 @@
               <w14:ligatures w14:val="standardContextual"/>
             </w:rPr>
           </w:pPr>
-          <w:hyperlink w:anchor="_Toc243496269" w:history="1">
+          <w:hyperlink w:anchor="_Toc243497825" w:history="1">
             <w:r>
               <w:rPr>
                 <w:rStyle w:val="a5"/>
@@ -2802,7 +2934,7 @@
               <w:rPr>
                 <w:noProof/>
               </w:rPr>
-              <w:instrText xml:space="preserve"> PAGEREF _Toc243496269 \h </w:instrText>
+              <w:instrText xml:space="preserve"> PAGEREF _Toc243497825 \h </w:instrText>
             </w:r>
             <w:r>
               <w:rPr>
@@ -2819,7 +2951,7 @@
               <w:rPr>
                 <w:noProof/>
               </w:rPr>
-              <w:t>17</w:t>
+              <w:t>18</w:t>
             </w:r>
             <w:r>
               <w:rPr>
@@ -2844,7 +2976,7 @@
               <w14:ligatures w14:val="standardContextual"/>
             </w:rPr>
           </w:pPr>
-          <w:hyperlink w:anchor="_Toc243496270" w:history="1">
+          <w:hyperlink w:anchor="_Toc243497826" w:history="1">
             <w:r>
               <w:rPr>
                 <w:rStyle w:val="a5"/>
@@ -2868,7 +3000,7 @@
               <w:rPr>
                 <w:noProof/>
               </w:rPr>
-              <w:instrText xml:space="preserve"> PAGEREF _Toc243496270 \h </w:instrText>
+              <w:instrText xml:space="preserve"> PAGEREF _Toc243497826 \h </w:instrText>
             </w:r>
             <w:r>
               <w:rPr>
@@ -2885,7 +3017,7 @@
               <w:rPr>
                 <w:noProof/>
               </w:rPr>
-              <w:t>17</w:t>
+              <w:t>18</w:t>
             </w:r>
             <w:r>
               <w:rPr>
@@ -2910,7 +3042,7 @@
               <w14:ligatures w14:val="standardContextual"/>
             </w:rPr>
           </w:pPr>
-          <w:hyperlink w:anchor="_Toc243496271" w:history="1">
+          <w:hyperlink w:anchor="_Toc243497827" w:history="1">
             <w:r>
               <w:rPr>
                 <w:rStyle w:val="a5"/>
@@ -2934,7 +3066,7 @@
               <w:rPr>
                 <w:noProof/>
               </w:rPr>
-              <w:instrText xml:space="preserve"> PAGEREF _Toc243496271 \h </w:instrText>
+              <w:instrText xml:space="preserve"> PAGEREF _Toc243497827 \h </w:instrText>
             </w:r>
             <w:r>
               <w:rPr>
@@ -2951,7 +3083,7 @@
               <w:rPr>
                 <w:noProof/>
               </w:rPr>
-              <w:t>17</w:t>
+              <w:t>18</w:t>
             </w:r>
             <w:r>
               <w:rPr>
@@ -2976,7 +3108,7 @@
               <w14:ligatures w14:val="standardContextual"/>
             </w:rPr>
           </w:pPr>
-          <w:hyperlink w:anchor="_Toc243496272" w:history="1">
+          <w:hyperlink w:anchor="_Toc243497828" w:history="1">
             <w:r>
               <w:rPr>
                 <w:rStyle w:val="a5"/>
@@ -3000,7 +3132,7 @@
               <w:rPr>
                 <w:noProof/>
               </w:rPr>
-              <w:instrText xml:space="preserve"> PAGEREF _Toc243496272 \h </w:instrText>
+              <w:instrText xml:space="preserve"> PAGEREF _Toc243497828 \h </w:instrText>
             </w:r>
             <w:r>
               <w:rPr>
@@ -3017,7 +3149,7 @@
               <w:rPr>
                 <w:noProof/>
               </w:rPr>
-              <w:t>17</w:t>
+              <w:t>18</w:t>
             </w:r>
             <w:r>
               <w:rPr>
@@ -3039,7 +3171,7 @@
         <w:pStyle w:val="1"/>
         <w:pageBreakBefore/>
       </w:pPr>
-      <w:bookmarkStart w:id="0" w:name="_Toc243496231"/>
+      <w:bookmarkStart w:id="0" w:name="_Toc243497785"/>
       <w:r>
         <w:lastRenderedPageBreak/>
         <w:t xml:space="preserve">1. </w:t>
@@ -3108,7 +3240,7 @@
       <w:pPr>
         <w:pStyle w:val="2"/>
       </w:pPr>
-      <w:bookmarkStart w:id="1" w:name="_Toc243496232"/>
+      <w:bookmarkStart w:id="1" w:name="_Toc243497786"/>
       <w:r>
         <w:t xml:space="preserve">1.1 </w:t>
       </w:r>
@@ -3290,7 +3422,7 @@
       <w:pPr>
         <w:pStyle w:val="2"/>
       </w:pPr>
-      <w:bookmarkStart w:id="2" w:name="_Toc243496233"/>
+      <w:bookmarkStart w:id="2" w:name="_Toc243497787"/>
       <w:r>
         <w:t xml:space="preserve">1.2 </w:t>
       </w:r>
@@ -3414,7 +3546,7 @@
         <w:pStyle w:val="1"/>
         <w:pageBreakBefore/>
       </w:pPr>
-      <w:bookmarkStart w:id="3" w:name="_Toc243496234"/>
+      <w:bookmarkStart w:id="3" w:name="_Toc243497788"/>
       <w:r>
         <w:lastRenderedPageBreak/>
         <w:t xml:space="preserve">2. </w:t>
@@ -3428,7 +3560,7 @@
       <w:pPr>
         <w:pStyle w:val="2"/>
       </w:pPr>
-      <w:bookmarkStart w:id="4" w:name="_Toc243496235"/>
+      <w:bookmarkStart w:id="4" w:name="_Toc243497789"/>
       <w:r>
         <w:t xml:space="preserve">2.1 </w:t>
       </w:r>
@@ -4442,7 +4574,7 @@
       <w:pPr>
         <w:pStyle w:val="2"/>
       </w:pPr>
-      <w:bookmarkStart w:id="5" w:name="_Toc243496236"/>
+      <w:bookmarkStart w:id="5" w:name="_Toc243497790"/>
       <w:r>
         <w:t xml:space="preserve">2.2 </w:t>
       </w:r>
@@ -4565,7 +4697,7 @@
       <w:pPr>
         <w:pStyle w:val="2"/>
       </w:pPr>
-      <w:bookmarkStart w:id="6" w:name="_Toc243496237"/>
+      <w:bookmarkStart w:id="6" w:name="_Toc243497791"/>
       <w:r>
         <w:t xml:space="preserve">2.3 wfview-win </w:t>
       </w:r>
@@ -4762,7 +4894,7 @@
       <w:pPr>
         <w:pStyle w:val="2"/>
       </w:pPr>
-      <w:bookmarkStart w:id="7" w:name="_Toc243496238"/>
+      <w:bookmarkStart w:id="7" w:name="_Toc243497792"/>
       <w:r>
         <w:t xml:space="preserve">2.4 </w:t>
       </w:r>
@@ -4899,7 +5031,7 @@
         <w:pStyle w:val="1"/>
         <w:pageBreakBefore/>
       </w:pPr>
-      <w:bookmarkStart w:id="8" w:name="_Toc243496239"/>
+      <w:bookmarkStart w:id="8" w:name="_Toc243497793"/>
       <w:r>
         <w:lastRenderedPageBreak/>
         <w:t xml:space="preserve">3. </w:t>
@@ -4919,10 +5051,10 @@
           <w:noProof/>
         </w:rPr>
         <w:drawing>
-          <wp:inline distT="0" distB="0" distL="0" distR="0" wp14:anchorId="75ED8314" wp14:editId="33CA969E">
+          <wp:inline distT="0" distB="0" distL="0" distR="0" wp14:anchorId="739B9666" wp14:editId="32E5B7D3">
             <wp:extent cx="6096000" cy="3105150"/>
             <wp:effectExtent l="0" t="0" r="0" b="0"/>
-            <wp:docPr id="901427706" name="図 901427706"/>
+            <wp:docPr id="1280643858" name="図 1280643858"/>
             <wp:cNvGraphicFramePr>
               <a:graphicFrameLocks xmlns:a="http://schemas.openxmlformats.org/drawingml/2006/main" noChangeAspect="1"/>
             </wp:cNvGraphicFramePr>
@@ -5975,7 +6107,7 @@
         <w:pStyle w:val="1"/>
         <w:pageBreakBefore/>
       </w:pPr>
-      <w:bookmarkStart w:id="9" w:name="_Toc243496240"/>
+      <w:bookmarkStart w:id="9" w:name="_Toc243497794"/>
       <w:r>
         <w:lastRenderedPageBreak/>
         <w:t xml:space="preserve">4. </w:t>
@@ -5989,7 +6121,7 @@
       <w:pPr>
         <w:pStyle w:val="2"/>
       </w:pPr>
-      <w:bookmarkStart w:id="10" w:name="_Toc243496241"/>
+      <w:bookmarkStart w:id="10" w:name="_Toc243497795"/>
       <w:r>
         <w:t xml:space="preserve">4.1 </w:t>
       </w:r>
@@ -6164,6 +6296,117 @@
     </w:p>
     <w:p>
       <w:pPr>
+        <w:spacing w:before="120" w:after="60"/>
+        <w:jc w:val="center"/>
+      </w:pPr>
+      <w:r>
+        <w:rPr>
+          <w:noProof/>
+        </w:rPr>
+        <w:drawing>
+          <wp:inline distT="0" distB="0" distL="0" distR="0" wp14:anchorId="31C9DB5E" wp14:editId="27F16417">
+            <wp:extent cx="4000500" cy="2171700"/>
+            <wp:effectExtent l="0" t="0" r="0" b="0"/>
+            <wp:docPr id="2040923941" name="図 2040923941"/>
+            <wp:cNvGraphicFramePr>
+              <a:graphicFrameLocks xmlns:a="http://schemas.openxmlformats.org/drawingml/2006/main" noChangeAspect="1"/>
+            </wp:cNvGraphicFramePr>
+            <a:graphic xmlns:a="http://schemas.openxmlformats.org/drawingml/2006/main">
+              <a:graphicData uri="http://schemas.openxmlformats.org/drawingml/2006/picture">
+                <pic:pic xmlns:pic="http://schemas.openxmlformats.org/drawingml/2006/picture">
+                  <pic:nvPicPr>
+                    <pic:cNvPr id="0" name=""/>
+                    <pic:cNvPicPr>
+                      <a:picLocks noChangeAspect="1" noChangeArrowheads="1"/>
+                    </pic:cNvPicPr>
+                  </pic:nvPicPr>
+                  <pic:blipFill>
+                    <a:blip r:embed="rId8"/>
+                    <a:srcRect/>
+                    <a:stretch>
+                      <a:fillRect/>
+                    </a:stretch>
+                  </pic:blipFill>
+                  <pic:spPr bwMode="auto">
+                    <a:xfrm>
+                      <a:off x="0" y="0"/>
+                      <a:ext cx="4000500" cy="2171700"/>
+                    </a:xfrm>
+                    <a:prstGeom prst="rect">
+                      <a:avLst/>
+                    </a:prstGeom>
+                  </pic:spPr>
+                </pic:pic>
+              </a:graphicData>
+            </a:graphic>
+          </wp:inline>
+        </w:drawing>
+      </w:r>
+    </w:p>
+    <w:p>
+      <w:pPr>
+        <w:spacing w:after="200"/>
+        <w:jc w:val="center"/>
+      </w:pPr>
+      <w:r>
+        <w:rPr>
+          <w:color w:val="595959"/>
+          <w:sz w:val="18"/>
+          <w:szCs w:val="18"/>
+        </w:rPr>
+        <w:t>図</w:t>
+      </w:r>
+      <w:r>
+        <w:rPr>
+          <w:color w:val="595959"/>
+          <w:sz w:val="18"/>
+          <w:szCs w:val="18"/>
+        </w:rPr>
+        <w:t xml:space="preserve"> 2</w:t>
+      </w:r>
+      <w:r>
+        <w:rPr>
+          <w:color w:val="595959"/>
+          <w:sz w:val="18"/>
+          <w:szCs w:val="18"/>
+        </w:rPr>
+        <w:t xml:space="preserve">　</w:t>
+      </w:r>
+      <w:r>
+        <w:rPr>
+          <w:color w:val="595959"/>
+          <w:sz w:val="18"/>
+          <w:szCs w:val="18"/>
+        </w:rPr>
+        <w:t xml:space="preserve">1 kHz </w:t>
+      </w:r>
+      <w:r>
+        <w:rPr>
+          <w:color w:val="595959"/>
+          <w:sz w:val="18"/>
+          <w:szCs w:val="18"/>
+        </w:rPr>
+        <w:t>の桁をクリックした状態（桁に下線が付き、「</w:t>
+      </w:r>
+      <w:r>
+        <w:rPr>
+          <w:color w:val="595959"/>
+          <w:sz w:val="18"/>
+          <w:szCs w:val="18"/>
+        </w:rPr>
+        <w:t>STEP 1 kHz</w:t>
+      </w:r>
+      <w:r>
+        <w:rPr>
+          <w:color w:val="595959"/>
+          <w:sz w:val="18"/>
+          <w:szCs w:val="18"/>
+        </w:rPr>
+        <w:t>」と表示）</w:t>
+      </w:r>
+    </w:p>
+    <w:p>
+      <w:pPr>
         <w:pStyle w:val="3"/>
       </w:pPr>
       <w:r>
@@ -6307,6 +6550,7 @@
         <w:pStyle w:val="3"/>
       </w:pPr>
       <w:r>
+        <w:lastRenderedPageBreak/>
         <w:t>バンドの切り替え</w:t>
       </w:r>
     </w:p>
@@ -7180,7 +7424,7 @@
       <w:pPr>
         <w:pStyle w:val="2"/>
       </w:pPr>
-      <w:bookmarkStart w:id="11" w:name="_Toc243496242"/>
+      <w:bookmarkStart w:id="11" w:name="_Toc243497796"/>
       <w:r>
         <w:t xml:space="preserve">4.2 </w:t>
       </w:r>
@@ -7260,7 +7504,7 @@
       <w:pPr>
         <w:pStyle w:val="2"/>
       </w:pPr>
-      <w:bookmarkStart w:id="12" w:name="_Toc243496243"/>
+      <w:bookmarkStart w:id="12" w:name="_Toc243497797"/>
       <w:r>
         <w:t xml:space="preserve">4.3 </w:t>
       </w:r>
@@ -7309,7 +7553,7 @@
       <w:pPr>
         <w:pStyle w:val="2"/>
       </w:pPr>
-      <w:bookmarkStart w:id="13" w:name="_Toc243496244"/>
+      <w:bookmarkStart w:id="13" w:name="_Toc243497798"/>
       <w:r>
         <w:t xml:space="preserve">4.4 </w:t>
       </w:r>
@@ -7420,14 +7664,20 @@
         <w:t xml:space="preserve"> ON </w:t>
       </w:r>
       <w:r>
-        <w:t>の命令は、無線機がケーブルに接続され、外部電源または電池が供給されているときだけ有効です。</w:t>
+        <w:t>の命令は、無線機がケーブルに接続され、外部電源または電池が供給されているときだけ有効です。電源の切断ができなくなったときは、バッテリーを一度外してください（</w:t>
+      </w:r>
+      <w:r>
+        <w:t xml:space="preserve">9.1 </w:t>
+      </w:r>
+      <w:r>
+        <w:t>節）。</w:t>
       </w:r>
     </w:p>
     <w:p>
       <w:pPr>
         <w:pStyle w:val="2"/>
       </w:pPr>
-      <w:bookmarkStart w:id="14" w:name="_Toc243496245"/>
+      <w:bookmarkStart w:id="14" w:name="_Toc243497799"/>
       <w:r>
         <w:t xml:space="preserve">4.5 </w:t>
       </w:r>
@@ -7465,7 +7715,7 @@
         <w:pStyle w:val="1"/>
         <w:pageBreakBefore/>
       </w:pPr>
-      <w:bookmarkStart w:id="15" w:name="_Toc243496246"/>
+      <w:bookmarkStart w:id="15" w:name="_Toc243497800"/>
       <w:r>
         <w:lastRenderedPageBreak/>
         <w:t xml:space="preserve">5. </w:t>
@@ -7644,7 +7894,7 @@
         <w:pStyle w:val="1"/>
         <w:pageBreakBefore/>
       </w:pPr>
-      <w:bookmarkStart w:id="16" w:name="_Toc243496247"/>
+      <w:bookmarkStart w:id="16" w:name="_Toc243497801"/>
       <w:r>
         <w:lastRenderedPageBreak/>
         <w:t xml:space="preserve">6. A / B / C / F </w:t>
@@ -7727,6 +7977,419 @@
       </w:r>
       <w:r>
         <w:t>の順にページが切り替わります。</w:t>
+      </w:r>
+    </w:p>
+    <w:p>
+      <w:pPr>
+        <w:spacing w:before="120" w:after="60"/>
+        <w:jc w:val="center"/>
+      </w:pPr>
+      <w:r>
+        <w:rPr>
+          <w:noProof/>
+        </w:rPr>
+        <w:drawing>
+          <wp:inline distT="0" distB="0" distL="0" distR="0" wp14:anchorId="72999002" wp14:editId="08368BC6">
+            <wp:extent cx="4762500" cy="800100"/>
+            <wp:effectExtent l="0" t="0" r="0" b="0"/>
+            <wp:docPr id="597184080" name="図 597184080"/>
+            <wp:cNvGraphicFramePr>
+              <a:graphicFrameLocks xmlns:a="http://schemas.openxmlformats.org/drawingml/2006/main" noChangeAspect="1"/>
+            </wp:cNvGraphicFramePr>
+            <a:graphic xmlns:a="http://schemas.openxmlformats.org/drawingml/2006/main">
+              <a:graphicData uri="http://schemas.openxmlformats.org/drawingml/2006/picture">
+                <pic:pic xmlns:pic="http://schemas.openxmlformats.org/drawingml/2006/picture">
+                  <pic:nvPicPr>
+                    <pic:cNvPr id="0" name=""/>
+                    <pic:cNvPicPr>
+                      <a:picLocks noChangeAspect="1" noChangeArrowheads="1"/>
+                    </pic:cNvPicPr>
+                  </pic:nvPicPr>
+                  <pic:blipFill>
+                    <a:blip r:embed="rId9"/>
+                    <a:srcRect/>
+                    <a:stretch>
+                      <a:fillRect/>
+                    </a:stretch>
+                  </pic:blipFill>
+                  <pic:spPr bwMode="auto">
+                    <a:xfrm>
+                      <a:off x="0" y="0"/>
+                      <a:ext cx="4762500" cy="800100"/>
+                    </a:xfrm>
+                    <a:prstGeom prst="rect">
+                      <a:avLst/>
+                    </a:prstGeom>
+                  </pic:spPr>
+                </pic:pic>
+              </a:graphicData>
+            </a:graphic>
+          </wp:inline>
+        </w:drawing>
+      </w:r>
+    </w:p>
+    <w:p>
+      <w:pPr>
+        <w:spacing w:after="200"/>
+        <w:jc w:val="center"/>
+      </w:pPr>
+      <w:r>
+        <w:rPr>
+          <w:color w:val="595959"/>
+          <w:sz w:val="18"/>
+          <w:szCs w:val="18"/>
+        </w:rPr>
+        <w:t>図</w:t>
+      </w:r>
+      <w:r>
+        <w:rPr>
+          <w:color w:val="595959"/>
+          <w:sz w:val="18"/>
+          <w:szCs w:val="18"/>
+        </w:rPr>
+        <w:t xml:space="preserve"> 3</w:t>
+      </w:r>
+      <w:r>
+        <w:rPr>
+          <w:color w:val="595959"/>
+          <w:sz w:val="18"/>
+          <w:szCs w:val="18"/>
+        </w:rPr>
+        <w:t xml:space="preserve">　</w:t>
+      </w:r>
+      <w:r>
+        <w:rPr>
+          <w:color w:val="595959"/>
+          <w:sz w:val="18"/>
+          <w:szCs w:val="18"/>
+        </w:rPr>
+        <w:t xml:space="preserve">F-1 </w:t>
+      </w:r>
+      <w:r>
+        <w:rPr>
+          <w:color w:val="595959"/>
+          <w:sz w:val="18"/>
+          <w:szCs w:val="18"/>
+        </w:rPr>
+        <w:t>ページ（</w:t>
+      </w:r>
+      <w:r>
+        <w:rPr>
+          <w:color w:val="595959"/>
+          <w:sz w:val="18"/>
+          <w:szCs w:val="18"/>
+        </w:rPr>
+        <w:t>A/B</w:t>
+      </w:r>
+      <w:r>
+        <w:rPr>
+          <w:color w:val="595959"/>
+          <w:sz w:val="18"/>
+          <w:szCs w:val="18"/>
+        </w:rPr>
+        <w:t>・</w:t>
+      </w:r>
+      <w:r>
+        <w:rPr>
+          <w:color w:val="595959"/>
+          <w:sz w:val="18"/>
+          <w:szCs w:val="18"/>
+        </w:rPr>
+        <w:t>SPL</w:t>
+      </w:r>
+      <w:r>
+        <w:rPr>
+          <w:color w:val="595959"/>
+          <w:sz w:val="18"/>
+          <w:szCs w:val="18"/>
+        </w:rPr>
+        <w:t>・</w:t>
+      </w:r>
+      <w:r>
+        <w:rPr>
+          <w:color w:val="595959"/>
+          <w:sz w:val="18"/>
+          <w:szCs w:val="18"/>
+        </w:rPr>
+        <w:t>CLAR</w:t>
+      </w:r>
+      <w:r>
+        <w:rPr>
+          <w:color w:val="595959"/>
+          <w:sz w:val="18"/>
+          <w:szCs w:val="18"/>
+        </w:rPr>
+        <w:t>）</w:t>
+      </w:r>
+    </w:p>
+    <w:p>
+      <w:pPr>
+        <w:spacing w:before="120" w:after="60"/>
+        <w:jc w:val="center"/>
+      </w:pPr>
+      <w:r>
+        <w:rPr>
+          <w:noProof/>
+        </w:rPr>
+        <w:drawing>
+          <wp:inline distT="0" distB="0" distL="0" distR="0" wp14:anchorId="2F9CE5E6" wp14:editId="312C8086">
+            <wp:extent cx="4762500" cy="800100"/>
+            <wp:effectExtent l="0" t="0" r="0" b="0"/>
+            <wp:docPr id="656569589" name="図 656569589"/>
+            <wp:cNvGraphicFramePr>
+              <a:graphicFrameLocks xmlns:a="http://schemas.openxmlformats.org/drawingml/2006/main" noChangeAspect="1"/>
+            </wp:cNvGraphicFramePr>
+            <a:graphic xmlns:a="http://schemas.openxmlformats.org/drawingml/2006/main">
+              <a:graphicData uri="http://schemas.openxmlformats.org/drawingml/2006/picture">
+                <pic:pic xmlns:pic="http://schemas.openxmlformats.org/drawingml/2006/picture">
+                  <pic:nvPicPr>
+                    <pic:cNvPr id="0" name=""/>
+                    <pic:cNvPicPr>
+                      <a:picLocks noChangeAspect="1" noChangeArrowheads="1"/>
+                    </pic:cNvPicPr>
+                  </pic:nvPicPr>
+                  <pic:blipFill>
+                    <a:blip r:embed="rId10"/>
+                    <a:srcRect/>
+                    <a:stretch>
+                      <a:fillRect/>
+                    </a:stretch>
+                  </pic:blipFill>
+                  <pic:spPr bwMode="auto">
+                    <a:xfrm>
+                      <a:off x="0" y="0"/>
+                      <a:ext cx="4762500" cy="800100"/>
+                    </a:xfrm>
+                    <a:prstGeom prst="rect">
+                      <a:avLst/>
+                    </a:prstGeom>
+                  </pic:spPr>
+                </pic:pic>
+              </a:graphicData>
+            </a:graphic>
+          </wp:inline>
+        </w:drawing>
+      </w:r>
+    </w:p>
+    <w:p>
+      <w:pPr>
+        <w:spacing w:after="200"/>
+        <w:jc w:val="center"/>
+      </w:pPr>
+      <w:r>
+        <w:rPr>
+          <w:color w:val="595959"/>
+          <w:sz w:val="18"/>
+          <w:szCs w:val="18"/>
+        </w:rPr>
+        <w:t>図</w:t>
+      </w:r>
+      <w:r>
+        <w:rPr>
+          <w:color w:val="595959"/>
+          <w:sz w:val="18"/>
+          <w:szCs w:val="18"/>
+        </w:rPr>
+        <w:t xml:space="preserve"> 4</w:t>
+      </w:r>
+      <w:r>
+        <w:rPr>
+          <w:color w:val="595959"/>
+          <w:sz w:val="18"/>
+          <w:szCs w:val="18"/>
+        </w:rPr>
+        <w:t xml:space="preserve">　</w:t>
+      </w:r>
+      <w:r>
+        <w:rPr>
+          <w:color w:val="595959"/>
+          <w:sz w:val="18"/>
+          <w:szCs w:val="18"/>
+        </w:rPr>
+        <w:t xml:space="preserve">F-2 </w:t>
+      </w:r>
+      <w:r>
+        <w:rPr>
+          <w:color w:val="595959"/>
+          <w:sz w:val="18"/>
+          <w:szCs w:val="18"/>
+        </w:rPr>
+        <w:t>ページ（</w:t>
+      </w:r>
+      <w:r>
+        <w:rPr>
+          <w:color w:val="595959"/>
+          <w:sz w:val="18"/>
+          <w:szCs w:val="18"/>
+        </w:rPr>
+        <w:t>RPT</w:t>
+      </w:r>
+      <w:r>
+        <w:rPr>
+          <w:color w:val="595959"/>
+          <w:sz w:val="18"/>
+          <w:szCs w:val="18"/>
+        </w:rPr>
+        <w:t>・</w:t>
+      </w:r>
+      <w:r>
+        <w:rPr>
+          <w:color w:val="595959"/>
+          <w:sz w:val="18"/>
+          <w:szCs w:val="18"/>
+        </w:rPr>
+        <w:t>TON</w:t>
+      </w:r>
+      <w:r>
+        <w:rPr>
+          <w:color w:val="595959"/>
+          <w:sz w:val="18"/>
+          <w:szCs w:val="18"/>
+        </w:rPr>
+        <w:t>・</w:t>
+      </w:r>
+      <w:r>
+        <w:rPr>
+          <w:color w:val="595959"/>
+          <w:sz w:val="18"/>
+          <w:szCs w:val="18"/>
+        </w:rPr>
+        <w:t>SET</w:t>
+      </w:r>
+      <w:r>
+        <w:rPr>
+          <w:color w:val="595959"/>
+          <w:sz w:val="18"/>
+          <w:szCs w:val="18"/>
+        </w:rPr>
+        <w:t>）</w:t>
+      </w:r>
+    </w:p>
+    <w:p>
+      <w:pPr>
+        <w:spacing w:before="120" w:after="60"/>
+        <w:jc w:val="center"/>
+      </w:pPr>
+      <w:r>
+        <w:rPr>
+          <w:noProof/>
+        </w:rPr>
+        <w:drawing>
+          <wp:inline distT="0" distB="0" distL="0" distR="0" wp14:anchorId="134B5199" wp14:editId="4B8627E8">
+            <wp:extent cx="4762500" cy="800100"/>
+            <wp:effectExtent l="0" t="0" r="0" b="0"/>
+            <wp:docPr id="458230758" name="図 458230758"/>
+            <wp:cNvGraphicFramePr>
+              <a:graphicFrameLocks xmlns:a="http://schemas.openxmlformats.org/drawingml/2006/main" noChangeAspect="1"/>
+            </wp:cNvGraphicFramePr>
+            <a:graphic xmlns:a="http://schemas.openxmlformats.org/drawingml/2006/main">
+              <a:graphicData uri="http://schemas.openxmlformats.org/drawingml/2006/picture">
+                <pic:pic xmlns:pic="http://schemas.openxmlformats.org/drawingml/2006/picture">
+                  <pic:nvPicPr>
+                    <pic:cNvPr id="0" name=""/>
+                    <pic:cNvPicPr>
+                      <a:picLocks noChangeAspect="1" noChangeArrowheads="1"/>
+                    </pic:cNvPicPr>
+                  </pic:nvPicPr>
+                  <pic:blipFill>
+                    <a:blip r:embed="rId11"/>
+                    <a:srcRect/>
+                    <a:stretch>
+                      <a:fillRect/>
+                    </a:stretch>
+                  </pic:blipFill>
+                  <pic:spPr bwMode="auto">
+                    <a:xfrm>
+                      <a:off x="0" y="0"/>
+                      <a:ext cx="4762500" cy="800100"/>
+                    </a:xfrm>
+                    <a:prstGeom prst="rect">
+                      <a:avLst/>
+                    </a:prstGeom>
+                  </pic:spPr>
+                </pic:pic>
+              </a:graphicData>
+            </a:graphic>
+          </wp:inline>
+        </w:drawing>
+      </w:r>
+    </w:p>
+    <w:p>
+      <w:pPr>
+        <w:spacing w:after="200"/>
+        <w:jc w:val="center"/>
+      </w:pPr>
+      <w:r>
+        <w:rPr>
+          <w:color w:val="595959"/>
+          <w:sz w:val="18"/>
+          <w:szCs w:val="18"/>
+        </w:rPr>
+        <w:t>図</w:t>
+      </w:r>
+      <w:r>
+        <w:rPr>
+          <w:color w:val="595959"/>
+          <w:sz w:val="18"/>
+          <w:szCs w:val="18"/>
+        </w:rPr>
+        <w:t xml:space="preserve"> 5</w:t>
+      </w:r>
+      <w:r>
+        <w:rPr>
+          <w:color w:val="595959"/>
+          <w:sz w:val="18"/>
+          <w:szCs w:val="18"/>
+        </w:rPr>
+        <w:t xml:space="preserve">　</w:t>
+      </w:r>
+      <w:r>
+        <w:rPr>
+          <w:color w:val="595959"/>
+          <w:sz w:val="18"/>
+          <w:szCs w:val="18"/>
+        </w:rPr>
+        <w:t xml:space="preserve">F-3 </w:t>
+      </w:r>
+      <w:r>
+        <w:rPr>
+          <w:color w:val="595959"/>
+          <w:sz w:val="18"/>
+          <w:szCs w:val="18"/>
+        </w:rPr>
+        <w:t>ページ（</w:t>
+      </w:r>
+      <w:r>
+        <w:rPr>
+          <w:color w:val="595959"/>
+          <w:sz w:val="18"/>
+          <w:szCs w:val="18"/>
+        </w:rPr>
+        <w:t>NAR</w:t>
+      </w:r>
+      <w:r>
+        <w:rPr>
+          <w:color w:val="595959"/>
+          <w:sz w:val="18"/>
+          <w:szCs w:val="18"/>
+        </w:rPr>
+        <w:t>・</w:t>
+      </w:r>
+      <w:r>
+        <w:rPr>
+          <w:color w:val="595959"/>
+          <w:sz w:val="18"/>
+          <w:szCs w:val="18"/>
+        </w:rPr>
+        <w:t>STEP</w:t>
+      </w:r>
+      <w:r>
+        <w:rPr>
+          <w:color w:val="595959"/>
+          <w:sz w:val="18"/>
+          <w:szCs w:val="18"/>
+        </w:rPr>
+        <w:t>）</w:t>
       </w:r>
     </w:p>
     <w:tbl>
@@ -8228,7 +8891,7 @@
       <w:pPr>
         <w:pStyle w:val="2"/>
       </w:pPr>
-      <w:bookmarkStart w:id="17" w:name="_Toc243496248"/>
+      <w:bookmarkStart w:id="17" w:name="_Toc243497802"/>
       <w:r>
         <w:t>6.1 A/B</w:t>
       </w:r>
@@ -8282,7 +8945,7 @@
       <w:pPr>
         <w:pStyle w:val="2"/>
       </w:pPr>
-      <w:bookmarkStart w:id="18" w:name="_Toc243496249"/>
+      <w:bookmarkStart w:id="18" w:name="_Toc243497803"/>
       <w:r>
         <w:t>6.2 SPL</w:t>
       </w:r>
@@ -8339,8 +9002,9 @@
       <w:pPr>
         <w:pStyle w:val="2"/>
       </w:pPr>
-      <w:bookmarkStart w:id="19" w:name="_Toc243496250"/>
-      <w:r>
+      <w:bookmarkStart w:id="19" w:name="_Toc243497804"/>
+      <w:r>
+        <w:lastRenderedPageBreak/>
         <w:t>6.3 CLAR</w:t>
       </w:r>
       <w:r>
@@ -8475,7 +9139,7 @@
       <w:pPr>
         <w:pStyle w:val="2"/>
       </w:pPr>
-      <w:bookmarkStart w:id="20" w:name="_Toc243496251"/>
+      <w:bookmarkStart w:id="20" w:name="_Toc243497805"/>
       <w:r>
         <w:t>6.4 RPT</w:t>
       </w:r>
@@ -8544,9 +9208,8 @@
       <w:pPr>
         <w:pStyle w:val="2"/>
       </w:pPr>
-      <w:bookmarkStart w:id="21" w:name="_Toc243496252"/>
-      <w:r>
-        <w:lastRenderedPageBreak/>
+      <w:bookmarkStart w:id="21" w:name="_Toc243497806"/>
+      <w:r>
         <w:t>6.5 TON</w:t>
       </w:r>
       <w:r>
@@ -8620,7 +9283,7 @@
       <w:pPr>
         <w:pStyle w:val="2"/>
       </w:pPr>
-      <w:bookmarkStart w:id="22" w:name="_Toc243496253"/>
+      <w:bookmarkStart w:id="22" w:name="_Toc243497807"/>
       <w:r>
         <w:t>6.6 SET</w:t>
       </w:r>
@@ -9057,7 +9720,7 @@
       <w:pPr>
         <w:pStyle w:val="2"/>
       </w:pPr>
-      <w:bookmarkStart w:id="23" w:name="_Toc243496254"/>
+      <w:bookmarkStart w:id="23" w:name="_Toc243497808"/>
       <w:r>
         <w:t>6.7 NAR</w:t>
       </w:r>
@@ -9105,7 +9768,7 @@
       <w:pPr>
         <w:pStyle w:val="2"/>
       </w:pPr>
-      <w:bookmarkStart w:id="24" w:name="_Toc243496255"/>
+      <w:bookmarkStart w:id="24" w:name="_Toc243497809"/>
       <w:r>
         <w:t>6.8 STEP</w:t>
       </w:r>
@@ -9133,7 +9796,7 @@
         <w:pStyle w:val="1"/>
         <w:pageBreakBefore/>
       </w:pPr>
-      <w:bookmarkStart w:id="25" w:name="_Toc243496256"/>
+      <w:bookmarkStart w:id="25" w:name="_Toc243497810"/>
       <w:r>
         <w:lastRenderedPageBreak/>
         <w:t xml:space="preserve">7. </w:t>
@@ -9185,10 +9848,10 @@
           <w:noProof/>
         </w:rPr>
         <w:drawing>
-          <wp:inline distT="0" distB="0" distL="0" distR="0" wp14:anchorId="7E010B14" wp14:editId="0912FCC0">
+          <wp:inline distT="0" distB="0" distL="0" distR="0" wp14:anchorId="74B5DA80" wp14:editId="7F8C5DED">
             <wp:extent cx="6096000" cy="542925"/>
             <wp:effectExtent l="0" t="0" r="0" b="0"/>
-            <wp:docPr id="368157086" name="図 368157086"/>
+            <wp:docPr id="1359383519" name="図 1359383519"/>
             <wp:cNvGraphicFramePr>
               <a:graphicFrameLocks xmlns:a="http://schemas.openxmlformats.org/drawingml/2006/main" noChangeAspect="1"/>
             </wp:cNvGraphicFramePr>
@@ -9202,7 +9865,7 @@
                     </pic:cNvPicPr>
                   </pic:nvPicPr>
                   <pic:blipFill>
-                    <a:blip r:embed="rId8"/>
+                    <a:blip r:embed="rId12"/>
                     <a:srcRect/>
                     <a:stretch>
                       <a:fillRect/>
@@ -9243,7 +9906,7 @@
           <w:sz w:val="18"/>
           <w:szCs w:val="18"/>
         </w:rPr>
-        <w:t xml:space="preserve"> 2</w:t>
+        <w:t xml:space="preserve"> 6</w:t>
       </w:r>
       <w:r>
         <w:rPr>
@@ -9258,7 +9921,7 @@
       <w:pPr>
         <w:pStyle w:val="2"/>
       </w:pPr>
-      <w:bookmarkStart w:id="26" w:name="_Toc243496257"/>
+      <w:bookmarkStart w:id="26" w:name="_Toc243497811"/>
       <w:r>
         <w:t xml:space="preserve">7.1 </w:t>
       </w:r>
@@ -9710,7 +10373,7 @@
       <w:pPr>
         <w:pStyle w:val="2"/>
       </w:pPr>
-      <w:bookmarkStart w:id="27" w:name="_Toc243496258"/>
+      <w:bookmarkStart w:id="27" w:name="_Toc243497812"/>
       <w:r>
         <w:t xml:space="preserve">7.2 </w:t>
       </w:r>
@@ -9806,7 +10469,7 @@
       <w:pPr>
         <w:pStyle w:val="2"/>
       </w:pPr>
-      <w:bookmarkStart w:id="28" w:name="_Toc243496259"/>
+      <w:bookmarkStart w:id="28" w:name="_Toc243497813"/>
       <w:r>
         <w:t xml:space="preserve">7.3 </w:t>
       </w:r>
@@ -10123,7 +10786,7 @@
       <w:pPr>
         <w:pStyle w:val="2"/>
       </w:pPr>
-      <w:bookmarkStart w:id="29" w:name="_Toc243496260"/>
+      <w:bookmarkStart w:id="29" w:name="_Toc243497814"/>
       <w:r>
         <w:t xml:space="preserve">7.4 </w:t>
       </w:r>
@@ -10190,7 +10853,7 @@
       <w:pPr>
         <w:pStyle w:val="2"/>
       </w:pPr>
-      <w:bookmarkStart w:id="30" w:name="_Toc243496261"/>
+      <w:bookmarkStart w:id="30" w:name="_Toc243497815"/>
       <w:r>
         <w:t xml:space="preserve">7.5 </w:t>
       </w:r>
@@ -10313,7 +10976,7 @@
         <w:pStyle w:val="1"/>
         <w:pageBreakBefore/>
       </w:pPr>
-      <w:bookmarkStart w:id="31" w:name="_Toc243496262"/>
+      <w:bookmarkStart w:id="31" w:name="_Toc243497816"/>
       <w:r>
         <w:lastRenderedPageBreak/>
         <w:t xml:space="preserve">8. LCD </w:t>
@@ -10333,10 +10996,10 @@
           <w:noProof/>
         </w:rPr>
         <w:drawing>
-          <wp:inline distT="0" distB="0" distL="0" distR="0" wp14:anchorId="3876F63E" wp14:editId="46D16D9B">
+          <wp:inline distT="0" distB="0" distL="0" distR="0" wp14:anchorId="46FC4FFF" wp14:editId="5895D010">
             <wp:extent cx="4953000" cy="2695575"/>
             <wp:effectExtent l="0" t="0" r="0" b="0"/>
-            <wp:docPr id="270649682" name="図 270649682"/>
+            <wp:docPr id="142267479" name="図 142267479"/>
             <wp:cNvGraphicFramePr>
               <a:graphicFrameLocks xmlns:a="http://schemas.openxmlformats.org/drawingml/2006/main" noChangeAspect="1"/>
             </wp:cNvGraphicFramePr>
@@ -10350,7 +11013,7 @@
                     </pic:cNvPicPr>
                   </pic:nvPicPr>
                   <pic:blipFill>
-                    <a:blip r:embed="rId9"/>
+                    <a:blip r:embed="rId13"/>
                     <a:srcRect/>
                     <a:stretch>
                       <a:fillRect/>
@@ -10391,7 +11054,7 @@
           <w:sz w:val="18"/>
           <w:szCs w:val="18"/>
         </w:rPr>
-        <w:t xml:space="preserve"> 3</w:t>
+        <w:t xml:space="preserve"> 7</w:t>
       </w:r>
       <w:r>
         <w:rPr>
@@ -10422,7 +11085,7 @@
       <w:pPr>
         <w:pStyle w:val="2"/>
       </w:pPr>
-      <w:bookmarkStart w:id="32" w:name="_Toc243496263"/>
+      <w:bookmarkStart w:id="32" w:name="_Toc243497817"/>
       <w:r>
         <w:t xml:space="preserve">8.1 </w:t>
       </w:r>
@@ -11214,7 +11877,7 @@
       <w:pPr>
         <w:pStyle w:val="2"/>
       </w:pPr>
-      <w:bookmarkStart w:id="33" w:name="_Toc243496264"/>
+      <w:bookmarkStart w:id="33" w:name="_Toc243497818"/>
       <w:r>
         <w:lastRenderedPageBreak/>
         <w:t xml:space="preserve">8.2 2 </w:t>
@@ -12127,7 +12790,7 @@
       <w:pPr>
         <w:pStyle w:val="2"/>
       </w:pPr>
-      <w:bookmarkStart w:id="34" w:name="_Toc243496265"/>
+      <w:bookmarkStart w:id="34" w:name="_Toc243497819"/>
       <w:r>
         <w:t xml:space="preserve">8.3 </w:t>
       </w:r>
@@ -12398,15 +13061,108 @@
         <w:pStyle w:val="1"/>
         <w:pageBreakBefore/>
       </w:pPr>
-      <w:bookmarkStart w:id="35" w:name="_Toc243496266"/>
+      <w:bookmarkStart w:id="35" w:name="_Toc243497820"/>
       <w:r>
         <w:lastRenderedPageBreak/>
         <w:t xml:space="preserve">9. </w:t>
       </w:r>
       <w:r>
-        <w:t>困ったとき</w:t>
+        <w:t>トラブルシューティング</w:t>
       </w:r>
       <w:bookmarkEnd w:id="35"/>
+    </w:p>
+    <w:p>
+      <w:pPr>
+        <w:pStyle w:val="2"/>
+      </w:pPr>
+      <w:bookmarkStart w:id="36" w:name="_Toc243497821"/>
+      <w:r>
+        <w:t xml:space="preserve">9.1 </w:t>
+      </w:r>
+      <w:r>
+        <w:t>無線機の電源を切れなくなったとき</w:t>
+      </w:r>
+      <w:bookmarkEnd w:id="36"/>
+    </w:p>
+    <w:p>
+      <w:pPr>
+        <w:pBdr>
+          <w:left w:val="single" w:sz="18" w:space="6" w:color="E07B00"/>
+        </w:pBdr>
+        <w:shd w:val="clear" w:color="auto" w:fill="FFF4E5"/>
+        <w:spacing w:before="80" w:after="160" w:line="290" w:lineRule="auto"/>
+        <w:ind w:left="120"/>
+      </w:pPr>
+      <w:r>
+        <w:rPr>
+          <w:b/>
+          <w:bCs/>
+          <w:color w:val="9C2A00"/>
+        </w:rPr>
+        <w:t>対処</w:t>
+      </w:r>
+      <w:r>
+        <w:rPr>
+          <w:b/>
+          <w:bCs/>
+          <w:color w:val="9C2A00"/>
+        </w:rPr>
+        <w:t xml:space="preserve">  </w:t>
+      </w:r>
+      <w:r>
+        <w:t>電源の切断ができなくなったとき（電源</w:t>
+      </w:r>
+      <w:r>
+        <w:t xml:space="preserve"> OFF </w:t>
+      </w:r>
+      <w:r>
+        <w:t>の操作を受け付けない、本体が操作に反応しない）は、無線機のバッテリー（または外部電源）を一度外してください。入れ直してから電源を入れると、通常どおり操作できるようになります。</w:t>
+      </w:r>
+    </w:p>
+    <w:p>
+      <w:pPr>
+        <w:spacing w:after="120" w:line="300" w:lineRule="auto"/>
+      </w:pPr>
+      <w:r>
+        <w:t>この状態のときは、</w:t>
+      </w:r>
+      <w:r>
+        <w:t xml:space="preserve">CAT </w:t>
+      </w:r>
+      <w:r>
+        <w:t>の応答も正しく返らなくなります。</w:t>
+      </w:r>
+      <w:r>
+        <w:t xml:space="preserve">FT-817 </w:t>
+      </w:r>
+      <w:r>
+        <w:t>画面では、周波数が「</w:t>
+      </w:r>
+      <w:r>
+        <w:t>0.000</w:t>
+      </w:r>
+      <w:r>
+        <w:t>」と表示される、</w:t>
+      </w:r>
+      <w:r>
+        <w:t xml:space="preserve">TX </w:t>
+      </w:r>
+      <w:r>
+        <w:t>が点灯したままになる、といった表示になることがあります。</w:t>
+      </w:r>
+    </w:p>
+    <w:p>
+      <w:pPr>
+        <w:pStyle w:val="2"/>
+      </w:pPr>
+      <w:bookmarkStart w:id="37" w:name="_Toc243497822"/>
+      <w:r>
+        <w:t xml:space="preserve">9.2 </w:t>
+      </w:r>
+      <w:r>
+        <w:t>症状と対処</w:t>
+      </w:r>
+      <w:bookmarkEnd w:id="37"/>
     </w:p>
     <w:tbl>
       <w:tblPr>
@@ -12533,10 +13289,7 @@
               <w:spacing w:line="276" w:lineRule="auto"/>
             </w:pPr>
             <w:r>
-              <w:t xml:space="preserve">FT-817 </w:t>
-            </w:r>
-            <w:r>
-              <w:t>画面が開かず、通常の画面のまま</w:t>
+              <w:t>電源を切れない、本体が操作に反応しない</w:t>
             </w:r>
           </w:p>
         </w:tc>
@@ -12561,25 +13314,13 @@
               <w:spacing w:line="276" w:lineRule="auto"/>
             </w:pPr>
             <w:r>
-              <w:t>機種に「</w:t>
-            </w:r>
-            <w:r>
-              <w:t>FT-817 / 817ND (USB serial CAT)</w:t>
-            </w:r>
-            <w:r>
-              <w:t>」が選ばれているか確認し、選び直して</w:t>
-            </w:r>
-            <w:r>
-              <w:t xml:space="preserve"> Save Settings </w:t>
-            </w:r>
-            <w:r>
-              <w:t>を押してください。古い版の</w:t>
-            </w:r>
-            <w:r>
-              <w:t xml:space="preserve"> wfview-win </w:t>
-            </w:r>
-            <w:r>
-              <w:t>を起動していないかも確認してください</w:t>
+              <w:t>バッテリー（または外部電源）を一度外し、入れ直してから電源を入れてください（</w:t>
+            </w:r>
+            <w:r>
+              <w:t xml:space="preserve">9.1 </w:t>
+            </w:r>
+            <w:r>
+              <w:t>節）</w:t>
             </w:r>
           </w:p>
         </w:tc>
@@ -12615,13 +13356,19 @@
               <w:spacing w:line="276" w:lineRule="auto"/>
             </w:pPr>
             <w:r>
-              <w:t>「</w:t>
-            </w:r>
-            <w:r>
-              <w:t xml:space="preserve">CAT </w:t>
-            </w:r>
-            <w:r>
-              <w:t>応答待ち」と表示される</w:t>
+              <w:t>周波数が</w:t>
+            </w:r>
+            <w:r>
+              <w:t xml:space="preserve"> 0.000 </w:t>
+            </w:r>
+            <w:r>
+              <w:t>と表示され、</w:t>
+            </w:r>
+            <w:r>
+              <w:t xml:space="preserve">TX </w:t>
+            </w:r>
+            <w:r>
+              <w:t>が点灯したままになる</w:t>
             </w:r>
           </w:p>
         </w:tc>
@@ -12646,31 +13393,13 @@
               <w:spacing w:line="276" w:lineRule="auto"/>
             </w:pPr>
             <w:r>
-              <w:t>無線機の電源、</w:t>
-            </w:r>
-            <w:r>
-              <w:t xml:space="preserve">CAT RATE </w:t>
-            </w:r>
-            <w:r>
-              <w:t>とボーレートの一致、ケーブルの配線（</w:t>
-            </w:r>
-            <w:r>
-              <w:t xml:space="preserve">TXD </w:t>
-            </w:r>
-            <w:r>
-              <w:t>と</w:t>
-            </w:r>
-            <w:r>
-              <w:t xml:space="preserve"> RXD </w:t>
-            </w:r>
-            <w:r>
-              <w:t>が逆になっていないか）、</w:t>
-            </w:r>
-            <w:r>
-              <w:t xml:space="preserve">COM </w:t>
-            </w:r>
-            <w:r>
-              <w:t>ポート番号を確認してください</w:t>
+              <w:t>無線機が正常に応答していません。無線機の状態を確認し、操作を受け付けない場合はバッテリーを一度外してください（</w:t>
+            </w:r>
+            <w:r>
+              <w:t xml:space="preserve">9.1 </w:t>
+            </w:r>
+            <w:r>
+              <w:t>節）</w:t>
             </w:r>
           </w:p>
         </w:tc>
@@ -12706,10 +13435,10 @@
               <w:spacing w:line="276" w:lineRule="auto"/>
             </w:pPr>
             <w:r>
-              <w:t xml:space="preserve">COM </w:t>
-            </w:r>
-            <w:r>
-              <w:t>ポートを開けない</w:t>
+              <w:t xml:space="preserve">FT-817 </w:t>
+            </w:r>
+            <w:r>
+              <w:t>画面が開かず、通常の画面のまま</w:t>
             </w:r>
           </w:p>
         </w:tc>
@@ -12734,13 +13463,25 @@
               <w:spacing w:line="276" w:lineRule="auto"/>
             </w:pPr>
             <w:r>
-              <w:t>ほかのソフト（ロギングソフトなど）が同じ</w:t>
-            </w:r>
-            <w:r>
-              <w:t xml:space="preserve"> COM </w:t>
-            </w:r>
-            <w:r>
-              <w:t>ポートを使っていないか確認してください</w:t>
+              <w:t>機種に「</w:t>
+            </w:r>
+            <w:r>
+              <w:t>FT-817 / 817ND (USB serial CAT)</w:t>
+            </w:r>
+            <w:r>
+              <w:t>」が選ばれているか確認し、選び直して</w:t>
+            </w:r>
+            <w:r>
+              <w:t xml:space="preserve"> Save Settings </w:t>
+            </w:r>
+            <w:r>
+              <w:t>を押してください。古い版の</w:t>
+            </w:r>
+            <w:r>
+              <w:t xml:space="preserve"> wfview-win </w:t>
+            </w:r>
+            <w:r>
+              <w:t>を起動していないかも確認してください</w:t>
             </w:r>
           </w:p>
         </w:tc>
@@ -12776,7 +13517,13 @@
               <w:spacing w:line="276" w:lineRule="auto"/>
             </w:pPr>
             <w:r>
-              <w:t>本体で変えた設定が反映されない</w:t>
+              <w:t>「</w:t>
+            </w:r>
+            <w:r>
+              <w:t xml:space="preserve">CAT </w:t>
+            </w:r>
+            <w:r>
+              <w:t>応答待ち」と表示される</w:t>
             </w:r>
           </w:p>
         </w:tc>
@@ -12801,13 +13548,31 @@
               <w:spacing w:line="276" w:lineRule="auto"/>
             </w:pPr>
             <w:r>
-              <w:t>下段の「更新」を押してください。</w:t>
-            </w:r>
-            <w:r>
-              <w:t xml:space="preserve">2 </w:t>
-            </w:r>
-            <w:r>
-              <w:t>段目の状態表示は、数秒おきに順番に読み直しています</w:t>
+              <w:t>無線機の電源、</w:t>
+            </w:r>
+            <w:r>
+              <w:t xml:space="preserve">CAT RATE </w:t>
+            </w:r>
+            <w:r>
+              <w:t>とボーレートの一致、ケーブルの配線（</w:t>
+            </w:r>
+            <w:r>
+              <w:t xml:space="preserve">TXD </w:t>
+            </w:r>
+            <w:r>
+              <w:t>と</w:t>
+            </w:r>
+            <w:r>
+              <w:t xml:space="preserve"> RXD </w:t>
+            </w:r>
+            <w:r>
+              <w:t>が逆になっていないか）、</w:t>
+            </w:r>
+            <w:r>
+              <w:t xml:space="preserve">COM </w:t>
+            </w:r>
+            <w:r>
+              <w:t>ポート番号を確認してください</w:t>
             </w:r>
           </w:p>
         </w:tc>
@@ -12843,7 +13608,10 @@
               <w:spacing w:line="276" w:lineRule="auto"/>
             </w:pPr>
             <w:r>
-              <w:t>スキャンがどの周波数でも止まる</w:t>
+              <w:t xml:space="preserve">COM </w:t>
+            </w:r>
+            <w:r>
+              <w:t>ポートを開けない</w:t>
             </w:r>
           </w:p>
         </w:tc>
@@ -12868,7 +13636,13 @@
               <w:spacing w:line="276" w:lineRule="auto"/>
             </w:pPr>
             <w:r>
-              <w:t>無線機のスケルチが開いたままになっていないか確認してください</w:t>
+              <w:t>ほかのソフト（ロギングソフトなど）が同じ</w:t>
+            </w:r>
+            <w:r>
+              <w:t xml:space="preserve"> COM </w:t>
+            </w:r>
+            <w:r>
+              <w:t>ポートを使っていないか確認してください</w:t>
             </w:r>
           </w:p>
         </w:tc>
@@ -12904,6 +13678,134 @@
               <w:spacing w:line="276" w:lineRule="auto"/>
             </w:pPr>
             <w:r>
+              <w:t>本体で変えた設定が反映されない</w:t>
+            </w:r>
+          </w:p>
+        </w:tc>
+        <w:tc>
+          <w:tcPr>
+            <w:tcW w:w="6438" w:type="dxa"/>
+            <w:tcBorders>
+              <w:top w:val="single" w:sz="4" w:space="0" w:color="A6A6A6"/>
+              <w:left w:val="single" w:sz="4" w:space="0" w:color="A6A6A6"/>
+              <w:bottom w:val="single" w:sz="4" w:space="0" w:color="A6A6A6"/>
+              <w:right w:val="single" w:sz="4" w:space="0" w:color="A6A6A6"/>
+            </w:tcBorders>
+            <w:tcMar>
+              <w:top w:w="60" w:type="dxa"/>
+              <w:left w:w="100" w:type="dxa"/>
+              <w:bottom w:w="60" w:type="dxa"/>
+              <w:right w:w="100" w:type="dxa"/>
+            </w:tcMar>
+          </w:tcPr>
+          <w:p>
+            <w:pPr>
+              <w:spacing w:line="276" w:lineRule="auto"/>
+            </w:pPr>
+            <w:r>
+              <w:t>下段の「更新」を押してください。</w:t>
+            </w:r>
+            <w:r>
+              <w:t xml:space="preserve">2 </w:t>
+            </w:r>
+            <w:r>
+              <w:t>段目の状態表示は、数秒おきに順番に読み直しています</w:t>
+            </w:r>
+          </w:p>
+        </w:tc>
+      </w:tr>
+      <w:tr>
+        <w:tblPrEx>
+          <w:tblCellMar>
+            <w:top w:w="0" w:type="dxa"/>
+            <w:bottom w:w="0" w:type="dxa"/>
+          </w:tblCellMar>
+        </w:tblPrEx>
+        <w:trPr>
+          <w:cantSplit/>
+        </w:trPr>
+        <w:tc>
+          <w:tcPr>
+            <w:tcW w:w="3200" w:type="dxa"/>
+            <w:tcBorders>
+              <w:top w:val="single" w:sz="4" w:space="0" w:color="A6A6A6"/>
+              <w:left w:val="single" w:sz="4" w:space="0" w:color="A6A6A6"/>
+              <w:bottom w:val="single" w:sz="4" w:space="0" w:color="A6A6A6"/>
+              <w:right w:val="single" w:sz="4" w:space="0" w:color="A6A6A6"/>
+            </w:tcBorders>
+            <w:tcMar>
+              <w:top w:w="60" w:type="dxa"/>
+              <w:left w:w="100" w:type="dxa"/>
+              <w:bottom w:w="60" w:type="dxa"/>
+              <w:right w:w="100" w:type="dxa"/>
+            </w:tcMar>
+          </w:tcPr>
+          <w:p>
+            <w:pPr>
+              <w:spacing w:line="276" w:lineRule="auto"/>
+            </w:pPr>
+            <w:r>
+              <w:t>スキャンがどの周波数でも止まる</w:t>
+            </w:r>
+          </w:p>
+        </w:tc>
+        <w:tc>
+          <w:tcPr>
+            <w:tcW w:w="6438" w:type="dxa"/>
+            <w:tcBorders>
+              <w:top w:val="single" w:sz="4" w:space="0" w:color="A6A6A6"/>
+              <w:left w:val="single" w:sz="4" w:space="0" w:color="A6A6A6"/>
+              <w:bottom w:val="single" w:sz="4" w:space="0" w:color="A6A6A6"/>
+              <w:right w:val="single" w:sz="4" w:space="0" w:color="A6A6A6"/>
+            </w:tcBorders>
+            <w:tcMar>
+              <w:top w:w="60" w:type="dxa"/>
+              <w:left w:w="100" w:type="dxa"/>
+              <w:bottom w:w="60" w:type="dxa"/>
+              <w:right w:w="100" w:type="dxa"/>
+            </w:tcMar>
+          </w:tcPr>
+          <w:p>
+            <w:pPr>
+              <w:spacing w:line="276" w:lineRule="auto"/>
+            </w:pPr>
+            <w:r>
+              <w:t>無線機のスケルチが開いたままになっていないか確認してください</w:t>
+            </w:r>
+          </w:p>
+        </w:tc>
+      </w:tr>
+      <w:tr>
+        <w:tblPrEx>
+          <w:tblCellMar>
+            <w:top w:w="0" w:type="dxa"/>
+            <w:bottom w:w="0" w:type="dxa"/>
+          </w:tblCellMar>
+        </w:tblPrEx>
+        <w:trPr>
+          <w:cantSplit/>
+        </w:trPr>
+        <w:tc>
+          <w:tcPr>
+            <w:tcW w:w="3200" w:type="dxa"/>
+            <w:tcBorders>
+              <w:top w:val="single" w:sz="4" w:space="0" w:color="A6A6A6"/>
+              <w:left w:val="single" w:sz="4" w:space="0" w:color="A6A6A6"/>
+              <w:bottom w:val="single" w:sz="4" w:space="0" w:color="A6A6A6"/>
+              <w:right w:val="single" w:sz="4" w:space="0" w:color="A6A6A6"/>
+            </w:tcBorders>
+            <w:tcMar>
+              <w:top w:w="60" w:type="dxa"/>
+              <w:left w:w="100" w:type="dxa"/>
+              <w:bottom w:w="60" w:type="dxa"/>
+              <w:right w:w="100" w:type="dxa"/>
+            </w:tcMar>
+          </w:tcPr>
+          <w:p>
+            <w:pPr>
+              <w:spacing w:line="276" w:lineRule="auto"/>
+            </w:pPr>
+            <w:r>
               <w:t>送信が</w:t>
             </w:r>
             <w:r>
@@ -12956,14 +13858,15 @@
       <w:pPr>
         <w:pStyle w:val="2"/>
       </w:pPr>
-      <w:bookmarkStart w:id="36" w:name="_Toc243496267"/>
-      <w:r>
-        <w:t xml:space="preserve">9.1 </w:t>
+      <w:bookmarkStart w:id="38" w:name="_Toc243497823"/>
+      <w:r>
+        <w:lastRenderedPageBreak/>
+        <w:t xml:space="preserve">9.3 </w:t>
       </w:r>
       <w:r>
         <w:t>プログラムが異常終了したとき</w:t>
       </w:r>
-      <w:bookmarkEnd w:id="36"/>
+      <w:bookmarkEnd w:id="38"/>
     </w:p>
     <w:p>
       <w:pPr>
@@ -13071,7 +13974,7 @@
         <w:pStyle w:val="1"/>
         <w:pageBreakBefore/>
       </w:pPr>
-      <w:bookmarkStart w:id="37" w:name="_Toc243496268"/>
+      <w:bookmarkStart w:id="39" w:name="_Toc243497824"/>
       <w:r>
         <w:lastRenderedPageBreak/>
         <w:t xml:space="preserve">10. </w:t>
@@ -13079,20 +13982,20 @@
       <w:r>
         <w:t>クレジットとライセンス</w:t>
       </w:r>
-      <w:bookmarkEnd w:id="37"/>
+      <w:bookmarkEnd w:id="39"/>
     </w:p>
     <w:p>
       <w:pPr>
         <w:pStyle w:val="2"/>
       </w:pPr>
-      <w:bookmarkStart w:id="38" w:name="_Toc243496269"/>
+      <w:bookmarkStart w:id="40" w:name="_Toc243497825"/>
       <w:r>
         <w:t xml:space="preserve">10.1 </w:t>
       </w:r>
       <w:r>
         <w:t>ライセンス</w:t>
       </w:r>
-      <w:bookmarkEnd w:id="38"/>
+      <w:bookmarkEnd w:id="40"/>
     </w:p>
     <w:p>
       <w:pPr>
@@ -13192,7 +14095,7 @@
         <w:t xml:space="preserve">FT-817 / FT-818 </w:t>
       </w:r>
       <w:r>
-        <w:t>画面、レンジスキャン、クラッシュログを含む）</w:t>
+        <w:t>画面、レンジスキャンを含む）</w:t>
       </w:r>
       <w:r>
         <w:t>: Copyright 2026 JA6FUF/JH1XHX</w:t>
@@ -13216,14 +14119,14 @@
       <w:pPr>
         <w:pStyle w:val="2"/>
       </w:pPr>
-      <w:bookmarkStart w:id="39" w:name="_Toc243496270"/>
+      <w:bookmarkStart w:id="41" w:name="_Toc243497826"/>
       <w:r>
         <w:t xml:space="preserve">10.2 </w:t>
       </w:r>
       <w:r>
         <w:t>クレジット</w:t>
       </w:r>
-      <w:bookmarkEnd w:id="39"/>
+      <w:bookmarkEnd w:id="41"/>
     </w:p>
     <w:p>
       <w:pPr>
@@ -13480,14 +14383,14 @@
       <w:pPr>
         <w:pStyle w:val="2"/>
       </w:pPr>
-      <w:bookmarkStart w:id="40" w:name="_Toc243496271"/>
+      <w:bookmarkStart w:id="42" w:name="_Toc243497827"/>
       <w:r>
         <w:t xml:space="preserve">10.3 </w:t>
       </w:r>
       <w:r>
         <w:t>商標</w:t>
       </w:r>
-      <w:bookmarkEnd w:id="40"/>
+      <w:bookmarkEnd w:id="42"/>
     </w:p>
     <w:p>
       <w:pPr>
@@ -13534,14 +14437,14 @@
       <w:pPr>
         <w:pStyle w:val="2"/>
       </w:pPr>
-      <w:bookmarkStart w:id="41" w:name="_Toc243496272"/>
+      <w:bookmarkStart w:id="43" w:name="_Toc243497828"/>
       <w:r>
         <w:t xml:space="preserve">10.4 </w:t>
       </w:r>
       <w:r>
         <w:t>免責事項</w:t>
       </w:r>
-      <w:bookmarkEnd w:id="41"/>
+      <w:bookmarkEnd w:id="43"/>
     </w:p>
     <w:p>
       <w:pPr>
@@ -13562,8 +14465,8 @@
       </w:r>
     </w:p>
     <w:sectPr>
-      <w:headerReference w:type="default" r:id="rId10"/>
-      <w:footerReference w:type="default" r:id="rId11"/>
+      <w:headerReference w:type="default" r:id="rId14"/>
+      <w:footerReference w:type="default" r:id="rId15"/>
       <w:pgSz w:w="11906" w:h="16838"/>
       <w:pgMar w:top="1300" w:right="1134" w:bottom="1200" w:left="1134" w:header="708" w:footer="708" w:gutter="0"/>
       <w:cols w:space="720"/>
@@ -13692,10 +14595,10 @@
 <file path=word/numbering.xml><?xml version="1.0" encoding="utf-8"?>
 <w:numbering xmlns:wpc="http://schemas.microsoft.com/office/word/2010/wordprocessingCanvas" xmlns:cx="http://schemas.microsoft.com/office/drawing/2014/chartex" xmlns:cx1="http://schemas.microsoft.com/office/drawing/2015/9/8/chartex" xmlns:cx2="http://schemas.microsoft.com/office/drawing/2015/10/21/chartex" xmlns:cx3="http://schemas.microsoft.com/office/drawing/2016/5/9/chartex" xmlns:cx4="http://schemas.microsoft.com/office/drawing/2016/5/10/chartex" xmlns:cx5="http://schemas.microsoft.com/office/drawing/2016/5/11/chartex" xmlns:cx6="http://schemas.microsoft.com/office/drawing/2016/5/12/chartex" xmlns:cx7="http://schemas.microsoft.com/office/drawing/2016/5/13/chartex" xmlns:cx8="http://schemas.microsoft.com/office/drawing/2016/5/14/chartex" xmlns:mc="http://schemas.openxmlformats.org/markup-compatibility/2006" xmlns:aink="http://schemas.microsoft.com/office/drawing/2016/ink" xmlns:am3d="http://schemas.microsoft.com/office/drawing/2017/model3d" xmlns:o="urn:schemas-microsoft-com:office:office" xmlns:oel="http://schemas.microsoft.com/office/2019/extlst" xmlns:r="http://schemas.openxmlformats.org/officeDocument/2006/relationships" xmlns:m="http://schemas.openxmlformats.org/officeDocument/2006/math" xmlns:v="urn:schemas-microsoft-com:vml" xmlns:wp14="http://schemas.microsoft.com/office/word/2010/wordprocessingDrawing" xmlns:wp="http://schemas.openxmlformats.org/drawingml/2006/wordprocessingDrawing" xmlns:w10="urn:schemas-microsoft-com:office:word" xmlns:w="http://schemas.openxmlformats.org/wordprocessingml/2006/main" xmlns:w14="http://schemas.microsoft.com/office/word/2010/wordml" xmlns:w15="http://schemas.microsoft.com/office/word/2012/wordml" xmlns:w16cex="http://schemas.microsoft.com/office/word/2018/wordml/cex" xmlns:w16cid="http://schemas.microsoft.com/office/word/2016/wordml/cid" xmlns:w16="http://schemas.microsoft.com/office/word/2018/wordml" xmlns:w16du="http://schemas.microsoft.com/office/word/2023/wordml/word16du" xmlns:w16sdtdh="http://schemas.microsoft.com/office/word/2020/wordml/sdtdatahash" xmlns:w16sdtfl="http://schemas.microsoft.com/office/word/2024/wordml/sdtformatlock" xmlns:w16se="http://schemas.microsoft.com/office/word/2015/wordml/symex" xmlns:wpg="http://schemas.microsoft.com/office/word/2010/wordprocessingGroup" xmlns:wpi="http://schemas.microsoft.com/office/word/2010/wordprocessingInk" xmlns:wne="http://schemas.microsoft.com/office/word/2006/wordml" xmlns:wps="http://schemas.microsoft.com/office/word/2010/wordprocessingShape" mc:Ignorable="w14 w15 w16se w16cid w16 w16cex w16sdtdh w16sdtfl w16du wp14">
   <w:abstractNum w:abstractNumId="0" w15:restartNumberingAfterBreak="0">
-    <w:nsid w:val="08740571"/>
+    <w:nsid w:val="0DBB75DB"/>
     <w:multiLevelType w:val="hybridMultilevel"/>
-    <w:tmpl w:val="D1B4A6B8"/>
-    <w:lvl w:ilvl="0" w:tplc="5078743A">
+    <w:tmpl w:val="58D8ADF4"/>
+    <w:lvl w:ilvl="0" w:tplc="1B0E6410">
       <w:start w:val="1"/>
       <w:numFmt w:val="decimal"/>
       <w:lvlText w:val="%1."/>
@@ -13704,138 +14607,52 @@
         <w:ind w:left="480" w:hanging="360"/>
       </w:pPr>
     </w:lvl>
-    <w:lvl w:ilvl="1" w:tplc="2F6CD336">
+    <w:lvl w:ilvl="1" w:tplc="2DBC01FA">
       <w:numFmt w:val="decimal"/>
       <w:lvlText w:val=""/>
       <w:lvlJc w:val="left"/>
     </w:lvl>
-    <w:lvl w:ilvl="2" w:tplc="50CC093A">
+    <w:lvl w:ilvl="2" w:tplc="4B103B40">
       <w:numFmt w:val="decimal"/>
       <w:lvlText w:val=""/>
       <w:lvlJc w:val="left"/>
     </w:lvl>
-    <w:lvl w:ilvl="3" w:tplc="7378316A">
+    <w:lvl w:ilvl="3" w:tplc="608A1846">
       <w:numFmt w:val="decimal"/>
       <w:lvlText w:val=""/>
       <w:lvlJc w:val="left"/>
     </w:lvl>
-    <w:lvl w:ilvl="4" w:tplc="17C2ADD6">
+    <w:lvl w:ilvl="4" w:tplc="865850B8">
       <w:numFmt w:val="decimal"/>
       <w:lvlText w:val=""/>
       <w:lvlJc w:val="left"/>
     </w:lvl>
-    <w:lvl w:ilvl="5" w:tplc="57EEDCBC">
+    <w:lvl w:ilvl="5" w:tplc="F17E28F2">
       <w:numFmt w:val="decimal"/>
       <w:lvlText w:val=""/>
       <w:lvlJc w:val="left"/>
     </w:lvl>
-    <w:lvl w:ilvl="6" w:tplc="CF92C8E4">
+    <w:lvl w:ilvl="6" w:tplc="4A18DA4E">
       <w:numFmt w:val="decimal"/>
       <w:lvlText w:val=""/>
       <w:lvlJc w:val="left"/>
     </w:lvl>
-    <w:lvl w:ilvl="7" w:tplc="618EE680">
+    <w:lvl w:ilvl="7" w:tplc="96C47BB4">
       <w:numFmt w:val="decimal"/>
       <w:lvlText w:val=""/>
       <w:lvlJc w:val="left"/>
     </w:lvl>
-    <w:lvl w:ilvl="8" w:tplc="4406021C">
+    <w:lvl w:ilvl="8" w:tplc="11ECD284">
       <w:numFmt w:val="decimal"/>
       <w:lvlText w:val=""/>
       <w:lvlJc w:val="left"/>
     </w:lvl>
   </w:abstractNum>
   <w:abstractNum w:abstractNumId="1" w15:restartNumberingAfterBreak="0">
-    <w:nsid w:val="21AE3EFD"/>
+    <w:nsid w:val="13AE3022"/>
     <w:multiLevelType w:val="hybridMultilevel"/>
-    <w:tmpl w:val="0E10F8C0"/>
-    <w:lvl w:ilvl="0" w:tplc="84288786">
-      <w:start w:val="1"/>
-      <w:numFmt w:val="bullet"/>
-      <w:lvlText w:val="●"/>
-      <w:lvlJc w:val="left"/>
-      <w:pPr>
-        <w:ind w:left="720" w:hanging="360"/>
-      </w:pPr>
-    </w:lvl>
-    <w:lvl w:ilvl="1" w:tplc="8938AD6E">
-      <w:start w:val="1"/>
-      <w:numFmt w:val="bullet"/>
-      <w:lvlText w:val="○"/>
-      <w:lvlJc w:val="left"/>
-      <w:pPr>
-        <w:ind w:left="1440" w:hanging="360"/>
-      </w:pPr>
-    </w:lvl>
-    <w:lvl w:ilvl="2" w:tplc="DA1AA990">
-      <w:start w:val="1"/>
-      <w:numFmt w:val="bullet"/>
-      <w:lvlText w:val="■"/>
-      <w:lvlJc w:val="left"/>
-      <w:pPr>
-        <w:ind w:left="2160" w:hanging="360"/>
-      </w:pPr>
-    </w:lvl>
-    <w:lvl w:ilvl="3" w:tplc="A44457C0">
-      <w:start w:val="1"/>
-      <w:numFmt w:val="bullet"/>
-      <w:lvlText w:val="●"/>
-      <w:lvlJc w:val="left"/>
-      <w:pPr>
-        <w:ind w:left="2880" w:hanging="360"/>
-      </w:pPr>
-    </w:lvl>
-    <w:lvl w:ilvl="4" w:tplc="FB58F9A2">
-      <w:start w:val="1"/>
-      <w:numFmt w:val="bullet"/>
-      <w:lvlText w:val="○"/>
-      <w:lvlJc w:val="left"/>
-      <w:pPr>
-        <w:ind w:left="3600" w:hanging="360"/>
-      </w:pPr>
-    </w:lvl>
-    <w:lvl w:ilvl="5" w:tplc="4818201E">
-      <w:start w:val="1"/>
-      <w:numFmt w:val="bullet"/>
-      <w:lvlText w:val="■"/>
-      <w:lvlJc w:val="left"/>
-      <w:pPr>
-        <w:ind w:left="4320" w:hanging="360"/>
-      </w:pPr>
-    </w:lvl>
-    <w:lvl w:ilvl="6" w:tplc="96F492D4">
-      <w:start w:val="1"/>
-      <w:numFmt w:val="bullet"/>
-      <w:lvlText w:val="●"/>
-      <w:lvlJc w:val="left"/>
-      <w:pPr>
-        <w:ind w:left="5040" w:hanging="360"/>
-      </w:pPr>
-    </w:lvl>
-    <w:lvl w:ilvl="7" w:tplc="5BB6B89A">
-      <w:start w:val="1"/>
-      <w:numFmt w:val="bullet"/>
-      <w:lvlText w:val="●"/>
-      <w:lvlJc w:val="left"/>
-      <w:pPr>
-        <w:ind w:left="5760" w:hanging="360"/>
-      </w:pPr>
-    </w:lvl>
-    <w:lvl w:ilvl="8" w:tplc="97CA88EA">
-      <w:start w:val="1"/>
-      <w:numFmt w:val="bullet"/>
-      <w:lvlText w:val="●"/>
-      <w:lvlJc w:val="left"/>
-      <w:pPr>
-        <w:ind w:left="6480" w:hanging="360"/>
-      </w:pPr>
-    </w:lvl>
-  </w:abstractNum>
-  <w:abstractNum w:abstractNumId="2" w15:restartNumberingAfterBreak="0">
-    <w:nsid w:val="3EFD246B"/>
-    <w:multiLevelType w:val="hybridMultilevel"/>
-    <w:tmpl w:val="93D617B0"/>
-    <w:lvl w:ilvl="0" w:tplc="1E9A4B56">
+    <w:tmpl w:val="68C0053E"/>
+    <w:lvl w:ilvl="0" w:tplc="99E6A4F0">
       <w:start w:val="1"/>
       <w:numFmt w:val="decimal"/>
       <w:lvlText w:val="%1."/>
@@ -13844,52 +14661,138 @@
         <w:ind w:left="480" w:hanging="360"/>
       </w:pPr>
     </w:lvl>
-    <w:lvl w:ilvl="1" w:tplc="9170E94C">
+    <w:lvl w:ilvl="1" w:tplc="1ED4F0A4">
       <w:numFmt w:val="decimal"/>
       <w:lvlText w:val=""/>
       <w:lvlJc w:val="left"/>
     </w:lvl>
-    <w:lvl w:ilvl="2" w:tplc="97588C78">
+    <w:lvl w:ilvl="2" w:tplc="5D26165C">
       <w:numFmt w:val="decimal"/>
       <w:lvlText w:val=""/>
       <w:lvlJc w:val="left"/>
     </w:lvl>
-    <w:lvl w:ilvl="3" w:tplc="473E7106">
+    <w:lvl w:ilvl="3" w:tplc="50AA0A12">
       <w:numFmt w:val="decimal"/>
       <w:lvlText w:val=""/>
       <w:lvlJc w:val="left"/>
     </w:lvl>
-    <w:lvl w:ilvl="4" w:tplc="4CF4AD36">
+    <w:lvl w:ilvl="4" w:tplc="B302E7D0">
       <w:numFmt w:val="decimal"/>
       <w:lvlText w:val=""/>
       <w:lvlJc w:val="left"/>
     </w:lvl>
-    <w:lvl w:ilvl="5" w:tplc="80523282">
+    <w:lvl w:ilvl="5" w:tplc="CBAE7DD4">
       <w:numFmt w:val="decimal"/>
       <w:lvlText w:val=""/>
       <w:lvlJc w:val="left"/>
     </w:lvl>
-    <w:lvl w:ilvl="6" w:tplc="210E64C8">
+    <w:lvl w:ilvl="6" w:tplc="A65203BE">
       <w:numFmt w:val="decimal"/>
       <w:lvlText w:val=""/>
       <w:lvlJc w:val="left"/>
     </w:lvl>
-    <w:lvl w:ilvl="7" w:tplc="DD00C41A">
+    <w:lvl w:ilvl="7" w:tplc="0E66B7C6">
       <w:numFmt w:val="decimal"/>
       <w:lvlText w:val=""/>
       <w:lvlJc w:val="left"/>
     </w:lvl>
-    <w:lvl w:ilvl="8" w:tplc="BFD4D89A">
+    <w:lvl w:ilvl="8" w:tplc="ABC42AEC">
       <w:numFmt w:val="decimal"/>
       <w:lvlText w:val=""/>
       <w:lvlJc w:val="left"/>
     </w:lvl>
   </w:abstractNum>
+  <w:abstractNum w:abstractNumId="2" w15:restartNumberingAfterBreak="0">
+    <w:nsid w:val="2FE77E05"/>
+    <w:multiLevelType w:val="hybridMultilevel"/>
+    <w:tmpl w:val="F21A798C"/>
+    <w:lvl w:ilvl="0" w:tplc="635E888A">
+      <w:start w:val="1"/>
+      <w:numFmt w:val="bullet"/>
+      <w:lvlText w:val="●"/>
+      <w:lvlJc w:val="left"/>
+      <w:pPr>
+        <w:ind w:left="720" w:hanging="360"/>
+      </w:pPr>
+    </w:lvl>
+    <w:lvl w:ilvl="1" w:tplc="BDD66A0A">
+      <w:start w:val="1"/>
+      <w:numFmt w:val="bullet"/>
+      <w:lvlText w:val="○"/>
+      <w:lvlJc w:val="left"/>
+      <w:pPr>
+        <w:ind w:left="1440" w:hanging="360"/>
+      </w:pPr>
+    </w:lvl>
+    <w:lvl w:ilvl="2" w:tplc="6C8E148A">
+      <w:start w:val="1"/>
+      <w:numFmt w:val="bullet"/>
+      <w:lvlText w:val="■"/>
+      <w:lvlJc w:val="left"/>
+      <w:pPr>
+        <w:ind w:left="2160" w:hanging="360"/>
+      </w:pPr>
+    </w:lvl>
+    <w:lvl w:ilvl="3" w:tplc="4436624C">
+      <w:start w:val="1"/>
+      <w:numFmt w:val="bullet"/>
+      <w:lvlText w:val="●"/>
+      <w:lvlJc w:val="left"/>
+      <w:pPr>
+        <w:ind w:left="2880" w:hanging="360"/>
+      </w:pPr>
+    </w:lvl>
+    <w:lvl w:ilvl="4" w:tplc="65A62FC4">
+      <w:start w:val="1"/>
+      <w:numFmt w:val="bullet"/>
+      <w:lvlText w:val="○"/>
+      <w:lvlJc w:val="left"/>
+      <w:pPr>
+        <w:ind w:left="3600" w:hanging="360"/>
+      </w:pPr>
+    </w:lvl>
+    <w:lvl w:ilvl="5" w:tplc="CB10C348">
+      <w:start w:val="1"/>
+      <w:numFmt w:val="bullet"/>
+      <w:lvlText w:val="■"/>
+      <w:lvlJc w:val="left"/>
+      <w:pPr>
+        <w:ind w:left="4320" w:hanging="360"/>
+      </w:pPr>
+    </w:lvl>
+    <w:lvl w:ilvl="6" w:tplc="158ABFF2">
+      <w:start w:val="1"/>
+      <w:numFmt w:val="bullet"/>
+      <w:lvlText w:val="●"/>
+      <w:lvlJc w:val="left"/>
+      <w:pPr>
+        <w:ind w:left="5040" w:hanging="360"/>
+      </w:pPr>
+    </w:lvl>
+    <w:lvl w:ilvl="7" w:tplc="22A0DC16">
+      <w:start w:val="1"/>
+      <w:numFmt w:val="bullet"/>
+      <w:lvlText w:val="●"/>
+      <w:lvlJc w:val="left"/>
+      <w:pPr>
+        <w:ind w:left="5760" w:hanging="360"/>
+      </w:pPr>
+    </w:lvl>
+    <w:lvl w:ilvl="8" w:tplc="C68C8050">
+      <w:start w:val="1"/>
+      <w:numFmt w:val="bullet"/>
+      <w:lvlText w:val="●"/>
+      <w:lvlJc w:val="left"/>
+      <w:pPr>
+        <w:ind w:left="6480" w:hanging="360"/>
+      </w:pPr>
+    </w:lvl>
+  </w:abstractNum>
   <w:abstractNum w:abstractNumId="3" w15:restartNumberingAfterBreak="0">
-    <w:nsid w:val="438E6ADE"/>
+    <w:nsid w:val="51474591"/>
     <w:multiLevelType w:val="hybridMultilevel"/>
-    <w:tmpl w:val="3A3EF03E"/>
-    <w:lvl w:ilvl="0" w:tplc="13B8C58E">
+    <w:tmpl w:val="FD88E83A"/>
+    <w:lvl w:ilvl="0" w:tplc="AC2C82A6">
       <w:start w:val="1"/>
       <w:numFmt w:val="decimal"/>
       <w:lvlText w:val="%1."/>
@@ -13898,52 +14801,52 @@
         <w:ind w:left="480" w:hanging="360"/>
       </w:pPr>
     </w:lvl>
-    <w:lvl w:ilvl="1" w:tplc="933876B2">
+    <w:lvl w:ilvl="1" w:tplc="A9D2919C">
       <w:numFmt w:val="decimal"/>
       <w:lvlText w:val=""/>
       <w:lvlJc w:val="left"/>
     </w:lvl>
-    <w:lvl w:ilvl="2" w:tplc="FF5619C0">
+    <w:lvl w:ilvl="2" w:tplc="7442A502">
       <w:numFmt w:val="decimal"/>
       <w:lvlText w:val=""/>
       <w:lvlJc w:val="left"/>
     </w:lvl>
-    <w:lvl w:ilvl="3" w:tplc="2EC80680">
+    <w:lvl w:ilvl="3" w:tplc="DEE0B79E">
       <w:numFmt w:val="decimal"/>
       <w:lvlText w:val=""/>
       <w:lvlJc w:val="left"/>
     </w:lvl>
-    <w:lvl w:ilvl="4" w:tplc="BDFE70DC">
+    <w:lvl w:ilvl="4" w:tplc="96AA8664">
       <w:numFmt w:val="decimal"/>
       <w:lvlText w:val=""/>
       <w:lvlJc w:val="left"/>
     </w:lvl>
-    <w:lvl w:ilvl="5" w:tplc="3F9A8BE2">
+    <w:lvl w:ilvl="5" w:tplc="4EF8F16E">
       <w:numFmt w:val="decimal"/>
       <w:lvlText w:val=""/>
       <w:lvlJc w:val="left"/>
     </w:lvl>
-    <w:lvl w:ilvl="6" w:tplc="DA00D480">
+    <w:lvl w:ilvl="6" w:tplc="D28CD4FC">
       <w:numFmt w:val="decimal"/>
       <w:lvlText w:val=""/>
       <w:lvlJc w:val="left"/>
     </w:lvl>
-    <w:lvl w:ilvl="7" w:tplc="BB6E191C">
+    <w:lvl w:ilvl="7" w:tplc="83C6C206">
       <w:numFmt w:val="decimal"/>
       <w:lvlText w:val=""/>
       <w:lvlJc w:val="left"/>
     </w:lvl>
-    <w:lvl w:ilvl="8" w:tplc="9CB8DF4C">
+    <w:lvl w:ilvl="8" w:tplc="1954036C">
       <w:numFmt w:val="decimal"/>
       <w:lvlText w:val=""/>
       <w:lvlJc w:val="left"/>
     </w:lvl>
   </w:abstractNum>
   <w:abstractNum w:abstractNumId="4" w15:restartNumberingAfterBreak="0">
-    <w:nsid w:val="634E61BD"/>
+    <w:nsid w:val="677409E7"/>
     <w:multiLevelType w:val="hybridMultilevel"/>
-    <w:tmpl w:val="A290D75A"/>
-    <w:lvl w:ilvl="0" w:tplc="5338E790">
+    <w:tmpl w:val="04301BCC"/>
+    <w:lvl w:ilvl="0" w:tplc="DB9453CA">
       <w:start w:val="1"/>
       <w:numFmt w:val="bullet"/>
       <w:lvlText w:val="●"/>
@@ -13957,7 +14860,7 @@
         <w:szCs w:val="14"/>
       </w:rPr>
     </w:lvl>
-    <w:lvl w:ilvl="1" w:tplc="386A99A2">
+    <w:lvl w:ilvl="1" w:tplc="C5F4A3D8">
       <w:start w:val="1"/>
       <w:numFmt w:val="bullet"/>
       <w:lvlText w:val="○"/>
@@ -13966,47 +14869,47 @@
         <w:ind w:left="900" w:hanging="300"/>
       </w:pPr>
     </w:lvl>
-    <w:lvl w:ilvl="2" w:tplc="51545EE2">
+    <w:lvl w:ilvl="2" w:tplc="0F3E30A0">
       <w:numFmt w:val="decimal"/>
       <w:lvlText w:val=""/>
       <w:lvlJc w:val="left"/>
     </w:lvl>
-    <w:lvl w:ilvl="3" w:tplc="6A3025D0">
+    <w:lvl w:ilvl="3" w:tplc="C060DADC">
       <w:numFmt w:val="decimal"/>
       <w:lvlText w:val=""/>
       <w:lvlJc w:val="left"/>
     </w:lvl>
-    <w:lvl w:ilvl="4" w:tplc="24A6613C">
+    <w:lvl w:ilvl="4" w:tplc="E3FE1188">
       <w:numFmt w:val="decimal"/>
       <w:lvlText w:val=""/>
       <w:lvlJc w:val="left"/>
     </w:lvl>
-    <w:lvl w:ilvl="5" w:tplc="9052FF82">
+    <w:lvl w:ilvl="5" w:tplc="E7925A94">
       <w:numFmt w:val="decimal"/>
       <w:lvlText w:val=""/>
       <w:lvlJc w:val="left"/>
     </w:lvl>
-    <w:lvl w:ilvl="6" w:tplc="EAF204D0">
+    <w:lvl w:ilvl="6" w:tplc="4462F3CC">
       <w:numFmt w:val="decimal"/>
       <w:lvlText w:val=""/>
       <w:lvlJc w:val="left"/>
     </w:lvl>
-    <w:lvl w:ilvl="7" w:tplc="E4CE3CE8">
+    <w:lvl w:ilvl="7" w:tplc="5CB06710">
       <w:numFmt w:val="decimal"/>
       <w:lvlText w:val=""/>
       <w:lvlJc w:val="left"/>
     </w:lvl>
-    <w:lvl w:ilvl="8" w:tplc="D92C0F12">
+    <w:lvl w:ilvl="8" w:tplc="71EE1C5C">
       <w:numFmt w:val="decimal"/>
       <w:lvlText w:val=""/>
       <w:lvlJc w:val="left"/>
     </w:lvl>
   </w:abstractNum>
   <w:abstractNum w:abstractNumId="5" w15:restartNumberingAfterBreak="0">
-    <w:nsid w:val="687B05A3"/>
+    <w:nsid w:val="7FB2259B"/>
     <w:multiLevelType w:val="hybridMultilevel"/>
-    <w:tmpl w:val="CDE45292"/>
-    <w:lvl w:ilvl="0" w:tplc="04B0397C">
+    <w:tmpl w:val="BBB6AA88"/>
+    <w:lvl w:ilvl="0" w:tplc="98EE5964">
       <w:start w:val="1"/>
       <w:numFmt w:val="decimal"/>
       <w:lvlText w:val="%1."/>
@@ -14015,79 +14918,79 @@
         <w:ind w:left="480" w:hanging="360"/>
       </w:pPr>
     </w:lvl>
-    <w:lvl w:ilvl="1" w:tplc="CE261ED8">
+    <w:lvl w:ilvl="1" w:tplc="C2D84F2C">
       <w:numFmt w:val="decimal"/>
       <w:lvlText w:val=""/>
       <w:lvlJc w:val="left"/>
     </w:lvl>
-    <w:lvl w:ilvl="2" w:tplc="AF1AFDA6">
+    <w:lvl w:ilvl="2" w:tplc="CB2025C2">
       <w:numFmt w:val="decimal"/>
       <w:lvlText w:val=""/>
       <w:lvlJc w:val="left"/>
     </w:lvl>
-    <w:lvl w:ilvl="3" w:tplc="7B5E2AF2">
+    <w:lvl w:ilvl="3" w:tplc="F970BEF4">
       <w:numFmt w:val="decimal"/>
       <w:lvlText w:val=""/>
       <w:lvlJc w:val="left"/>
     </w:lvl>
-    <w:lvl w:ilvl="4" w:tplc="D2DCBCE0">
+    <w:lvl w:ilvl="4" w:tplc="23E8FC4E">
       <w:numFmt w:val="decimal"/>
       <w:lvlText w:val=""/>
       <w:lvlJc w:val="left"/>
     </w:lvl>
-    <w:lvl w:ilvl="5" w:tplc="56E2840C">
+    <w:lvl w:ilvl="5" w:tplc="BEF8C3DE">
       <w:numFmt w:val="decimal"/>
       <w:lvlText w:val=""/>
       <w:lvlJc w:val="left"/>
     </w:lvl>
-    <w:lvl w:ilvl="6" w:tplc="41909364">
+    <w:lvl w:ilvl="6" w:tplc="BD98E014">
       <w:numFmt w:val="decimal"/>
       <w:lvlText w:val=""/>
       <w:lvlJc w:val="left"/>
     </w:lvl>
-    <w:lvl w:ilvl="7" w:tplc="D36420E0">
+    <w:lvl w:ilvl="7" w:tplc="0C36DC0A">
       <w:numFmt w:val="decimal"/>
       <w:lvlText w:val=""/>
       <w:lvlJc w:val="left"/>
     </w:lvl>
-    <w:lvl w:ilvl="8" w:tplc="9ED01F2E">
+    <w:lvl w:ilvl="8" w:tplc="02D4F1EE">
       <w:numFmt w:val="decimal"/>
       <w:lvlText w:val=""/>
       <w:lvlJc w:val="left"/>
     </w:lvl>
   </w:abstractNum>
-  <w:num w:numId="1" w16cid:durableId="1071974499">
+  <w:num w:numId="1" w16cid:durableId="1067455134">
+    <w:abstractNumId w:val="2"/>
+    <w:lvlOverride w:ilvl="0">
+      <w:startOverride w:val="1"/>
+    </w:lvlOverride>
+  </w:num>
+  <w:num w:numId="2" w16cid:durableId="743995134">
+    <w:abstractNumId w:val="4"/>
+    <w:lvlOverride w:ilvl="0">
+      <w:startOverride w:val="1"/>
+    </w:lvlOverride>
+  </w:num>
+  <w:num w:numId="3" w16cid:durableId="1605917627">
+    <w:abstractNumId w:val="3"/>
+    <w:lvlOverride w:ilvl="0">
+      <w:startOverride w:val="1"/>
+    </w:lvlOverride>
+  </w:num>
+  <w:num w:numId="4" w16cid:durableId="398407647">
     <w:abstractNumId w:val="1"/>
     <w:lvlOverride w:ilvl="0">
       <w:startOverride w:val="1"/>
     </w:lvlOverride>
   </w:num>
-  <w:num w:numId="2" w16cid:durableId="780297206">
-    <w:abstractNumId w:val="4"/>
+  <w:num w:numId="5" w16cid:durableId="1063873965">
+    <w:abstractNumId w:val="5"/>
     <w:lvlOverride w:ilvl="0">
       <w:startOverride w:val="1"/>
     </w:lvlOverride>
   </w:num>
-  <w:num w:numId="3" w16cid:durableId="1720667671">
-    <w:abstractNumId w:val="2"/>
-    <w:lvlOverride w:ilvl="0">
-      <w:startOverride w:val="1"/>
-    </w:lvlOverride>
-  </w:num>
-  <w:num w:numId="4" w16cid:durableId="44916120">
+  <w:num w:numId="6" w16cid:durableId="1568884216">
     <w:abstractNumId w:val="0"/>
-    <w:lvlOverride w:ilvl="0">
-      <w:startOverride w:val="1"/>
-    </w:lvlOverride>
-  </w:num>
-  <w:num w:numId="5" w16cid:durableId="1414353510">
-    <w:abstractNumId w:val="3"/>
-    <w:lvlOverride w:ilvl="0">
-      <w:startOverride w:val="1"/>
-    </w:lvlOverride>
-  </w:num>
-  <w:num w:numId="6" w16cid:durableId="296643426">
-    <w:abstractNumId w:val="5"/>
     <w:lvlOverride w:ilvl="0">
       <w:startOverride w:val="1"/>
     </w:lvlOverride>
@@ -14680,7 +15583,7 @@
     <w:name w:val="toc 1"/>
     <w:uiPriority w:val="39"/>
     <w:pPr>
-      <w:spacing w:before="40" w:line="228" w:lineRule="auto"/>
+      <w:spacing w:before="20" w:line="216" w:lineRule="auto"/>
     </w:pPr>
     <w:rPr>
       <w:b/>
@@ -14693,12 +15596,12 @@
     <w:name w:val="toc 2"/>
     <w:uiPriority w:val="39"/>
     <w:pPr>
-      <w:spacing w:line="216" w:lineRule="auto"/>
+      <w:spacing w:line="204" w:lineRule="auto"/>
       <w:ind w:left="360"/>
     </w:pPr>
     <w:rPr>
-      <w:sz w:val="19"/>
-      <w:szCs w:val="19"/>
+      <w:sz w:val="18"/>
+      <w:szCs w:val="18"/>
     </w:rPr>
   </w:style>
   <w:style w:type="paragraph" w:styleId="a9">
@@ -14707,7 +15610,7 @@
     <w:link w:val="aa"/>
     <w:uiPriority w:val="99"/>
     <w:unhideWhenUsed/>
-    <w:rsid w:val="00226CE1"/>
+    <w:rsid w:val="00DA4677"/>
     <w:pPr>
       <w:tabs>
         <w:tab w:val="center" w:pos="4252"/>
@@ -14721,7 +15624,7 @@
     <w:basedOn w:val="a0"/>
     <w:link w:val="a9"/>
     <w:uiPriority w:val="99"/>
-    <w:rsid w:val="00226CE1"/>
+    <w:rsid w:val="00DA4677"/>
   </w:style>
   <w:style w:type="paragraph" w:styleId="ab">
     <w:name w:val="footer"/>
@@ -14729,7 +15632,7 @@
     <w:link w:val="ac"/>
     <w:uiPriority w:val="99"/>
     <w:unhideWhenUsed/>
-    <w:rsid w:val="00226CE1"/>
+    <w:rsid w:val="00DA4677"/>
     <w:pPr>
       <w:tabs>
         <w:tab w:val="center" w:pos="4252"/>
@@ -14743,7 +15646,7 @@
     <w:basedOn w:val="a0"/>
     <w:link w:val="ab"/>
     <w:uiPriority w:val="99"/>
-    <w:rsid w:val="00226CE1"/>
+    <w:rsid w:val="00DA4677"/>
   </w:style>
 </w:styles>
 </file>

</xml_diff>

<commit_message>
Manuals and README: screenshots without the YAESU label
- FT-817 window screenshots now show the window without the logo
- Settings screenshot: maker field masked like host name and user ID
- FT-817 manual cover: target version 2.30

Co-Authored-By: Claude Opus 5.5 <noreply@anthropic.com>
</commit_message>
<xml_diff>
--- a/docs/FT-817_操作説明書.docx
+++ b/docs/FT-817_操作説明書.docx
@@ -63,7 +63,7 @@
           <w:noProof/>
         </w:rPr>
         <w:drawing>
-          <wp:inline distT="0" distB="0" distL="0" distR="0" wp14:anchorId="1CBCC641" wp14:editId="110E7B44">
+          <wp:inline distT="0" distB="0" distL="0" distR="0" wp14:anchorId="772A48B6" wp14:editId="2C346781">
             <wp:extent cx="5334000" cy="2714625"/>
             <wp:effectExtent l="0" t="0" r="0" b="0"/>
             <wp:docPr id="1" name="図 1"/>
@@ -119,7 +119,7 @@
           <w:sz w:val="22"/>
           <w:szCs w:val="22"/>
         </w:rPr>
-        <w:t>: wfview-win 2.29</w:t>
+        <w:t>: wfview-win 2.30</w:t>
       </w:r>
       <w:r>
         <w:rPr>
@@ -215,7 +215,7 @@
     <w:sdt>
       <w:sdtPr>
         <w:alias w:val="目次"/>
-        <w:id w:val="-75817938"/>
+        <w:id w:val="-854344097"/>
       </w:sdtPr>
       <w:sdtEndPr>
         <w:rPr>
@@ -252,7 +252,7 @@
           <w:r>
             <w:fldChar w:fldCharType="separate"/>
           </w:r>
-          <w:hyperlink w:anchor="_Toc243497785" w:history="1">
+          <w:hyperlink w:anchor="_Toc243507511" w:history="1">
             <w:r>
               <w:rPr>
                 <w:rStyle w:val="a5"/>
@@ -276,7 +276,7 @@
               <w:rPr>
                 <w:noProof/>
               </w:rPr>
-              <w:instrText xml:space="preserve"> PAGEREF _Toc243497785 \h </w:instrText>
+              <w:instrText xml:space="preserve"> PAGEREF _Toc243507511 \h </w:instrText>
             </w:r>
             <w:r>
               <w:rPr>
@@ -318,7 +318,7 @@
               <w14:ligatures w14:val="standardContextual"/>
             </w:rPr>
           </w:pPr>
-          <w:hyperlink w:anchor="_Toc243497786" w:history="1">
+          <w:hyperlink w:anchor="_Toc243507512" w:history="1">
             <w:r>
               <w:rPr>
                 <w:rStyle w:val="a5"/>
@@ -342,7 +342,7 @@
               <w:rPr>
                 <w:noProof/>
               </w:rPr>
-              <w:instrText xml:space="preserve"> PAGEREF _Toc243497786 \h </w:instrText>
+              <w:instrText xml:space="preserve"> PAGEREF _Toc243507512 \h </w:instrText>
             </w:r>
             <w:r>
               <w:rPr>
@@ -384,7 +384,7 @@
               <w14:ligatures w14:val="standardContextual"/>
             </w:rPr>
           </w:pPr>
-          <w:hyperlink w:anchor="_Toc243497787" w:history="1">
+          <w:hyperlink w:anchor="_Toc243507513" w:history="1">
             <w:r>
               <w:rPr>
                 <w:rStyle w:val="a5"/>
@@ -408,7 +408,7 @@
               <w:rPr>
                 <w:noProof/>
               </w:rPr>
-              <w:instrText xml:space="preserve"> PAGEREF _Toc243497787 \h </w:instrText>
+              <w:instrText xml:space="preserve"> PAGEREF _Toc243507513 \h </w:instrText>
             </w:r>
             <w:r>
               <w:rPr>
@@ -452,7 +452,7 @@
               <w14:ligatures w14:val="standardContextual"/>
             </w:rPr>
           </w:pPr>
-          <w:hyperlink w:anchor="_Toc243497788" w:history="1">
+          <w:hyperlink w:anchor="_Toc243507514" w:history="1">
             <w:r>
               <w:rPr>
                 <w:rStyle w:val="a5"/>
@@ -476,7 +476,7 @@
               <w:rPr>
                 <w:noProof/>
               </w:rPr>
-              <w:instrText xml:space="preserve"> PAGEREF _Toc243497788 \h </w:instrText>
+              <w:instrText xml:space="preserve"> PAGEREF _Toc243507514 \h </w:instrText>
             </w:r>
             <w:r>
               <w:rPr>
@@ -518,7 +518,7 @@
               <w14:ligatures w14:val="standardContextual"/>
             </w:rPr>
           </w:pPr>
-          <w:hyperlink w:anchor="_Toc243497789" w:history="1">
+          <w:hyperlink w:anchor="_Toc243507515" w:history="1">
             <w:r>
               <w:rPr>
                 <w:rStyle w:val="a5"/>
@@ -542,7 +542,7 @@
               <w:rPr>
                 <w:noProof/>
               </w:rPr>
-              <w:instrText xml:space="preserve"> PAGEREF _Toc243497789 \h </w:instrText>
+              <w:instrText xml:space="preserve"> PAGEREF _Toc243507515 \h </w:instrText>
             </w:r>
             <w:r>
               <w:rPr>
@@ -584,7 +584,7 @@
               <w14:ligatures w14:val="standardContextual"/>
             </w:rPr>
           </w:pPr>
-          <w:hyperlink w:anchor="_Toc243497790" w:history="1">
+          <w:hyperlink w:anchor="_Toc243507516" w:history="1">
             <w:r>
               <w:rPr>
                 <w:rStyle w:val="a5"/>
@@ -608,7 +608,7 @@
               <w:rPr>
                 <w:noProof/>
               </w:rPr>
-              <w:instrText xml:space="preserve"> PAGEREF _Toc243497790 \h </w:instrText>
+              <w:instrText xml:space="preserve"> PAGEREF _Toc243507516 \h </w:instrText>
             </w:r>
             <w:r>
               <w:rPr>
@@ -650,7 +650,7 @@
               <w14:ligatures w14:val="standardContextual"/>
             </w:rPr>
           </w:pPr>
-          <w:hyperlink w:anchor="_Toc243497791" w:history="1">
+          <w:hyperlink w:anchor="_Toc243507517" w:history="1">
             <w:r>
               <w:rPr>
                 <w:rStyle w:val="a5"/>
@@ -674,7 +674,7 @@
               <w:rPr>
                 <w:noProof/>
               </w:rPr>
-              <w:instrText xml:space="preserve"> PAGEREF _Toc243497791 \h </w:instrText>
+              <w:instrText xml:space="preserve"> PAGEREF _Toc243507517 \h </w:instrText>
             </w:r>
             <w:r>
               <w:rPr>
@@ -716,7 +716,7 @@
               <w14:ligatures w14:val="standardContextual"/>
             </w:rPr>
           </w:pPr>
-          <w:hyperlink w:anchor="_Toc243497792" w:history="1">
+          <w:hyperlink w:anchor="_Toc243507518" w:history="1">
             <w:r>
               <w:rPr>
                 <w:rStyle w:val="a5"/>
@@ -740,7 +740,7 @@
               <w:rPr>
                 <w:noProof/>
               </w:rPr>
-              <w:instrText xml:space="preserve"> PAGEREF _Toc243497792 \h </w:instrText>
+              <w:instrText xml:space="preserve"> PAGEREF _Toc243507518 \h </w:instrText>
             </w:r>
             <w:r>
               <w:rPr>
@@ -784,7 +784,7 @@
               <w14:ligatures w14:val="standardContextual"/>
             </w:rPr>
           </w:pPr>
-          <w:hyperlink w:anchor="_Toc243497793" w:history="1">
+          <w:hyperlink w:anchor="_Toc243507519" w:history="1">
             <w:r>
               <w:rPr>
                 <w:rStyle w:val="a5"/>
@@ -808,7 +808,7 @@
               <w:rPr>
                 <w:noProof/>
               </w:rPr>
-              <w:instrText xml:space="preserve"> PAGEREF _Toc243497793 \h </w:instrText>
+              <w:instrText xml:space="preserve"> PAGEREF _Toc243507519 \h </w:instrText>
             </w:r>
             <w:r>
               <w:rPr>
@@ -852,7 +852,7 @@
               <w14:ligatures w14:val="standardContextual"/>
             </w:rPr>
           </w:pPr>
-          <w:hyperlink w:anchor="_Toc243497794" w:history="1">
+          <w:hyperlink w:anchor="_Toc243507520" w:history="1">
             <w:r>
               <w:rPr>
                 <w:rStyle w:val="a5"/>
@@ -876,7 +876,7 @@
               <w:rPr>
                 <w:noProof/>
               </w:rPr>
-              <w:instrText xml:space="preserve"> PAGEREF _Toc243497794 \h </w:instrText>
+              <w:instrText xml:space="preserve"> PAGEREF _Toc243507520 \h </w:instrText>
             </w:r>
             <w:r>
               <w:rPr>
@@ -918,7 +918,7 @@
               <w14:ligatures w14:val="standardContextual"/>
             </w:rPr>
           </w:pPr>
-          <w:hyperlink w:anchor="_Toc243497795" w:history="1">
+          <w:hyperlink w:anchor="_Toc243507521" w:history="1">
             <w:r>
               <w:rPr>
                 <w:rStyle w:val="a5"/>
@@ -942,7 +942,7 @@
               <w:rPr>
                 <w:noProof/>
               </w:rPr>
-              <w:instrText xml:space="preserve"> PAGEREF _Toc243497795 \h </w:instrText>
+              <w:instrText xml:space="preserve"> PAGEREF _Toc243507521 \h </w:instrText>
             </w:r>
             <w:r>
               <w:rPr>
@@ -984,7 +984,7 @@
               <w14:ligatures w14:val="standardContextual"/>
             </w:rPr>
           </w:pPr>
-          <w:hyperlink w:anchor="_Toc243497796" w:history="1">
+          <w:hyperlink w:anchor="_Toc243507522" w:history="1">
             <w:r>
               <w:rPr>
                 <w:rStyle w:val="a5"/>
@@ -1008,7 +1008,7 @@
               <w:rPr>
                 <w:noProof/>
               </w:rPr>
-              <w:instrText xml:space="preserve"> PAGEREF _Toc243497796 \h </w:instrText>
+              <w:instrText xml:space="preserve"> PAGEREF _Toc243507522 \h </w:instrText>
             </w:r>
             <w:r>
               <w:rPr>
@@ -1050,7 +1050,7 @@
               <w14:ligatures w14:val="standardContextual"/>
             </w:rPr>
           </w:pPr>
-          <w:hyperlink w:anchor="_Toc243497797" w:history="1">
+          <w:hyperlink w:anchor="_Toc243507523" w:history="1">
             <w:r>
               <w:rPr>
                 <w:rStyle w:val="a5"/>
@@ -1074,7 +1074,7 @@
               <w:rPr>
                 <w:noProof/>
               </w:rPr>
-              <w:instrText xml:space="preserve"> PAGEREF _Toc243497797 \h </w:instrText>
+              <w:instrText xml:space="preserve"> PAGEREF _Toc243507523 \h </w:instrText>
             </w:r>
             <w:r>
               <w:rPr>
@@ -1116,7 +1116,7 @@
               <w14:ligatures w14:val="standardContextual"/>
             </w:rPr>
           </w:pPr>
-          <w:hyperlink w:anchor="_Toc243497798" w:history="1">
+          <w:hyperlink w:anchor="_Toc243507524" w:history="1">
             <w:r>
               <w:rPr>
                 <w:rStyle w:val="a5"/>
@@ -1140,7 +1140,7 @@
               <w:rPr>
                 <w:noProof/>
               </w:rPr>
-              <w:instrText xml:space="preserve"> PAGEREF _Toc243497798 \h </w:instrText>
+              <w:instrText xml:space="preserve"> PAGEREF _Toc243507524 \h </w:instrText>
             </w:r>
             <w:r>
               <w:rPr>
@@ -1182,7 +1182,7 @@
               <w14:ligatures w14:val="standardContextual"/>
             </w:rPr>
           </w:pPr>
-          <w:hyperlink w:anchor="_Toc243497799" w:history="1">
+          <w:hyperlink w:anchor="_Toc243507525" w:history="1">
             <w:r>
               <w:rPr>
                 <w:rStyle w:val="a5"/>
@@ -1206,7 +1206,7 @@
               <w:rPr>
                 <w:noProof/>
               </w:rPr>
-              <w:instrText xml:space="preserve"> PAGEREF _Toc243497799 \h </w:instrText>
+              <w:instrText xml:space="preserve"> PAGEREF _Toc243507525 \h </w:instrText>
             </w:r>
             <w:r>
               <w:rPr>
@@ -1250,7 +1250,7 @@
               <w14:ligatures w14:val="standardContextual"/>
             </w:rPr>
           </w:pPr>
-          <w:hyperlink w:anchor="_Toc243497800" w:history="1">
+          <w:hyperlink w:anchor="_Toc243507526" w:history="1">
             <w:r>
               <w:rPr>
                 <w:rStyle w:val="a5"/>
@@ -1274,7 +1274,7 @@
               <w:rPr>
                 <w:noProof/>
               </w:rPr>
-              <w:instrText xml:space="preserve"> PAGEREF _Toc243497800 \h </w:instrText>
+              <w:instrText xml:space="preserve"> PAGEREF _Toc243507526 \h </w:instrText>
             </w:r>
             <w:r>
               <w:rPr>
@@ -1318,7 +1318,7 @@
               <w14:ligatures w14:val="standardContextual"/>
             </w:rPr>
           </w:pPr>
-          <w:hyperlink w:anchor="_Toc243497801" w:history="1">
+          <w:hyperlink w:anchor="_Toc243507527" w:history="1">
             <w:r>
               <w:rPr>
                 <w:rStyle w:val="a5"/>
@@ -1342,7 +1342,7 @@
               <w:rPr>
                 <w:noProof/>
               </w:rPr>
-              <w:instrText xml:space="preserve"> PAGEREF _Toc243497801 \h </w:instrText>
+              <w:instrText xml:space="preserve"> PAGEREF _Toc243507527 \h </w:instrText>
             </w:r>
             <w:r>
               <w:rPr>
@@ -1384,7 +1384,7 @@
               <w14:ligatures w14:val="standardContextual"/>
             </w:rPr>
           </w:pPr>
-          <w:hyperlink w:anchor="_Toc243497802" w:history="1">
+          <w:hyperlink w:anchor="_Toc243507528" w:history="1">
             <w:r>
               <w:rPr>
                 <w:rStyle w:val="a5"/>
@@ -1408,7 +1408,7 @@
               <w:rPr>
                 <w:noProof/>
               </w:rPr>
-              <w:instrText xml:space="preserve"> PAGEREF _Toc243497802 \h </w:instrText>
+              <w:instrText xml:space="preserve"> PAGEREF _Toc243507528 \h </w:instrText>
             </w:r>
             <w:r>
               <w:rPr>
@@ -1450,7 +1450,7 @@
               <w14:ligatures w14:val="standardContextual"/>
             </w:rPr>
           </w:pPr>
-          <w:hyperlink w:anchor="_Toc243497803" w:history="1">
+          <w:hyperlink w:anchor="_Toc243507529" w:history="1">
             <w:r>
               <w:rPr>
                 <w:rStyle w:val="a5"/>
@@ -1474,7 +1474,7 @@
               <w:rPr>
                 <w:noProof/>
               </w:rPr>
-              <w:instrText xml:space="preserve"> PAGEREF _Toc243497803 \h </w:instrText>
+              <w:instrText xml:space="preserve"> PAGEREF _Toc243507529 \h </w:instrText>
             </w:r>
             <w:r>
               <w:rPr>
@@ -1516,7 +1516,7 @@
               <w14:ligatures w14:val="standardContextual"/>
             </w:rPr>
           </w:pPr>
-          <w:hyperlink w:anchor="_Toc243497804" w:history="1">
+          <w:hyperlink w:anchor="_Toc243507530" w:history="1">
             <w:r>
               <w:rPr>
                 <w:rStyle w:val="a5"/>
@@ -1540,7 +1540,7 @@
               <w:rPr>
                 <w:noProof/>
               </w:rPr>
-              <w:instrText xml:space="preserve"> PAGEREF _Toc243497804 \h </w:instrText>
+              <w:instrText xml:space="preserve"> PAGEREF _Toc243507530 \h </w:instrText>
             </w:r>
             <w:r>
               <w:rPr>
@@ -1582,7 +1582,7 @@
               <w14:ligatures w14:val="standardContextual"/>
             </w:rPr>
           </w:pPr>
-          <w:hyperlink w:anchor="_Toc243497805" w:history="1">
+          <w:hyperlink w:anchor="_Toc243507531" w:history="1">
             <w:r>
               <w:rPr>
                 <w:rStyle w:val="a5"/>
@@ -1606,7 +1606,7 @@
               <w:rPr>
                 <w:noProof/>
               </w:rPr>
-              <w:instrText xml:space="preserve"> PAGEREF _Toc243497805 \h </w:instrText>
+              <w:instrText xml:space="preserve"> PAGEREF _Toc243507531 \h </w:instrText>
             </w:r>
             <w:r>
               <w:rPr>
@@ -1648,7 +1648,7 @@
               <w14:ligatures w14:val="standardContextual"/>
             </w:rPr>
           </w:pPr>
-          <w:hyperlink w:anchor="_Toc243497806" w:history="1">
+          <w:hyperlink w:anchor="_Toc243507532" w:history="1">
             <w:r>
               <w:rPr>
                 <w:rStyle w:val="a5"/>
@@ -1672,7 +1672,7 @@
               <w:rPr>
                 <w:noProof/>
               </w:rPr>
-              <w:instrText xml:space="preserve"> PAGEREF _Toc243497806 \h </w:instrText>
+              <w:instrText xml:space="preserve"> PAGEREF _Toc243507532 \h </w:instrText>
             </w:r>
             <w:r>
               <w:rPr>
@@ -1714,7 +1714,7 @@
               <w14:ligatures w14:val="standardContextual"/>
             </w:rPr>
           </w:pPr>
-          <w:hyperlink w:anchor="_Toc243497807" w:history="1">
+          <w:hyperlink w:anchor="_Toc243507533" w:history="1">
             <w:r>
               <w:rPr>
                 <w:rStyle w:val="a5"/>
@@ -1738,7 +1738,7 @@
               <w:rPr>
                 <w:noProof/>
               </w:rPr>
-              <w:instrText xml:space="preserve"> PAGEREF _Toc243497807 \h </w:instrText>
+              <w:instrText xml:space="preserve"> PAGEREF _Toc243507533 \h </w:instrText>
             </w:r>
             <w:r>
               <w:rPr>
@@ -1780,7 +1780,7 @@
               <w14:ligatures w14:val="standardContextual"/>
             </w:rPr>
           </w:pPr>
-          <w:hyperlink w:anchor="_Toc243497808" w:history="1">
+          <w:hyperlink w:anchor="_Toc243507534" w:history="1">
             <w:r>
               <w:rPr>
                 <w:rStyle w:val="a5"/>
@@ -1804,7 +1804,7 @@
               <w:rPr>
                 <w:noProof/>
               </w:rPr>
-              <w:instrText xml:space="preserve"> PAGEREF _Toc243497808 \h </w:instrText>
+              <w:instrText xml:space="preserve"> PAGEREF _Toc243507534 \h </w:instrText>
             </w:r>
             <w:r>
               <w:rPr>
@@ -1846,7 +1846,7 @@
               <w14:ligatures w14:val="standardContextual"/>
             </w:rPr>
           </w:pPr>
-          <w:hyperlink w:anchor="_Toc243497809" w:history="1">
+          <w:hyperlink w:anchor="_Toc243507535" w:history="1">
             <w:r>
               <w:rPr>
                 <w:rStyle w:val="a5"/>
@@ -1870,7 +1870,7 @@
               <w:rPr>
                 <w:noProof/>
               </w:rPr>
-              <w:instrText xml:space="preserve"> PAGEREF _Toc243497809 \h </w:instrText>
+              <w:instrText xml:space="preserve"> PAGEREF _Toc243507535 \h </w:instrText>
             </w:r>
             <w:r>
               <w:rPr>
@@ -1914,7 +1914,7 @@
               <w14:ligatures w14:val="standardContextual"/>
             </w:rPr>
           </w:pPr>
-          <w:hyperlink w:anchor="_Toc243497810" w:history="1">
+          <w:hyperlink w:anchor="_Toc243507536" w:history="1">
             <w:r>
               <w:rPr>
                 <w:rStyle w:val="a5"/>
@@ -1938,7 +1938,7 @@
               <w:rPr>
                 <w:noProof/>
               </w:rPr>
-              <w:instrText xml:space="preserve"> PAGEREF _Toc243497810 \h </w:instrText>
+              <w:instrText xml:space="preserve"> PAGEREF _Toc243507536 \h </w:instrText>
             </w:r>
             <w:r>
               <w:rPr>
@@ -1980,7 +1980,7 @@
               <w14:ligatures w14:val="standardContextual"/>
             </w:rPr>
           </w:pPr>
-          <w:hyperlink w:anchor="_Toc243497811" w:history="1">
+          <w:hyperlink w:anchor="_Toc243507537" w:history="1">
             <w:r>
               <w:rPr>
                 <w:rStyle w:val="a5"/>
@@ -2004,7 +2004,7 @@
               <w:rPr>
                 <w:noProof/>
               </w:rPr>
-              <w:instrText xml:space="preserve"> PAGEREF _Toc243497811 \h </w:instrText>
+              <w:instrText xml:space="preserve"> PAGEREF _Toc243507537 \h </w:instrText>
             </w:r>
             <w:r>
               <w:rPr>
@@ -2046,7 +2046,7 @@
               <w14:ligatures w14:val="standardContextual"/>
             </w:rPr>
           </w:pPr>
-          <w:hyperlink w:anchor="_Toc243497812" w:history="1">
+          <w:hyperlink w:anchor="_Toc243507538" w:history="1">
             <w:r>
               <w:rPr>
                 <w:rStyle w:val="a5"/>
@@ -2070,7 +2070,7 @@
               <w:rPr>
                 <w:noProof/>
               </w:rPr>
-              <w:instrText xml:space="preserve"> PAGEREF _Toc243497812 \h </w:instrText>
+              <w:instrText xml:space="preserve"> PAGEREF _Toc243507538 \h </w:instrText>
             </w:r>
             <w:r>
               <w:rPr>
@@ -2112,7 +2112,7 @@
               <w14:ligatures w14:val="standardContextual"/>
             </w:rPr>
           </w:pPr>
-          <w:hyperlink w:anchor="_Toc243497813" w:history="1">
+          <w:hyperlink w:anchor="_Toc243507539" w:history="1">
             <w:r>
               <w:rPr>
                 <w:rStyle w:val="a5"/>
@@ -2136,7 +2136,7 @@
               <w:rPr>
                 <w:noProof/>
               </w:rPr>
-              <w:instrText xml:space="preserve"> PAGEREF _Toc243497813 \h </w:instrText>
+              <w:instrText xml:space="preserve"> PAGEREF _Toc243507539 \h </w:instrText>
             </w:r>
             <w:r>
               <w:rPr>
@@ -2178,7 +2178,7 @@
               <w14:ligatures w14:val="standardContextual"/>
             </w:rPr>
           </w:pPr>
-          <w:hyperlink w:anchor="_Toc243497814" w:history="1">
+          <w:hyperlink w:anchor="_Toc243507540" w:history="1">
             <w:r>
               <w:rPr>
                 <w:rStyle w:val="a5"/>
@@ -2202,7 +2202,7 @@
               <w:rPr>
                 <w:noProof/>
               </w:rPr>
-              <w:instrText xml:space="preserve"> PAGEREF _Toc243497814 \h </w:instrText>
+              <w:instrText xml:space="preserve"> PAGEREF _Toc243507540 \h </w:instrText>
             </w:r>
             <w:r>
               <w:rPr>
@@ -2244,7 +2244,7 @@
               <w14:ligatures w14:val="standardContextual"/>
             </w:rPr>
           </w:pPr>
-          <w:hyperlink w:anchor="_Toc243497815" w:history="1">
+          <w:hyperlink w:anchor="_Toc243507541" w:history="1">
             <w:r>
               <w:rPr>
                 <w:rStyle w:val="a5"/>
@@ -2268,7 +2268,7 @@
               <w:rPr>
                 <w:noProof/>
               </w:rPr>
-              <w:instrText xml:space="preserve"> PAGEREF _Toc243497815 \h </w:instrText>
+              <w:instrText xml:space="preserve"> PAGEREF _Toc243507541 \h </w:instrText>
             </w:r>
             <w:r>
               <w:rPr>
@@ -2312,7 +2312,7 @@
               <w14:ligatures w14:val="standardContextual"/>
             </w:rPr>
           </w:pPr>
-          <w:hyperlink w:anchor="_Toc243497816" w:history="1">
+          <w:hyperlink w:anchor="_Toc243507542" w:history="1">
             <w:r>
               <w:rPr>
                 <w:rStyle w:val="a5"/>
@@ -2336,7 +2336,7 @@
               <w:rPr>
                 <w:noProof/>
               </w:rPr>
-              <w:instrText xml:space="preserve"> PAGEREF _Toc243497816 \h </w:instrText>
+              <w:instrText xml:space="preserve"> PAGEREF _Toc243507542 \h </w:instrText>
             </w:r>
             <w:r>
               <w:rPr>
@@ -2378,7 +2378,7 @@
               <w14:ligatures w14:val="standardContextual"/>
             </w:rPr>
           </w:pPr>
-          <w:hyperlink w:anchor="_Toc243497817" w:history="1">
+          <w:hyperlink w:anchor="_Toc243507543" w:history="1">
             <w:r>
               <w:rPr>
                 <w:rStyle w:val="a5"/>
@@ -2402,7 +2402,7 @@
               <w:rPr>
                 <w:noProof/>
               </w:rPr>
-              <w:instrText xml:space="preserve"> PAGEREF _Toc243497817 \h </w:instrText>
+              <w:instrText xml:space="preserve"> PAGEREF _Toc243507543 \h </w:instrText>
             </w:r>
             <w:r>
               <w:rPr>
@@ -2444,7 +2444,7 @@
               <w14:ligatures w14:val="standardContextual"/>
             </w:rPr>
           </w:pPr>
-          <w:hyperlink w:anchor="_Toc243497818" w:history="1">
+          <w:hyperlink w:anchor="_Toc243507544" w:history="1">
             <w:r>
               <w:rPr>
                 <w:rStyle w:val="a5"/>
@@ -2468,7 +2468,7 @@
               <w:rPr>
                 <w:noProof/>
               </w:rPr>
-              <w:instrText xml:space="preserve"> PAGEREF _Toc243497818 \h </w:instrText>
+              <w:instrText xml:space="preserve"> PAGEREF _Toc243507544 \h </w:instrText>
             </w:r>
             <w:r>
               <w:rPr>
@@ -2510,7 +2510,7 @@
               <w14:ligatures w14:val="standardContextual"/>
             </w:rPr>
           </w:pPr>
-          <w:hyperlink w:anchor="_Toc243497819" w:history="1">
+          <w:hyperlink w:anchor="_Toc243507545" w:history="1">
             <w:r>
               <w:rPr>
                 <w:rStyle w:val="a5"/>
@@ -2534,7 +2534,7 @@
               <w:rPr>
                 <w:noProof/>
               </w:rPr>
-              <w:instrText xml:space="preserve"> PAGEREF _Toc243497819 \h </w:instrText>
+              <w:instrText xml:space="preserve"> PAGEREF _Toc243507545 \h </w:instrText>
             </w:r>
             <w:r>
               <w:rPr>
@@ -2578,7 +2578,7 @@
               <w14:ligatures w14:val="standardContextual"/>
             </w:rPr>
           </w:pPr>
-          <w:hyperlink w:anchor="_Toc243497820" w:history="1">
+          <w:hyperlink w:anchor="_Toc243507546" w:history="1">
             <w:r>
               <w:rPr>
                 <w:rStyle w:val="a5"/>
@@ -2602,7 +2602,7 @@
               <w:rPr>
                 <w:noProof/>
               </w:rPr>
-              <w:instrText xml:space="preserve"> PAGEREF _Toc243497820 \h </w:instrText>
+              <w:instrText xml:space="preserve"> PAGEREF _Toc243507546 \h </w:instrText>
             </w:r>
             <w:r>
               <w:rPr>
@@ -2644,7 +2644,7 @@
               <w14:ligatures w14:val="standardContextual"/>
             </w:rPr>
           </w:pPr>
-          <w:hyperlink w:anchor="_Toc243497821" w:history="1">
+          <w:hyperlink w:anchor="_Toc243507547" w:history="1">
             <w:r>
               <w:rPr>
                 <w:rStyle w:val="a5"/>
@@ -2668,7 +2668,7 @@
               <w:rPr>
                 <w:noProof/>
               </w:rPr>
-              <w:instrText xml:space="preserve"> PAGEREF _Toc243497821 \h </w:instrText>
+              <w:instrText xml:space="preserve"> PAGEREF _Toc243507547 \h </w:instrText>
             </w:r>
             <w:r>
               <w:rPr>
@@ -2710,7 +2710,7 @@
               <w14:ligatures w14:val="standardContextual"/>
             </w:rPr>
           </w:pPr>
-          <w:hyperlink w:anchor="_Toc243497822" w:history="1">
+          <w:hyperlink w:anchor="_Toc243507548" w:history="1">
             <w:r>
               <w:rPr>
                 <w:rStyle w:val="a5"/>
@@ -2734,7 +2734,7 @@
               <w:rPr>
                 <w:noProof/>
               </w:rPr>
-              <w:instrText xml:space="preserve"> PAGEREF _Toc243497822 \h </w:instrText>
+              <w:instrText xml:space="preserve"> PAGEREF _Toc243507548 \h </w:instrText>
             </w:r>
             <w:r>
               <w:rPr>
@@ -2776,7 +2776,7 @@
               <w14:ligatures w14:val="standardContextual"/>
             </w:rPr>
           </w:pPr>
-          <w:hyperlink w:anchor="_Toc243497823" w:history="1">
+          <w:hyperlink w:anchor="_Toc243507549" w:history="1">
             <w:r>
               <w:rPr>
                 <w:rStyle w:val="a5"/>
@@ -2800,7 +2800,7 @@
               <w:rPr>
                 <w:noProof/>
               </w:rPr>
-              <w:instrText xml:space="preserve"> PAGEREF _Toc243497823 \h </w:instrText>
+              <w:instrText xml:space="preserve"> PAGEREF _Toc243507549 \h </w:instrText>
             </w:r>
             <w:r>
               <w:rPr>
@@ -2844,7 +2844,7 @@
               <w14:ligatures w14:val="standardContextual"/>
             </w:rPr>
           </w:pPr>
-          <w:hyperlink w:anchor="_Toc243497824" w:history="1">
+          <w:hyperlink w:anchor="_Toc243507550" w:history="1">
             <w:r>
               <w:rPr>
                 <w:rStyle w:val="a5"/>
@@ -2868,7 +2868,7 @@
               <w:rPr>
                 <w:noProof/>
               </w:rPr>
-              <w:instrText xml:space="preserve"> PAGEREF _Toc243497824 \h </w:instrText>
+              <w:instrText xml:space="preserve"> PAGEREF _Toc243507550 \h </w:instrText>
             </w:r>
             <w:r>
               <w:rPr>
@@ -2910,7 +2910,7 @@
               <w14:ligatures w14:val="standardContextual"/>
             </w:rPr>
           </w:pPr>
-          <w:hyperlink w:anchor="_Toc243497825" w:history="1">
+          <w:hyperlink w:anchor="_Toc243507551" w:history="1">
             <w:r>
               <w:rPr>
                 <w:rStyle w:val="a5"/>
@@ -2934,7 +2934,7 @@
               <w:rPr>
                 <w:noProof/>
               </w:rPr>
-              <w:instrText xml:space="preserve"> PAGEREF _Toc243497825 \h </w:instrText>
+              <w:instrText xml:space="preserve"> PAGEREF _Toc243507551 \h </w:instrText>
             </w:r>
             <w:r>
               <w:rPr>
@@ -2976,7 +2976,7 @@
               <w14:ligatures w14:val="standardContextual"/>
             </w:rPr>
           </w:pPr>
-          <w:hyperlink w:anchor="_Toc243497826" w:history="1">
+          <w:hyperlink w:anchor="_Toc243507552" w:history="1">
             <w:r>
               <w:rPr>
                 <w:rStyle w:val="a5"/>
@@ -3000,7 +3000,7 @@
               <w:rPr>
                 <w:noProof/>
               </w:rPr>
-              <w:instrText xml:space="preserve"> PAGEREF _Toc243497826 \h </w:instrText>
+              <w:instrText xml:space="preserve"> PAGEREF _Toc243507552 \h </w:instrText>
             </w:r>
             <w:r>
               <w:rPr>
@@ -3042,7 +3042,7 @@
               <w14:ligatures w14:val="standardContextual"/>
             </w:rPr>
           </w:pPr>
-          <w:hyperlink w:anchor="_Toc243497827" w:history="1">
+          <w:hyperlink w:anchor="_Toc243507553" w:history="1">
             <w:r>
               <w:rPr>
                 <w:rStyle w:val="a5"/>
@@ -3066,7 +3066,7 @@
               <w:rPr>
                 <w:noProof/>
               </w:rPr>
-              <w:instrText xml:space="preserve"> PAGEREF _Toc243497827 \h </w:instrText>
+              <w:instrText xml:space="preserve"> PAGEREF _Toc243507553 \h </w:instrText>
             </w:r>
             <w:r>
               <w:rPr>
@@ -3108,7 +3108,7 @@
               <w14:ligatures w14:val="standardContextual"/>
             </w:rPr>
           </w:pPr>
-          <w:hyperlink w:anchor="_Toc243497828" w:history="1">
+          <w:hyperlink w:anchor="_Toc243507554" w:history="1">
             <w:r>
               <w:rPr>
                 <w:rStyle w:val="a5"/>
@@ -3132,7 +3132,7 @@
               <w:rPr>
                 <w:noProof/>
               </w:rPr>
-              <w:instrText xml:space="preserve"> PAGEREF _Toc243497828 \h </w:instrText>
+              <w:instrText xml:space="preserve"> PAGEREF _Toc243507554 \h </w:instrText>
             </w:r>
             <w:r>
               <w:rPr>
@@ -3171,7 +3171,7 @@
         <w:pStyle w:val="1"/>
         <w:pageBreakBefore/>
       </w:pPr>
-      <w:bookmarkStart w:id="0" w:name="_Toc243497785"/>
+      <w:bookmarkStart w:id="0" w:name="_Toc243507511"/>
       <w:r>
         <w:lastRenderedPageBreak/>
         <w:t xml:space="preserve">1. </w:t>
@@ -3240,7 +3240,7 @@
       <w:pPr>
         <w:pStyle w:val="2"/>
       </w:pPr>
-      <w:bookmarkStart w:id="1" w:name="_Toc243497786"/>
+      <w:bookmarkStart w:id="1" w:name="_Toc243507512"/>
       <w:r>
         <w:t xml:space="preserve">1.1 </w:t>
       </w:r>
@@ -3422,7 +3422,7 @@
       <w:pPr>
         <w:pStyle w:val="2"/>
       </w:pPr>
-      <w:bookmarkStart w:id="2" w:name="_Toc243497787"/>
+      <w:bookmarkStart w:id="2" w:name="_Toc243507513"/>
       <w:r>
         <w:t xml:space="preserve">1.2 </w:t>
       </w:r>
@@ -3546,7 +3546,7 @@
         <w:pStyle w:val="1"/>
         <w:pageBreakBefore/>
       </w:pPr>
-      <w:bookmarkStart w:id="3" w:name="_Toc243497788"/>
+      <w:bookmarkStart w:id="3" w:name="_Toc243507514"/>
       <w:r>
         <w:lastRenderedPageBreak/>
         <w:t xml:space="preserve">2. </w:t>
@@ -3560,7 +3560,7 @@
       <w:pPr>
         <w:pStyle w:val="2"/>
       </w:pPr>
-      <w:bookmarkStart w:id="4" w:name="_Toc243497789"/>
+      <w:bookmarkStart w:id="4" w:name="_Toc243507515"/>
       <w:r>
         <w:t xml:space="preserve">2.1 </w:t>
       </w:r>
@@ -4574,7 +4574,7 @@
       <w:pPr>
         <w:pStyle w:val="2"/>
       </w:pPr>
-      <w:bookmarkStart w:id="5" w:name="_Toc243497790"/>
+      <w:bookmarkStart w:id="5" w:name="_Toc243507516"/>
       <w:r>
         <w:t xml:space="preserve">2.2 </w:t>
       </w:r>
@@ -4697,7 +4697,7 @@
       <w:pPr>
         <w:pStyle w:val="2"/>
       </w:pPr>
-      <w:bookmarkStart w:id="6" w:name="_Toc243497791"/>
+      <w:bookmarkStart w:id="6" w:name="_Toc243507517"/>
       <w:r>
         <w:t xml:space="preserve">2.3 wfview-win </w:t>
       </w:r>
@@ -4894,7 +4894,7 @@
       <w:pPr>
         <w:pStyle w:val="2"/>
       </w:pPr>
-      <w:bookmarkStart w:id="7" w:name="_Toc243497792"/>
+      <w:bookmarkStart w:id="7" w:name="_Toc243507518"/>
       <w:r>
         <w:t xml:space="preserve">2.4 </w:t>
       </w:r>
@@ -5031,7 +5031,7 @@
         <w:pStyle w:val="1"/>
         <w:pageBreakBefore/>
       </w:pPr>
-      <w:bookmarkStart w:id="8" w:name="_Toc243497793"/>
+      <w:bookmarkStart w:id="8" w:name="_Toc243507519"/>
       <w:r>
         <w:lastRenderedPageBreak/>
         <w:t xml:space="preserve">3. </w:t>
@@ -5051,10 +5051,10 @@
           <w:noProof/>
         </w:rPr>
         <w:drawing>
-          <wp:inline distT="0" distB="0" distL="0" distR="0" wp14:anchorId="739B9666" wp14:editId="32E5B7D3">
+          <wp:inline distT="0" distB="0" distL="0" distR="0" wp14:anchorId="71737D3A" wp14:editId="76981134">
             <wp:extent cx="6096000" cy="3105150"/>
             <wp:effectExtent l="0" t="0" r="0" b="0"/>
-            <wp:docPr id="1280643858" name="図 1280643858"/>
+            <wp:docPr id="1922854476" name="図 1922854476"/>
             <wp:cNvGraphicFramePr>
               <a:graphicFrameLocks xmlns:a="http://schemas.openxmlformats.org/drawingml/2006/main" noChangeAspect="1"/>
             </wp:cNvGraphicFramePr>
@@ -6107,7 +6107,7 @@
         <w:pStyle w:val="1"/>
         <w:pageBreakBefore/>
       </w:pPr>
-      <w:bookmarkStart w:id="9" w:name="_Toc243497794"/>
+      <w:bookmarkStart w:id="9" w:name="_Toc243507520"/>
       <w:r>
         <w:lastRenderedPageBreak/>
         <w:t xml:space="preserve">4. </w:t>
@@ -6121,7 +6121,7 @@
       <w:pPr>
         <w:pStyle w:val="2"/>
       </w:pPr>
-      <w:bookmarkStart w:id="10" w:name="_Toc243497795"/>
+      <w:bookmarkStart w:id="10" w:name="_Toc243507521"/>
       <w:r>
         <w:t xml:space="preserve">4.1 </w:t>
       </w:r>
@@ -6304,10 +6304,10 @@
           <w:noProof/>
         </w:rPr>
         <w:drawing>
-          <wp:inline distT="0" distB="0" distL="0" distR="0" wp14:anchorId="31C9DB5E" wp14:editId="27F16417">
+          <wp:inline distT="0" distB="0" distL="0" distR="0" wp14:anchorId="42D8F0E6" wp14:editId="179E8EE2">
             <wp:extent cx="4000500" cy="2171700"/>
             <wp:effectExtent l="0" t="0" r="0" b="0"/>
-            <wp:docPr id="2040923941" name="図 2040923941"/>
+            <wp:docPr id="251523065" name="図 251523065"/>
             <wp:cNvGraphicFramePr>
               <a:graphicFrameLocks xmlns:a="http://schemas.openxmlformats.org/drawingml/2006/main" noChangeAspect="1"/>
             </wp:cNvGraphicFramePr>
@@ -7424,7 +7424,7 @@
       <w:pPr>
         <w:pStyle w:val="2"/>
       </w:pPr>
-      <w:bookmarkStart w:id="11" w:name="_Toc243497796"/>
+      <w:bookmarkStart w:id="11" w:name="_Toc243507522"/>
       <w:r>
         <w:t xml:space="preserve">4.2 </w:t>
       </w:r>
@@ -7504,7 +7504,7 @@
       <w:pPr>
         <w:pStyle w:val="2"/>
       </w:pPr>
-      <w:bookmarkStart w:id="12" w:name="_Toc243497797"/>
+      <w:bookmarkStart w:id="12" w:name="_Toc243507523"/>
       <w:r>
         <w:t xml:space="preserve">4.3 </w:t>
       </w:r>
@@ -7553,7 +7553,7 @@
       <w:pPr>
         <w:pStyle w:val="2"/>
       </w:pPr>
-      <w:bookmarkStart w:id="13" w:name="_Toc243497798"/>
+      <w:bookmarkStart w:id="13" w:name="_Toc243507524"/>
       <w:r>
         <w:t xml:space="preserve">4.4 </w:t>
       </w:r>
@@ -7677,7 +7677,7 @@
       <w:pPr>
         <w:pStyle w:val="2"/>
       </w:pPr>
-      <w:bookmarkStart w:id="14" w:name="_Toc243497799"/>
+      <w:bookmarkStart w:id="14" w:name="_Toc243507525"/>
       <w:r>
         <w:t xml:space="preserve">4.5 </w:t>
       </w:r>
@@ -7715,7 +7715,7 @@
         <w:pStyle w:val="1"/>
         <w:pageBreakBefore/>
       </w:pPr>
-      <w:bookmarkStart w:id="15" w:name="_Toc243497800"/>
+      <w:bookmarkStart w:id="15" w:name="_Toc243507526"/>
       <w:r>
         <w:lastRenderedPageBreak/>
         <w:t xml:space="preserve">5. </w:t>
@@ -7894,7 +7894,7 @@
         <w:pStyle w:val="1"/>
         <w:pageBreakBefore/>
       </w:pPr>
-      <w:bookmarkStart w:id="16" w:name="_Toc243497801"/>
+      <w:bookmarkStart w:id="16" w:name="_Toc243507527"/>
       <w:r>
         <w:lastRenderedPageBreak/>
         <w:t xml:space="preserve">6. A / B / C / F </w:t>
@@ -7989,10 +7989,10 @@
           <w:noProof/>
         </w:rPr>
         <w:drawing>
-          <wp:inline distT="0" distB="0" distL="0" distR="0" wp14:anchorId="72999002" wp14:editId="08368BC6">
+          <wp:inline distT="0" distB="0" distL="0" distR="0" wp14:anchorId="38DC3A16" wp14:editId="73AD2A7E">
             <wp:extent cx="4762500" cy="800100"/>
             <wp:effectExtent l="0" t="0" r="0" b="0"/>
-            <wp:docPr id="597184080" name="図 597184080"/>
+            <wp:docPr id="1893095526" name="図 1893095526"/>
             <wp:cNvGraphicFramePr>
               <a:graphicFrameLocks xmlns:a="http://schemas.openxmlformats.org/drawingml/2006/main" noChangeAspect="1"/>
             </wp:cNvGraphicFramePr>
@@ -8132,10 +8132,10 @@
           <w:noProof/>
         </w:rPr>
         <w:drawing>
-          <wp:inline distT="0" distB="0" distL="0" distR="0" wp14:anchorId="2F9CE5E6" wp14:editId="312C8086">
+          <wp:inline distT="0" distB="0" distL="0" distR="0" wp14:anchorId="55440F12" wp14:editId="2F030393">
             <wp:extent cx="4762500" cy="800100"/>
             <wp:effectExtent l="0" t="0" r="0" b="0"/>
-            <wp:docPr id="656569589" name="図 656569589"/>
+            <wp:docPr id="1433742128" name="図 1433742128"/>
             <wp:cNvGraphicFramePr>
               <a:graphicFrameLocks xmlns:a="http://schemas.openxmlformats.org/drawingml/2006/main" noChangeAspect="1"/>
             </wp:cNvGraphicFramePr>
@@ -8275,10 +8275,10 @@
           <w:noProof/>
         </w:rPr>
         <w:drawing>
-          <wp:inline distT="0" distB="0" distL="0" distR="0" wp14:anchorId="134B5199" wp14:editId="4B8627E8">
+          <wp:inline distT="0" distB="0" distL="0" distR="0" wp14:anchorId="21ACF6AC" wp14:editId="037FD6EA">
             <wp:extent cx="4762500" cy="800100"/>
             <wp:effectExtent l="0" t="0" r="0" b="0"/>
-            <wp:docPr id="458230758" name="図 458230758"/>
+            <wp:docPr id="1695887473" name="図 1695887473"/>
             <wp:cNvGraphicFramePr>
               <a:graphicFrameLocks xmlns:a="http://schemas.openxmlformats.org/drawingml/2006/main" noChangeAspect="1"/>
             </wp:cNvGraphicFramePr>
@@ -8891,7 +8891,7 @@
       <w:pPr>
         <w:pStyle w:val="2"/>
       </w:pPr>
-      <w:bookmarkStart w:id="17" w:name="_Toc243497802"/>
+      <w:bookmarkStart w:id="17" w:name="_Toc243507528"/>
       <w:r>
         <w:t>6.1 A/B</w:t>
       </w:r>
@@ -8945,7 +8945,7 @@
       <w:pPr>
         <w:pStyle w:val="2"/>
       </w:pPr>
-      <w:bookmarkStart w:id="18" w:name="_Toc243497803"/>
+      <w:bookmarkStart w:id="18" w:name="_Toc243507529"/>
       <w:r>
         <w:t>6.2 SPL</w:t>
       </w:r>
@@ -9002,7 +9002,7 @@
       <w:pPr>
         <w:pStyle w:val="2"/>
       </w:pPr>
-      <w:bookmarkStart w:id="19" w:name="_Toc243497804"/>
+      <w:bookmarkStart w:id="19" w:name="_Toc243507530"/>
       <w:r>
         <w:lastRenderedPageBreak/>
         <w:t>6.3 CLAR</w:t>
@@ -9139,7 +9139,7 @@
       <w:pPr>
         <w:pStyle w:val="2"/>
       </w:pPr>
-      <w:bookmarkStart w:id="20" w:name="_Toc243497805"/>
+      <w:bookmarkStart w:id="20" w:name="_Toc243507531"/>
       <w:r>
         <w:t>6.4 RPT</w:t>
       </w:r>
@@ -9208,7 +9208,7 @@
       <w:pPr>
         <w:pStyle w:val="2"/>
       </w:pPr>
-      <w:bookmarkStart w:id="21" w:name="_Toc243497806"/>
+      <w:bookmarkStart w:id="21" w:name="_Toc243507532"/>
       <w:r>
         <w:t>6.5 TON</w:t>
       </w:r>
@@ -9283,7 +9283,7 @@
       <w:pPr>
         <w:pStyle w:val="2"/>
       </w:pPr>
-      <w:bookmarkStart w:id="22" w:name="_Toc243497807"/>
+      <w:bookmarkStart w:id="22" w:name="_Toc243507533"/>
       <w:r>
         <w:t>6.6 SET</w:t>
       </w:r>
@@ -9720,7 +9720,7 @@
       <w:pPr>
         <w:pStyle w:val="2"/>
       </w:pPr>
-      <w:bookmarkStart w:id="23" w:name="_Toc243497808"/>
+      <w:bookmarkStart w:id="23" w:name="_Toc243507534"/>
       <w:r>
         <w:t>6.7 NAR</w:t>
       </w:r>
@@ -9768,7 +9768,7 @@
       <w:pPr>
         <w:pStyle w:val="2"/>
       </w:pPr>
-      <w:bookmarkStart w:id="24" w:name="_Toc243497809"/>
+      <w:bookmarkStart w:id="24" w:name="_Toc243507535"/>
       <w:r>
         <w:t>6.8 STEP</w:t>
       </w:r>
@@ -9796,7 +9796,7 @@
         <w:pStyle w:val="1"/>
         <w:pageBreakBefore/>
       </w:pPr>
-      <w:bookmarkStart w:id="25" w:name="_Toc243497810"/>
+      <w:bookmarkStart w:id="25" w:name="_Toc243507536"/>
       <w:r>
         <w:lastRenderedPageBreak/>
         <w:t xml:space="preserve">7. </w:t>
@@ -9848,10 +9848,10 @@
           <w:noProof/>
         </w:rPr>
         <w:drawing>
-          <wp:inline distT="0" distB="0" distL="0" distR="0" wp14:anchorId="74B5DA80" wp14:editId="7F8C5DED">
+          <wp:inline distT="0" distB="0" distL="0" distR="0" wp14:anchorId="5A648BD9" wp14:editId="5E55F08D">
             <wp:extent cx="6096000" cy="542925"/>
             <wp:effectExtent l="0" t="0" r="0" b="0"/>
-            <wp:docPr id="1359383519" name="図 1359383519"/>
+            <wp:docPr id="483588171" name="図 483588171"/>
             <wp:cNvGraphicFramePr>
               <a:graphicFrameLocks xmlns:a="http://schemas.openxmlformats.org/drawingml/2006/main" noChangeAspect="1"/>
             </wp:cNvGraphicFramePr>
@@ -9921,7 +9921,7 @@
       <w:pPr>
         <w:pStyle w:val="2"/>
       </w:pPr>
-      <w:bookmarkStart w:id="26" w:name="_Toc243497811"/>
+      <w:bookmarkStart w:id="26" w:name="_Toc243507537"/>
       <w:r>
         <w:t xml:space="preserve">7.1 </w:t>
       </w:r>
@@ -10373,7 +10373,7 @@
       <w:pPr>
         <w:pStyle w:val="2"/>
       </w:pPr>
-      <w:bookmarkStart w:id="27" w:name="_Toc243497812"/>
+      <w:bookmarkStart w:id="27" w:name="_Toc243507538"/>
       <w:r>
         <w:t xml:space="preserve">7.2 </w:t>
       </w:r>
@@ -10469,7 +10469,7 @@
       <w:pPr>
         <w:pStyle w:val="2"/>
       </w:pPr>
-      <w:bookmarkStart w:id="28" w:name="_Toc243497813"/>
+      <w:bookmarkStart w:id="28" w:name="_Toc243507539"/>
       <w:r>
         <w:t xml:space="preserve">7.3 </w:t>
       </w:r>
@@ -10786,7 +10786,7 @@
       <w:pPr>
         <w:pStyle w:val="2"/>
       </w:pPr>
-      <w:bookmarkStart w:id="29" w:name="_Toc243497814"/>
+      <w:bookmarkStart w:id="29" w:name="_Toc243507540"/>
       <w:r>
         <w:t xml:space="preserve">7.4 </w:t>
       </w:r>
@@ -10853,7 +10853,7 @@
       <w:pPr>
         <w:pStyle w:val="2"/>
       </w:pPr>
-      <w:bookmarkStart w:id="30" w:name="_Toc243497815"/>
+      <w:bookmarkStart w:id="30" w:name="_Toc243507541"/>
       <w:r>
         <w:t xml:space="preserve">7.5 </w:t>
       </w:r>
@@ -10976,7 +10976,7 @@
         <w:pStyle w:val="1"/>
         <w:pageBreakBefore/>
       </w:pPr>
-      <w:bookmarkStart w:id="31" w:name="_Toc243497816"/>
+      <w:bookmarkStart w:id="31" w:name="_Toc243507542"/>
       <w:r>
         <w:lastRenderedPageBreak/>
         <w:t xml:space="preserve">8. LCD </w:t>
@@ -10996,10 +10996,10 @@
           <w:noProof/>
         </w:rPr>
         <w:drawing>
-          <wp:inline distT="0" distB="0" distL="0" distR="0" wp14:anchorId="46FC4FFF" wp14:editId="5895D010">
+          <wp:inline distT="0" distB="0" distL="0" distR="0" wp14:anchorId="21FA4091" wp14:editId="188BD15F">
             <wp:extent cx="4953000" cy="2695575"/>
             <wp:effectExtent l="0" t="0" r="0" b="0"/>
-            <wp:docPr id="142267479" name="図 142267479"/>
+            <wp:docPr id="263021183" name="図 263021183"/>
             <wp:cNvGraphicFramePr>
               <a:graphicFrameLocks xmlns:a="http://schemas.openxmlformats.org/drawingml/2006/main" noChangeAspect="1"/>
             </wp:cNvGraphicFramePr>
@@ -11085,7 +11085,7 @@
       <w:pPr>
         <w:pStyle w:val="2"/>
       </w:pPr>
-      <w:bookmarkStart w:id="32" w:name="_Toc243497817"/>
+      <w:bookmarkStart w:id="32" w:name="_Toc243507543"/>
       <w:r>
         <w:t xml:space="preserve">8.1 </w:t>
       </w:r>
@@ -11877,7 +11877,7 @@
       <w:pPr>
         <w:pStyle w:val="2"/>
       </w:pPr>
-      <w:bookmarkStart w:id="33" w:name="_Toc243497818"/>
+      <w:bookmarkStart w:id="33" w:name="_Toc243507544"/>
       <w:r>
         <w:lastRenderedPageBreak/>
         <w:t xml:space="preserve">8.2 2 </w:t>
@@ -12790,7 +12790,7 @@
       <w:pPr>
         <w:pStyle w:val="2"/>
       </w:pPr>
-      <w:bookmarkStart w:id="34" w:name="_Toc243497819"/>
+      <w:bookmarkStart w:id="34" w:name="_Toc243507545"/>
       <w:r>
         <w:t xml:space="preserve">8.3 </w:t>
       </w:r>
@@ -13061,7 +13061,7 @@
         <w:pStyle w:val="1"/>
         <w:pageBreakBefore/>
       </w:pPr>
-      <w:bookmarkStart w:id="35" w:name="_Toc243497820"/>
+      <w:bookmarkStart w:id="35" w:name="_Toc243507546"/>
       <w:r>
         <w:lastRenderedPageBreak/>
         <w:t xml:space="preserve">9. </w:t>
@@ -13075,7 +13075,7 @@
       <w:pPr>
         <w:pStyle w:val="2"/>
       </w:pPr>
-      <w:bookmarkStart w:id="36" w:name="_Toc243497821"/>
+      <w:bookmarkStart w:id="36" w:name="_Toc243507547"/>
       <w:r>
         <w:t xml:space="preserve">9.1 </w:t>
       </w:r>
@@ -13155,7 +13155,7 @@
       <w:pPr>
         <w:pStyle w:val="2"/>
       </w:pPr>
-      <w:bookmarkStart w:id="37" w:name="_Toc243497822"/>
+      <w:bookmarkStart w:id="37" w:name="_Toc243507548"/>
       <w:r>
         <w:t xml:space="preserve">9.2 </w:t>
       </w:r>
@@ -13858,7 +13858,7 @@
       <w:pPr>
         <w:pStyle w:val="2"/>
       </w:pPr>
-      <w:bookmarkStart w:id="38" w:name="_Toc243497823"/>
+      <w:bookmarkStart w:id="38" w:name="_Toc243507549"/>
       <w:r>
         <w:lastRenderedPageBreak/>
         <w:t xml:space="preserve">9.3 </w:t>
@@ -13974,7 +13974,7 @@
         <w:pStyle w:val="1"/>
         <w:pageBreakBefore/>
       </w:pPr>
-      <w:bookmarkStart w:id="39" w:name="_Toc243497824"/>
+      <w:bookmarkStart w:id="39" w:name="_Toc243507550"/>
       <w:r>
         <w:lastRenderedPageBreak/>
         <w:t xml:space="preserve">10. </w:t>
@@ -13988,7 +13988,7 @@
       <w:pPr>
         <w:pStyle w:val="2"/>
       </w:pPr>
-      <w:bookmarkStart w:id="40" w:name="_Toc243497825"/>
+      <w:bookmarkStart w:id="40" w:name="_Toc243507551"/>
       <w:r>
         <w:t xml:space="preserve">10.1 </w:t>
       </w:r>
@@ -14119,7 +14119,7 @@
       <w:pPr>
         <w:pStyle w:val="2"/>
       </w:pPr>
-      <w:bookmarkStart w:id="41" w:name="_Toc243497826"/>
+      <w:bookmarkStart w:id="41" w:name="_Toc243507552"/>
       <w:r>
         <w:t xml:space="preserve">10.2 </w:t>
       </w:r>
@@ -14383,7 +14383,7 @@
       <w:pPr>
         <w:pStyle w:val="2"/>
       </w:pPr>
-      <w:bookmarkStart w:id="42" w:name="_Toc243497827"/>
+      <w:bookmarkStart w:id="42" w:name="_Toc243507553"/>
       <w:r>
         <w:t xml:space="preserve">10.3 </w:t>
       </w:r>
@@ -14437,7 +14437,7 @@
       <w:pPr>
         <w:pStyle w:val="2"/>
       </w:pPr>
-      <w:bookmarkStart w:id="43" w:name="_Toc243497828"/>
+      <w:bookmarkStart w:id="43" w:name="_Toc243507554"/>
       <w:r>
         <w:t xml:space="preserve">10.4 </w:t>
       </w:r>
@@ -14595,64 +14595,73 @@
 <file path=word/numbering.xml><?xml version="1.0" encoding="utf-8"?>
 <w:numbering xmlns:wpc="http://schemas.microsoft.com/office/word/2010/wordprocessingCanvas" xmlns:cx="http://schemas.microsoft.com/office/drawing/2014/chartex" xmlns:cx1="http://schemas.microsoft.com/office/drawing/2015/9/8/chartex" xmlns:cx2="http://schemas.microsoft.com/office/drawing/2015/10/21/chartex" xmlns:cx3="http://schemas.microsoft.com/office/drawing/2016/5/9/chartex" xmlns:cx4="http://schemas.microsoft.com/office/drawing/2016/5/10/chartex" xmlns:cx5="http://schemas.microsoft.com/office/drawing/2016/5/11/chartex" xmlns:cx6="http://schemas.microsoft.com/office/drawing/2016/5/12/chartex" xmlns:cx7="http://schemas.microsoft.com/office/drawing/2016/5/13/chartex" xmlns:cx8="http://schemas.microsoft.com/office/drawing/2016/5/14/chartex" xmlns:mc="http://schemas.openxmlformats.org/markup-compatibility/2006" xmlns:aink="http://schemas.microsoft.com/office/drawing/2016/ink" xmlns:am3d="http://schemas.microsoft.com/office/drawing/2017/model3d" xmlns:o="urn:schemas-microsoft-com:office:office" xmlns:oel="http://schemas.microsoft.com/office/2019/extlst" xmlns:r="http://schemas.openxmlformats.org/officeDocument/2006/relationships" xmlns:m="http://schemas.openxmlformats.org/officeDocument/2006/math" xmlns:v="urn:schemas-microsoft-com:vml" xmlns:wp14="http://schemas.microsoft.com/office/word/2010/wordprocessingDrawing" xmlns:wp="http://schemas.openxmlformats.org/drawingml/2006/wordprocessingDrawing" xmlns:w10="urn:schemas-microsoft-com:office:word" xmlns:w="http://schemas.openxmlformats.org/wordprocessingml/2006/main" xmlns:w14="http://schemas.microsoft.com/office/word/2010/wordml" xmlns:w15="http://schemas.microsoft.com/office/word/2012/wordml" xmlns:w16cex="http://schemas.microsoft.com/office/word/2018/wordml/cex" xmlns:w16cid="http://schemas.microsoft.com/office/word/2016/wordml/cid" xmlns:w16="http://schemas.microsoft.com/office/word/2018/wordml" xmlns:w16du="http://schemas.microsoft.com/office/word/2023/wordml/word16du" xmlns:w16sdtdh="http://schemas.microsoft.com/office/word/2020/wordml/sdtdatahash" xmlns:w16sdtfl="http://schemas.microsoft.com/office/word/2024/wordml/sdtformatlock" xmlns:w16se="http://schemas.microsoft.com/office/word/2015/wordml/symex" xmlns:wpg="http://schemas.microsoft.com/office/word/2010/wordprocessingGroup" xmlns:wpi="http://schemas.microsoft.com/office/word/2010/wordprocessingInk" xmlns:wne="http://schemas.microsoft.com/office/word/2006/wordml" xmlns:wps="http://schemas.microsoft.com/office/word/2010/wordprocessingShape" mc:Ignorable="w14 w15 w16se w16cid w16 w16cex w16sdtdh w16sdtfl w16du wp14">
   <w:abstractNum w:abstractNumId="0" w15:restartNumberingAfterBreak="0">
-    <w:nsid w:val="0DBB75DB"/>
+    <w:nsid w:val="1597662F"/>
     <w:multiLevelType w:val="hybridMultilevel"/>
-    <w:tmpl w:val="58D8ADF4"/>
-    <w:lvl w:ilvl="0" w:tplc="1B0E6410">
+    <w:tmpl w:val="AE023018"/>
+    <w:lvl w:ilvl="0" w:tplc="834EA5EC">
       <w:start w:val="1"/>
-      <w:numFmt w:val="decimal"/>
-      <w:lvlText w:val="%1."/>
+      <w:numFmt w:val="bullet"/>
+      <w:lvlText w:val="●"/>
       <w:lvlJc w:val="left"/>
       <w:pPr>
-        <w:ind w:left="480" w:hanging="360"/>
-      </w:pPr>
+        <w:ind w:left="480" w:hanging="300"/>
+      </w:pPr>
+      <w:rPr>
+        <w:color w:val="1F4E79"/>
+        <w:sz w:val="14"/>
+        <w:szCs w:val="14"/>
+      </w:rPr>
     </w:lvl>
-    <w:lvl w:ilvl="1" w:tplc="2DBC01FA">
+    <w:lvl w:ilvl="1" w:tplc="BE880D4C">
+      <w:start w:val="1"/>
+      <w:numFmt w:val="bullet"/>
+      <w:lvlText w:val="○"/>
+      <w:lvlJc w:val="left"/>
+      <w:pPr>
+        <w:ind w:left="900" w:hanging="300"/>
+      </w:pPr>
+    </w:lvl>
+    <w:lvl w:ilvl="2" w:tplc="78E41E4A">
       <w:numFmt w:val="decimal"/>
       <w:lvlText w:val=""/>
       <w:lvlJc w:val="left"/>
     </w:lvl>
-    <w:lvl w:ilvl="2" w:tplc="4B103B40">
+    <w:lvl w:ilvl="3" w:tplc="56241B56">
       <w:numFmt w:val="decimal"/>
       <w:lvlText w:val=""/>
       <w:lvlJc w:val="left"/>
     </w:lvl>
-    <w:lvl w:ilvl="3" w:tplc="608A1846">
+    <w:lvl w:ilvl="4" w:tplc="104A4242">
       <w:numFmt w:val="decimal"/>
       <w:lvlText w:val=""/>
       <w:lvlJc w:val="left"/>
     </w:lvl>
-    <w:lvl w:ilvl="4" w:tplc="865850B8">
+    <w:lvl w:ilvl="5" w:tplc="57FE1048">
       <w:numFmt w:val="decimal"/>
       <w:lvlText w:val=""/>
       <w:lvlJc w:val="left"/>
     </w:lvl>
-    <w:lvl w:ilvl="5" w:tplc="F17E28F2">
+    <w:lvl w:ilvl="6" w:tplc="EB84B342">
       <w:numFmt w:val="decimal"/>
       <w:lvlText w:val=""/>
       <w:lvlJc w:val="left"/>
     </w:lvl>
-    <w:lvl w:ilvl="6" w:tplc="4A18DA4E">
+    <w:lvl w:ilvl="7" w:tplc="84E02D76">
       <w:numFmt w:val="decimal"/>
       <w:lvlText w:val=""/>
       <w:lvlJc w:val="left"/>
     </w:lvl>
-    <w:lvl w:ilvl="7" w:tplc="96C47BB4">
-      <w:numFmt w:val="decimal"/>
-      <w:lvlText w:val=""/>
-      <w:lvlJc w:val="left"/>
-    </w:lvl>
-    <w:lvl w:ilvl="8" w:tplc="11ECD284">
+    <w:lvl w:ilvl="8" w:tplc="5F4E8D34">
       <w:numFmt w:val="decimal"/>
       <w:lvlText w:val=""/>
       <w:lvlJc w:val="left"/>
     </w:lvl>
   </w:abstractNum>
   <w:abstractNum w:abstractNumId="1" w15:restartNumberingAfterBreak="0">
-    <w:nsid w:val="13AE3022"/>
+    <w:nsid w:val="188145CF"/>
     <w:multiLevelType w:val="hybridMultilevel"/>
-    <w:tmpl w:val="68C0053E"/>
-    <w:lvl w:ilvl="0" w:tplc="99E6A4F0">
+    <w:tmpl w:val="9DA66B5C"/>
+    <w:lvl w:ilvl="0" w:tplc="197E5F7E">
       <w:start w:val="1"/>
       <w:numFmt w:val="decimal"/>
       <w:lvlText w:val="%1."/>
@@ -14661,138 +14670,52 @@
         <w:ind w:left="480" w:hanging="360"/>
       </w:pPr>
     </w:lvl>
-    <w:lvl w:ilvl="1" w:tplc="1ED4F0A4">
+    <w:lvl w:ilvl="1" w:tplc="D734A4B2">
       <w:numFmt w:val="decimal"/>
       <w:lvlText w:val=""/>
       <w:lvlJc w:val="left"/>
     </w:lvl>
-    <w:lvl w:ilvl="2" w:tplc="5D26165C">
+    <w:lvl w:ilvl="2" w:tplc="D8B63C9E">
       <w:numFmt w:val="decimal"/>
       <w:lvlText w:val=""/>
       <w:lvlJc w:val="left"/>
     </w:lvl>
-    <w:lvl w:ilvl="3" w:tplc="50AA0A12">
+    <w:lvl w:ilvl="3" w:tplc="E3BA1412">
       <w:numFmt w:val="decimal"/>
       <w:lvlText w:val=""/>
       <w:lvlJc w:val="left"/>
     </w:lvl>
-    <w:lvl w:ilvl="4" w:tplc="B302E7D0">
+    <w:lvl w:ilvl="4" w:tplc="42C26A2A">
       <w:numFmt w:val="decimal"/>
       <w:lvlText w:val=""/>
       <w:lvlJc w:val="left"/>
     </w:lvl>
-    <w:lvl w:ilvl="5" w:tplc="CBAE7DD4">
+    <w:lvl w:ilvl="5" w:tplc="4AAC0620">
       <w:numFmt w:val="decimal"/>
       <w:lvlText w:val=""/>
       <w:lvlJc w:val="left"/>
     </w:lvl>
-    <w:lvl w:ilvl="6" w:tplc="A65203BE">
+    <w:lvl w:ilvl="6" w:tplc="367CBB80">
       <w:numFmt w:val="decimal"/>
       <w:lvlText w:val=""/>
       <w:lvlJc w:val="left"/>
     </w:lvl>
-    <w:lvl w:ilvl="7" w:tplc="0E66B7C6">
+    <w:lvl w:ilvl="7" w:tplc="8F008AE6">
       <w:numFmt w:val="decimal"/>
       <w:lvlText w:val=""/>
       <w:lvlJc w:val="left"/>
     </w:lvl>
-    <w:lvl w:ilvl="8" w:tplc="ABC42AEC">
+    <w:lvl w:ilvl="8" w:tplc="1FDC87FA">
       <w:numFmt w:val="decimal"/>
       <w:lvlText w:val=""/>
       <w:lvlJc w:val="left"/>
     </w:lvl>
   </w:abstractNum>
   <w:abstractNum w:abstractNumId="2" w15:restartNumberingAfterBreak="0">
-    <w:nsid w:val="2FE77E05"/>
+    <w:nsid w:val="3B323543"/>
     <w:multiLevelType w:val="hybridMultilevel"/>
-    <w:tmpl w:val="F21A798C"/>
-    <w:lvl w:ilvl="0" w:tplc="635E888A">
-      <w:start w:val="1"/>
-      <w:numFmt w:val="bullet"/>
-      <w:lvlText w:val="●"/>
-      <w:lvlJc w:val="left"/>
-      <w:pPr>
-        <w:ind w:left="720" w:hanging="360"/>
-      </w:pPr>
-    </w:lvl>
-    <w:lvl w:ilvl="1" w:tplc="BDD66A0A">
-      <w:start w:val="1"/>
-      <w:numFmt w:val="bullet"/>
-      <w:lvlText w:val="○"/>
-      <w:lvlJc w:val="left"/>
-      <w:pPr>
-        <w:ind w:left="1440" w:hanging="360"/>
-      </w:pPr>
-    </w:lvl>
-    <w:lvl w:ilvl="2" w:tplc="6C8E148A">
-      <w:start w:val="1"/>
-      <w:numFmt w:val="bullet"/>
-      <w:lvlText w:val="■"/>
-      <w:lvlJc w:val="left"/>
-      <w:pPr>
-        <w:ind w:left="2160" w:hanging="360"/>
-      </w:pPr>
-    </w:lvl>
-    <w:lvl w:ilvl="3" w:tplc="4436624C">
-      <w:start w:val="1"/>
-      <w:numFmt w:val="bullet"/>
-      <w:lvlText w:val="●"/>
-      <w:lvlJc w:val="left"/>
-      <w:pPr>
-        <w:ind w:left="2880" w:hanging="360"/>
-      </w:pPr>
-    </w:lvl>
-    <w:lvl w:ilvl="4" w:tplc="65A62FC4">
-      <w:start w:val="1"/>
-      <w:numFmt w:val="bullet"/>
-      <w:lvlText w:val="○"/>
-      <w:lvlJc w:val="left"/>
-      <w:pPr>
-        <w:ind w:left="3600" w:hanging="360"/>
-      </w:pPr>
-    </w:lvl>
-    <w:lvl w:ilvl="5" w:tplc="CB10C348">
-      <w:start w:val="1"/>
-      <w:numFmt w:val="bullet"/>
-      <w:lvlText w:val="■"/>
-      <w:lvlJc w:val="left"/>
-      <w:pPr>
-        <w:ind w:left="4320" w:hanging="360"/>
-      </w:pPr>
-    </w:lvl>
-    <w:lvl w:ilvl="6" w:tplc="158ABFF2">
-      <w:start w:val="1"/>
-      <w:numFmt w:val="bullet"/>
-      <w:lvlText w:val="●"/>
-      <w:lvlJc w:val="left"/>
-      <w:pPr>
-        <w:ind w:left="5040" w:hanging="360"/>
-      </w:pPr>
-    </w:lvl>
-    <w:lvl w:ilvl="7" w:tplc="22A0DC16">
-      <w:start w:val="1"/>
-      <w:numFmt w:val="bullet"/>
-      <w:lvlText w:val="●"/>
-      <w:lvlJc w:val="left"/>
-      <w:pPr>
-        <w:ind w:left="5760" w:hanging="360"/>
-      </w:pPr>
-    </w:lvl>
-    <w:lvl w:ilvl="8" w:tplc="C68C8050">
-      <w:start w:val="1"/>
-      <w:numFmt w:val="bullet"/>
-      <w:lvlText w:val="●"/>
-      <w:lvlJc w:val="left"/>
-      <w:pPr>
-        <w:ind w:left="6480" w:hanging="360"/>
-      </w:pPr>
-    </w:lvl>
-  </w:abstractNum>
-  <w:abstractNum w:abstractNumId="3" w15:restartNumberingAfterBreak="0">
-    <w:nsid w:val="51474591"/>
-    <w:multiLevelType w:val="hybridMultilevel"/>
-    <w:tmpl w:val="FD88E83A"/>
-    <w:lvl w:ilvl="0" w:tplc="AC2C82A6">
+    <w:tmpl w:val="06F40804"/>
+    <w:lvl w:ilvl="0" w:tplc="EACE7B02">
       <w:start w:val="1"/>
       <w:numFmt w:val="decimal"/>
       <w:lvlText w:val="%1."/>
@@ -14801,196 +14724,273 @@
         <w:ind w:left="480" w:hanging="360"/>
       </w:pPr>
     </w:lvl>
-    <w:lvl w:ilvl="1" w:tplc="A9D2919C">
+    <w:lvl w:ilvl="1" w:tplc="71B0CB88">
       <w:numFmt w:val="decimal"/>
       <w:lvlText w:val=""/>
       <w:lvlJc w:val="left"/>
     </w:lvl>
-    <w:lvl w:ilvl="2" w:tplc="7442A502">
+    <w:lvl w:ilvl="2" w:tplc="9CCA8CFA">
       <w:numFmt w:val="decimal"/>
       <w:lvlText w:val=""/>
       <w:lvlJc w:val="left"/>
     </w:lvl>
-    <w:lvl w:ilvl="3" w:tplc="DEE0B79E">
+    <w:lvl w:ilvl="3" w:tplc="FDF8B866">
       <w:numFmt w:val="decimal"/>
       <w:lvlText w:val=""/>
       <w:lvlJc w:val="left"/>
     </w:lvl>
-    <w:lvl w:ilvl="4" w:tplc="96AA8664">
+    <w:lvl w:ilvl="4" w:tplc="B7001226">
       <w:numFmt w:val="decimal"/>
       <w:lvlText w:val=""/>
       <w:lvlJc w:val="left"/>
     </w:lvl>
-    <w:lvl w:ilvl="5" w:tplc="4EF8F16E">
+    <w:lvl w:ilvl="5" w:tplc="9210DBA8">
       <w:numFmt w:val="decimal"/>
       <w:lvlText w:val=""/>
       <w:lvlJc w:val="left"/>
     </w:lvl>
-    <w:lvl w:ilvl="6" w:tplc="D28CD4FC">
+    <w:lvl w:ilvl="6" w:tplc="61EAC56C">
       <w:numFmt w:val="decimal"/>
       <w:lvlText w:val=""/>
       <w:lvlJc w:val="left"/>
     </w:lvl>
-    <w:lvl w:ilvl="7" w:tplc="83C6C206">
+    <w:lvl w:ilvl="7" w:tplc="714CF568">
       <w:numFmt w:val="decimal"/>
       <w:lvlText w:val=""/>
       <w:lvlJc w:val="left"/>
     </w:lvl>
-    <w:lvl w:ilvl="8" w:tplc="1954036C">
+    <w:lvl w:ilvl="8" w:tplc="420C11AA">
+      <w:numFmt w:val="decimal"/>
+      <w:lvlText w:val=""/>
+      <w:lvlJc w:val="left"/>
+    </w:lvl>
+  </w:abstractNum>
+  <w:abstractNum w:abstractNumId="3" w15:restartNumberingAfterBreak="0">
+    <w:nsid w:val="4E456F6E"/>
+    <w:multiLevelType w:val="hybridMultilevel"/>
+    <w:tmpl w:val="376806F6"/>
+    <w:lvl w:ilvl="0" w:tplc="7DB4F044">
+      <w:start w:val="1"/>
+      <w:numFmt w:val="decimal"/>
+      <w:lvlText w:val="%1."/>
+      <w:lvlJc w:val="left"/>
+      <w:pPr>
+        <w:ind w:left="480" w:hanging="360"/>
+      </w:pPr>
+    </w:lvl>
+    <w:lvl w:ilvl="1" w:tplc="FD8EB2F0">
+      <w:numFmt w:val="decimal"/>
+      <w:lvlText w:val=""/>
+      <w:lvlJc w:val="left"/>
+    </w:lvl>
+    <w:lvl w:ilvl="2" w:tplc="48FE8888">
+      <w:numFmt w:val="decimal"/>
+      <w:lvlText w:val=""/>
+      <w:lvlJc w:val="left"/>
+    </w:lvl>
+    <w:lvl w:ilvl="3" w:tplc="6A08216A">
+      <w:numFmt w:val="decimal"/>
+      <w:lvlText w:val=""/>
+      <w:lvlJc w:val="left"/>
+    </w:lvl>
+    <w:lvl w:ilvl="4" w:tplc="4AC24DEE">
+      <w:numFmt w:val="decimal"/>
+      <w:lvlText w:val=""/>
+      <w:lvlJc w:val="left"/>
+    </w:lvl>
+    <w:lvl w:ilvl="5" w:tplc="1C6A7308">
+      <w:numFmt w:val="decimal"/>
+      <w:lvlText w:val=""/>
+      <w:lvlJc w:val="left"/>
+    </w:lvl>
+    <w:lvl w:ilvl="6" w:tplc="7AEC542E">
+      <w:numFmt w:val="decimal"/>
+      <w:lvlText w:val=""/>
+      <w:lvlJc w:val="left"/>
+    </w:lvl>
+    <w:lvl w:ilvl="7" w:tplc="F03EF95C">
+      <w:numFmt w:val="decimal"/>
+      <w:lvlText w:val=""/>
+      <w:lvlJc w:val="left"/>
+    </w:lvl>
+    <w:lvl w:ilvl="8" w:tplc="CED8D902">
       <w:numFmt w:val="decimal"/>
       <w:lvlText w:val=""/>
       <w:lvlJc w:val="left"/>
     </w:lvl>
   </w:abstractNum>
   <w:abstractNum w:abstractNumId="4" w15:restartNumberingAfterBreak="0">
-    <w:nsid w:val="677409E7"/>
+    <w:nsid w:val="4F0A0709"/>
     <w:multiLevelType w:val="hybridMultilevel"/>
-    <w:tmpl w:val="04301BCC"/>
-    <w:lvl w:ilvl="0" w:tplc="DB9453CA">
+    <w:tmpl w:val="4F165AAE"/>
+    <w:lvl w:ilvl="0" w:tplc="26EECACE">
       <w:start w:val="1"/>
-      <w:numFmt w:val="bullet"/>
-      <w:lvlText w:val="●"/>
+      <w:numFmt w:val="decimal"/>
+      <w:lvlText w:val="%1."/>
       <w:lvlJc w:val="left"/>
       <w:pPr>
-        <w:ind w:left="480" w:hanging="300"/>
-      </w:pPr>
-      <w:rPr>
-        <w:color w:val="1F4E79"/>
-        <w:sz w:val="14"/>
-        <w:szCs w:val="14"/>
-      </w:rPr>
+        <w:ind w:left="480" w:hanging="360"/>
+      </w:pPr>
     </w:lvl>
-    <w:lvl w:ilvl="1" w:tplc="C5F4A3D8">
-      <w:start w:val="1"/>
-      <w:numFmt w:val="bullet"/>
-      <w:lvlText w:val="○"/>
-      <w:lvlJc w:val="left"/>
-      <w:pPr>
-        <w:ind w:left="900" w:hanging="300"/>
-      </w:pPr>
-    </w:lvl>
-    <w:lvl w:ilvl="2" w:tplc="0F3E30A0">
+    <w:lvl w:ilvl="1" w:tplc="B9BA8EBC">
       <w:numFmt w:val="decimal"/>
       <w:lvlText w:val=""/>
       <w:lvlJc w:val="left"/>
     </w:lvl>
-    <w:lvl w:ilvl="3" w:tplc="C060DADC">
+    <w:lvl w:ilvl="2" w:tplc="658AF7EA">
       <w:numFmt w:val="decimal"/>
       <w:lvlText w:val=""/>
       <w:lvlJc w:val="left"/>
     </w:lvl>
-    <w:lvl w:ilvl="4" w:tplc="E3FE1188">
+    <w:lvl w:ilvl="3" w:tplc="910E509A">
       <w:numFmt w:val="decimal"/>
       <w:lvlText w:val=""/>
       <w:lvlJc w:val="left"/>
     </w:lvl>
-    <w:lvl w:ilvl="5" w:tplc="E7925A94">
+    <w:lvl w:ilvl="4" w:tplc="84702E9C">
       <w:numFmt w:val="decimal"/>
       <w:lvlText w:val=""/>
       <w:lvlJc w:val="left"/>
     </w:lvl>
-    <w:lvl w:ilvl="6" w:tplc="4462F3CC">
+    <w:lvl w:ilvl="5" w:tplc="A45842B2">
       <w:numFmt w:val="decimal"/>
       <w:lvlText w:val=""/>
       <w:lvlJc w:val="left"/>
     </w:lvl>
-    <w:lvl w:ilvl="7" w:tplc="5CB06710">
+    <w:lvl w:ilvl="6" w:tplc="36B89F78">
       <w:numFmt w:val="decimal"/>
       <w:lvlText w:val=""/>
       <w:lvlJc w:val="left"/>
     </w:lvl>
-    <w:lvl w:ilvl="8" w:tplc="71EE1C5C">
+    <w:lvl w:ilvl="7" w:tplc="36629B68">
+      <w:numFmt w:val="decimal"/>
+      <w:lvlText w:val=""/>
+      <w:lvlJc w:val="left"/>
+    </w:lvl>
+    <w:lvl w:ilvl="8" w:tplc="7D885E66">
       <w:numFmt w:val="decimal"/>
       <w:lvlText w:val=""/>
       <w:lvlJc w:val="left"/>
     </w:lvl>
   </w:abstractNum>
   <w:abstractNum w:abstractNumId="5" w15:restartNumberingAfterBreak="0">
-    <w:nsid w:val="7FB2259B"/>
+    <w:nsid w:val="7C0C364D"/>
     <w:multiLevelType w:val="hybridMultilevel"/>
-    <w:tmpl w:val="BBB6AA88"/>
-    <w:lvl w:ilvl="0" w:tplc="98EE5964">
+    <w:tmpl w:val="E8746C5A"/>
+    <w:lvl w:ilvl="0" w:tplc="46BC011C">
       <w:start w:val="1"/>
-      <w:numFmt w:val="decimal"/>
-      <w:lvlText w:val="%1."/>
+      <w:numFmt w:val="bullet"/>
+      <w:lvlText w:val="●"/>
       <w:lvlJc w:val="left"/>
       <w:pPr>
-        <w:ind w:left="480" w:hanging="360"/>
+        <w:ind w:left="720" w:hanging="360"/>
       </w:pPr>
     </w:lvl>
-    <w:lvl w:ilvl="1" w:tplc="C2D84F2C">
-      <w:numFmt w:val="decimal"/>
-      <w:lvlText w:val=""/>
+    <w:lvl w:ilvl="1" w:tplc="D5AA9A0C">
+      <w:start w:val="1"/>
+      <w:numFmt w:val="bullet"/>
+      <w:lvlText w:val="○"/>
       <w:lvlJc w:val="left"/>
+      <w:pPr>
+        <w:ind w:left="1440" w:hanging="360"/>
+      </w:pPr>
     </w:lvl>
-    <w:lvl w:ilvl="2" w:tplc="CB2025C2">
-      <w:numFmt w:val="decimal"/>
-      <w:lvlText w:val=""/>
+    <w:lvl w:ilvl="2" w:tplc="257205A4">
+      <w:start w:val="1"/>
+      <w:numFmt w:val="bullet"/>
+      <w:lvlText w:val="■"/>
       <w:lvlJc w:val="left"/>
+      <w:pPr>
+        <w:ind w:left="2160" w:hanging="360"/>
+      </w:pPr>
     </w:lvl>
-    <w:lvl w:ilvl="3" w:tplc="F970BEF4">
-      <w:numFmt w:val="decimal"/>
-      <w:lvlText w:val=""/>
+    <w:lvl w:ilvl="3" w:tplc="D2769BA8">
+      <w:start w:val="1"/>
+      <w:numFmt w:val="bullet"/>
+      <w:lvlText w:val="●"/>
       <w:lvlJc w:val="left"/>
+      <w:pPr>
+        <w:ind w:left="2880" w:hanging="360"/>
+      </w:pPr>
     </w:lvl>
-    <w:lvl w:ilvl="4" w:tplc="23E8FC4E">
-      <w:numFmt w:val="decimal"/>
-      <w:lvlText w:val=""/>
+    <w:lvl w:ilvl="4" w:tplc="038C90CA">
+      <w:start w:val="1"/>
+      <w:numFmt w:val="bullet"/>
+      <w:lvlText w:val="○"/>
       <w:lvlJc w:val="left"/>
+      <w:pPr>
+        <w:ind w:left="3600" w:hanging="360"/>
+      </w:pPr>
     </w:lvl>
-    <w:lvl w:ilvl="5" w:tplc="BEF8C3DE">
-      <w:numFmt w:val="decimal"/>
-      <w:lvlText w:val=""/>
+    <w:lvl w:ilvl="5" w:tplc="2B8E542E">
+      <w:start w:val="1"/>
+      <w:numFmt w:val="bullet"/>
+      <w:lvlText w:val="■"/>
       <w:lvlJc w:val="left"/>
+      <w:pPr>
+        <w:ind w:left="4320" w:hanging="360"/>
+      </w:pPr>
     </w:lvl>
-    <w:lvl w:ilvl="6" w:tplc="BD98E014">
-      <w:numFmt w:val="decimal"/>
-      <w:lvlText w:val=""/>
+    <w:lvl w:ilvl="6" w:tplc="C6508912">
+      <w:start w:val="1"/>
+      <w:numFmt w:val="bullet"/>
+      <w:lvlText w:val="●"/>
       <w:lvlJc w:val="left"/>
+      <w:pPr>
+        <w:ind w:left="5040" w:hanging="360"/>
+      </w:pPr>
     </w:lvl>
-    <w:lvl w:ilvl="7" w:tplc="0C36DC0A">
-      <w:numFmt w:val="decimal"/>
-      <w:lvlText w:val=""/>
+    <w:lvl w:ilvl="7" w:tplc="0556EC70">
+      <w:start w:val="1"/>
+      <w:numFmt w:val="bullet"/>
+      <w:lvlText w:val="●"/>
       <w:lvlJc w:val="left"/>
+      <w:pPr>
+        <w:ind w:left="5760" w:hanging="360"/>
+      </w:pPr>
     </w:lvl>
-    <w:lvl w:ilvl="8" w:tplc="02D4F1EE">
-      <w:numFmt w:val="decimal"/>
-      <w:lvlText w:val=""/>
+    <w:lvl w:ilvl="8" w:tplc="2F4490E2">
+      <w:start w:val="1"/>
+      <w:numFmt w:val="bullet"/>
+      <w:lvlText w:val="●"/>
       <w:lvlJc w:val="left"/>
+      <w:pPr>
+        <w:ind w:left="6480" w:hanging="360"/>
+      </w:pPr>
     </w:lvl>
   </w:abstractNum>
-  <w:num w:numId="1" w16cid:durableId="1067455134">
+  <w:num w:numId="1" w16cid:durableId="563761074">
+    <w:abstractNumId w:val="5"/>
+    <w:lvlOverride w:ilvl="0">
+      <w:startOverride w:val="1"/>
+    </w:lvlOverride>
+  </w:num>
+  <w:num w:numId="2" w16cid:durableId="1583757754">
+    <w:abstractNumId w:val="0"/>
+    <w:lvlOverride w:ilvl="0">
+      <w:startOverride w:val="1"/>
+    </w:lvlOverride>
+  </w:num>
+  <w:num w:numId="3" w16cid:durableId="2132438397">
     <w:abstractNumId w:val="2"/>
     <w:lvlOverride w:ilvl="0">
       <w:startOverride w:val="1"/>
     </w:lvlOverride>
   </w:num>
-  <w:num w:numId="2" w16cid:durableId="743995134">
-    <w:abstractNumId w:val="4"/>
-    <w:lvlOverride w:ilvl="0">
-      <w:startOverride w:val="1"/>
-    </w:lvlOverride>
-  </w:num>
-  <w:num w:numId="3" w16cid:durableId="1605917627">
+  <w:num w:numId="4" w16cid:durableId="876740690">
     <w:abstractNumId w:val="3"/>
     <w:lvlOverride w:ilvl="0">
       <w:startOverride w:val="1"/>
     </w:lvlOverride>
   </w:num>
-  <w:num w:numId="4" w16cid:durableId="398407647">
+  <w:num w:numId="5" w16cid:durableId="1611664016">
     <w:abstractNumId w:val="1"/>
     <w:lvlOverride w:ilvl="0">
       <w:startOverride w:val="1"/>
     </w:lvlOverride>
   </w:num>
-  <w:num w:numId="5" w16cid:durableId="1063873965">
-    <w:abstractNumId w:val="5"/>
-    <w:lvlOverride w:ilvl="0">
-      <w:startOverride w:val="1"/>
-    </w:lvlOverride>
-  </w:num>
-  <w:num w:numId="6" w16cid:durableId="1568884216">
-    <w:abstractNumId w:val="0"/>
+  <w:num w:numId="6" w16cid:durableId="238560787">
+    <w:abstractNumId w:val="4"/>
     <w:lvlOverride w:ilvl="0">
       <w:startOverride w:val="1"/>
     </w:lvlOverride>
@@ -15610,7 +15610,7 @@
     <w:link w:val="aa"/>
     <w:uiPriority w:val="99"/>
     <w:unhideWhenUsed/>
-    <w:rsid w:val="00DA4677"/>
+    <w:rsid w:val="003A4756"/>
     <w:pPr>
       <w:tabs>
         <w:tab w:val="center" w:pos="4252"/>
@@ -15624,7 +15624,7 @@
     <w:basedOn w:val="a0"/>
     <w:link w:val="a9"/>
     <w:uiPriority w:val="99"/>
-    <w:rsid w:val="00DA4677"/>
+    <w:rsid w:val="003A4756"/>
   </w:style>
   <w:style w:type="paragraph" w:styleId="ab">
     <w:name w:val="footer"/>
@@ -15632,7 +15632,7 @@
     <w:link w:val="ac"/>
     <w:uiPriority w:val="99"/>
     <w:unhideWhenUsed/>
-    <w:rsid w:val="00DA4677"/>
+    <w:rsid w:val="003A4756"/>
     <w:pPr>
       <w:tabs>
         <w:tab w:val="center" w:pos="4252"/>
@@ -15646,7 +15646,7 @@
     <w:basedOn w:val="a0"/>
     <w:link w:val="ab"/>
     <w:uiPriority w:val="99"/>
-    <w:rsid w:val="00DA4677"/>
+    <w:rsid w:val="003A4756"/>
   </w:style>
 </w:styles>
 </file>

</xml_diff>

<commit_message>
Bump version to 2.31
Manual covers updated to 2.31.

Co-Authored-By: Claude Opus 5.5 <noreply@anthropic.com>
</commit_message>
<xml_diff>
--- a/docs/FT-817_操作説明書.docx
+++ b/docs/FT-817_操作説明書.docx
@@ -63,7 +63,7 @@
           <w:noProof/>
         </w:rPr>
         <w:drawing>
-          <wp:inline distT="0" distB="0" distL="0" distR="0" wp14:anchorId="772A48B6" wp14:editId="2C346781">
+          <wp:inline distT="0" distB="0" distL="0" distR="0" wp14:anchorId="7FFAF5D9" wp14:editId="59B67254">
             <wp:extent cx="5334000" cy="2714625"/>
             <wp:effectExtent l="0" t="0" r="0" b="0"/>
             <wp:docPr id="1" name="図 1"/>
@@ -119,7 +119,7 @@
           <w:sz w:val="22"/>
           <w:szCs w:val="22"/>
         </w:rPr>
-        <w:t>: wfview-win 2.30</w:t>
+        <w:t>: wfview-win 2.31</w:t>
       </w:r>
       <w:r>
         <w:rPr>
@@ -215,7 +215,7 @@
     <w:sdt>
       <w:sdtPr>
         <w:alias w:val="目次"/>
-        <w:id w:val="-854344097"/>
+        <w:id w:val="948830887"/>
       </w:sdtPr>
       <w:sdtEndPr>
         <w:rPr>
@@ -252,7 +252,7 @@
           <w:r>
             <w:fldChar w:fldCharType="separate"/>
           </w:r>
-          <w:hyperlink w:anchor="_Toc243507511" w:history="1">
+          <w:hyperlink w:anchor="_Toc243507603" w:history="1">
             <w:r>
               <w:rPr>
                 <w:rStyle w:val="a5"/>
@@ -276,7 +276,7 @@
               <w:rPr>
                 <w:noProof/>
               </w:rPr>
-              <w:instrText xml:space="preserve"> PAGEREF _Toc243507511 \h </w:instrText>
+              <w:instrText xml:space="preserve"> PAGEREF _Toc243507603 \h </w:instrText>
             </w:r>
             <w:r>
               <w:rPr>
@@ -318,7 +318,7 @@
               <w14:ligatures w14:val="standardContextual"/>
             </w:rPr>
           </w:pPr>
-          <w:hyperlink w:anchor="_Toc243507512" w:history="1">
+          <w:hyperlink w:anchor="_Toc243507604" w:history="1">
             <w:r>
               <w:rPr>
                 <w:rStyle w:val="a5"/>
@@ -342,7 +342,7 @@
               <w:rPr>
                 <w:noProof/>
               </w:rPr>
-              <w:instrText xml:space="preserve"> PAGEREF _Toc243507512 \h </w:instrText>
+              <w:instrText xml:space="preserve"> PAGEREF _Toc243507604 \h </w:instrText>
             </w:r>
             <w:r>
               <w:rPr>
@@ -384,7 +384,7 @@
               <w14:ligatures w14:val="standardContextual"/>
             </w:rPr>
           </w:pPr>
-          <w:hyperlink w:anchor="_Toc243507513" w:history="1">
+          <w:hyperlink w:anchor="_Toc243507605" w:history="1">
             <w:r>
               <w:rPr>
                 <w:rStyle w:val="a5"/>
@@ -408,7 +408,7 @@
               <w:rPr>
                 <w:noProof/>
               </w:rPr>
-              <w:instrText xml:space="preserve"> PAGEREF _Toc243507513 \h </w:instrText>
+              <w:instrText xml:space="preserve"> PAGEREF _Toc243507605 \h </w:instrText>
             </w:r>
             <w:r>
               <w:rPr>
@@ -452,7 +452,7 @@
               <w14:ligatures w14:val="standardContextual"/>
             </w:rPr>
           </w:pPr>
-          <w:hyperlink w:anchor="_Toc243507514" w:history="1">
+          <w:hyperlink w:anchor="_Toc243507606" w:history="1">
             <w:r>
               <w:rPr>
                 <w:rStyle w:val="a5"/>
@@ -476,7 +476,7 @@
               <w:rPr>
                 <w:noProof/>
               </w:rPr>
-              <w:instrText xml:space="preserve"> PAGEREF _Toc243507514 \h </w:instrText>
+              <w:instrText xml:space="preserve"> PAGEREF _Toc243507606 \h </w:instrText>
             </w:r>
             <w:r>
               <w:rPr>
@@ -518,7 +518,7 @@
               <w14:ligatures w14:val="standardContextual"/>
             </w:rPr>
           </w:pPr>
-          <w:hyperlink w:anchor="_Toc243507515" w:history="1">
+          <w:hyperlink w:anchor="_Toc243507607" w:history="1">
             <w:r>
               <w:rPr>
                 <w:rStyle w:val="a5"/>
@@ -542,7 +542,7 @@
               <w:rPr>
                 <w:noProof/>
               </w:rPr>
-              <w:instrText xml:space="preserve"> PAGEREF _Toc243507515 \h </w:instrText>
+              <w:instrText xml:space="preserve"> PAGEREF _Toc243507607 \h </w:instrText>
             </w:r>
             <w:r>
               <w:rPr>
@@ -584,7 +584,7 @@
               <w14:ligatures w14:val="standardContextual"/>
             </w:rPr>
           </w:pPr>
-          <w:hyperlink w:anchor="_Toc243507516" w:history="1">
+          <w:hyperlink w:anchor="_Toc243507608" w:history="1">
             <w:r>
               <w:rPr>
                 <w:rStyle w:val="a5"/>
@@ -608,7 +608,7 @@
               <w:rPr>
                 <w:noProof/>
               </w:rPr>
-              <w:instrText xml:space="preserve"> PAGEREF _Toc243507516 \h </w:instrText>
+              <w:instrText xml:space="preserve"> PAGEREF _Toc243507608 \h </w:instrText>
             </w:r>
             <w:r>
               <w:rPr>
@@ -650,7 +650,7 @@
               <w14:ligatures w14:val="standardContextual"/>
             </w:rPr>
           </w:pPr>
-          <w:hyperlink w:anchor="_Toc243507517" w:history="1">
+          <w:hyperlink w:anchor="_Toc243507609" w:history="1">
             <w:r>
               <w:rPr>
                 <w:rStyle w:val="a5"/>
@@ -674,7 +674,7 @@
               <w:rPr>
                 <w:noProof/>
               </w:rPr>
-              <w:instrText xml:space="preserve"> PAGEREF _Toc243507517 \h </w:instrText>
+              <w:instrText xml:space="preserve"> PAGEREF _Toc243507609 \h </w:instrText>
             </w:r>
             <w:r>
               <w:rPr>
@@ -716,7 +716,7 @@
               <w14:ligatures w14:val="standardContextual"/>
             </w:rPr>
           </w:pPr>
-          <w:hyperlink w:anchor="_Toc243507518" w:history="1">
+          <w:hyperlink w:anchor="_Toc243507610" w:history="1">
             <w:r>
               <w:rPr>
                 <w:rStyle w:val="a5"/>
@@ -740,7 +740,7 @@
               <w:rPr>
                 <w:noProof/>
               </w:rPr>
-              <w:instrText xml:space="preserve"> PAGEREF _Toc243507518 \h </w:instrText>
+              <w:instrText xml:space="preserve"> PAGEREF _Toc243507610 \h </w:instrText>
             </w:r>
             <w:r>
               <w:rPr>
@@ -784,7 +784,7 @@
               <w14:ligatures w14:val="standardContextual"/>
             </w:rPr>
           </w:pPr>
-          <w:hyperlink w:anchor="_Toc243507519" w:history="1">
+          <w:hyperlink w:anchor="_Toc243507611" w:history="1">
             <w:r>
               <w:rPr>
                 <w:rStyle w:val="a5"/>
@@ -808,7 +808,7 @@
               <w:rPr>
                 <w:noProof/>
               </w:rPr>
-              <w:instrText xml:space="preserve"> PAGEREF _Toc243507519 \h </w:instrText>
+              <w:instrText xml:space="preserve"> PAGEREF _Toc243507611 \h </w:instrText>
             </w:r>
             <w:r>
               <w:rPr>
@@ -852,7 +852,7 @@
               <w14:ligatures w14:val="standardContextual"/>
             </w:rPr>
           </w:pPr>
-          <w:hyperlink w:anchor="_Toc243507520" w:history="1">
+          <w:hyperlink w:anchor="_Toc243507612" w:history="1">
             <w:r>
               <w:rPr>
                 <w:rStyle w:val="a5"/>
@@ -876,7 +876,7 @@
               <w:rPr>
                 <w:noProof/>
               </w:rPr>
-              <w:instrText xml:space="preserve"> PAGEREF _Toc243507520 \h </w:instrText>
+              <w:instrText xml:space="preserve"> PAGEREF _Toc243507612 \h </w:instrText>
             </w:r>
             <w:r>
               <w:rPr>
@@ -918,7 +918,7 @@
               <w14:ligatures w14:val="standardContextual"/>
             </w:rPr>
           </w:pPr>
-          <w:hyperlink w:anchor="_Toc243507521" w:history="1">
+          <w:hyperlink w:anchor="_Toc243507613" w:history="1">
             <w:r>
               <w:rPr>
                 <w:rStyle w:val="a5"/>
@@ -942,7 +942,7 @@
               <w:rPr>
                 <w:noProof/>
               </w:rPr>
-              <w:instrText xml:space="preserve"> PAGEREF _Toc243507521 \h </w:instrText>
+              <w:instrText xml:space="preserve"> PAGEREF _Toc243507613 \h </w:instrText>
             </w:r>
             <w:r>
               <w:rPr>
@@ -984,7 +984,7 @@
               <w14:ligatures w14:val="standardContextual"/>
             </w:rPr>
           </w:pPr>
-          <w:hyperlink w:anchor="_Toc243507522" w:history="1">
+          <w:hyperlink w:anchor="_Toc243507614" w:history="1">
             <w:r>
               <w:rPr>
                 <w:rStyle w:val="a5"/>
@@ -1008,7 +1008,7 @@
               <w:rPr>
                 <w:noProof/>
               </w:rPr>
-              <w:instrText xml:space="preserve"> PAGEREF _Toc243507522 \h </w:instrText>
+              <w:instrText xml:space="preserve"> PAGEREF _Toc243507614 \h </w:instrText>
             </w:r>
             <w:r>
               <w:rPr>
@@ -1050,7 +1050,7 @@
               <w14:ligatures w14:val="standardContextual"/>
             </w:rPr>
           </w:pPr>
-          <w:hyperlink w:anchor="_Toc243507523" w:history="1">
+          <w:hyperlink w:anchor="_Toc243507615" w:history="1">
             <w:r>
               <w:rPr>
                 <w:rStyle w:val="a5"/>
@@ -1074,7 +1074,7 @@
               <w:rPr>
                 <w:noProof/>
               </w:rPr>
-              <w:instrText xml:space="preserve"> PAGEREF _Toc243507523 \h </w:instrText>
+              <w:instrText xml:space="preserve"> PAGEREF _Toc243507615 \h </w:instrText>
             </w:r>
             <w:r>
               <w:rPr>
@@ -1116,7 +1116,7 @@
               <w14:ligatures w14:val="standardContextual"/>
             </w:rPr>
           </w:pPr>
-          <w:hyperlink w:anchor="_Toc243507524" w:history="1">
+          <w:hyperlink w:anchor="_Toc243507616" w:history="1">
             <w:r>
               <w:rPr>
                 <w:rStyle w:val="a5"/>
@@ -1140,7 +1140,7 @@
               <w:rPr>
                 <w:noProof/>
               </w:rPr>
-              <w:instrText xml:space="preserve"> PAGEREF _Toc243507524 \h </w:instrText>
+              <w:instrText xml:space="preserve"> PAGEREF _Toc243507616 \h </w:instrText>
             </w:r>
             <w:r>
               <w:rPr>
@@ -1182,7 +1182,7 @@
               <w14:ligatures w14:val="standardContextual"/>
             </w:rPr>
           </w:pPr>
-          <w:hyperlink w:anchor="_Toc243507525" w:history="1">
+          <w:hyperlink w:anchor="_Toc243507617" w:history="1">
             <w:r>
               <w:rPr>
                 <w:rStyle w:val="a5"/>
@@ -1206,7 +1206,7 @@
               <w:rPr>
                 <w:noProof/>
               </w:rPr>
-              <w:instrText xml:space="preserve"> PAGEREF _Toc243507525 \h </w:instrText>
+              <w:instrText xml:space="preserve"> PAGEREF _Toc243507617 \h </w:instrText>
             </w:r>
             <w:r>
               <w:rPr>
@@ -1250,7 +1250,7 @@
               <w14:ligatures w14:val="standardContextual"/>
             </w:rPr>
           </w:pPr>
-          <w:hyperlink w:anchor="_Toc243507526" w:history="1">
+          <w:hyperlink w:anchor="_Toc243507618" w:history="1">
             <w:r>
               <w:rPr>
                 <w:rStyle w:val="a5"/>
@@ -1274,7 +1274,7 @@
               <w:rPr>
                 <w:noProof/>
               </w:rPr>
-              <w:instrText xml:space="preserve"> PAGEREF _Toc243507526 \h </w:instrText>
+              <w:instrText xml:space="preserve"> PAGEREF _Toc243507618 \h </w:instrText>
             </w:r>
             <w:r>
               <w:rPr>
@@ -1318,7 +1318,7 @@
               <w14:ligatures w14:val="standardContextual"/>
             </w:rPr>
           </w:pPr>
-          <w:hyperlink w:anchor="_Toc243507527" w:history="1">
+          <w:hyperlink w:anchor="_Toc243507619" w:history="1">
             <w:r>
               <w:rPr>
                 <w:rStyle w:val="a5"/>
@@ -1342,7 +1342,7 @@
               <w:rPr>
                 <w:noProof/>
               </w:rPr>
-              <w:instrText xml:space="preserve"> PAGEREF _Toc243507527 \h </w:instrText>
+              <w:instrText xml:space="preserve"> PAGEREF _Toc243507619 \h </w:instrText>
             </w:r>
             <w:r>
               <w:rPr>
@@ -1384,7 +1384,7 @@
               <w14:ligatures w14:val="standardContextual"/>
             </w:rPr>
           </w:pPr>
-          <w:hyperlink w:anchor="_Toc243507528" w:history="1">
+          <w:hyperlink w:anchor="_Toc243507620" w:history="1">
             <w:r>
               <w:rPr>
                 <w:rStyle w:val="a5"/>
@@ -1408,7 +1408,7 @@
               <w:rPr>
                 <w:noProof/>
               </w:rPr>
-              <w:instrText xml:space="preserve"> PAGEREF _Toc243507528 \h </w:instrText>
+              <w:instrText xml:space="preserve"> PAGEREF _Toc243507620 \h </w:instrText>
             </w:r>
             <w:r>
               <w:rPr>
@@ -1450,7 +1450,7 @@
               <w14:ligatures w14:val="standardContextual"/>
             </w:rPr>
           </w:pPr>
-          <w:hyperlink w:anchor="_Toc243507529" w:history="1">
+          <w:hyperlink w:anchor="_Toc243507621" w:history="1">
             <w:r>
               <w:rPr>
                 <w:rStyle w:val="a5"/>
@@ -1474,7 +1474,7 @@
               <w:rPr>
                 <w:noProof/>
               </w:rPr>
-              <w:instrText xml:space="preserve"> PAGEREF _Toc243507529 \h </w:instrText>
+              <w:instrText xml:space="preserve"> PAGEREF _Toc243507621 \h </w:instrText>
             </w:r>
             <w:r>
               <w:rPr>
@@ -1516,7 +1516,7 @@
               <w14:ligatures w14:val="standardContextual"/>
             </w:rPr>
           </w:pPr>
-          <w:hyperlink w:anchor="_Toc243507530" w:history="1">
+          <w:hyperlink w:anchor="_Toc243507622" w:history="1">
             <w:r>
               <w:rPr>
                 <w:rStyle w:val="a5"/>
@@ -1540,7 +1540,7 @@
               <w:rPr>
                 <w:noProof/>
               </w:rPr>
-              <w:instrText xml:space="preserve"> PAGEREF _Toc243507530 \h </w:instrText>
+              <w:instrText xml:space="preserve"> PAGEREF _Toc243507622 \h </w:instrText>
             </w:r>
             <w:r>
               <w:rPr>
@@ -1582,7 +1582,7 @@
               <w14:ligatures w14:val="standardContextual"/>
             </w:rPr>
           </w:pPr>
-          <w:hyperlink w:anchor="_Toc243507531" w:history="1">
+          <w:hyperlink w:anchor="_Toc243507623" w:history="1">
             <w:r>
               <w:rPr>
                 <w:rStyle w:val="a5"/>
@@ -1606,7 +1606,7 @@
               <w:rPr>
                 <w:noProof/>
               </w:rPr>
-              <w:instrText xml:space="preserve"> PAGEREF _Toc243507531 \h </w:instrText>
+              <w:instrText xml:space="preserve"> PAGEREF _Toc243507623 \h </w:instrText>
             </w:r>
             <w:r>
               <w:rPr>
@@ -1648,7 +1648,7 @@
               <w14:ligatures w14:val="standardContextual"/>
             </w:rPr>
           </w:pPr>
-          <w:hyperlink w:anchor="_Toc243507532" w:history="1">
+          <w:hyperlink w:anchor="_Toc243507624" w:history="1">
             <w:r>
               <w:rPr>
                 <w:rStyle w:val="a5"/>
@@ -1672,7 +1672,7 @@
               <w:rPr>
                 <w:noProof/>
               </w:rPr>
-              <w:instrText xml:space="preserve"> PAGEREF _Toc243507532 \h </w:instrText>
+              <w:instrText xml:space="preserve"> PAGEREF _Toc243507624 \h </w:instrText>
             </w:r>
             <w:r>
               <w:rPr>
@@ -1714,7 +1714,7 @@
               <w14:ligatures w14:val="standardContextual"/>
             </w:rPr>
           </w:pPr>
-          <w:hyperlink w:anchor="_Toc243507533" w:history="1">
+          <w:hyperlink w:anchor="_Toc243507625" w:history="1">
             <w:r>
               <w:rPr>
                 <w:rStyle w:val="a5"/>
@@ -1738,7 +1738,7 @@
               <w:rPr>
                 <w:noProof/>
               </w:rPr>
-              <w:instrText xml:space="preserve"> PAGEREF _Toc243507533 \h </w:instrText>
+              <w:instrText xml:space="preserve"> PAGEREF _Toc243507625 \h </w:instrText>
             </w:r>
             <w:r>
               <w:rPr>
@@ -1780,7 +1780,7 @@
               <w14:ligatures w14:val="standardContextual"/>
             </w:rPr>
           </w:pPr>
-          <w:hyperlink w:anchor="_Toc243507534" w:history="1">
+          <w:hyperlink w:anchor="_Toc243507626" w:history="1">
             <w:r>
               <w:rPr>
                 <w:rStyle w:val="a5"/>
@@ -1804,7 +1804,7 @@
               <w:rPr>
                 <w:noProof/>
               </w:rPr>
-              <w:instrText xml:space="preserve"> PAGEREF _Toc243507534 \h </w:instrText>
+              <w:instrText xml:space="preserve"> PAGEREF _Toc243507626 \h </w:instrText>
             </w:r>
             <w:r>
               <w:rPr>
@@ -1846,7 +1846,7 @@
               <w14:ligatures w14:val="standardContextual"/>
             </w:rPr>
           </w:pPr>
-          <w:hyperlink w:anchor="_Toc243507535" w:history="1">
+          <w:hyperlink w:anchor="_Toc243507627" w:history="1">
             <w:r>
               <w:rPr>
                 <w:rStyle w:val="a5"/>
@@ -1870,7 +1870,7 @@
               <w:rPr>
                 <w:noProof/>
               </w:rPr>
-              <w:instrText xml:space="preserve"> PAGEREF _Toc243507535 \h </w:instrText>
+              <w:instrText xml:space="preserve"> PAGEREF _Toc243507627 \h </w:instrText>
             </w:r>
             <w:r>
               <w:rPr>
@@ -1914,7 +1914,7 @@
               <w14:ligatures w14:val="standardContextual"/>
             </w:rPr>
           </w:pPr>
-          <w:hyperlink w:anchor="_Toc243507536" w:history="1">
+          <w:hyperlink w:anchor="_Toc243507628" w:history="1">
             <w:r>
               <w:rPr>
                 <w:rStyle w:val="a5"/>
@@ -1938,7 +1938,7 @@
               <w:rPr>
                 <w:noProof/>
               </w:rPr>
-              <w:instrText xml:space="preserve"> PAGEREF _Toc243507536 \h </w:instrText>
+              <w:instrText xml:space="preserve"> PAGEREF _Toc243507628 \h </w:instrText>
             </w:r>
             <w:r>
               <w:rPr>
@@ -1980,7 +1980,7 @@
               <w14:ligatures w14:val="standardContextual"/>
             </w:rPr>
           </w:pPr>
-          <w:hyperlink w:anchor="_Toc243507537" w:history="1">
+          <w:hyperlink w:anchor="_Toc243507629" w:history="1">
             <w:r>
               <w:rPr>
                 <w:rStyle w:val="a5"/>
@@ -2004,7 +2004,7 @@
               <w:rPr>
                 <w:noProof/>
               </w:rPr>
-              <w:instrText xml:space="preserve"> PAGEREF _Toc243507537 \h </w:instrText>
+              <w:instrText xml:space="preserve"> PAGEREF _Toc243507629 \h </w:instrText>
             </w:r>
             <w:r>
               <w:rPr>
@@ -2046,7 +2046,7 @@
               <w14:ligatures w14:val="standardContextual"/>
             </w:rPr>
           </w:pPr>
-          <w:hyperlink w:anchor="_Toc243507538" w:history="1">
+          <w:hyperlink w:anchor="_Toc243507630" w:history="1">
             <w:r>
               <w:rPr>
                 <w:rStyle w:val="a5"/>
@@ -2070,7 +2070,7 @@
               <w:rPr>
                 <w:noProof/>
               </w:rPr>
-              <w:instrText xml:space="preserve"> PAGEREF _Toc243507538 \h </w:instrText>
+              <w:instrText xml:space="preserve"> PAGEREF _Toc243507630 \h </w:instrText>
             </w:r>
             <w:r>
               <w:rPr>
@@ -2112,7 +2112,7 @@
               <w14:ligatures w14:val="standardContextual"/>
             </w:rPr>
           </w:pPr>
-          <w:hyperlink w:anchor="_Toc243507539" w:history="1">
+          <w:hyperlink w:anchor="_Toc243507631" w:history="1">
             <w:r>
               <w:rPr>
                 <w:rStyle w:val="a5"/>
@@ -2136,7 +2136,7 @@
               <w:rPr>
                 <w:noProof/>
               </w:rPr>
-              <w:instrText xml:space="preserve"> PAGEREF _Toc243507539 \h </w:instrText>
+              <w:instrText xml:space="preserve"> PAGEREF _Toc243507631 \h </w:instrText>
             </w:r>
             <w:r>
               <w:rPr>
@@ -2178,7 +2178,7 @@
               <w14:ligatures w14:val="standardContextual"/>
             </w:rPr>
           </w:pPr>
-          <w:hyperlink w:anchor="_Toc243507540" w:history="1">
+          <w:hyperlink w:anchor="_Toc243507632" w:history="1">
             <w:r>
               <w:rPr>
                 <w:rStyle w:val="a5"/>
@@ -2202,7 +2202,7 @@
               <w:rPr>
                 <w:noProof/>
               </w:rPr>
-              <w:instrText xml:space="preserve"> PAGEREF _Toc243507540 \h </w:instrText>
+              <w:instrText xml:space="preserve"> PAGEREF _Toc243507632 \h </w:instrText>
             </w:r>
             <w:r>
               <w:rPr>
@@ -2244,7 +2244,7 @@
               <w14:ligatures w14:val="standardContextual"/>
             </w:rPr>
           </w:pPr>
-          <w:hyperlink w:anchor="_Toc243507541" w:history="1">
+          <w:hyperlink w:anchor="_Toc243507633" w:history="1">
             <w:r>
               <w:rPr>
                 <w:rStyle w:val="a5"/>
@@ -2268,7 +2268,7 @@
               <w:rPr>
                 <w:noProof/>
               </w:rPr>
-              <w:instrText xml:space="preserve"> PAGEREF _Toc243507541 \h </w:instrText>
+              <w:instrText xml:space="preserve"> PAGEREF _Toc243507633 \h </w:instrText>
             </w:r>
             <w:r>
               <w:rPr>
@@ -2312,7 +2312,7 @@
               <w14:ligatures w14:val="standardContextual"/>
             </w:rPr>
           </w:pPr>
-          <w:hyperlink w:anchor="_Toc243507542" w:history="1">
+          <w:hyperlink w:anchor="_Toc243507634" w:history="1">
             <w:r>
               <w:rPr>
                 <w:rStyle w:val="a5"/>
@@ -2336,7 +2336,7 @@
               <w:rPr>
                 <w:noProof/>
               </w:rPr>
-              <w:instrText xml:space="preserve"> PAGEREF _Toc243507542 \h </w:instrText>
+              <w:instrText xml:space="preserve"> PAGEREF _Toc243507634 \h </w:instrText>
             </w:r>
             <w:r>
               <w:rPr>
@@ -2378,7 +2378,7 @@
               <w14:ligatures w14:val="standardContextual"/>
             </w:rPr>
           </w:pPr>
-          <w:hyperlink w:anchor="_Toc243507543" w:history="1">
+          <w:hyperlink w:anchor="_Toc243507635" w:history="1">
             <w:r>
               <w:rPr>
                 <w:rStyle w:val="a5"/>
@@ -2402,7 +2402,7 @@
               <w:rPr>
                 <w:noProof/>
               </w:rPr>
-              <w:instrText xml:space="preserve"> PAGEREF _Toc243507543 \h </w:instrText>
+              <w:instrText xml:space="preserve"> PAGEREF _Toc243507635 \h </w:instrText>
             </w:r>
             <w:r>
               <w:rPr>
@@ -2444,7 +2444,7 @@
               <w14:ligatures w14:val="standardContextual"/>
             </w:rPr>
           </w:pPr>
-          <w:hyperlink w:anchor="_Toc243507544" w:history="1">
+          <w:hyperlink w:anchor="_Toc243507636" w:history="1">
             <w:r>
               <w:rPr>
                 <w:rStyle w:val="a5"/>
@@ -2468,7 +2468,7 @@
               <w:rPr>
                 <w:noProof/>
               </w:rPr>
-              <w:instrText xml:space="preserve"> PAGEREF _Toc243507544 \h </w:instrText>
+              <w:instrText xml:space="preserve"> PAGEREF _Toc243507636 \h </w:instrText>
             </w:r>
             <w:r>
               <w:rPr>
@@ -2510,7 +2510,7 @@
               <w14:ligatures w14:val="standardContextual"/>
             </w:rPr>
           </w:pPr>
-          <w:hyperlink w:anchor="_Toc243507545" w:history="1">
+          <w:hyperlink w:anchor="_Toc243507637" w:history="1">
             <w:r>
               <w:rPr>
                 <w:rStyle w:val="a5"/>
@@ -2534,7 +2534,7 @@
               <w:rPr>
                 <w:noProof/>
               </w:rPr>
-              <w:instrText xml:space="preserve"> PAGEREF _Toc243507545 \h </w:instrText>
+              <w:instrText xml:space="preserve"> PAGEREF _Toc243507637 \h </w:instrText>
             </w:r>
             <w:r>
               <w:rPr>
@@ -2578,7 +2578,7 @@
               <w14:ligatures w14:val="standardContextual"/>
             </w:rPr>
           </w:pPr>
-          <w:hyperlink w:anchor="_Toc243507546" w:history="1">
+          <w:hyperlink w:anchor="_Toc243507638" w:history="1">
             <w:r>
               <w:rPr>
                 <w:rStyle w:val="a5"/>
@@ -2602,7 +2602,7 @@
               <w:rPr>
                 <w:noProof/>
               </w:rPr>
-              <w:instrText xml:space="preserve"> PAGEREF _Toc243507546 \h </w:instrText>
+              <w:instrText xml:space="preserve"> PAGEREF _Toc243507638 \h </w:instrText>
             </w:r>
             <w:r>
               <w:rPr>
@@ -2644,7 +2644,7 @@
               <w14:ligatures w14:val="standardContextual"/>
             </w:rPr>
           </w:pPr>
-          <w:hyperlink w:anchor="_Toc243507547" w:history="1">
+          <w:hyperlink w:anchor="_Toc243507639" w:history="1">
             <w:r>
               <w:rPr>
                 <w:rStyle w:val="a5"/>
@@ -2668,7 +2668,7 @@
               <w:rPr>
                 <w:noProof/>
               </w:rPr>
-              <w:instrText xml:space="preserve"> PAGEREF _Toc243507547 \h </w:instrText>
+              <w:instrText xml:space="preserve"> PAGEREF _Toc243507639 \h </w:instrText>
             </w:r>
             <w:r>
               <w:rPr>
@@ -2710,7 +2710,7 @@
               <w14:ligatures w14:val="standardContextual"/>
             </w:rPr>
           </w:pPr>
-          <w:hyperlink w:anchor="_Toc243507548" w:history="1">
+          <w:hyperlink w:anchor="_Toc243507640" w:history="1">
             <w:r>
               <w:rPr>
                 <w:rStyle w:val="a5"/>
@@ -2734,7 +2734,7 @@
               <w:rPr>
                 <w:noProof/>
               </w:rPr>
-              <w:instrText xml:space="preserve"> PAGEREF _Toc243507548 \h </w:instrText>
+              <w:instrText xml:space="preserve"> PAGEREF _Toc243507640 \h </w:instrText>
             </w:r>
             <w:r>
               <w:rPr>
@@ -2776,7 +2776,7 @@
               <w14:ligatures w14:val="standardContextual"/>
             </w:rPr>
           </w:pPr>
-          <w:hyperlink w:anchor="_Toc243507549" w:history="1">
+          <w:hyperlink w:anchor="_Toc243507641" w:history="1">
             <w:r>
               <w:rPr>
                 <w:rStyle w:val="a5"/>
@@ -2800,7 +2800,7 @@
               <w:rPr>
                 <w:noProof/>
               </w:rPr>
-              <w:instrText xml:space="preserve"> PAGEREF _Toc243507549 \h </w:instrText>
+              <w:instrText xml:space="preserve"> PAGEREF _Toc243507641 \h </w:instrText>
             </w:r>
             <w:r>
               <w:rPr>
@@ -2844,7 +2844,7 @@
               <w14:ligatures w14:val="standardContextual"/>
             </w:rPr>
           </w:pPr>
-          <w:hyperlink w:anchor="_Toc243507550" w:history="1">
+          <w:hyperlink w:anchor="_Toc243507642" w:history="1">
             <w:r>
               <w:rPr>
                 <w:rStyle w:val="a5"/>
@@ -2868,7 +2868,7 @@
               <w:rPr>
                 <w:noProof/>
               </w:rPr>
-              <w:instrText xml:space="preserve"> PAGEREF _Toc243507550 \h </w:instrText>
+              <w:instrText xml:space="preserve"> PAGEREF _Toc243507642 \h </w:instrText>
             </w:r>
             <w:r>
               <w:rPr>
@@ -2910,7 +2910,7 @@
               <w14:ligatures w14:val="standardContextual"/>
             </w:rPr>
           </w:pPr>
-          <w:hyperlink w:anchor="_Toc243507551" w:history="1">
+          <w:hyperlink w:anchor="_Toc243507643" w:history="1">
             <w:r>
               <w:rPr>
                 <w:rStyle w:val="a5"/>
@@ -2934,7 +2934,7 @@
               <w:rPr>
                 <w:noProof/>
               </w:rPr>
-              <w:instrText xml:space="preserve"> PAGEREF _Toc243507551 \h </w:instrText>
+              <w:instrText xml:space="preserve"> PAGEREF _Toc243507643 \h </w:instrText>
             </w:r>
             <w:r>
               <w:rPr>
@@ -2976,7 +2976,7 @@
               <w14:ligatures w14:val="standardContextual"/>
             </w:rPr>
           </w:pPr>
-          <w:hyperlink w:anchor="_Toc243507552" w:history="1">
+          <w:hyperlink w:anchor="_Toc243507644" w:history="1">
             <w:r>
               <w:rPr>
                 <w:rStyle w:val="a5"/>
@@ -3000,7 +3000,7 @@
               <w:rPr>
                 <w:noProof/>
               </w:rPr>
-              <w:instrText xml:space="preserve"> PAGEREF _Toc243507552 \h </w:instrText>
+              <w:instrText xml:space="preserve"> PAGEREF _Toc243507644 \h </w:instrText>
             </w:r>
             <w:r>
               <w:rPr>
@@ -3042,7 +3042,7 @@
               <w14:ligatures w14:val="standardContextual"/>
             </w:rPr>
           </w:pPr>
-          <w:hyperlink w:anchor="_Toc243507553" w:history="1">
+          <w:hyperlink w:anchor="_Toc243507645" w:history="1">
             <w:r>
               <w:rPr>
                 <w:rStyle w:val="a5"/>
@@ -3066,7 +3066,7 @@
               <w:rPr>
                 <w:noProof/>
               </w:rPr>
-              <w:instrText xml:space="preserve"> PAGEREF _Toc243507553 \h </w:instrText>
+              <w:instrText xml:space="preserve"> PAGEREF _Toc243507645 \h </w:instrText>
             </w:r>
             <w:r>
               <w:rPr>
@@ -3108,7 +3108,7 @@
               <w14:ligatures w14:val="standardContextual"/>
             </w:rPr>
           </w:pPr>
-          <w:hyperlink w:anchor="_Toc243507554" w:history="1">
+          <w:hyperlink w:anchor="_Toc243507646" w:history="1">
             <w:r>
               <w:rPr>
                 <w:rStyle w:val="a5"/>
@@ -3132,7 +3132,7 @@
               <w:rPr>
                 <w:noProof/>
               </w:rPr>
-              <w:instrText xml:space="preserve"> PAGEREF _Toc243507554 \h </w:instrText>
+              <w:instrText xml:space="preserve"> PAGEREF _Toc243507646 \h </w:instrText>
             </w:r>
             <w:r>
               <w:rPr>
@@ -3171,7 +3171,7 @@
         <w:pStyle w:val="1"/>
         <w:pageBreakBefore/>
       </w:pPr>
-      <w:bookmarkStart w:id="0" w:name="_Toc243507511"/>
+      <w:bookmarkStart w:id="0" w:name="_Toc243507603"/>
       <w:r>
         <w:lastRenderedPageBreak/>
         <w:t xml:space="preserve">1. </w:t>
@@ -3240,7 +3240,7 @@
       <w:pPr>
         <w:pStyle w:val="2"/>
       </w:pPr>
-      <w:bookmarkStart w:id="1" w:name="_Toc243507512"/>
+      <w:bookmarkStart w:id="1" w:name="_Toc243507604"/>
       <w:r>
         <w:t xml:space="preserve">1.1 </w:t>
       </w:r>
@@ -3422,7 +3422,7 @@
       <w:pPr>
         <w:pStyle w:val="2"/>
       </w:pPr>
-      <w:bookmarkStart w:id="2" w:name="_Toc243507513"/>
+      <w:bookmarkStart w:id="2" w:name="_Toc243507605"/>
       <w:r>
         <w:t xml:space="preserve">1.2 </w:t>
       </w:r>
@@ -3546,7 +3546,7 @@
         <w:pStyle w:val="1"/>
         <w:pageBreakBefore/>
       </w:pPr>
-      <w:bookmarkStart w:id="3" w:name="_Toc243507514"/>
+      <w:bookmarkStart w:id="3" w:name="_Toc243507606"/>
       <w:r>
         <w:lastRenderedPageBreak/>
         <w:t xml:space="preserve">2. </w:t>
@@ -3560,7 +3560,7 @@
       <w:pPr>
         <w:pStyle w:val="2"/>
       </w:pPr>
-      <w:bookmarkStart w:id="4" w:name="_Toc243507515"/>
+      <w:bookmarkStart w:id="4" w:name="_Toc243507607"/>
       <w:r>
         <w:t xml:space="preserve">2.1 </w:t>
       </w:r>
@@ -4574,7 +4574,7 @@
       <w:pPr>
         <w:pStyle w:val="2"/>
       </w:pPr>
-      <w:bookmarkStart w:id="5" w:name="_Toc243507516"/>
+      <w:bookmarkStart w:id="5" w:name="_Toc243507608"/>
       <w:r>
         <w:t xml:space="preserve">2.2 </w:t>
       </w:r>
@@ -4697,7 +4697,7 @@
       <w:pPr>
         <w:pStyle w:val="2"/>
       </w:pPr>
-      <w:bookmarkStart w:id="6" w:name="_Toc243507517"/>
+      <w:bookmarkStart w:id="6" w:name="_Toc243507609"/>
       <w:r>
         <w:t xml:space="preserve">2.3 wfview-win </w:t>
       </w:r>
@@ -4894,7 +4894,7 @@
       <w:pPr>
         <w:pStyle w:val="2"/>
       </w:pPr>
-      <w:bookmarkStart w:id="7" w:name="_Toc243507518"/>
+      <w:bookmarkStart w:id="7" w:name="_Toc243507610"/>
       <w:r>
         <w:t xml:space="preserve">2.4 </w:t>
       </w:r>
@@ -5031,7 +5031,7 @@
         <w:pStyle w:val="1"/>
         <w:pageBreakBefore/>
       </w:pPr>
-      <w:bookmarkStart w:id="8" w:name="_Toc243507519"/>
+      <w:bookmarkStart w:id="8" w:name="_Toc243507611"/>
       <w:r>
         <w:lastRenderedPageBreak/>
         <w:t xml:space="preserve">3. </w:t>
@@ -5051,10 +5051,10 @@
           <w:noProof/>
         </w:rPr>
         <w:drawing>
-          <wp:inline distT="0" distB="0" distL="0" distR="0" wp14:anchorId="71737D3A" wp14:editId="76981134">
+          <wp:inline distT="0" distB="0" distL="0" distR="0" wp14:anchorId="474CDAF4" wp14:editId="6A78A5B2">
             <wp:extent cx="6096000" cy="3105150"/>
             <wp:effectExtent l="0" t="0" r="0" b="0"/>
-            <wp:docPr id="1922854476" name="図 1922854476"/>
+            <wp:docPr id="718582764" name="図 718582764"/>
             <wp:cNvGraphicFramePr>
               <a:graphicFrameLocks xmlns:a="http://schemas.openxmlformats.org/drawingml/2006/main" noChangeAspect="1"/>
             </wp:cNvGraphicFramePr>
@@ -6107,7 +6107,7 @@
         <w:pStyle w:val="1"/>
         <w:pageBreakBefore/>
       </w:pPr>
-      <w:bookmarkStart w:id="9" w:name="_Toc243507520"/>
+      <w:bookmarkStart w:id="9" w:name="_Toc243507612"/>
       <w:r>
         <w:lastRenderedPageBreak/>
         <w:t xml:space="preserve">4. </w:t>
@@ -6121,7 +6121,7 @@
       <w:pPr>
         <w:pStyle w:val="2"/>
       </w:pPr>
-      <w:bookmarkStart w:id="10" w:name="_Toc243507521"/>
+      <w:bookmarkStart w:id="10" w:name="_Toc243507613"/>
       <w:r>
         <w:t xml:space="preserve">4.1 </w:t>
       </w:r>
@@ -6304,10 +6304,10 @@
           <w:noProof/>
         </w:rPr>
         <w:drawing>
-          <wp:inline distT="0" distB="0" distL="0" distR="0" wp14:anchorId="42D8F0E6" wp14:editId="179E8EE2">
+          <wp:inline distT="0" distB="0" distL="0" distR="0" wp14:anchorId="31797C73" wp14:editId="1CA81901">
             <wp:extent cx="4000500" cy="2171700"/>
             <wp:effectExtent l="0" t="0" r="0" b="0"/>
-            <wp:docPr id="251523065" name="図 251523065"/>
+            <wp:docPr id="454237724" name="図 454237724"/>
             <wp:cNvGraphicFramePr>
               <a:graphicFrameLocks xmlns:a="http://schemas.openxmlformats.org/drawingml/2006/main" noChangeAspect="1"/>
             </wp:cNvGraphicFramePr>
@@ -7424,7 +7424,7 @@
       <w:pPr>
         <w:pStyle w:val="2"/>
       </w:pPr>
-      <w:bookmarkStart w:id="11" w:name="_Toc243507522"/>
+      <w:bookmarkStart w:id="11" w:name="_Toc243507614"/>
       <w:r>
         <w:t xml:space="preserve">4.2 </w:t>
       </w:r>
@@ -7504,7 +7504,7 @@
       <w:pPr>
         <w:pStyle w:val="2"/>
       </w:pPr>
-      <w:bookmarkStart w:id="12" w:name="_Toc243507523"/>
+      <w:bookmarkStart w:id="12" w:name="_Toc243507615"/>
       <w:r>
         <w:t xml:space="preserve">4.3 </w:t>
       </w:r>
@@ -7553,7 +7553,7 @@
       <w:pPr>
         <w:pStyle w:val="2"/>
       </w:pPr>
-      <w:bookmarkStart w:id="13" w:name="_Toc243507524"/>
+      <w:bookmarkStart w:id="13" w:name="_Toc243507616"/>
       <w:r>
         <w:t xml:space="preserve">4.4 </w:t>
       </w:r>
@@ -7677,7 +7677,7 @@
       <w:pPr>
         <w:pStyle w:val="2"/>
       </w:pPr>
-      <w:bookmarkStart w:id="14" w:name="_Toc243507525"/>
+      <w:bookmarkStart w:id="14" w:name="_Toc243507617"/>
       <w:r>
         <w:t xml:space="preserve">4.5 </w:t>
       </w:r>
@@ -7715,7 +7715,7 @@
         <w:pStyle w:val="1"/>
         <w:pageBreakBefore/>
       </w:pPr>
-      <w:bookmarkStart w:id="15" w:name="_Toc243507526"/>
+      <w:bookmarkStart w:id="15" w:name="_Toc243507618"/>
       <w:r>
         <w:lastRenderedPageBreak/>
         <w:t xml:space="preserve">5. </w:t>
@@ -7894,7 +7894,7 @@
         <w:pStyle w:val="1"/>
         <w:pageBreakBefore/>
       </w:pPr>
-      <w:bookmarkStart w:id="16" w:name="_Toc243507527"/>
+      <w:bookmarkStart w:id="16" w:name="_Toc243507619"/>
       <w:r>
         <w:lastRenderedPageBreak/>
         <w:t xml:space="preserve">6. A / B / C / F </w:t>
@@ -7989,10 +7989,10 @@
           <w:noProof/>
         </w:rPr>
         <w:drawing>
-          <wp:inline distT="0" distB="0" distL="0" distR="0" wp14:anchorId="38DC3A16" wp14:editId="73AD2A7E">
+          <wp:inline distT="0" distB="0" distL="0" distR="0" wp14:anchorId="77D3EAF1" wp14:editId="17E90681">
             <wp:extent cx="4762500" cy="800100"/>
             <wp:effectExtent l="0" t="0" r="0" b="0"/>
-            <wp:docPr id="1893095526" name="図 1893095526"/>
+            <wp:docPr id="60329330" name="図 60329330"/>
             <wp:cNvGraphicFramePr>
               <a:graphicFrameLocks xmlns:a="http://schemas.openxmlformats.org/drawingml/2006/main" noChangeAspect="1"/>
             </wp:cNvGraphicFramePr>
@@ -8132,10 +8132,10 @@
           <w:noProof/>
         </w:rPr>
         <w:drawing>
-          <wp:inline distT="0" distB="0" distL="0" distR="0" wp14:anchorId="55440F12" wp14:editId="2F030393">
+          <wp:inline distT="0" distB="0" distL="0" distR="0" wp14:anchorId="61AB4C84" wp14:editId="03A35300">
             <wp:extent cx="4762500" cy="800100"/>
             <wp:effectExtent l="0" t="0" r="0" b="0"/>
-            <wp:docPr id="1433742128" name="図 1433742128"/>
+            <wp:docPr id="1699529321" name="図 1699529321"/>
             <wp:cNvGraphicFramePr>
               <a:graphicFrameLocks xmlns:a="http://schemas.openxmlformats.org/drawingml/2006/main" noChangeAspect="1"/>
             </wp:cNvGraphicFramePr>
@@ -8275,10 +8275,10 @@
           <w:noProof/>
         </w:rPr>
         <w:drawing>
-          <wp:inline distT="0" distB="0" distL="0" distR="0" wp14:anchorId="21ACF6AC" wp14:editId="037FD6EA">
+          <wp:inline distT="0" distB="0" distL="0" distR="0" wp14:anchorId="2BB3E1D2" wp14:editId="2EEAFF52">
             <wp:extent cx="4762500" cy="800100"/>
             <wp:effectExtent l="0" t="0" r="0" b="0"/>
-            <wp:docPr id="1695887473" name="図 1695887473"/>
+            <wp:docPr id="484099299" name="図 484099299"/>
             <wp:cNvGraphicFramePr>
               <a:graphicFrameLocks xmlns:a="http://schemas.openxmlformats.org/drawingml/2006/main" noChangeAspect="1"/>
             </wp:cNvGraphicFramePr>
@@ -8891,7 +8891,7 @@
       <w:pPr>
         <w:pStyle w:val="2"/>
       </w:pPr>
-      <w:bookmarkStart w:id="17" w:name="_Toc243507528"/>
+      <w:bookmarkStart w:id="17" w:name="_Toc243507620"/>
       <w:r>
         <w:t>6.1 A/B</w:t>
       </w:r>
@@ -8945,7 +8945,7 @@
       <w:pPr>
         <w:pStyle w:val="2"/>
       </w:pPr>
-      <w:bookmarkStart w:id="18" w:name="_Toc243507529"/>
+      <w:bookmarkStart w:id="18" w:name="_Toc243507621"/>
       <w:r>
         <w:t>6.2 SPL</w:t>
       </w:r>
@@ -9002,7 +9002,7 @@
       <w:pPr>
         <w:pStyle w:val="2"/>
       </w:pPr>
-      <w:bookmarkStart w:id="19" w:name="_Toc243507530"/>
+      <w:bookmarkStart w:id="19" w:name="_Toc243507622"/>
       <w:r>
         <w:lastRenderedPageBreak/>
         <w:t>6.3 CLAR</w:t>
@@ -9139,7 +9139,7 @@
       <w:pPr>
         <w:pStyle w:val="2"/>
       </w:pPr>
-      <w:bookmarkStart w:id="20" w:name="_Toc243507531"/>
+      <w:bookmarkStart w:id="20" w:name="_Toc243507623"/>
       <w:r>
         <w:t>6.4 RPT</w:t>
       </w:r>
@@ -9208,7 +9208,7 @@
       <w:pPr>
         <w:pStyle w:val="2"/>
       </w:pPr>
-      <w:bookmarkStart w:id="21" w:name="_Toc243507532"/>
+      <w:bookmarkStart w:id="21" w:name="_Toc243507624"/>
       <w:r>
         <w:t>6.5 TON</w:t>
       </w:r>
@@ -9283,7 +9283,7 @@
       <w:pPr>
         <w:pStyle w:val="2"/>
       </w:pPr>
-      <w:bookmarkStart w:id="22" w:name="_Toc243507533"/>
+      <w:bookmarkStart w:id="22" w:name="_Toc243507625"/>
       <w:r>
         <w:t>6.6 SET</w:t>
       </w:r>
@@ -9720,7 +9720,7 @@
       <w:pPr>
         <w:pStyle w:val="2"/>
       </w:pPr>
-      <w:bookmarkStart w:id="23" w:name="_Toc243507534"/>
+      <w:bookmarkStart w:id="23" w:name="_Toc243507626"/>
       <w:r>
         <w:t>6.7 NAR</w:t>
       </w:r>
@@ -9768,7 +9768,7 @@
       <w:pPr>
         <w:pStyle w:val="2"/>
       </w:pPr>
-      <w:bookmarkStart w:id="24" w:name="_Toc243507535"/>
+      <w:bookmarkStart w:id="24" w:name="_Toc243507627"/>
       <w:r>
         <w:t>6.8 STEP</w:t>
       </w:r>
@@ -9796,7 +9796,7 @@
         <w:pStyle w:val="1"/>
         <w:pageBreakBefore/>
       </w:pPr>
-      <w:bookmarkStart w:id="25" w:name="_Toc243507536"/>
+      <w:bookmarkStart w:id="25" w:name="_Toc243507628"/>
       <w:r>
         <w:lastRenderedPageBreak/>
         <w:t xml:space="preserve">7. </w:t>
@@ -9848,10 +9848,10 @@
           <w:noProof/>
         </w:rPr>
         <w:drawing>
-          <wp:inline distT="0" distB="0" distL="0" distR="0" wp14:anchorId="5A648BD9" wp14:editId="5E55F08D">
+          <wp:inline distT="0" distB="0" distL="0" distR="0" wp14:anchorId="0851B1F4" wp14:editId="412483DB">
             <wp:extent cx="6096000" cy="542925"/>
             <wp:effectExtent l="0" t="0" r="0" b="0"/>
-            <wp:docPr id="483588171" name="図 483588171"/>
+            <wp:docPr id="999627858" name="図 999627858"/>
             <wp:cNvGraphicFramePr>
               <a:graphicFrameLocks xmlns:a="http://schemas.openxmlformats.org/drawingml/2006/main" noChangeAspect="1"/>
             </wp:cNvGraphicFramePr>
@@ -9921,7 +9921,7 @@
       <w:pPr>
         <w:pStyle w:val="2"/>
       </w:pPr>
-      <w:bookmarkStart w:id="26" w:name="_Toc243507537"/>
+      <w:bookmarkStart w:id="26" w:name="_Toc243507629"/>
       <w:r>
         <w:t xml:space="preserve">7.1 </w:t>
       </w:r>
@@ -10373,7 +10373,7 @@
       <w:pPr>
         <w:pStyle w:val="2"/>
       </w:pPr>
-      <w:bookmarkStart w:id="27" w:name="_Toc243507538"/>
+      <w:bookmarkStart w:id="27" w:name="_Toc243507630"/>
       <w:r>
         <w:t xml:space="preserve">7.2 </w:t>
       </w:r>
@@ -10469,7 +10469,7 @@
       <w:pPr>
         <w:pStyle w:val="2"/>
       </w:pPr>
-      <w:bookmarkStart w:id="28" w:name="_Toc243507539"/>
+      <w:bookmarkStart w:id="28" w:name="_Toc243507631"/>
       <w:r>
         <w:t xml:space="preserve">7.3 </w:t>
       </w:r>
@@ -10786,7 +10786,7 @@
       <w:pPr>
         <w:pStyle w:val="2"/>
       </w:pPr>
-      <w:bookmarkStart w:id="29" w:name="_Toc243507540"/>
+      <w:bookmarkStart w:id="29" w:name="_Toc243507632"/>
       <w:r>
         <w:t xml:space="preserve">7.4 </w:t>
       </w:r>
@@ -10853,7 +10853,7 @@
       <w:pPr>
         <w:pStyle w:val="2"/>
       </w:pPr>
-      <w:bookmarkStart w:id="30" w:name="_Toc243507541"/>
+      <w:bookmarkStart w:id="30" w:name="_Toc243507633"/>
       <w:r>
         <w:t xml:space="preserve">7.5 </w:t>
       </w:r>
@@ -10976,7 +10976,7 @@
         <w:pStyle w:val="1"/>
         <w:pageBreakBefore/>
       </w:pPr>
-      <w:bookmarkStart w:id="31" w:name="_Toc243507542"/>
+      <w:bookmarkStart w:id="31" w:name="_Toc243507634"/>
       <w:r>
         <w:lastRenderedPageBreak/>
         <w:t xml:space="preserve">8. LCD </w:t>
@@ -10996,10 +10996,10 @@
           <w:noProof/>
         </w:rPr>
         <w:drawing>
-          <wp:inline distT="0" distB="0" distL="0" distR="0" wp14:anchorId="21FA4091" wp14:editId="188BD15F">
+          <wp:inline distT="0" distB="0" distL="0" distR="0" wp14:anchorId="30E33476" wp14:editId="17606CC9">
             <wp:extent cx="4953000" cy="2695575"/>
             <wp:effectExtent l="0" t="0" r="0" b="0"/>
-            <wp:docPr id="263021183" name="図 263021183"/>
+            <wp:docPr id="471531442" name="図 471531442"/>
             <wp:cNvGraphicFramePr>
               <a:graphicFrameLocks xmlns:a="http://schemas.openxmlformats.org/drawingml/2006/main" noChangeAspect="1"/>
             </wp:cNvGraphicFramePr>
@@ -11085,7 +11085,7 @@
       <w:pPr>
         <w:pStyle w:val="2"/>
       </w:pPr>
-      <w:bookmarkStart w:id="32" w:name="_Toc243507543"/>
+      <w:bookmarkStart w:id="32" w:name="_Toc243507635"/>
       <w:r>
         <w:t xml:space="preserve">8.1 </w:t>
       </w:r>
@@ -11877,7 +11877,7 @@
       <w:pPr>
         <w:pStyle w:val="2"/>
       </w:pPr>
-      <w:bookmarkStart w:id="33" w:name="_Toc243507544"/>
+      <w:bookmarkStart w:id="33" w:name="_Toc243507636"/>
       <w:r>
         <w:lastRenderedPageBreak/>
         <w:t xml:space="preserve">8.2 2 </w:t>
@@ -12790,7 +12790,7 @@
       <w:pPr>
         <w:pStyle w:val="2"/>
       </w:pPr>
-      <w:bookmarkStart w:id="34" w:name="_Toc243507545"/>
+      <w:bookmarkStart w:id="34" w:name="_Toc243507637"/>
       <w:r>
         <w:t xml:space="preserve">8.3 </w:t>
       </w:r>
@@ -13061,7 +13061,7 @@
         <w:pStyle w:val="1"/>
         <w:pageBreakBefore/>
       </w:pPr>
-      <w:bookmarkStart w:id="35" w:name="_Toc243507546"/>
+      <w:bookmarkStart w:id="35" w:name="_Toc243507638"/>
       <w:r>
         <w:lastRenderedPageBreak/>
         <w:t xml:space="preserve">9. </w:t>
@@ -13075,7 +13075,7 @@
       <w:pPr>
         <w:pStyle w:val="2"/>
       </w:pPr>
-      <w:bookmarkStart w:id="36" w:name="_Toc243507547"/>
+      <w:bookmarkStart w:id="36" w:name="_Toc243507639"/>
       <w:r>
         <w:t xml:space="preserve">9.1 </w:t>
       </w:r>
@@ -13155,7 +13155,7 @@
       <w:pPr>
         <w:pStyle w:val="2"/>
       </w:pPr>
-      <w:bookmarkStart w:id="37" w:name="_Toc243507548"/>
+      <w:bookmarkStart w:id="37" w:name="_Toc243507640"/>
       <w:r>
         <w:t xml:space="preserve">9.2 </w:t>
       </w:r>
@@ -13858,7 +13858,7 @@
       <w:pPr>
         <w:pStyle w:val="2"/>
       </w:pPr>
-      <w:bookmarkStart w:id="38" w:name="_Toc243507549"/>
+      <w:bookmarkStart w:id="38" w:name="_Toc243507641"/>
       <w:r>
         <w:lastRenderedPageBreak/>
         <w:t xml:space="preserve">9.3 </w:t>
@@ -13974,7 +13974,7 @@
         <w:pStyle w:val="1"/>
         <w:pageBreakBefore/>
       </w:pPr>
-      <w:bookmarkStart w:id="39" w:name="_Toc243507550"/>
+      <w:bookmarkStart w:id="39" w:name="_Toc243507642"/>
       <w:r>
         <w:lastRenderedPageBreak/>
         <w:t xml:space="preserve">10. </w:t>
@@ -13988,7 +13988,7 @@
       <w:pPr>
         <w:pStyle w:val="2"/>
       </w:pPr>
-      <w:bookmarkStart w:id="40" w:name="_Toc243507551"/>
+      <w:bookmarkStart w:id="40" w:name="_Toc243507643"/>
       <w:r>
         <w:t xml:space="preserve">10.1 </w:t>
       </w:r>
@@ -14119,7 +14119,7 @@
       <w:pPr>
         <w:pStyle w:val="2"/>
       </w:pPr>
-      <w:bookmarkStart w:id="41" w:name="_Toc243507552"/>
+      <w:bookmarkStart w:id="41" w:name="_Toc243507644"/>
       <w:r>
         <w:t xml:space="preserve">10.2 </w:t>
       </w:r>
@@ -14383,7 +14383,7 @@
       <w:pPr>
         <w:pStyle w:val="2"/>
       </w:pPr>
-      <w:bookmarkStart w:id="42" w:name="_Toc243507553"/>
+      <w:bookmarkStart w:id="42" w:name="_Toc243507645"/>
       <w:r>
         <w:t xml:space="preserve">10.3 </w:t>
       </w:r>
@@ -14437,7 +14437,7 @@
       <w:pPr>
         <w:pStyle w:val="2"/>
       </w:pPr>
-      <w:bookmarkStart w:id="43" w:name="_Toc243507554"/>
+      <w:bookmarkStart w:id="43" w:name="_Toc243507646"/>
       <w:r>
         <w:t xml:space="preserve">10.4 </w:t>
       </w:r>
@@ -14595,10 +14595,64 @@
 <file path=word/numbering.xml><?xml version="1.0" encoding="utf-8"?>
 <w:numbering xmlns:wpc="http://schemas.microsoft.com/office/word/2010/wordprocessingCanvas" xmlns:cx="http://schemas.microsoft.com/office/drawing/2014/chartex" xmlns:cx1="http://schemas.microsoft.com/office/drawing/2015/9/8/chartex" xmlns:cx2="http://schemas.microsoft.com/office/drawing/2015/10/21/chartex" xmlns:cx3="http://schemas.microsoft.com/office/drawing/2016/5/9/chartex" xmlns:cx4="http://schemas.microsoft.com/office/drawing/2016/5/10/chartex" xmlns:cx5="http://schemas.microsoft.com/office/drawing/2016/5/11/chartex" xmlns:cx6="http://schemas.microsoft.com/office/drawing/2016/5/12/chartex" xmlns:cx7="http://schemas.microsoft.com/office/drawing/2016/5/13/chartex" xmlns:cx8="http://schemas.microsoft.com/office/drawing/2016/5/14/chartex" xmlns:mc="http://schemas.openxmlformats.org/markup-compatibility/2006" xmlns:aink="http://schemas.microsoft.com/office/drawing/2016/ink" xmlns:am3d="http://schemas.microsoft.com/office/drawing/2017/model3d" xmlns:o="urn:schemas-microsoft-com:office:office" xmlns:oel="http://schemas.microsoft.com/office/2019/extlst" xmlns:r="http://schemas.openxmlformats.org/officeDocument/2006/relationships" xmlns:m="http://schemas.openxmlformats.org/officeDocument/2006/math" xmlns:v="urn:schemas-microsoft-com:vml" xmlns:wp14="http://schemas.microsoft.com/office/word/2010/wordprocessingDrawing" xmlns:wp="http://schemas.openxmlformats.org/drawingml/2006/wordprocessingDrawing" xmlns:w10="urn:schemas-microsoft-com:office:word" xmlns:w="http://schemas.openxmlformats.org/wordprocessingml/2006/main" xmlns:w14="http://schemas.microsoft.com/office/word/2010/wordml" xmlns:w15="http://schemas.microsoft.com/office/word/2012/wordml" xmlns:w16cex="http://schemas.microsoft.com/office/word/2018/wordml/cex" xmlns:w16cid="http://schemas.microsoft.com/office/word/2016/wordml/cid" xmlns:w16="http://schemas.microsoft.com/office/word/2018/wordml" xmlns:w16du="http://schemas.microsoft.com/office/word/2023/wordml/word16du" xmlns:w16sdtdh="http://schemas.microsoft.com/office/word/2020/wordml/sdtdatahash" xmlns:w16sdtfl="http://schemas.microsoft.com/office/word/2024/wordml/sdtformatlock" xmlns:w16se="http://schemas.microsoft.com/office/word/2015/wordml/symex" xmlns:wpg="http://schemas.microsoft.com/office/word/2010/wordprocessingGroup" xmlns:wpi="http://schemas.microsoft.com/office/word/2010/wordprocessingInk" xmlns:wne="http://schemas.microsoft.com/office/word/2006/wordml" xmlns:wps="http://schemas.microsoft.com/office/word/2010/wordprocessingShape" mc:Ignorable="w14 w15 w16se w16cid w16 w16cex w16sdtdh w16sdtfl w16du wp14">
   <w:abstractNum w:abstractNumId="0" w15:restartNumberingAfterBreak="0">
-    <w:nsid w:val="1597662F"/>
+    <w:nsid w:val="07416B0B"/>
     <w:multiLevelType w:val="hybridMultilevel"/>
-    <w:tmpl w:val="AE023018"/>
-    <w:lvl w:ilvl="0" w:tplc="834EA5EC">
+    <w:tmpl w:val="C3C88BA4"/>
+    <w:lvl w:ilvl="0" w:tplc="B03682EC">
+      <w:start w:val="1"/>
+      <w:numFmt w:val="decimal"/>
+      <w:lvlText w:val="%1."/>
+      <w:lvlJc w:val="left"/>
+      <w:pPr>
+        <w:ind w:left="480" w:hanging="360"/>
+      </w:pPr>
+    </w:lvl>
+    <w:lvl w:ilvl="1" w:tplc="0A88438E">
+      <w:numFmt w:val="decimal"/>
+      <w:lvlText w:val=""/>
+      <w:lvlJc w:val="left"/>
+    </w:lvl>
+    <w:lvl w:ilvl="2" w:tplc="FB5CAA40">
+      <w:numFmt w:val="decimal"/>
+      <w:lvlText w:val=""/>
+      <w:lvlJc w:val="left"/>
+    </w:lvl>
+    <w:lvl w:ilvl="3" w:tplc="F15E2B5E">
+      <w:numFmt w:val="decimal"/>
+      <w:lvlText w:val=""/>
+      <w:lvlJc w:val="left"/>
+    </w:lvl>
+    <w:lvl w:ilvl="4" w:tplc="F8EC3196">
+      <w:numFmt w:val="decimal"/>
+      <w:lvlText w:val=""/>
+      <w:lvlJc w:val="left"/>
+    </w:lvl>
+    <w:lvl w:ilvl="5" w:tplc="AC8E77AA">
+      <w:numFmt w:val="decimal"/>
+      <w:lvlText w:val=""/>
+      <w:lvlJc w:val="left"/>
+    </w:lvl>
+    <w:lvl w:ilvl="6" w:tplc="29D8D184">
+      <w:numFmt w:val="decimal"/>
+      <w:lvlText w:val=""/>
+      <w:lvlJc w:val="left"/>
+    </w:lvl>
+    <w:lvl w:ilvl="7" w:tplc="573C1D88">
+      <w:numFmt w:val="decimal"/>
+      <w:lvlText w:val=""/>
+      <w:lvlJc w:val="left"/>
+    </w:lvl>
+    <w:lvl w:ilvl="8" w:tplc="45DA2C36">
+      <w:numFmt w:val="decimal"/>
+      <w:lvlText w:val=""/>
+      <w:lvlJc w:val="left"/>
+    </w:lvl>
+  </w:abstractNum>
+  <w:abstractNum w:abstractNumId="1" w15:restartNumberingAfterBreak="0">
+    <w:nsid w:val="1F967168"/>
+    <w:multiLevelType w:val="hybridMultilevel"/>
+    <w:tmpl w:val="DA407DEA"/>
+    <w:lvl w:ilvl="0" w:tplc="1ACC7A92">
       <w:start w:val="1"/>
       <w:numFmt w:val="bullet"/>
       <w:lvlText w:val="●"/>
@@ -14612,7 +14666,7 @@
         <w:szCs w:val="14"/>
       </w:rPr>
     </w:lvl>
-    <w:lvl w:ilvl="1" w:tplc="BE880D4C">
+    <w:lvl w:ilvl="1" w:tplc="C6F431A2">
       <w:start w:val="1"/>
       <w:numFmt w:val="bullet"/>
       <w:lvlText w:val="○"/>
@@ -14621,101 +14675,47 @@
         <w:ind w:left="900" w:hanging="300"/>
       </w:pPr>
     </w:lvl>
-    <w:lvl w:ilvl="2" w:tplc="78E41E4A">
+    <w:lvl w:ilvl="2" w:tplc="9AA05502">
       <w:numFmt w:val="decimal"/>
       <w:lvlText w:val=""/>
       <w:lvlJc w:val="left"/>
     </w:lvl>
-    <w:lvl w:ilvl="3" w:tplc="56241B56">
+    <w:lvl w:ilvl="3" w:tplc="914EDFC8">
       <w:numFmt w:val="decimal"/>
       <w:lvlText w:val=""/>
       <w:lvlJc w:val="left"/>
     </w:lvl>
-    <w:lvl w:ilvl="4" w:tplc="104A4242">
+    <w:lvl w:ilvl="4" w:tplc="9B5EE30A">
       <w:numFmt w:val="decimal"/>
       <w:lvlText w:val=""/>
       <w:lvlJc w:val="left"/>
     </w:lvl>
-    <w:lvl w:ilvl="5" w:tplc="57FE1048">
+    <w:lvl w:ilvl="5" w:tplc="8C202DF8">
       <w:numFmt w:val="decimal"/>
       <w:lvlText w:val=""/>
       <w:lvlJc w:val="left"/>
     </w:lvl>
-    <w:lvl w:ilvl="6" w:tplc="EB84B342">
+    <w:lvl w:ilvl="6" w:tplc="F5066F4A">
       <w:numFmt w:val="decimal"/>
       <w:lvlText w:val=""/>
       <w:lvlJc w:val="left"/>
     </w:lvl>
-    <w:lvl w:ilvl="7" w:tplc="84E02D76">
+    <w:lvl w:ilvl="7" w:tplc="FDA2FE1E">
       <w:numFmt w:val="decimal"/>
       <w:lvlText w:val=""/>
       <w:lvlJc w:val="left"/>
     </w:lvl>
-    <w:lvl w:ilvl="8" w:tplc="5F4E8D34">
-      <w:numFmt w:val="decimal"/>
-      <w:lvlText w:val=""/>
-      <w:lvlJc w:val="left"/>
-    </w:lvl>
-  </w:abstractNum>
-  <w:abstractNum w:abstractNumId="1" w15:restartNumberingAfterBreak="0">
-    <w:nsid w:val="188145CF"/>
-    <w:multiLevelType w:val="hybridMultilevel"/>
-    <w:tmpl w:val="9DA66B5C"/>
-    <w:lvl w:ilvl="0" w:tplc="197E5F7E">
-      <w:start w:val="1"/>
-      <w:numFmt w:val="decimal"/>
-      <w:lvlText w:val="%1."/>
-      <w:lvlJc w:val="left"/>
-      <w:pPr>
-        <w:ind w:left="480" w:hanging="360"/>
-      </w:pPr>
-    </w:lvl>
-    <w:lvl w:ilvl="1" w:tplc="D734A4B2">
-      <w:numFmt w:val="decimal"/>
-      <w:lvlText w:val=""/>
-      <w:lvlJc w:val="left"/>
-    </w:lvl>
-    <w:lvl w:ilvl="2" w:tplc="D8B63C9E">
-      <w:numFmt w:val="decimal"/>
-      <w:lvlText w:val=""/>
-      <w:lvlJc w:val="left"/>
-    </w:lvl>
-    <w:lvl w:ilvl="3" w:tplc="E3BA1412">
-      <w:numFmt w:val="decimal"/>
-      <w:lvlText w:val=""/>
-      <w:lvlJc w:val="left"/>
-    </w:lvl>
-    <w:lvl w:ilvl="4" w:tplc="42C26A2A">
-      <w:numFmt w:val="decimal"/>
-      <w:lvlText w:val=""/>
-      <w:lvlJc w:val="left"/>
-    </w:lvl>
-    <w:lvl w:ilvl="5" w:tplc="4AAC0620">
-      <w:numFmt w:val="decimal"/>
-      <w:lvlText w:val=""/>
-      <w:lvlJc w:val="left"/>
-    </w:lvl>
-    <w:lvl w:ilvl="6" w:tplc="367CBB80">
-      <w:numFmt w:val="decimal"/>
-      <w:lvlText w:val=""/>
-      <w:lvlJc w:val="left"/>
-    </w:lvl>
-    <w:lvl w:ilvl="7" w:tplc="8F008AE6">
-      <w:numFmt w:val="decimal"/>
-      <w:lvlText w:val=""/>
-      <w:lvlJc w:val="left"/>
-    </w:lvl>
-    <w:lvl w:ilvl="8" w:tplc="1FDC87FA">
+    <w:lvl w:ilvl="8" w:tplc="6900BF06">
       <w:numFmt w:val="decimal"/>
       <w:lvlText w:val=""/>
       <w:lvlJc w:val="left"/>
     </w:lvl>
   </w:abstractNum>
   <w:abstractNum w:abstractNumId="2" w15:restartNumberingAfterBreak="0">
-    <w:nsid w:val="3B323543"/>
+    <w:nsid w:val="4C6F0BC5"/>
     <w:multiLevelType w:val="hybridMultilevel"/>
-    <w:tmpl w:val="06F40804"/>
-    <w:lvl w:ilvl="0" w:tplc="EACE7B02">
+    <w:tmpl w:val="50FC31C4"/>
+    <w:lvl w:ilvl="0" w:tplc="9BC2078A">
       <w:start w:val="1"/>
       <w:numFmt w:val="decimal"/>
       <w:lvlText w:val="%1."/>
@@ -14724,52 +14724,138 @@
         <w:ind w:left="480" w:hanging="360"/>
       </w:pPr>
     </w:lvl>
-    <w:lvl w:ilvl="1" w:tplc="71B0CB88">
+    <w:lvl w:ilvl="1" w:tplc="8BFA5A22">
       <w:numFmt w:val="decimal"/>
       <w:lvlText w:val=""/>
       <w:lvlJc w:val="left"/>
     </w:lvl>
-    <w:lvl w:ilvl="2" w:tplc="9CCA8CFA">
+    <w:lvl w:ilvl="2" w:tplc="3148108C">
       <w:numFmt w:val="decimal"/>
       <w:lvlText w:val=""/>
       <w:lvlJc w:val="left"/>
     </w:lvl>
-    <w:lvl w:ilvl="3" w:tplc="FDF8B866">
+    <w:lvl w:ilvl="3" w:tplc="1DFEE93A">
       <w:numFmt w:val="decimal"/>
       <w:lvlText w:val=""/>
       <w:lvlJc w:val="left"/>
     </w:lvl>
-    <w:lvl w:ilvl="4" w:tplc="B7001226">
+    <w:lvl w:ilvl="4" w:tplc="11181CBE">
       <w:numFmt w:val="decimal"/>
       <w:lvlText w:val=""/>
       <w:lvlJc w:val="left"/>
     </w:lvl>
-    <w:lvl w:ilvl="5" w:tplc="9210DBA8">
+    <w:lvl w:ilvl="5" w:tplc="2AC6356E">
       <w:numFmt w:val="decimal"/>
       <w:lvlText w:val=""/>
       <w:lvlJc w:val="left"/>
     </w:lvl>
-    <w:lvl w:ilvl="6" w:tplc="61EAC56C">
+    <w:lvl w:ilvl="6" w:tplc="4578668E">
       <w:numFmt w:val="decimal"/>
       <w:lvlText w:val=""/>
       <w:lvlJc w:val="left"/>
     </w:lvl>
-    <w:lvl w:ilvl="7" w:tplc="714CF568">
+    <w:lvl w:ilvl="7" w:tplc="E2905E64">
       <w:numFmt w:val="decimal"/>
       <w:lvlText w:val=""/>
       <w:lvlJc w:val="left"/>
     </w:lvl>
-    <w:lvl w:ilvl="8" w:tplc="420C11AA">
+    <w:lvl w:ilvl="8" w:tplc="8C484DEE">
       <w:numFmt w:val="decimal"/>
       <w:lvlText w:val=""/>
       <w:lvlJc w:val="left"/>
     </w:lvl>
   </w:abstractNum>
   <w:abstractNum w:abstractNumId="3" w15:restartNumberingAfterBreak="0">
-    <w:nsid w:val="4E456F6E"/>
+    <w:nsid w:val="56D73D6D"/>
     <w:multiLevelType w:val="hybridMultilevel"/>
-    <w:tmpl w:val="376806F6"/>
-    <w:lvl w:ilvl="0" w:tplc="7DB4F044">
+    <w:tmpl w:val="C6B00988"/>
+    <w:lvl w:ilvl="0" w:tplc="FDE24C38">
+      <w:start w:val="1"/>
+      <w:numFmt w:val="bullet"/>
+      <w:lvlText w:val="●"/>
+      <w:lvlJc w:val="left"/>
+      <w:pPr>
+        <w:ind w:left="720" w:hanging="360"/>
+      </w:pPr>
+    </w:lvl>
+    <w:lvl w:ilvl="1" w:tplc="96FA628A">
+      <w:start w:val="1"/>
+      <w:numFmt w:val="bullet"/>
+      <w:lvlText w:val="○"/>
+      <w:lvlJc w:val="left"/>
+      <w:pPr>
+        <w:ind w:left="1440" w:hanging="360"/>
+      </w:pPr>
+    </w:lvl>
+    <w:lvl w:ilvl="2" w:tplc="A1CA717C">
+      <w:start w:val="1"/>
+      <w:numFmt w:val="bullet"/>
+      <w:lvlText w:val="■"/>
+      <w:lvlJc w:val="left"/>
+      <w:pPr>
+        <w:ind w:left="2160" w:hanging="360"/>
+      </w:pPr>
+    </w:lvl>
+    <w:lvl w:ilvl="3" w:tplc="2F505E10">
+      <w:start w:val="1"/>
+      <w:numFmt w:val="bullet"/>
+      <w:lvlText w:val="●"/>
+      <w:lvlJc w:val="left"/>
+      <w:pPr>
+        <w:ind w:left="2880" w:hanging="360"/>
+      </w:pPr>
+    </w:lvl>
+    <w:lvl w:ilvl="4" w:tplc="19CAB256">
+      <w:start w:val="1"/>
+      <w:numFmt w:val="bullet"/>
+      <w:lvlText w:val="○"/>
+      <w:lvlJc w:val="left"/>
+      <w:pPr>
+        <w:ind w:left="3600" w:hanging="360"/>
+      </w:pPr>
+    </w:lvl>
+    <w:lvl w:ilvl="5" w:tplc="3E8CDBAC">
+      <w:start w:val="1"/>
+      <w:numFmt w:val="bullet"/>
+      <w:lvlText w:val="■"/>
+      <w:lvlJc w:val="left"/>
+      <w:pPr>
+        <w:ind w:left="4320" w:hanging="360"/>
+      </w:pPr>
+    </w:lvl>
+    <w:lvl w:ilvl="6" w:tplc="F2728014">
+      <w:start w:val="1"/>
+      <w:numFmt w:val="bullet"/>
+      <w:lvlText w:val="●"/>
+      <w:lvlJc w:val="left"/>
+      <w:pPr>
+        <w:ind w:left="5040" w:hanging="360"/>
+      </w:pPr>
+    </w:lvl>
+    <w:lvl w:ilvl="7" w:tplc="ED7AF398">
+      <w:start w:val="1"/>
+      <w:numFmt w:val="bullet"/>
+      <w:lvlText w:val="●"/>
+      <w:lvlJc w:val="left"/>
+      <w:pPr>
+        <w:ind w:left="5760" w:hanging="360"/>
+      </w:pPr>
+    </w:lvl>
+    <w:lvl w:ilvl="8" w:tplc="C60A05B2">
+      <w:start w:val="1"/>
+      <w:numFmt w:val="bullet"/>
+      <w:lvlText w:val="●"/>
+      <w:lvlJc w:val="left"/>
+      <w:pPr>
+        <w:ind w:left="6480" w:hanging="360"/>
+      </w:pPr>
+    </w:lvl>
+  </w:abstractNum>
+  <w:abstractNum w:abstractNumId="4" w15:restartNumberingAfterBreak="0">
+    <w:nsid w:val="5E6A6127"/>
+    <w:multiLevelType w:val="hybridMultilevel"/>
+    <w:tmpl w:val="D63AE5E8"/>
+    <w:lvl w:ilvl="0" w:tplc="B7664638">
       <w:start w:val="1"/>
       <w:numFmt w:val="decimal"/>
       <w:lvlText w:val="%1."/>
@@ -14778,219 +14864,133 @@
         <w:ind w:left="480" w:hanging="360"/>
       </w:pPr>
     </w:lvl>
-    <w:lvl w:ilvl="1" w:tplc="FD8EB2F0">
+    <w:lvl w:ilvl="1" w:tplc="378C667A">
       <w:numFmt w:val="decimal"/>
       <w:lvlText w:val=""/>
       <w:lvlJc w:val="left"/>
     </w:lvl>
-    <w:lvl w:ilvl="2" w:tplc="48FE8888">
+    <w:lvl w:ilvl="2" w:tplc="F77C0C5C">
       <w:numFmt w:val="decimal"/>
       <w:lvlText w:val=""/>
       <w:lvlJc w:val="left"/>
     </w:lvl>
-    <w:lvl w:ilvl="3" w:tplc="6A08216A">
+    <w:lvl w:ilvl="3" w:tplc="7C6CBE02">
       <w:numFmt w:val="decimal"/>
       <w:lvlText w:val=""/>
       <w:lvlJc w:val="left"/>
     </w:lvl>
-    <w:lvl w:ilvl="4" w:tplc="4AC24DEE">
+    <w:lvl w:ilvl="4" w:tplc="E68C4242">
       <w:numFmt w:val="decimal"/>
       <w:lvlText w:val=""/>
       <w:lvlJc w:val="left"/>
     </w:lvl>
-    <w:lvl w:ilvl="5" w:tplc="1C6A7308">
+    <w:lvl w:ilvl="5" w:tplc="56C665DA">
       <w:numFmt w:val="decimal"/>
       <w:lvlText w:val=""/>
       <w:lvlJc w:val="left"/>
     </w:lvl>
-    <w:lvl w:ilvl="6" w:tplc="7AEC542E">
+    <w:lvl w:ilvl="6" w:tplc="EFE4C69E">
       <w:numFmt w:val="decimal"/>
       <w:lvlText w:val=""/>
       <w:lvlJc w:val="left"/>
     </w:lvl>
-    <w:lvl w:ilvl="7" w:tplc="F03EF95C">
+    <w:lvl w:ilvl="7" w:tplc="4F3E7674">
       <w:numFmt w:val="decimal"/>
       <w:lvlText w:val=""/>
       <w:lvlJc w:val="left"/>
     </w:lvl>
-    <w:lvl w:ilvl="8" w:tplc="CED8D902">
-      <w:numFmt w:val="decimal"/>
-      <w:lvlText w:val=""/>
-      <w:lvlJc w:val="left"/>
-    </w:lvl>
-  </w:abstractNum>
-  <w:abstractNum w:abstractNumId="4" w15:restartNumberingAfterBreak="0">
-    <w:nsid w:val="4F0A0709"/>
-    <w:multiLevelType w:val="hybridMultilevel"/>
-    <w:tmpl w:val="4F165AAE"/>
-    <w:lvl w:ilvl="0" w:tplc="26EECACE">
-      <w:start w:val="1"/>
-      <w:numFmt w:val="decimal"/>
-      <w:lvlText w:val="%1."/>
-      <w:lvlJc w:val="left"/>
-      <w:pPr>
-        <w:ind w:left="480" w:hanging="360"/>
-      </w:pPr>
-    </w:lvl>
-    <w:lvl w:ilvl="1" w:tplc="B9BA8EBC">
-      <w:numFmt w:val="decimal"/>
-      <w:lvlText w:val=""/>
-      <w:lvlJc w:val="left"/>
-    </w:lvl>
-    <w:lvl w:ilvl="2" w:tplc="658AF7EA">
-      <w:numFmt w:val="decimal"/>
-      <w:lvlText w:val=""/>
-      <w:lvlJc w:val="left"/>
-    </w:lvl>
-    <w:lvl w:ilvl="3" w:tplc="910E509A">
-      <w:numFmt w:val="decimal"/>
-      <w:lvlText w:val=""/>
-      <w:lvlJc w:val="left"/>
-    </w:lvl>
-    <w:lvl w:ilvl="4" w:tplc="84702E9C">
-      <w:numFmt w:val="decimal"/>
-      <w:lvlText w:val=""/>
-      <w:lvlJc w:val="left"/>
-    </w:lvl>
-    <w:lvl w:ilvl="5" w:tplc="A45842B2">
-      <w:numFmt w:val="decimal"/>
-      <w:lvlText w:val=""/>
-      <w:lvlJc w:val="left"/>
-    </w:lvl>
-    <w:lvl w:ilvl="6" w:tplc="36B89F78">
-      <w:numFmt w:val="decimal"/>
-      <w:lvlText w:val=""/>
-      <w:lvlJc w:val="left"/>
-    </w:lvl>
-    <w:lvl w:ilvl="7" w:tplc="36629B68">
-      <w:numFmt w:val="decimal"/>
-      <w:lvlText w:val=""/>
-      <w:lvlJc w:val="left"/>
-    </w:lvl>
-    <w:lvl w:ilvl="8" w:tplc="7D885E66">
+    <w:lvl w:ilvl="8" w:tplc="AD147530">
       <w:numFmt w:val="decimal"/>
       <w:lvlText w:val=""/>
       <w:lvlJc w:val="left"/>
     </w:lvl>
   </w:abstractNum>
   <w:abstractNum w:abstractNumId="5" w15:restartNumberingAfterBreak="0">
-    <w:nsid w:val="7C0C364D"/>
+    <w:nsid w:val="6A520A60"/>
     <w:multiLevelType w:val="hybridMultilevel"/>
-    <w:tmpl w:val="E8746C5A"/>
-    <w:lvl w:ilvl="0" w:tplc="46BC011C">
+    <w:tmpl w:val="6C3A6528"/>
+    <w:lvl w:ilvl="0" w:tplc="439C437C">
       <w:start w:val="1"/>
-      <w:numFmt w:val="bullet"/>
-      <w:lvlText w:val="●"/>
+      <w:numFmt w:val="decimal"/>
+      <w:lvlText w:val="%1."/>
       <w:lvlJc w:val="left"/>
       <w:pPr>
-        <w:ind w:left="720" w:hanging="360"/>
+        <w:ind w:left="480" w:hanging="360"/>
       </w:pPr>
     </w:lvl>
-    <w:lvl w:ilvl="1" w:tplc="D5AA9A0C">
-      <w:start w:val="1"/>
-      <w:numFmt w:val="bullet"/>
-      <w:lvlText w:val="○"/>
+    <w:lvl w:ilvl="1" w:tplc="7D36F3AE">
+      <w:numFmt w:val="decimal"/>
+      <w:lvlText w:val=""/>
       <w:lvlJc w:val="left"/>
-      <w:pPr>
-        <w:ind w:left="1440" w:hanging="360"/>
-      </w:pPr>
     </w:lvl>
-    <w:lvl w:ilvl="2" w:tplc="257205A4">
-      <w:start w:val="1"/>
-      <w:numFmt w:val="bullet"/>
-      <w:lvlText w:val="■"/>
+    <w:lvl w:ilvl="2" w:tplc="F3465FCE">
+      <w:numFmt w:val="decimal"/>
+      <w:lvlText w:val=""/>
       <w:lvlJc w:val="left"/>
-      <w:pPr>
-        <w:ind w:left="2160" w:hanging="360"/>
-      </w:pPr>
     </w:lvl>
-    <w:lvl w:ilvl="3" w:tplc="D2769BA8">
-      <w:start w:val="1"/>
-      <w:numFmt w:val="bullet"/>
-      <w:lvlText w:val="●"/>
+    <w:lvl w:ilvl="3" w:tplc="F0544CF8">
+      <w:numFmt w:val="decimal"/>
+      <w:lvlText w:val=""/>
       <w:lvlJc w:val="left"/>
-      <w:pPr>
-        <w:ind w:left="2880" w:hanging="360"/>
-      </w:pPr>
     </w:lvl>
-    <w:lvl w:ilvl="4" w:tplc="038C90CA">
-      <w:start w:val="1"/>
-      <w:numFmt w:val="bullet"/>
-      <w:lvlText w:val="○"/>
+    <w:lvl w:ilvl="4" w:tplc="40CC4824">
+      <w:numFmt w:val="decimal"/>
+      <w:lvlText w:val=""/>
       <w:lvlJc w:val="left"/>
-      <w:pPr>
-        <w:ind w:left="3600" w:hanging="360"/>
-      </w:pPr>
     </w:lvl>
-    <w:lvl w:ilvl="5" w:tplc="2B8E542E">
-      <w:start w:val="1"/>
-      <w:numFmt w:val="bullet"/>
-      <w:lvlText w:val="■"/>
+    <w:lvl w:ilvl="5" w:tplc="F9A02722">
+      <w:numFmt w:val="decimal"/>
+      <w:lvlText w:val=""/>
       <w:lvlJc w:val="left"/>
-      <w:pPr>
-        <w:ind w:left="4320" w:hanging="360"/>
-      </w:pPr>
     </w:lvl>
-    <w:lvl w:ilvl="6" w:tplc="C6508912">
-      <w:start w:val="1"/>
-      <w:numFmt w:val="bullet"/>
-      <w:lvlText w:val="●"/>
+    <w:lvl w:ilvl="6" w:tplc="9E36F1EA">
+      <w:numFmt w:val="decimal"/>
+      <w:lvlText w:val=""/>
       <w:lvlJc w:val="left"/>
-      <w:pPr>
-        <w:ind w:left="5040" w:hanging="360"/>
-      </w:pPr>
     </w:lvl>
-    <w:lvl w:ilvl="7" w:tplc="0556EC70">
-      <w:start w:val="1"/>
-      <w:numFmt w:val="bullet"/>
-      <w:lvlText w:val="●"/>
+    <w:lvl w:ilvl="7" w:tplc="3FF2B640">
+      <w:numFmt w:val="decimal"/>
+      <w:lvlText w:val=""/>
       <w:lvlJc w:val="left"/>
-      <w:pPr>
-        <w:ind w:left="5760" w:hanging="360"/>
-      </w:pPr>
     </w:lvl>
-    <w:lvl w:ilvl="8" w:tplc="2F4490E2">
-      <w:start w:val="1"/>
-      <w:numFmt w:val="bullet"/>
-      <w:lvlText w:val="●"/>
+    <w:lvl w:ilvl="8" w:tplc="5A00390E">
+      <w:numFmt w:val="decimal"/>
+      <w:lvlText w:val=""/>
       <w:lvlJc w:val="left"/>
-      <w:pPr>
-        <w:ind w:left="6480" w:hanging="360"/>
-      </w:pPr>
     </w:lvl>
   </w:abstractNum>
-  <w:num w:numId="1" w16cid:durableId="563761074">
-    <w:abstractNumId w:val="5"/>
+  <w:num w:numId="1" w16cid:durableId="787744296">
+    <w:abstractNumId w:val="3"/>
     <w:lvlOverride w:ilvl="0">
       <w:startOverride w:val="1"/>
     </w:lvlOverride>
   </w:num>
-  <w:num w:numId="2" w16cid:durableId="1583757754">
+  <w:num w:numId="2" w16cid:durableId="400644328">
+    <w:abstractNumId w:val="1"/>
+    <w:lvlOverride w:ilvl="0">
+      <w:startOverride w:val="1"/>
+    </w:lvlOverride>
+  </w:num>
+  <w:num w:numId="3" w16cid:durableId="335228438">
     <w:abstractNumId w:val="0"/>
     <w:lvlOverride w:ilvl="0">
       <w:startOverride w:val="1"/>
     </w:lvlOverride>
   </w:num>
-  <w:num w:numId="3" w16cid:durableId="2132438397">
+  <w:num w:numId="4" w16cid:durableId="808281755">
+    <w:abstractNumId w:val="4"/>
+    <w:lvlOverride w:ilvl="0">
+      <w:startOverride w:val="1"/>
+    </w:lvlOverride>
+  </w:num>
+  <w:num w:numId="5" w16cid:durableId="1594319217">
     <w:abstractNumId w:val="2"/>
     <w:lvlOverride w:ilvl="0">
       <w:startOverride w:val="1"/>
     </w:lvlOverride>
   </w:num>
-  <w:num w:numId="4" w16cid:durableId="876740690">
-    <w:abstractNumId w:val="3"/>
-    <w:lvlOverride w:ilvl="0">
-      <w:startOverride w:val="1"/>
-    </w:lvlOverride>
-  </w:num>
-  <w:num w:numId="5" w16cid:durableId="1611664016">
-    <w:abstractNumId w:val="1"/>
-    <w:lvlOverride w:ilvl="0">
-      <w:startOverride w:val="1"/>
-    </w:lvlOverride>
-  </w:num>
-  <w:num w:numId="6" w16cid:durableId="238560787">
-    <w:abstractNumId w:val="4"/>
+  <w:num w:numId="6" w16cid:durableId="1357273063">
+    <w:abstractNumId w:val="5"/>
     <w:lvlOverride w:ilvl="0">
       <w:startOverride w:val="1"/>
     </w:lvlOverride>
@@ -15610,7 +15610,7 @@
     <w:link w:val="aa"/>
     <w:uiPriority w:val="99"/>
     <w:unhideWhenUsed/>
-    <w:rsid w:val="003A4756"/>
+    <w:rsid w:val="005C2E56"/>
     <w:pPr>
       <w:tabs>
         <w:tab w:val="center" w:pos="4252"/>
@@ -15624,7 +15624,7 @@
     <w:basedOn w:val="a0"/>
     <w:link w:val="a9"/>
     <w:uiPriority w:val="99"/>
-    <w:rsid w:val="003A4756"/>
+    <w:rsid w:val="005C2E56"/>
   </w:style>
   <w:style w:type="paragraph" w:styleId="ab">
     <w:name w:val="footer"/>
@@ -15632,7 +15632,7 @@
     <w:link w:val="ac"/>
     <w:uiPriority w:val="99"/>
     <w:unhideWhenUsed/>
-    <w:rsid w:val="003A4756"/>
+    <w:rsid w:val="005C2E56"/>
     <w:pPr>
       <w:tabs>
         <w:tab w:val="center" w:pos="4252"/>
@@ -15646,7 +15646,7 @@
     <w:basedOn w:val="a0"/>
     <w:link w:val="ab"/>
     <w:uiPriority w:val="99"/>
-    <w:rsid w:val="003A4756"/>
+    <w:rsid w:val="005C2E56"/>
   </w:style>
 </w:styles>
 </file>

</xml_diff>

<commit_message>
Bump version to 2.32
FT-817 manual: band change auto-mode rules; manual covers updated to 2.32.

Co-Authored-By: Claude Opus 5.5 <noreply@anthropic.com>
</commit_message>
<xml_diff>
--- a/docs/FT-817_操作説明書.docx
+++ b/docs/FT-817_操作説明書.docx
@@ -63,7 +63,7 @@
           <w:noProof/>
         </w:rPr>
         <w:drawing>
-          <wp:inline distT="0" distB="0" distL="0" distR="0" wp14:anchorId="7FFAF5D9" wp14:editId="59B67254">
+          <wp:inline distT="0" distB="0" distL="0" distR="0" wp14:anchorId="4356E2A9" wp14:editId="7742510C">
             <wp:extent cx="5334000" cy="2714625"/>
             <wp:effectExtent l="0" t="0" r="0" b="0"/>
             <wp:docPr id="1" name="図 1"/>
@@ -119,7 +119,7 @@
           <w:sz w:val="22"/>
           <w:szCs w:val="22"/>
         </w:rPr>
-        <w:t>: wfview-win 2.31</w:t>
+        <w:t>: wfview-win 2.32</w:t>
       </w:r>
       <w:r>
         <w:rPr>
@@ -215,7 +215,7 @@
     <w:sdt>
       <w:sdtPr>
         <w:alias w:val="目次"/>
-        <w:id w:val="948830887"/>
+        <w:id w:val="-1813328740"/>
       </w:sdtPr>
       <w:sdtEndPr>
         <w:rPr>
@@ -252,7 +252,7 @@
           <w:r>
             <w:fldChar w:fldCharType="separate"/>
           </w:r>
-          <w:hyperlink w:anchor="_Toc243507603" w:history="1">
+          <w:hyperlink w:anchor="_Toc243509775" w:history="1">
             <w:r>
               <w:rPr>
                 <w:rStyle w:val="a5"/>
@@ -276,7 +276,7 @@
               <w:rPr>
                 <w:noProof/>
               </w:rPr>
-              <w:instrText xml:space="preserve"> PAGEREF _Toc243507603 \h </w:instrText>
+              <w:instrText xml:space="preserve"> PAGEREF _Toc243509775 \h </w:instrText>
             </w:r>
             <w:r>
               <w:rPr>
@@ -318,7 +318,7 @@
               <w14:ligatures w14:val="standardContextual"/>
             </w:rPr>
           </w:pPr>
-          <w:hyperlink w:anchor="_Toc243507604" w:history="1">
+          <w:hyperlink w:anchor="_Toc243509776" w:history="1">
             <w:r>
               <w:rPr>
                 <w:rStyle w:val="a5"/>
@@ -342,7 +342,7 @@
               <w:rPr>
                 <w:noProof/>
               </w:rPr>
-              <w:instrText xml:space="preserve"> PAGEREF _Toc243507604 \h </w:instrText>
+              <w:instrText xml:space="preserve"> PAGEREF _Toc243509776 \h </w:instrText>
             </w:r>
             <w:r>
               <w:rPr>
@@ -384,7 +384,7 @@
               <w14:ligatures w14:val="standardContextual"/>
             </w:rPr>
           </w:pPr>
-          <w:hyperlink w:anchor="_Toc243507605" w:history="1">
+          <w:hyperlink w:anchor="_Toc243509777" w:history="1">
             <w:r>
               <w:rPr>
                 <w:rStyle w:val="a5"/>
@@ -408,7 +408,7 @@
               <w:rPr>
                 <w:noProof/>
               </w:rPr>
-              <w:instrText xml:space="preserve"> PAGEREF _Toc243507605 \h </w:instrText>
+              <w:instrText xml:space="preserve"> PAGEREF _Toc243509777 \h </w:instrText>
             </w:r>
             <w:r>
               <w:rPr>
@@ -452,7 +452,7 @@
               <w14:ligatures w14:val="standardContextual"/>
             </w:rPr>
           </w:pPr>
-          <w:hyperlink w:anchor="_Toc243507606" w:history="1">
+          <w:hyperlink w:anchor="_Toc243509778" w:history="1">
             <w:r>
               <w:rPr>
                 <w:rStyle w:val="a5"/>
@@ -476,7 +476,7 @@
               <w:rPr>
                 <w:noProof/>
               </w:rPr>
-              <w:instrText xml:space="preserve"> PAGEREF _Toc243507606 \h </w:instrText>
+              <w:instrText xml:space="preserve"> PAGEREF _Toc243509778 \h </w:instrText>
             </w:r>
             <w:r>
               <w:rPr>
@@ -518,7 +518,7 @@
               <w14:ligatures w14:val="standardContextual"/>
             </w:rPr>
           </w:pPr>
-          <w:hyperlink w:anchor="_Toc243507607" w:history="1">
+          <w:hyperlink w:anchor="_Toc243509779" w:history="1">
             <w:r>
               <w:rPr>
                 <w:rStyle w:val="a5"/>
@@ -542,7 +542,7 @@
               <w:rPr>
                 <w:noProof/>
               </w:rPr>
-              <w:instrText xml:space="preserve"> PAGEREF _Toc243507607 \h </w:instrText>
+              <w:instrText xml:space="preserve"> PAGEREF _Toc243509779 \h </w:instrText>
             </w:r>
             <w:r>
               <w:rPr>
@@ -584,7 +584,7 @@
               <w14:ligatures w14:val="standardContextual"/>
             </w:rPr>
           </w:pPr>
-          <w:hyperlink w:anchor="_Toc243507608" w:history="1">
+          <w:hyperlink w:anchor="_Toc243509780" w:history="1">
             <w:r>
               <w:rPr>
                 <w:rStyle w:val="a5"/>
@@ -608,7 +608,7 @@
               <w:rPr>
                 <w:noProof/>
               </w:rPr>
-              <w:instrText xml:space="preserve"> PAGEREF _Toc243507608 \h </w:instrText>
+              <w:instrText xml:space="preserve"> PAGEREF _Toc243509780 \h </w:instrText>
             </w:r>
             <w:r>
               <w:rPr>
@@ -650,7 +650,7 @@
               <w14:ligatures w14:val="standardContextual"/>
             </w:rPr>
           </w:pPr>
-          <w:hyperlink w:anchor="_Toc243507609" w:history="1">
+          <w:hyperlink w:anchor="_Toc243509781" w:history="1">
             <w:r>
               <w:rPr>
                 <w:rStyle w:val="a5"/>
@@ -674,7 +674,7 @@
               <w:rPr>
                 <w:noProof/>
               </w:rPr>
-              <w:instrText xml:space="preserve"> PAGEREF _Toc243507609 \h </w:instrText>
+              <w:instrText xml:space="preserve"> PAGEREF _Toc243509781 \h </w:instrText>
             </w:r>
             <w:r>
               <w:rPr>
@@ -716,7 +716,7 @@
               <w14:ligatures w14:val="standardContextual"/>
             </w:rPr>
           </w:pPr>
-          <w:hyperlink w:anchor="_Toc243507610" w:history="1">
+          <w:hyperlink w:anchor="_Toc243509782" w:history="1">
             <w:r>
               <w:rPr>
                 <w:rStyle w:val="a5"/>
@@ -740,7 +740,7 @@
               <w:rPr>
                 <w:noProof/>
               </w:rPr>
-              <w:instrText xml:space="preserve"> PAGEREF _Toc243507610 \h </w:instrText>
+              <w:instrText xml:space="preserve"> PAGEREF _Toc243509782 \h </w:instrText>
             </w:r>
             <w:r>
               <w:rPr>
@@ -784,7 +784,7 @@
               <w14:ligatures w14:val="standardContextual"/>
             </w:rPr>
           </w:pPr>
-          <w:hyperlink w:anchor="_Toc243507611" w:history="1">
+          <w:hyperlink w:anchor="_Toc243509783" w:history="1">
             <w:r>
               <w:rPr>
                 <w:rStyle w:val="a5"/>
@@ -808,7 +808,7 @@
               <w:rPr>
                 <w:noProof/>
               </w:rPr>
-              <w:instrText xml:space="preserve"> PAGEREF _Toc243507611 \h </w:instrText>
+              <w:instrText xml:space="preserve"> PAGEREF _Toc243509783 \h </w:instrText>
             </w:r>
             <w:r>
               <w:rPr>
@@ -852,7 +852,7 @@
               <w14:ligatures w14:val="standardContextual"/>
             </w:rPr>
           </w:pPr>
-          <w:hyperlink w:anchor="_Toc243507612" w:history="1">
+          <w:hyperlink w:anchor="_Toc243509784" w:history="1">
             <w:r>
               <w:rPr>
                 <w:rStyle w:val="a5"/>
@@ -876,7 +876,7 @@
               <w:rPr>
                 <w:noProof/>
               </w:rPr>
-              <w:instrText xml:space="preserve"> PAGEREF _Toc243507612 \h </w:instrText>
+              <w:instrText xml:space="preserve"> PAGEREF _Toc243509784 \h </w:instrText>
             </w:r>
             <w:r>
               <w:rPr>
@@ -918,7 +918,7 @@
               <w14:ligatures w14:val="standardContextual"/>
             </w:rPr>
           </w:pPr>
-          <w:hyperlink w:anchor="_Toc243507613" w:history="1">
+          <w:hyperlink w:anchor="_Toc243509785" w:history="1">
             <w:r>
               <w:rPr>
                 <w:rStyle w:val="a5"/>
@@ -942,7 +942,7 @@
               <w:rPr>
                 <w:noProof/>
               </w:rPr>
-              <w:instrText xml:space="preserve"> PAGEREF _Toc243507613 \h </w:instrText>
+              <w:instrText xml:space="preserve"> PAGEREF _Toc243509785 \h </w:instrText>
             </w:r>
             <w:r>
               <w:rPr>
@@ -984,7 +984,7 @@
               <w14:ligatures w14:val="standardContextual"/>
             </w:rPr>
           </w:pPr>
-          <w:hyperlink w:anchor="_Toc243507614" w:history="1">
+          <w:hyperlink w:anchor="_Toc243509786" w:history="1">
             <w:r>
               <w:rPr>
                 <w:rStyle w:val="a5"/>
@@ -1008,7 +1008,7 @@
               <w:rPr>
                 <w:noProof/>
               </w:rPr>
-              <w:instrText xml:space="preserve"> PAGEREF _Toc243507614 \h </w:instrText>
+              <w:instrText xml:space="preserve"> PAGEREF _Toc243509786 \h </w:instrText>
             </w:r>
             <w:r>
               <w:rPr>
@@ -1050,7 +1050,7 @@
               <w14:ligatures w14:val="standardContextual"/>
             </w:rPr>
           </w:pPr>
-          <w:hyperlink w:anchor="_Toc243507615" w:history="1">
+          <w:hyperlink w:anchor="_Toc243509787" w:history="1">
             <w:r>
               <w:rPr>
                 <w:rStyle w:val="a5"/>
@@ -1074,7 +1074,7 @@
               <w:rPr>
                 <w:noProof/>
               </w:rPr>
-              <w:instrText xml:space="preserve"> PAGEREF _Toc243507615 \h </w:instrText>
+              <w:instrText xml:space="preserve"> PAGEREF _Toc243509787 \h </w:instrText>
             </w:r>
             <w:r>
               <w:rPr>
@@ -1116,7 +1116,7 @@
               <w14:ligatures w14:val="standardContextual"/>
             </w:rPr>
           </w:pPr>
-          <w:hyperlink w:anchor="_Toc243507616" w:history="1">
+          <w:hyperlink w:anchor="_Toc243509788" w:history="1">
             <w:r>
               <w:rPr>
                 <w:rStyle w:val="a5"/>
@@ -1140,7 +1140,7 @@
               <w:rPr>
                 <w:noProof/>
               </w:rPr>
-              <w:instrText xml:space="preserve"> PAGEREF _Toc243507616 \h </w:instrText>
+              <w:instrText xml:space="preserve"> PAGEREF _Toc243509788 \h </w:instrText>
             </w:r>
             <w:r>
               <w:rPr>
@@ -1157,7 +1157,7 @@
               <w:rPr>
                 <w:noProof/>
               </w:rPr>
-              <w:t>8</w:t>
+              <w:t>9</w:t>
             </w:r>
             <w:r>
               <w:rPr>
@@ -1182,7 +1182,7 @@
               <w14:ligatures w14:val="standardContextual"/>
             </w:rPr>
           </w:pPr>
-          <w:hyperlink w:anchor="_Toc243507617" w:history="1">
+          <w:hyperlink w:anchor="_Toc243509789" w:history="1">
             <w:r>
               <w:rPr>
                 <w:rStyle w:val="a5"/>
@@ -1206,7 +1206,7 @@
               <w:rPr>
                 <w:noProof/>
               </w:rPr>
-              <w:instrText xml:space="preserve"> PAGEREF _Toc243507617 \h </w:instrText>
+              <w:instrText xml:space="preserve"> PAGEREF _Toc243509789 \h </w:instrText>
             </w:r>
             <w:r>
               <w:rPr>
@@ -1223,7 +1223,7 @@
               <w:rPr>
                 <w:noProof/>
               </w:rPr>
-              <w:t>8</w:t>
+              <w:t>9</w:t>
             </w:r>
             <w:r>
               <w:rPr>
@@ -1250,7 +1250,7 @@
               <w14:ligatures w14:val="standardContextual"/>
             </w:rPr>
           </w:pPr>
-          <w:hyperlink w:anchor="_Toc243507618" w:history="1">
+          <w:hyperlink w:anchor="_Toc243509790" w:history="1">
             <w:r>
               <w:rPr>
                 <w:rStyle w:val="a5"/>
@@ -1274,7 +1274,7 @@
               <w:rPr>
                 <w:noProof/>
               </w:rPr>
-              <w:instrText xml:space="preserve"> PAGEREF _Toc243507618 \h </w:instrText>
+              <w:instrText xml:space="preserve"> PAGEREF _Toc243509790 \h </w:instrText>
             </w:r>
             <w:r>
               <w:rPr>
@@ -1291,7 +1291,7 @@
               <w:rPr>
                 <w:noProof/>
               </w:rPr>
-              <w:t>9</w:t>
+              <w:t>10</w:t>
             </w:r>
             <w:r>
               <w:rPr>
@@ -1318,7 +1318,7 @@
               <w14:ligatures w14:val="standardContextual"/>
             </w:rPr>
           </w:pPr>
-          <w:hyperlink w:anchor="_Toc243507619" w:history="1">
+          <w:hyperlink w:anchor="_Toc243509791" w:history="1">
             <w:r>
               <w:rPr>
                 <w:rStyle w:val="a5"/>
@@ -1342,7 +1342,7 @@
               <w:rPr>
                 <w:noProof/>
               </w:rPr>
-              <w:instrText xml:space="preserve"> PAGEREF _Toc243507619 \h </w:instrText>
+              <w:instrText xml:space="preserve"> PAGEREF _Toc243509791 \h </w:instrText>
             </w:r>
             <w:r>
               <w:rPr>
@@ -1359,7 +1359,7 @@
               <w:rPr>
                 <w:noProof/>
               </w:rPr>
-              <w:t>10</w:t>
+              <w:t>11</w:t>
             </w:r>
             <w:r>
               <w:rPr>
@@ -1384,7 +1384,7 @@
               <w14:ligatures w14:val="standardContextual"/>
             </w:rPr>
           </w:pPr>
-          <w:hyperlink w:anchor="_Toc243507620" w:history="1">
+          <w:hyperlink w:anchor="_Toc243509792" w:history="1">
             <w:r>
               <w:rPr>
                 <w:rStyle w:val="a5"/>
@@ -1408,7 +1408,7 @@
               <w:rPr>
                 <w:noProof/>
               </w:rPr>
-              <w:instrText xml:space="preserve"> PAGEREF _Toc243507620 \h </w:instrText>
+              <w:instrText xml:space="preserve"> PAGEREF _Toc243509792 \h </w:instrText>
             </w:r>
             <w:r>
               <w:rPr>
@@ -1425,7 +1425,7 @@
               <w:rPr>
                 <w:noProof/>
               </w:rPr>
-              <w:t>10</w:t>
+              <w:t>11</w:t>
             </w:r>
             <w:r>
               <w:rPr>
@@ -1450,7 +1450,7 @@
               <w14:ligatures w14:val="standardContextual"/>
             </w:rPr>
           </w:pPr>
-          <w:hyperlink w:anchor="_Toc243507621" w:history="1">
+          <w:hyperlink w:anchor="_Toc243509793" w:history="1">
             <w:r>
               <w:rPr>
                 <w:rStyle w:val="a5"/>
@@ -1474,7 +1474,7 @@
               <w:rPr>
                 <w:noProof/>
               </w:rPr>
-              <w:instrText xml:space="preserve"> PAGEREF _Toc243507621 \h </w:instrText>
+              <w:instrText xml:space="preserve"> PAGEREF _Toc243509793 \h </w:instrText>
             </w:r>
             <w:r>
               <w:rPr>
@@ -1491,7 +1491,7 @@
               <w:rPr>
                 <w:noProof/>
               </w:rPr>
-              <w:t>10</w:t>
+              <w:t>11</w:t>
             </w:r>
             <w:r>
               <w:rPr>
@@ -1516,7 +1516,7 @@
               <w14:ligatures w14:val="standardContextual"/>
             </w:rPr>
           </w:pPr>
-          <w:hyperlink w:anchor="_Toc243507622" w:history="1">
+          <w:hyperlink w:anchor="_Toc243509794" w:history="1">
             <w:r>
               <w:rPr>
                 <w:rStyle w:val="a5"/>
@@ -1540,7 +1540,7 @@
               <w:rPr>
                 <w:noProof/>
               </w:rPr>
-              <w:instrText xml:space="preserve"> PAGEREF _Toc243507622 \h </w:instrText>
+              <w:instrText xml:space="preserve"> PAGEREF _Toc243509794 \h </w:instrText>
             </w:r>
             <w:r>
               <w:rPr>
@@ -1557,7 +1557,7 @@
               <w:rPr>
                 <w:noProof/>
               </w:rPr>
-              <w:t>11</w:t>
+              <w:t>12</w:t>
             </w:r>
             <w:r>
               <w:rPr>
@@ -1582,7 +1582,7 @@
               <w14:ligatures w14:val="standardContextual"/>
             </w:rPr>
           </w:pPr>
-          <w:hyperlink w:anchor="_Toc243507623" w:history="1">
+          <w:hyperlink w:anchor="_Toc243509795" w:history="1">
             <w:r>
               <w:rPr>
                 <w:rStyle w:val="a5"/>
@@ -1606,7 +1606,7 @@
               <w:rPr>
                 <w:noProof/>
               </w:rPr>
-              <w:instrText xml:space="preserve"> PAGEREF _Toc243507623 \h </w:instrText>
+              <w:instrText xml:space="preserve"> PAGEREF _Toc243509795 \h </w:instrText>
             </w:r>
             <w:r>
               <w:rPr>
@@ -1623,7 +1623,7 @@
               <w:rPr>
                 <w:noProof/>
               </w:rPr>
-              <w:t>11</w:t>
+              <w:t>12</w:t>
             </w:r>
             <w:r>
               <w:rPr>
@@ -1648,7 +1648,7 @@
               <w14:ligatures w14:val="standardContextual"/>
             </w:rPr>
           </w:pPr>
-          <w:hyperlink w:anchor="_Toc243507624" w:history="1">
+          <w:hyperlink w:anchor="_Toc243509796" w:history="1">
             <w:r>
               <w:rPr>
                 <w:rStyle w:val="a5"/>
@@ -1672,7 +1672,7 @@
               <w:rPr>
                 <w:noProof/>
               </w:rPr>
-              <w:instrText xml:space="preserve"> PAGEREF _Toc243507624 \h </w:instrText>
+              <w:instrText xml:space="preserve"> PAGEREF _Toc243509796 \h </w:instrText>
             </w:r>
             <w:r>
               <w:rPr>
@@ -1689,7 +1689,7 @@
               <w:rPr>
                 <w:noProof/>
               </w:rPr>
-              <w:t>11</w:t>
+              <w:t>12</w:t>
             </w:r>
             <w:r>
               <w:rPr>
@@ -1714,7 +1714,7 @@
               <w14:ligatures w14:val="standardContextual"/>
             </w:rPr>
           </w:pPr>
-          <w:hyperlink w:anchor="_Toc243507625" w:history="1">
+          <w:hyperlink w:anchor="_Toc243509797" w:history="1">
             <w:r>
               <w:rPr>
                 <w:rStyle w:val="a5"/>
@@ -1738,7 +1738,7 @@
               <w:rPr>
                 <w:noProof/>
               </w:rPr>
-              <w:instrText xml:space="preserve"> PAGEREF _Toc243507625 \h </w:instrText>
+              <w:instrText xml:space="preserve"> PAGEREF _Toc243509797 \h </w:instrText>
             </w:r>
             <w:r>
               <w:rPr>
@@ -1755,7 +1755,7 @@
               <w:rPr>
                 <w:noProof/>
               </w:rPr>
-              <w:t>11</w:t>
+              <w:t>12</w:t>
             </w:r>
             <w:r>
               <w:rPr>
@@ -1780,7 +1780,7 @@
               <w14:ligatures w14:val="standardContextual"/>
             </w:rPr>
           </w:pPr>
-          <w:hyperlink w:anchor="_Toc243507626" w:history="1">
+          <w:hyperlink w:anchor="_Toc243509798" w:history="1">
             <w:r>
               <w:rPr>
                 <w:rStyle w:val="a5"/>
@@ -1804,7 +1804,7 @@
               <w:rPr>
                 <w:noProof/>
               </w:rPr>
-              <w:instrText xml:space="preserve"> PAGEREF _Toc243507626 \h </w:instrText>
+              <w:instrText xml:space="preserve"> PAGEREF _Toc243509798 \h </w:instrText>
             </w:r>
             <w:r>
               <w:rPr>
@@ -1821,7 +1821,7 @@
               <w:rPr>
                 <w:noProof/>
               </w:rPr>
-              <w:t>11</w:t>
+              <w:t>12</w:t>
             </w:r>
             <w:r>
               <w:rPr>
@@ -1846,7 +1846,7 @@
               <w14:ligatures w14:val="standardContextual"/>
             </w:rPr>
           </w:pPr>
-          <w:hyperlink w:anchor="_Toc243507627" w:history="1">
+          <w:hyperlink w:anchor="_Toc243509799" w:history="1">
             <w:r>
               <w:rPr>
                 <w:rStyle w:val="a5"/>
@@ -1870,7 +1870,7 @@
               <w:rPr>
                 <w:noProof/>
               </w:rPr>
-              <w:instrText xml:space="preserve"> PAGEREF _Toc243507627 \h </w:instrText>
+              <w:instrText xml:space="preserve"> PAGEREF _Toc243509799 \h </w:instrText>
             </w:r>
             <w:r>
               <w:rPr>
@@ -1887,7 +1887,7 @@
               <w:rPr>
                 <w:noProof/>
               </w:rPr>
-              <w:t>11</w:t>
+              <w:t>12</w:t>
             </w:r>
             <w:r>
               <w:rPr>
@@ -1914,7 +1914,7 @@
               <w14:ligatures w14:val="standardContextual"/>
             </w:rPr>
           </w:pPr>
-          <w:hyperlink w:anchor="_Toc243507628" w:history="1">
+          <w:hyperlink w:anchor="_Toc243509800" w:history="1">
             <w:r>
               <w:rPr>
                 <w:rStyle w:val="a5"/>
@@ -1938,7 +1938,7 @@
               <w:rPr>
                 <w:noProof/>
               </w:rPr>
-              <w:instrText xml:space="preserve"> PAGEREF _Toc243507628 \h </w:instrText>
+              <w:instrText xml:space="preserve"> PAGEREF _Toc243509800 \h </w:instrText>
             </w:r>
             <w:r>
               <w:rPr>
@@ -1955,7 +1955,7 @@
               <w:rPr>
                 <w:noProof/>
               </w:rPr>
-              <w:t>12</w:t>
+              <w:t>13</w:t>
             </w:r>
             <w:r>
               <w:rPr>
@@ -1980,7 +1980,7 @@
               <w14:ligatures w14:val="standardContextual"/>
             </w:rPr>
           </w:pPr>
-          <w:hyperlink w:anchor="_Toc243507629" w:history="1">
+          <w:hyperlink w:anchor="_Toc243509801" w:history="1">
             <w:r>
               <w:rPr>
                 <w:rStyle w:val="a5"/>
@@ -2004,7 +2004,7 @@
               <w:rPr>
                 <w:noProof/>
               </w:rPr>
-              <w:instrText xml:space="preserve"> PAGEREF _Toc243507629 \h </w:instrText>
+              <w:instrText xml:space="preserve"> PAGEREF _Toc243509801 \h </w:instrText>
             </w:r>
             <w:r>
               <w:rPr>
@@ -2021,7 +2021,7 @@
               <w:rPr>
                 <w:noProof/>
               </w:rPr>
-              <w:t>12</w:t>
+              <w:t>13</w:t>
             </w:r>
             <w:r>
               <w:rPr>
@@ -2046,7 +2046,7 @@
               <w14:ligatures w14:val="standardContextual"/>
             </w:rPr>
           </w:pPr>
-          <w:hyperlink w:anchor="_Toc243507630" w:history="1">
+          <w:hyperlink w:anchor="_Toc243509802" w:history="1">
             <w:r>
               <w:rPr>
                 <w:rStyle w:val="a5"/>
@@ -2070,7 +2070,7 @@
               <w:rPr>
                 <w:noProof/>
               </w:rPr>
-              <w:instrText xml:space="preserve"> PAGEREF _Toc243507630 \h </w:instrText>
+              <w:instrText xml:space="preserve"> PAGEREF _Toc243509802 \h </w:instrText>
             </w:r>
             <w:r>
               <w:rPr>
@@ -2087,7 +2087,7 @@
               <w:rPr>
                 <w:noProof/>
               </w:rPr>
-              <w:t>12</w:t>
+              <w:t>13</w:t>
             </w:r>
             <w:r>
               <w:rPr>
@@ -2112,7 +2112,7 @@
               <w14:ligatures w14:val="standardContextual"/>
             </w:rPr>
           </w:pPr>
-          <w:hyperlink w:anchor="_Toc243507631" w:history="1">
+          <w:hyperlink w:anchor="_Toc243509803" w:history="1">
             <w:r>
               <w:rPr>
                 <w:rStyle w:val="a5"/>
@@ -2136,7 +2136,7 @@
               <w:rPr>
                 <w:noProof/>
               </w:rPr>
-              <w:instrText xml:space="preserve"> PAGEREF _Toc243507631 \h </w:instrText>
+              <w:instrText xml:space="preserve"> PAGEREF _Toc243509803 \h </w:instrText>
             </w:r>
             <w:r>
               <w:rPr>
@@ -2153,7 +2153,7 @@
               <w:rPr>
                 <w:noProof/>
               </w:rPr>
-              <w:t>12</w:t>
+              <w:t>13</w:t>
             </w:r>
             <w:r>
               <w:rPr>
@@ -2178,7 +2178,7 @@
               <w14:ligatures w14:val="standardContextual"/>
             </w:rPr>
           </w:pPr>
-          <w:hyperlink w:anchor="_Toc243507632" w:history="1">
+          <w:hyperlink w:anchor="_Toc243509804" w:history="1">
             <w:r>
               <w:rPr>
                 <w:rStyle w:val="a5"/>
@@ -2202,7 +2202,7 @@
               <w:rPr>
                 <w:noProof/>
               </w:rPr>
-              <w:instrText xml:space="preserve"> PAGEREF _Toc243507632 \h </w:instrText>
+              <w:instrText xml:space="preserve"> PAGEREF _Toc243509804 \h </w:instrText>
             </w:r>
             <w:r>
               <w:rPr>
@@ -2219,7 +2219,7 @@
               <w:rPr>
                 <w:noProof/>
               </w:rPr>
-              <w:t>13</w:t>
+              <w:t>14</w:t>
             </w:r>
             <w:r>
               <w:rPr>
@@ -2244,7 +2244,7 @@
               <w14:ligatures w14:val="standardContextual"/>
             </w:rPr>
           </w:pPr>
-          <w:hyperlink w:anchor="_Toc243507633" w:history="1">
+          <w:hyperlink w:anchor="_Toc243509805" w:history="1">
             <w:r>
               <w:rPr>
                 <w:rStyle w:val="a5"/>
@@ -2268,7 +2268,7 @@
               <w:rPr>
                 <w:noProof/>
               </w:rPr>
-              <w:instrText xml:space="preserve"> PAGEREF _Toc243507633 \h </w:instrText>
+              <w:instrText xml:space="preserve"> PAGEREF _Toc243509805 \h </w:instrText>
             </w:r>
             <w:r>
               <w:rPr>
@@ -2285,7 +2285,7 @@
               <w:rPr>
                 <w:noProof/>
               </w:rPr>
-              <w:t>13</w:t>
+              <w:t>14</w:t>
             </w:r>
             <w:r>
               <w:rPr>
@@ -2312,7 +2312,7 @@
               <w14:ligatures w14:val="standardContextual"/>
             </w:rPr>
           </w:pPr>
-          <w:hyperlink w:anchor="_Toc243507634" w:history="1">
+          <w:hyperlink w:anchor="_Toc243509806" w:history="1">
             <w:r>
               <w:rPr>
                 <w:rStyle w:val="a5"/>
@@ -2336,7 +2336,7 @@
               <w:rPr>
                 <w:noProof/>
               </w:rPr>
-              <w:instrText xml:space="preserve"> PAGEREF _Toc243507634 \h </w:instrText>
+              <w:instrText xml:space="preserve"> PAGEREF _Toc243509806 \h </w:instrText>
             </w:r>
             <w:r>
               <w:rPr>
@@ -2353,7 +2353,7 @@
               <w:rPr>
                 <w:noProof/>
               </w:rPr>
-              <w:t>14</w:t>
+              <w:t>15</w:t>
             </w:r>
             <w:r>
               <w:rPr>
@@ -2378,7 +2378,7 @@
               <w14:ligatures w14:val="standardContextual"/>
             </w:rPr>
           </w:pPr>
-          <w:hyperlink w:anchor="_Toc243507635" w:history="1">
+          <w:hyperlink w:anchor="_Toc243509807" w:history="1">
             <w:r>
               <w:rPr>
                 <w:rStyle w:val="a5"/>
@@ -2402,7 +2402,7 @@
               <w:rPr>
                 <w:noProof/>
               </w:rPr>
-              <w:instrText xml:space="preserve"> PAGEREF _Toc243507635 \h </w:instrText>
+              <w:instrText xml:space="preserve"> PAGEREF _Toc243509807 \h </w:instrText>
             </w:r>
             <w:r>
               <w:rPr>
@@ -2419,7 +2419,7 @@
               <w:rPr>
                 <w:noProof/>
               </w:rPr>
-              <w:t>14</w:t>
+              <w:t>15</w:t>
             </w:r>
             <w:r>
               <w:rPr>
@@ -2444,7 +2444,7 @@
               <w14:ligatures w14:val="standardContextual"/>
             </w:rPr>
           </w:pPr>
-          <w:hyperlink w:anchor="_Toc243507636" w:history="1">
+          <w:hyperlink w:anchor="_Toc243509808" w:history="1">
             <w:r>
               <w:rPr>
                 <w:rStyle w:val="a5"/>
@@ -2468,7 +2468,7 @@
               <w:rPr>
                 <w:noProof/>
               </w:rPr>
-              <w:instrText xml:space="preserve"> PAGEREF _Toc243507636 \h </w:instrText>
+              <w:instrText xml:space="preserve"> PAGEREF _Toc243509808 \h </w:instrText>
             </w:r>
             <w:r>
               <w:rPr>
@@ -2485,7 +2485,7 @@
               <w:rPr>
                 <w:noProof/>
               </w:rPr>
-              <w:t>15</w:t>
+              <w:t>16</w:t>
             </w:r>
             <w:r>
               <w:rPr>
@@ -2510,7 +2510,7 @@
               <w14:ligatures w14:val="standardContextual"/>
             </w:rPr>
           </w:pPr>
-          <w:hyperlink w:anchor="_Toc243507637" w:history="1">
+          <w:hyperlink w:anchor="_Toc243509809" w:history="1">
             <w:r>
               <w:rPr>
                 <w:rStyle w:val="a5"/>
@@ -2534,7 +2534,7 @@
               <w:rPr>
                 <w:noProof/>
               </w:rPr>
-              <w:instrText xml:space="preserve"> PAGEREF _Toc243507637 \h </w:instrText>
+              <w:instrText xml:space="preserve"> PAGEREF _Toc243509809 \h </w:instrText>
             </w:r>
             <w:r>
               <w:rPr>
@@ -2551,7 +2551,7 @@
               <w:rPr>
                 <w:noProof/>
               </w:rPr>
-              <w:t>15</w:t>
+              <w:t>16</w:t>
             </w:r>
             <w:r>
               <w:rPr>
@@ -2578,7 +2578,7 @@
               <w14:ligatures w14:val="standardContextual"/>
             </w:rPr>
           </w:pPr>
-          <w:hyperlink w:anchor="_Toc243507638" w:history="1">
+          <w:hyperlink w:anchor="_Toc243509810" w:history="1">
             <w:r>
               <w:rPr>
                 <w:rStyle w:val="a5"/>
@@ -2602,7 +2602,7 @@
               <w:rPr>
                 <w:noProof/>
               </w:rPr>
-              <w:instrText xml:space="preserve"> PAGEREF _Toc243507638 \h </w:instrText>
+              <w:instrText xml:space="preserve"> PAGEREF _Toc243509810 \h </w:instrText>
             </w:r>
             <w:r>
               <w:rPr>
@@ -2619,7 +2619,7 @@
               <w:rPr>
                 <w:noProof/>
               </w:rPr>
-              <w:t>16</w:t>
+              <w:t>17</w:t>
             </w:r>
             <w:r>
               <w:rPr>
@@ -2644,7 +2644,7 @@
               <w14:ligatures w14:val="standardContextual"/>
             </w:rPr>
           </w:pPr>
-          <w:hyperlink w:anchor="_Toc243507639" w:history="1">
+          <w:hyperlink w:anchor="_Toc243509811" w:history="1">
             <w:r>
               <w:rPr>
                 <w:rStyle w:val="a5"/>
@@ -2668,7 +2668,7 @@
               <w:rPr>
                 <w:noProof/>
               </w:rPr>
-              <w:instrText xml:space="preserve"> PAGEREF _Toc243507639 \h </w:instrText>
+              <w:instrText xml:space="preserve"> PAGEREF _Toc243509811 \h </w:instrText>
             </w:r>
             <w:r>
               <w:rPr>
@@ -2685,7 +2685,7 @@
               <w:rPr>
                 <w:noProof/>
               </w:rPr>
-              <w:t>16</w:t>
+              <w:t>17</w:t>
             </w:r>
             <w:r>
               <w:rPr>
@@ -2710,7 +2710,7 @@
               <w14:ligatures w14:val="standardContextual"/>
             </w:rPr>
           </w:pPr>
-          <w:hyperlink w:anchor="_Toc243507640" w:history="1">
+          <w:hyperlink w:anchor="_Toc243509812" w:history="1">
             <w:r>
               <w:rPr>
                 <w:rStyle w:val="a5"/>
@@ -2734,7 +2734,7 @@
               <w:rPr>
                 <w:noProof/>
               </w:rPr>
-              <w:instrText xml:space="preserve"> PAGEREF _Toc243507640 \h </w:instrText>
+              <w:instrText xml:space="preserve"> PAGEREF _Toc243509812 \h </w:instrText>
             </w:r>
             <w:r>
               <w:rPr>
@@ -2751,7 +2751,7 @@
               <w:rPr>
                 <w:noProof/>
               </w:rPr>
-              <w:t>16</w:t>
+              <w:t>17</w:t>
             </w:r>
             <w:r>
               <w:rPr>
@@ -2776,7 +2776,7 @@
               <w14:ligatures w14:val="standardContextual"/>
             </w:rPr>
           </w:pPr>
-          <w:hyperlink w:anchor="_Toc243507641" w:history="1">
+          <w:hyperlink w:anchor="_Toc243509813" w:history="1">
             <w:r>
               <w:rPr>
                 <w:rStyle w:val="a5"/>
@@ -2800,7 +2800,7 @@
               <w:rPr>
                 <w:noProof/>
               </w:rPr>
-              <w:instrText xml:space="preserve"> PAGEREF _Toc243507641 \h </w:instrText>
+              <w:instrText xml:space="preserve"> PAGEREF _Toc243509813 \h </w:instrText>
             </w:r>
             <w:r>
               <w:rPr>
@@ -2817,7 +2817,7 @@
               <w:rPr>
                 <w:noProof/>
               </w:rPr>
-              <w:t>17</w:t>
+              <w:t>18</w:t>
             </w:r>
             <w:r>
               <w:rPr>
@@ -2844,7 +2844,7 @@
               <w14:ligatures w14:val="standardContextual"/>
             </w:rPr>
           </w:pPr>
-          <w:hyperlink w:anchor="_Toc243507642" w:history="1">
+          <w:hyperlink w:anchor="_Toc243509814" w:history="1">
             <w:r>
               <w:rPr>
                 <w:rStyle w:val="a5"/>
@@ -2868,7 +2868,7 @@
               <w:rPr>
                 <w:noProof/>
               </w:rPr>
-              <w:instrText xml:space="preserve"> PAGEREF _Toc243507642 \h </w:instrText>
+              <w:instrText xml:space="preserve"> PAGEREF _Toc243509814 \h </w:instrText>
             </w:r>
             <w:r>
               <w:rPr>
@@ -2885,7 +2885,7 @@
               <w:rPr>
                 <w:noProof/>
               </w:rPr>
-              <w:t>18</w:t>
+              <w:t>19</w:t>
             </w:r>
             <w:r>
               <w:rPr>
@@ -2910,7 +2910,7 @@
               <w14:ligatures w14:val="standardContextual"/>
             </w:rPr>
           </w:pPr>
-          <w:hyperlink w:anchor="_Toc243507643" w:history="1">
+          <w:hyperlink w:anchor="_Toc243509815" w:history="1">
             <w:r>
               <w:rPr>
                 <w:rStyle w:val="a5"/>
@@ -2934,7 +2934,7 @@
               <w:rPr>
                 <w:noProof/>
               </w:rPr>
-              <w:instrText xml:space="preserve"> PAGEREF _Toc243507643 \h </w:instrText>
+              <w:instrText xml:space="preserve"> PAGEREF _Toc243509815 \h </w:instrText>
             </w:r>
             <w:r>
               <w:rPr>
@@ -2951,7 +2951,7 @@
               <w:rPr>
                 <w:noProof/>
               </w:rPr>
-              <w:t>18</w:t>
+              <w:t>19</w:t>
             </w:r>
             <w:r>
               <w:rPr>
@@ -2976,7 +2976,7 @@
               <w14:ligatures w14:val="standardContextual"/>
             </w:rPr>
           </w:pPr>
-          <w:hyperlink w:anchor="_Toc243507644" w:history="1">
+          <w:hyperlink w:anchor="_Toc243509816" w:history="1">
             <w:r>
               <w:rPr>
                 <w:rStyle w:val="a5"/>
@@ -3000,7 +3000,7 @@
               <w:rPr>
                 <w:noProof/>
               </w:rPr>
-              <w:instrText xml:space="preserve"> PAGEREF _Toc243507644 \h </w:instrText>
+              <w:instrText xml:space="preserve"> PAGEREF _Toc243509816 \h </w:instrText>
             </w:r>
             <w:r>
               <w:rPr>
@@ -3017,7 +3017,7 @@
               <w:rPr>
                 <w:noProof/>
               </w:rPr>
-              <w:t>18</w:t>
+              <w:t>19</w:t>
             </w:r>
             <w:r>
               <w:rPr>
@@ -3042,7 +3042,7 @@
               <w14:ligatures w14:val="standardContextual"/>
             </w:rPr>
           </w:pPr>
-          <w:hyperlink w:anchor="_Toc243507645" w:history="1">
+          <w:hyperlink w:anchor="_Toc243509817" w:history="1">
             <w:r>
               <w:rPr>
                 <w:rStyle w:val="a5"/>
@@ -3066,7 +3066,7 @@
               <w:rPr>
                 <w:noProof/>
               </w:rPr>
-              <w:instrText xml:space="preserve"> PAGEREF _Toc243507645 \h </w:instrText>
+              <w:instrText xml:space="preserve"> PAGEREF _Toc243509817 \h </w:instrText>
             </w:r>
             <w:r>
               <w:rPr>
@@ -3083,7 +3083,7 @@
               <w:rPr>
                 <w:noProof/>
               </w:rPr>
-              <w:t>18</w:t>
+              <w:t>19</w:t>
             </w:r>
             <w:r>
               <w:rPr>
@@ -3108,7 +3108,7 @@
               <w14:ligatures w14:val="standardContextual"/>
             </w:rPr>
           </w:pPr>
-          <w:hyperlink w:anchor="_Toc243507646" w:history="1">
+          <w:hyperlink w:anchor="_Toc243509818" w:history="1">
             <w:r>
               <w:rPr>
                 <w:rStyle w:val="a5"/>
@@ -3132,7 +3132,7 @@
               <w:rPr>
                 <w:noProof/>
               </w:rPr>
-              <w:instrText xml:space="preserve"> PAGEREF _Toc243507646 \h </w:instrText>
+              <w:instrText xml:space="preserve"> PAGEREF _Toc243509818 \h </w:instrText>
             </w:r>
             <w:r>
               <w:rPr>
@@ -3149,7 +3149,7 @@
               <w:rPr>
                 <w:noProof/>
               </w:rPr>
-              <w:t>18</w:t>
+              <w:t>19</w:t>
             </w:r>
             <w:r>
               <w:rPr>
@@ -3171,7 +3171,7 @@
         <w:pStyle w:val="1"/>
         <w:pageBreakBefore/>
       </w:pPr>
-      <w:bookmarkStart w:id="0" w:name="_Toc243507603"/>
+      <w:bookmarkStart w:id="0" w:name="_Toc243509775"/>
       <w:r>
         <w:lastRenderedPageBreak/>
         <w:t xml:space="preserve">1. </w:t>
@@ -3240,7 +3240,7 @@
       <w:pPr>
         <w:pStyle w:val="2"/>
       </w:pPr>
-      <w:bookmarkStart w:id="1" w:name="_Toc243507604"/>
+      <w:bookmarkStart w:id="1" w:name="_Toc243509776"/>
       <w:r>
         <w:t xml:space="preserve">1.1 </w:t>
       </w:r>
@@ -3422,7 +3422,7 @@
       <w:pPr>
         <w:pStyle w:val="2"/>
       </w:pPr>
-      <w:bookmarkStart w:id="2" w:name="_Toc243507605"/>
+      <w:bookmarkStart w:id="2" w:name="_Toc243509777"/>
       <w:r>
         <w:t xml:space="preserve">1.2 </w:t>
       </w:r>
@@ -3546,7 +3546,7 @@
         <w:pStyle w:val="1"/>
         <w:pageBreakBefore/>
       </w:pPr>
-      <w:bookmarkStart w:id="3" w:name="_Toc243507606"/>
+      <w:bookmarkStart w:id="3" w:name="_Toc243509778"/>
       <w:r>
         <w:lastRenderedPageBreak/>
         <w:t xml:space="preserve">2. </w:t>
@@ -3560,7 +3560,7 @@
       <w:pPr>
         <w:pStyle w:val="2"/>
       </w:pPr>
-      <w:bookmarkStart w:id="4" w:name="_Toc243507607"/>
+      <w:bookmarkStart w:id="4" w:name="_Toc243509779"/>
       <w:r>
         <w:t xml:space="preserve">2.1 </w:t>
       </w:r>
@@ -4574,7 +4574,7 @@
       <w:pPr>
         <w:pStyle w:val="2"/>
       </w:pPr>
-      <w:bookmarkStart w:id="5" w:name="_Toc243507608"/>
+      <w:bookmarkStart w:id="5" w:name="_Toc243509780"/>
       <w:r>
         <w:t xml:space="preserve">2.2 </w:t>
       </w:r>
@@ -4697,7 +4697,7 @@
       <w:pPr>
         <w:pStyle w:val="2"/>
       </w:pPr>
-      <w:bookmarkStart w:id="6" w:name="_Toc243507609"/>
+      <w:bookmarkStart w:id="6" w:name="_Toc243509781"/>
       <w:r>
         <w:t xml:space="preserve">2.3 wfview-win </w:t>
       </w:r>
@@ -4894,7 +4894,7 @@
       <w:pPr>
         <w:pStyle w:val="2"/>
       </w:pPr>
-      <w:bookmarkStart w:id="7" w:name="_Toc243507610"/>
+      <w:bookmarkStart w:id="7" w:name="_Toc243509782"/>
       <w:r>
         <w:t xml:space="preserve">2.4 </w:t>
       </w:r>
@@ -5031,7 +5031,7 @@
         <w:pStyle w:val="1"/>
         <w:pageBreakBefore/>
       </w:pPr>
-      <w:bookmarkStart w:id="8" w:name="_Toc243507611"/>
+      <w:bookmarkStart w:id="8" w:name="_Toc243509783"/>
       <w:r>
         <w:lastRenderedPageBreak/>
         <w:t xml:space="preserve">3. </w:t>
@@ -5051,10 +5051,10 @@
           <w:noProof/>
         </w:rPr>
         <w:drawing>
-          <wp:inline distT="0" distB="0" distL="0" distR="0" wp14:anchorId="474CDAF4" wp14:editId="6A78A5B2">
+          <wp:inline distT="0" distB="0" distL="0" distR="0" wp14:anchorId="462C2987" wp14:editId="2741F6BD">
             <wp:extent cx="6096000" cy="3105150"/>
             <wp:effectExtent l="0" t="0" r="0" b="0"/>
-            <wp:docPr id="718582764" name="図 718582764"/>
+            <wp:docPr id="349937985" name="図 349937985"/>
             <wp:cNvGraphicFramePr>
               <a:graphicFrameLocks xmlns:a="http://schemas.openxmlformats.org/drawingml/2006/main" noChangeAspect="1"/>
             </wp:cNvGraphicFramePr>
@@ -6107,7 +6107,7 @@
         <w:pStyle w:val="1"/>
         <w:pageBreakBefore/>
       </w:pPr>
-      <w:bookmarkStart w:id="9" w:name="_Toc243507612"/>
+      <w:bookmarkStart w:id="9" w:name="_Toc243509784"/>
       <w:r>
         <w:lastRenderedPageBreak/>
         <w:t xml:space="preserve">4. </w:t>
@@ -6121,7 +6121,7 @@
       <w:pPr>
         <w:pStyle w:val="2"/>
       </w:pPr>
-      <w:bookmarkStart w:id="10" w:name="_Toc243507613"/>
+      <w:bookmarkStart w:id="10" w:name="_Toc243509785"/>
       <w:r>
         <w:t xml:space="preserve">4.1 </w:t>
       </w:r>
@@ -6304,10 +6304,10 @@
           <w:noProof/>
         </w:rPr>
         <w:drawing>
-          <wp:inline distT="0" distB="0" distL="0" distR="0" wp14:anchorId="31797C73" wp14:editId="1CA81901">
+          <wp:inline distT="0" distB="0" distL="0" distR="0" wp14:anchorId="28A36A35" wp14:editId="202E39EA">
             <wp:extent cx="4000500" cy="2171700"/>
             <wp:effectExtent l="0" t="0" r="0" b="0"/>
-            <wp:docPr id="454237724" name="図 454237724"/>
+            <wp:docPr id="930257256" name="図 930257256"/>
             <wp:cNvGraphicFramePr>
               <a:graphicFrameLocks xmlns:a="http://schemas.openxmlformats.org/drawingml/2006/main" noChangeAspect="1"/>
             </wp:cNvGraphicFramePr>
@@ -6580,6 +6580,561 @@
       <w:r>
         <w:t>を押すと、次のバンドのあらかじめ決めた周波数に移ります。一番上のバンドの次は一番下に、一番下の前は一番上に戻ります（循環式）。</w:t>
       </w:r>
+    </w:p>
+    <w:p>
+      <w:pPr>
+        <w:spacing w:after="120" w:line="300" w:lineRule="auto"/>
+      </w:pPr>
+      <w:r>
+        <w:t>バンドを切り替えたときは、次の規則でモードも自動で設定します。</w:t>
+      </w:r>
+    </w:p>
+    <w:tbl>
+      <w:tblPr>
+        <w:tblW w:w="9638" w:type="dxa"/>
+        <w:tblBorders>
+          <w:top w:val="single" w:sz="4" w:space="0" w:color="auto"/>
+          <w:left w:val="single" w:sz="4" w:space="0" w:color="auto"/>
+          <w:bottom w:val="single" w:sz="4" w:space="0" w:color="auto"/>
+          <w:right w:val="single" w:sz="4" w:space="0" w:color="auto"/>
+          <w:insideH w:val="single" w:sz="4" w:space="0" w:color="auto"/>
+          <w:insideV w:val="single" w:sz="4" w:space="0" w:color="auto"/>
+        </w:tblBorders>
+        <w:tblLayout w:type="fixed"/>
+        <w:tblCellMar>
+          <w:left w:w="10" w:type="dxa"/>
+          <w:right w:w="10" w:type="dxa"/>
+        </w:tblCellMar>
+        <w:tblLook w:val="04A0" w:firstRow="1" w:lastRow="0" w:firstColumn="1" w:lastColumn="0" w:noHBand="0" w:noVBand="1"/>
+      </w:tblPr>
+      <w:tblGrid>
+        <w:gridCol w:w="2900"/>
+        <w:gridCol w:w="3000"/>
+        <w:gridCol w:w="3738"/>
+      </w:tblGrid>
+      <w:tr>
+        <w:tblPrEx>
+          <w:tblCellMar>
+            <w:top w:w="0" w:type="dxa"/>
+            <w:bottom w:w="0" w:type="dxa"/>
+          </w:tblCellMar>
+        </w:tblPrEx>
+        <w:trPr>
+          <w:cantSplit/>
+          <w:tblHeader/>
+        </w:trPr>
+        <w:tc>
+          <w:tcPr>
+            <w:tcW w:w="2900" w:type="dxa"/>
+            <w:tcBorders>
+              <w:top w:val="single" w:sz="4" w:space="0" w:color="A6A6A6"/>
+              <w:left w:val="single" w:sz="4" w:space="0" w:color="A6A6A6"/>
+              <w:bottom w:val="single" w:sz="4" w:space="0" w:color="A6A6A6"/>
+              <w:right w:val="single" w:sz="4" w:space="0" w:color="A6A6A6"/>
+            </w:tcBorders>
+            <w:shd w:val="clear" w:color="auto" w:fill="DCE6F1"/>
+            <w:tcMar>
+              <w:top w:w="60" w:type="dxa"/>
+              <w:left w:w="100" w:type="dxa"/>
+              <w:bottom w:w="60" w:type="dxa"/>
+              <w:right w:w="100" w:type="dxa"/>
+            </w:tcMar>
+          </w:tcPr>
+          <w:p>
+            <w:pPr>
+              <w:spacing w:line="276" w:lineRule="auto"/>
+            </w:pPr>
+            <w:r>
+              <w:rPr>
+                <w:b/>
+                <w:bCs/>
+              </w:rPr>
+              <w:t>切り替える前のモード</w:t>
+            </w:r>
+          </w:p>
+        </w:tc>
+        <w:tc>
+          <w:tcPr>
+            <w:tcW w:w="3000" w:type="dxa"/>
+            <w:tcBorders>
+              <w:top w:val="single" w:sz="4" w:space="0" w:color="A6A6A6"/>
+              <w:left w:val="single" w:sz="4" w:space="0" w:color="A6A6A6"/>
+              <w:bottom w:val="single" w:sz="4" w:space="0" w:color="A6A6A6"/>
+              <w:right w:val="single" w:sz="4" w:space="0" w:color="A6A6A6"/>
+            </w:tcBorders>
+            <w:shd w:val="clear" w:color="auto" w:fill="DCE6F1"/>
+            <w:tcMar>
+              <w:top w:w="60" w:type="dxa"/>
+              <w:left w:w="100" w:type="dxa"/>
+              <w:bottom w:w="60" w:type="dxa"/>
+              <w:right w:w="100" w:type="dxa"/>
+            </w:tcMar>
+          </w:tcPr>
+          <w:p>
+            <w:pPr>
+              <w:spacing w:line="276" w:lineRule="auto"/>
+            </w:pPr>
+            <w:r>
+              <w:rPr>
+                <w:b/>
+                <w:bCs/>
+              </w:rPr>
+              <w:t>移り先</w:t>
+            </w:r>
+          </w:p>
+        </w:tc>
+        <w:tc>
+          <w:tcPr>
+            <w:tcW w:w="3738" w:type="dxa"/>
+            <w:tcBorders>
+              <w:top w:val="single" w:sz="4" w:space="0" w:color="A6A6A6"/>
+              <w:left w:val="single" w:sz="4" w:space="0" w:color="A6A6A6"/>
+              <w:bottom w:val="single" w:sz="4" w:space="0" w:color="A6A6A6"/>
+              <w:right w:val="single" w:sz="4" w:space="0" w:color="A6A6A6"/>
+            </w:tcBorders>
+            <w:shd w:val="clear" w:color="auto" w:fill="DCE6F1"/>
+            <w:tcMar>
+              <w:top w:w="60" w:type="dxa"/>
+              <w:left w:w="100" w:type="dxa"/>
+              <w:bottom w:w="60" w:type="dxa"/>
+              <w:right w:w="100" w:type="dxa"/>
+            </w:tcMar>
+          </w:tcPr>
+          <w:p>
+            <w:pPr>
+              <w:spacing w:line="276" w:lineRule="auto"/>
+            </w:pPr>
+            <w:r>
+              <w:rPr>
+                <w:b/>
+                <w:bCs/>
+              </w:rPr>
+              <w:t>切り替え後のモード</w:t>
+            </w:r>
+          </w:p>
+        </w:tc>
+      </w:tr>
+      <w:tr>
+        <w:tblPrEx>
+          <w:tblCellMar>
+            <w:top w:w="0" w:type="dxa"/>
+            <w:bottom w:w="0" w:type="dxa"/>
+          </w:tblCellMar>
+        </w:tblPrEx>
+        <w:trPr>
+          <w:cantSplit/>
+        </w:trPr>
+        <w:tc>
+          <w:tcPr>
+            <w:tcW w:w="2900" w:type="dxa"/>
+            <w:tcBorders>
+              <w:top w:val="single" w:sz="4" w:space="0" w:color="A6A6A6"/>
+              <w:left w:val="single" w:sz="4" w:space="0" w:color="A6A6A6"/>
+              <w:bottom w:val="single" w:sz="4" w:space="0" w:color="A6A6A6"/>
+              <w:right w:val="single" w:sz="4" w:space="0" w:color="A6A6A6"/>
+            </w:tcBorders>
+            <w:tcMar>
+              <w:top w:w="60" w:type="dxa"/>
+              <w:left w:w="100" w:type="dxa"/>
+              <w:bottom w:w="60" w:type="dxa"/>
+              <w:right w:w="100" w:type="dxa"/>
+            </w:tcMar>
+          </w:tcPr>
+          <w:p>
+            <w:pPr>
+              <w:spacing w:line="276" w:lineRule="auto"/>
+            </w:pPr>
+            <w:r>
+              <w:t>LSB / USB</w:t>
+            </w:r>
+          </w:p>
+        </w:tc>
+        <w:tc>
+          <w:tcPr>
+            <w:tcW w:w="3000" w:type="dxa"/>
+            <w:tcBorders>
+              <w:top w:val="single" w:sz="4" w:space="0" w:color="A6A6A6"/>
+              <w:left w:val="single" w:sz="4" w:space="0" w:color="A6A6A6"/>
+              <w:bottom w:val="single" w:sz="4" w:space="0" w:color="A6A6A6"/>
+              <w:right w:val="single" w:sz="4" w:space="0" w:color="A6A6A6"/>
+            </w:tcBorders>
+            <w:tcMar>
+              <w:top w:w="60" w:type="dxa"/>
+              <w:left w:w="100" w:type="dxa"/>
+              <w:bottom w:w="60" w:type="dxa"/>
+              <w:right w:w="100" w:type="dxa"/>
+            </w:tcMar>
+          </w:tcPr>
+          <w:p>
+            <w:pPr>
+              <w:spacing w:line="276" w:lineRule="auto"/>
+            </w:pPr>
+            <w:r>
+              <w:t>すべてのバンド</w:t>
+            </w:r>
+          </w:p>
+        </w:tc>
+        <w:tc>
+          <w:tcPr>
+            <w:tcW w:w="3738" w:type="dxa"/>
+            <w:tcBorders>
+              <w:top w:val="single" w:sz="4" w:space="0" w:color="A6A6A6"/>
+              <w:left w:val="single" w:sz="4" w:space="0" w:color="A6A6A6"/>
+              <w:bottom w:val="single" w:sz="4" w:space="0" w:color="A6A6A6"/>
+              <w:right w:val="single" w:sz="4" w:space="0" w:color="A6A6A6"/>
+            </w:tcBorders>
+            <w:tcMar>
+              <w:top w:w="60" w:type="dxa"/>
+              <w:left w:w="100" w:type="dxa"/>
+              <w:bottom w:w="60" w:type="dxa"/>
+              <w:right w:w="100" w:type="dxa"/>
+            </w:tcMar>
+          </w:tcPr>
+          <w:p>
+            <w:pPr>
+              <w:spacing w:line="276" w:lineRule="auto"/>
+            </w:pPr>
+            <w:r>
+              <w:t xml:space="preserve">10 MHz </w:t>
+            </w:r>
+            <w:r>
+              <w:t>以上は</w:t>
+            </w:r>
+            <w:r>
+              <w:t xml:space="preserve"> USB</w:t>
+            </w:r>
+            <w:r>
+              <w:t>、</w:t>
+            </w:r>
+            <w:r>
+              <w:t xml:space="preserve">10 MHz </w:t>
+            </w:r>
+            <w:r>
+              <w:t>未満は</w:t>
+            </w:r>
+            <w:r>
+              <w:t xml:space="preserve"> LSB</w:t>
+            </w:r>
+          </w:p>
+        </w:tc>
+      </w:tr>
+      <w:tr>
+        <w:tblPrEx>
+          <w:tblCellMar>
+            <w:top w:w="0" w:type="dxa"/>
+            <w:bottom w:w="0" w:type="dxa"/>
+          </w:tblCellMar>
+        </w:tblPrEx>
+        <w:trPr>
+          <w:cantSplit/>
+        </w:trPr>
+        <w:tc>
+          <w:tcPr>
+            <w:tcW w:w="2900" w:type="dxa"/>
+            <w:tcBorders>
+              <w:top w:val="single" w:sz="4" w:space="0" w:color="A6A6A6"/>
+              <w:left w:val="single" w:sz="4" w:space="0" w:color="A6A6A6"/>
+              <w:bottom w:val="single" w:sz="4" w:space="0" w:color="A6A6A6"/>
+              <w:right w:val="single" w:sz="4" w:space="0" w:color="A6A6A6"/>
+            </w:tcBorders>
+            <w:tcMar>
+              <w:top w:w="60" w:type="dxa"/>
+              <w:left w:w="100" w:type="dxa"/>
+              <w:bottom w:w="60" w:type="dxa"/>
+              <w:right w:w="100" w:type="dxa"/>
+            </w:tcMar>
+          </w:tcPr>
+          <w:p>
+            <w:pPr>
+              <w:spacing w:line="276" w:lineRule="auto"/>
+            </w:pPr>
+            <w:r>
+              <w:t>FM / FM-N</w:t>
+            </w:r>
+          </w:p>
+        </w:tc>
+        <w:tc>
+          <w:tcPr>
+            <w:tcW w:w="3000" w:type="dxa"/>
+            <w:tcBorders>
+              <w:top w:val="single" w:sz="4" w:space="0" w:color="A6A6A6"/>
+              <w:left w:val="single" w:sz="4" w:space="0" w:color="A6A6A6"/>
+              <w:bottom w:val="single" w:sz="4" w:space="0" w:color="A6A6A6"/>
+              <w:right w:val="single" w:sz="4" w:space="0" w:color="A6A6A6"/>
+            </w:tcBorders>
+            <w:tcMar>
+              <w:top w:w="60" w:type="dxa"/>
+              <w:left w:w="100" w:type="dxa"/>
+              <w:bottom w:w="60" w:type="dxa"/>
+              <w:right w:w="100" w:type="dxa"/>
+            </w:tcMar>
+          </w:tcPr>
+          <w:p>
+            <w:pPr>
+              <w:spacing w:line="276" w:lineRule="auto"/>
+            </w:pPr>
+            <w:r>
+              <w:t>160m</w:t>
+            </w:r>
+            <w:r>
+              <w:t>～</w:t>
+            </w:r>
+            <w:r>
+              <w:t>12m</w:t>
+            </w:r>
+            <w:r>
+              <w:t>（</w:t>
+            </w:r>
+            <w:r>
+              <w:t xml:space="preserve">24.99 MHz </w:t>
+            </w:r>
+            <w:r>
+              <w:t>まで）</w:t>
+            </w:r>
+          </w:p>
+        </w:tc>
+        <w:tc>
+          <w:tcPr>
+            <w:tcW w:w="3738" w:type="dxa"/>
+            <w:tcBorders>
+              <w:top w:val="single" w:sz="4" w:space="0" w:color="A6A6A6"/>
+              <w:left w:val="single" w:sz="4" w:space="0" w:color="A6A6A6"/>
+              <w:bottom w:val="single" w:sz="4" w:space="0" w:color="A6A6A6"/>
+              <w:right w:val="single" w:sz="4" w:space="0" w:color="A6A6A6"/>
+            </w:tcBorders>
+            <w:tcMar>
+              <w:top w:w="60" w:type="dxa"/>
+              <w:left w:w="100" w:type="dxa"/>
+              <w:bottom w:w="60" w:type="dxa"/>
+              <w:right w:w="100" w:type="dxa"/>
+            </w:tcMar>
+          </w:tcPr>
+          <w:p>
+            <w:pPr>
+              <w:spacing w:line="276" w:lineRule="auto"/>
+            </w:pPr>
+            <w:r>
+              <w:t xml:space="preserve">10 MHz </w:t>
+            </w:r>
+            <w:r>
+              <w:t>以上は</w:t>
+            </w:r>
+            <w:r>
+              <w:t xml:space="preserve"> USB</w:t>
+            </w:r>
+            <w:r>
+              <w:t>、</w:t>
+            </w:r>
+            <w:r>
+              <w:t xml:space="preserve">10 MHz </w:t>
+            </w:r>
+            <w:r>
+              <w:t>未満は</w:t>
+            </w:r>
+            <w:r>
+              <w:t xml:space="preserve"> LSB</w:t>
+            </w:r>
+          </w:p>
+        </w:tc>
+      </w:tr>
+      <w:tr>
+        <w:tblPrEx>
+          <w:tblCellMar>
+            <w:top w:w="0" w:type="dxa"/>
+            <w:bottom w:w="0" w:type="dxa"/>
+          </w:tblCellMar>
+        </w:tblPrEx>
+        <w:trPr>
+          <w:cantSplit/>
+        </w:trPr>
+        <w:tc>
+          <w:tcPr>
+            <w:tcW w:w="2900" w:type="dxa"/>
+            <w:tcBorders>
+              <w:top w:val="single" w:sz="4" w:space="0" w:color="A6A6A6"/>
+              <w:left w:val="single" w:sz="4" w:space="0" w:color="A6A6A6"/>
+              <w:bottom w:val="single" w:sz="4" w:space="0" w:color="A6A6A6"/>
+              <w:right w:val="single" w:sz="4" w:space="0" w:color="A6A6A6"/>
+            </w:tcBorders>
+            <w:tcMar>
+              <w:top w:w="60" w:type="dxa"/>
+              <w:left w:w="100" w:type="dxa"/>
+              <w:bottom w:w="60" w:type="dxa"/>
+              <w:right w:w="100" w:type="dxa"/>
+            </w:tcMar>
+          </w:tcPr>
+          <w:p>
+            <w:pPr>
+              <w:spacing w:line="276" w:lineRule="auto"/>
+            </w:pPr>
+            <w:r>
+              <w:t>FM / FM-N</w:t>
+            </w:r>
+          </w:p>
+        </w:tc>
+        <w:tc>
+          <w:tcPr>
+            <w:tcW w:w="3000" w:type="dxa"/>
+            <w:tcBorders>
+              <w:top w:val="single" w:sz="4" w:space="0" w:color="A6A6A6"/>
+              <w:left w:val="single" w:sz="4" w:space="0" w:color="A6A6A6"/>
+              <w:bottom w:val="single" w:sz="4" w:space="0" w:color="A6A6A6"/>
+              <w:right w:val="single" w:sz="4" w:space="0" w:color="A6A6A6"/>
+            </w:tcBorders>
+            <w:tcMar>
+              <w:top w:w="60" w:type="dxa"/>
+              <w:left w:w="100" w:type="dxa"/>
+              <w:bottom w:w="60" w:type="dxa"/>
+              <w:right w:w="100" w:type="dxa"/>
+            </w:tcMar>
+          </w:tcPr>
+          <w:p>
+            <w:pPr>
+              <w:spacing w:line="276" w:lineRule="auto"/>
+            </w:pPr>
+            <w:r>
+              <w:t>10m</w:t>
+            </w:r>
+            <w:r>
+              <w:t>、</w:t>
+            </w:r>
+            <w:r>
+              <w:t>6m</w:t>
+            </w:r>
+            <w:r>
+              <w:t>、</w:t>
+            </w:r>
+            <w:r>
+              <w:t>2m</w:t>
+            </w:r>
+            <w:r>
+              <w:t>、</w:t>
+            </w:r>
+            <w:r>
+              <w:t>70cm</w:t>
+            </w:r>
+          </w:p>
+        </w:tc>
+        <w:tc>
+          <w:tcPr>
+            <w:tcW w:w="3738" w:type="dxa"/>
+            <w:tcBorders>
+              <w:top w:val="single" w:sz="4" w:space="0" w:color="A6A6A6"/>
+              <w:left w:val="single" w:sz="4" w:space="0" w:color="A6A6A6"/>
+              <w:bottom w:val="single" w:sz="4" w:space="0" w:color="A6A6A6"/>
+              <w:right w:val="single" w:sz="4" w:space="0" w:color="A6A6A6"/>
+            </w:tcBorders>
+            <w:tcMar>
+              <w:top w:w="60" w:type="dxa"/>
+              <w:left w:w="100" w:type="dxa"/>
+              <w:bottom w:w="60" w:type="dxa"/>
+              <w:right w:w="100" w:type="dxa"/>
+            </w:tcMar>
+          </w:tcPr>
+          <w:p>
+            <w:pPr>
+              <w:spacing w:line="276" w:lineRule="auto"/>
+            </w:pPr>
+            <w:r>
+              <w:t xml:space="preserve">FM </w:t>
+            </w:r>
+            <w:r>
+              <w:t>のまま</w:t>
+            </w:r>
+          </w:p>
+        </w:tc>
+      </w:tr>
+      <w:tr>
+        <w:tblPrEx>
+          <w:tblCellMar>
+            <w:top w:w="0" w:type="dxa"/>
+            <w:bottom w:w="0" w:type="dxa"/>
+          </w:tblCellMar>
+        </w:tblPrEx>
+        <w:trPr>
+          <w:cantSplit/>
+        </w:trPr>
+        <w:tc>
+          <w:tcPr>
+            <w:tcW w:w="2900" w:type="dxa"/>
+            <w:tcBorders>
+              <w:top w:val="single" w:sz="4" w:space="0" w:color="A6A6A6"/>
+              <w:left w:val="single" w:sz="4" w:space="0" w:color="A6A6A6"/>
+              <w:bottom w:val="single" w:sz="4" w:space="0" w:color="A6A6A6"/>
+              <w:right w:val="single" w:sz="4" w:space="0" w:color="A6A6A6"/>
+            </w:tcBorders>
+            <w:tcMar>
+              <w:top w:w="60" w:type="dxa"/>
+              <w:left w:w="100" w:type="dxa"/>
+              <w:bottom w:w="60" w:type="dxa"/>
+              <w:right w:w="100" w:type="dxa"/>
+            </w:tcMar>
+          </w:tcPr>
+          <w:p>
+            <w:pPr>
+              <w:spacing w:line="276" w:lineRule="auto"/>
+            </w:pPr>
+            <w:r>
+              <w:t>CW / CWR / AM / DIG / PKT</w:t>
+            </w:r>
+          </w:p>
+        </w:tc>
+        <w:tc>
+          <w:tcPr>
+            <w:tcW w:w="3000" w:type="dxa"/>
+            <w:tcBorders>
+              <w:top w:val="single" w:sz="4" w:space="0" w:color="A6A6A6"/>
+              <w:left w:val="single" w:sz="4" w:space="0" w:color="A6A6A6"/>
+              <w:bottom w:val="single" w:sz="4" w:space="0" w:color="A6A6A6"/>
+              <w:right w:val="single" w:sz="4" w:space="0" w:color="A6A6A6"/>
+            </w:tcBorders>
+            <w:tcMar>
+              <w:top w:w="60" w:type="dxa"/>
+              <w:left w:w="100" w:type="dxa"/>
+              <w:bottom w:w="60" w:type="dxa"/>
+              <w:right w:w="100" w:type="dxa"/>
+            </w:tcMar>
+          </w:tcPr>
+          <w:p>
+            <w:pPr>
+              <w:spacing w:line="276" w:lineRule="auto"/>
+            </w:pPr>
+            <w:r>
+              <w:t>すべてのバンド</w:t>
+            </w:r>
+          </w:p>
+        </w:tc>
+        <w:tc>
+          <w:tcPr>
+            <w:tcW w:w="3738" w:type="dxa"/>
+            <w:tcBorders>
+              <w:top w:val="single" w:sz="4" w:space="0" w:color="A6A6A6"/>
+              <w:left w:val="single" w:sz="4" w:space="0" w:color="A6A6A6"/>
+              <w:bottom w:val="single" w:sz="4" w:space="0" w:color="A6A6A6"/>
+              <w:right w:val="single" w:sz="4" w:space="0" w:color="A6A6A6"/>
+            </w:tcBorders>
+            <w:tcMar>
+              <w:top w:w="60" w:type="dxa"/>
+              <w:left w:w="100" w:type="dxa"/>
+              <w:bottom w:w="60" w:type="dxa"/>
+              <w:right w:w="100" w:type="dxa"/>
+            </w:tcMar>
+          </w:tcPr>
+          <w:p>
+            <w:pPr>
+              <w:spacing w:line="276" w:lineRule="auto"/>
+            </w:pPr>
+            <w:r>
+              <w:t>そのまま</w:t>
+            </w:r>
+          </w:p>
+        </w:tc>
+      </w:tr>
+    </w:tbl>
+    <w:p>
+      <w:pPr>
+        <w:spacing w:after="120"/>
+      </w:pPr>
     </w:p>
     <w:tbl>
       <w:tblPr>
@@ -7424,7 +7979,7 @@
       <w:pPr>
         <w:pStyle w:val="2"/>
       </w:pPr>
-      <w:bookmarkStart w:id="11" w:name="_Toc243507614"/>
+      <w:bookmarkStart w:id="11" w:name="_Toc243509786"/>
       <w:r>
         <w:t xml:space="preserve">4.2 </w:t>
       </w:r>
@@ -7504,7 +8059,7 @@
       <w:pPr>
         <w:pStyle w:val="2"/>
       </w:pPr>
-      <w:bookmarkStart w:id="12" w:name="_Toc243507615"/>
+      <w:bookmarkStart w:id="12" w:name="_Toc243509787"/>
       <w:r>
         <w:t xml:space="preserve">4.3 </w:t>
       </w:r>
@@ -7553,8 +8108,9 @@
       <w:pPr>
         <w:pStyle w:val="2"/>
       </w:pPr>
-      <w:bookmarkStart w:id="13" w:name="_Toc243507616"/>
-      <w:r>
+      <w:bookmarkStart w:id="13" w:name="_Toc243509788"/>
+      <w:r>
+        <w:lastRenderedPageBreak/>
         <w:t xml:space="preserve">4.4 </w:t>
       </w:r>
       <w:r>
@@ -7677,7 +8233,7 @@
       <w:pPr>
         <w:pStyle w:val="2"/>
       </w:pPr>
-      <w:bookmarkStart w:id="14" w:name="_Toc243507617"/>
+      <w:bookmarkStart w:id="14" w:name="_Toc243509789"/>
       <w:r>
         <w:t xml:space="preserve">4.5 </w:t>
       </w:r>
@@ -7715,7 +8271,7 @@
         <w:pStyle w:val="1"/>
         <w:pageBreakBefore/>
       </w:pPr>
-      <w:bookmarkStart w:id="15" w:name="_Toc243507618"/>
+      <w:bookmarkStart w:id="15" w:name="_Toc243509790"/>
       <w:r>
         <w:lastRenderedPageBreak/>
         <w:t xml:space="preserve">5. </w:t>
@@ -7894,7 +8450,7 @@
         <w:pStyle w:val="1"/>
         <w:pageBreakBefore/>
       </w:pPr>
-      <w:bookmarkStart w:id="16" w:name="_Toc243507619"/>
+      <w:bookmarkStart w:id="16" w:name="_Toc243509791"/>
       <w:r>
         <w:lastRenderedPageBreak/>
         <w:t xml:space="preserve">6. A / B / C / F </w:t>
@@ -7989,10 +8545,10 @@
           <w:noProof/>
         </w:rPr>
         <w:drawing>
-          <wp:inline distT="0" distB="0" distL="0" distR="0" wp14:anchorId="77D3EAF1" wp14:editId="17E90681">
+          <wp:inline distT="0" distB="0" distL="0" distR="0" wp14:anchorId="28708480" wp14:editId="7F97E8B4">
             <wp:extent cx="4762500" cy="800100"/>
             <wp:effectExtent l="0" t="0" r="0" b="0"/>
-            <wp:docPr id="60329330" name="図 60329330"/>
+            <wp:docPr id="562052046" name="図 562052046"/>
             <wp:cNvGraphicFramePr>
               <a:graphicFrameLocks xmlns:a="http://schemas.openxmlformats.org/drawingml/2006/main" noChangeAspect="1"/>
             </wp:cNvGraphicFramePr>
@@ -8132,10 +8688,10 @@
           <w:noProof/>
         </w:rPr>
         <w:drawing>
-          <wp:inline distT="0" distB="0" distL="0" distR="0" wp14:anchorId="61AB4C84" wp14:editId="03A35300">
+          <wp:inline distT="0" distB="0" distL="0" distR="0" wp14:anchorId="01C7492A" wp14:editId="554E88D4">
             <wp:extent cx="4762500" cy="800100"/>
             <wp:effectExtent l="0" t="0" r="0" b="0"/>
-            <wp:docPr id="1699529321" name="図 1699529321"/>
+            <wp:docPr id="17410226" name="図 17410226"/>
             <wp:cNvGraphicFramePr>
               <a:graphicFrameLocks xmlns:a="http://schemas.openxmlformats.org/drawingml/2006/main" noChangeAspect="1"/>
             </wp:cNvGraphicFramePr>
@@ -8275,10 +8831,10 @@
           <w:noProof/>
         </w:rPr>
         <w:drawing>
-          <wp:inline distT="0" distB="0" distL="0" distR="0" wp14:anchorId="2BB3E1D2" wp14:editId="2EEAFF52">
+          <wp:inline distT="0" distB="0" distL="0" distR="0" wp14:anchorId="40E40C2D" wp14:editId="07B3FF0E">
             <wp:extent cx="4762500" cy="800100"/>
             <wp:effectExtent l="0" t="0" r="0" b="0"/>
-            <wp:docPr id="484099299" name="図 484099299"/>
+            <wp:docPr id="947206824" name="図 947206824"/>
             <wp:cNvGraphicFramePr>
               <a:graphicFrameLocks xmlns:a="http://schemas.openxmlformats.org/drawingml/2006/main" noChangeAspect="1"/>
             </wp:cNvGraphicFramePr>
@@ -8891,7 +9447,7 @@
       <w:pPr>
         <w:pStyle w:val="2"/>
       </w:pPr>
-      <w:bookmarkStart w:id="17" w:name="_Toc243507620"/>
+      <w:bookmarkStart w:id="17" w:name="_Toc243509792"/>
       <w:r>
         <w:t>6.1 A/B</w:t>
       </w:r>
@@ -8945,7 +9501,7 @@
       <w:pPr>
         <w:pStyle w:val="2"/>
       </w:pPr>
-      <w:bookmarkStart w:id="18" w:name="_Toc243507621"/>
+      <w:bookmarkStart w:id="18" w:name="_Toc243509793"/>
       <w:r>
         <w:t>6.2 SPL</w:t>
       </w:r>
@@ -9002,7 +9558,7 @@
       <w:pPr>
         <w:pStyle w:val="2"/>
       </w:pPr>
-      <w:bookmarkStart w:id="19" w:name="_Toc243507622"/>
+      <w:bookmarkStart w:id="19" w:name="_Toc243509794"/>
       <w:r>
         <w:lastRenderedPageBreak/>
         <w:t>6.3 CLAR</w:t>
@@ -9139,7 +9695,7 @@
       <w:pPr>
         <w:pStyle w:val="2"/>
       </w:pPr>
-      <w:bookmarkStart w:id="20" w:name="_Toc243507623"/>
+      <w:bookmarkStart w:id="20" w:name="_Toc243509795"/>
       <w:r>
         <w:t>6.4 RPT</w:t>
       </w:r>
@@ -9208,7 +9764,7 @@
       <w:pPr>
         <w:pStyle w:val="2"/>
       </w:pPr>
-      <w:bookmarkStart w:id="21" w:name="_Toc243507624"/>
+      <w:bookmarkStart w:id="21" w:name="_Toc243509796"/>
       <w:r>
         <w:t>6.5 TON</w:t>
       </w:r>
@@ -9283,7 +9839,7 @@
       <w:pPr>
         <w:pStyle w:val="2"/>
       </w:pPr>
-      <w:bookmarkStart w:id="22" w:name="_Toc243507625"/>
+      <w:bookmarkStart w:id="22" w:name="_Toc243509797"/>
       <w:r>
         <w:t>6.6 SET</w:t>
       </w:r>
@@ -9720,7 +10276,7 @@
       <w:pPr>
         <w:pStyle w:val="2"/>
       </w:pPr>
-      <w:bookmarkStart w:id="23" w:name="_Toc243507626"/>
+      <w:bookmarkStart w:id="23" w:name="_Toc243509798"/>
       <w:r>
         <w:t>6.7 NAR</w:t>
       </w:r>
@@ -9768,7 +10324,7 @@
       <w:pPr>
         <w:pStyle w:val="2"/>
       </w:pPr>
-      <w:bookmarkStart w:id="24" w:name="_Toc243507627"/>
+      <w:bookmarkStart w:id="24" w:name="_Toc243509799"/>
       <w:r>
         <w:t>6.8 STEP</w:t>
       </w:r>
@@ -9796,7 +10352,7 @@
         <w:pStyle w:val="1"/>
         <w:pageBreakBefore/>
       </w:pPr>
-      <w:bookmarkStart w:id="25" w:name="_Toc243507628"/>
+      <w:bookmarkStart w:id="25" w:name="_Toc243509800"/>
       <w:r>
         <w:lastRenderedPageBreak/>
         <w:t xml:space="preserve">7. </w:t>
@@ -9848,10 +10404,10 @@
           <w:noProof/>
         </w:rPr>
         <w:drawing>
-          <wp:inline distT="0" distB="0" distL="0" distR="0" wp14:anchorId="0851B1F4" wp14:editId="412483DB">
+          <wp:inline distT="0" distB="0" distL="0" distR="0" wp14:anchorId="1F4C745C" wp14:editId="5318B0B5">
             <wp:extent cx="6096000" cy="542925"/>
             <wp:effectExtent l="0" t="0" r="0" b="0"/>
-            <wp:docPr id="999627858" name="図 999627858"/>
+            <wp:docPr id="1612056188" name="図 1612056188"/>
             <wp:cNvGraphicFramePr>
               <a:graphicFrameLocks xmlns:a="http://schemas.openxmlformats.org/drawingml/2006/main" noChangeAspect="1"/>
             </wp:cNvGraphicFramePr>
@@ -9921,7 +10477,7 @@
       <w:pPr>
         <w:pStyle w:val="2"/>
       </w:pPr>
-      <w:bookmarkStart w:id="26" w:name="_Toc243507629"/>
+      <w:bookmarkStart w:id="26" w:name="_Toc243509801"/>
       <w:r>
         <w:t xml:space="preserve">7.1 </w:t>
       </w:r>
@@ -10373,7 +10929,7 @@
       <w:pPr>
         <w:pStyle w:val="2"/>
       </w:pPr>
-      <w:bookmarkStart w:id="27" w:name="_Toc243507630"/>
+      <w:bookmarkStart w:id="27" w:name="_Toc243509802"/>
       <w:r>
         <w:t xml:space="preserve">7.2 </w:t>
       </w:r>
@@ -10469,7 +11025,7 @@
       <w:pPr>
         <w:pStyle w:val="2"/>
       </w:pPr>
-      <w:bookmarkStart w:id="28" w:name="_Toc243507631"/>
+      <w:bookmarkStart w:id="28" w:name="_Toc243509803"/>
       <w:r>
         <w:t xml:space="preserve">7.3 </w:t>
       </w:r>
@@ -10786,7 +11342,7 @@
       <w:pPr>
         <w:pStyle w:val="2"/>
       </w:pPr>
-      <w:bookmarkStart w:id="29" w:name="_Toc243507632"/>
+      <w:bookmarkStart w:id="29" w:name="_Toc243509804"/>
       <w:r>
         <w:t xml:space="preserve">7.4 </w:t>
       </w:r>
@@ -10853,7 +11409,7 @@
       <w:pPr>
         <w:pStyle w:val="2"/>
       </w:pPr>
-      <w:bookmarkStart w:id="30" w:name="_Toc243507633"/>
+      <w:bookmarkStart w:id="30" w:name="_Toc243509805"/>
       <w:r>
         <w:t xml:space="preserve">7.5 </w:t>
       </w:r>
@@ -10976,7 +11532,7 @@
         <w:pStyle w:val="1"/>
         <w:pageBreakBefore/>
       </w:pPr>
-      <w:bookmarkStart w:id="31" w:name="_Toc243507634"/>
+      <w:bookmarkStart w:id="31" w:name="_Toc243509806"/>
       <w:r>
         <w:lastRenderedPageBreak/>
         <w:t xml:space="preserve">8. LCD </w:t>
@@ -10996,10 +11552,10 @@
           <w:noProof/>
         </w:rPr>
         <w:drawing>
-          <wp:inline distT="0" distB="0" distL="0" distR="0" wp14:anchorId="30E33476" wp14:editId="17606CC9">
+          <wp:inline distT="0" distB="0" distL="0" distR="0" wp14:anchorId="753FEDF0" wp14:editId="3097F664">
             <wp:extent cx="4953000" cy="2695575"/>
             <wp:effectExtent l="0" t="0" r="0" b="0"/>
-            <wp:docPr id="471531442" name="図 471531442"/>
+            <wp:docPr id="757330039" name="図 757330039"/>
             <wp:cNvGraphicFramePr>
               <a:graphicFrameLocks xmlns:a="http://schemas.openxmlformats.org/drawingml/2006/main" noChangeAspect="1"/>
             </wp:cNvGraphicFramePr>
@@ -11085,7 +11641,7 @@
       <w:pPr>
         <w:pStyle w:val="2"/>
       </w:pPr>
-      <w:bookmarkStart w:id="32" w:name="_Toc243507635"/>
+      <w:bookmarkStart w:id="32" w:name="_Toc243509807"/>
       <w:r>
         <w:t xml:space="preserve">8.1 </w:t>
       </w:r>
@@ -11877,7 +12433,7 @@
       <w:pPr>
         <w:pStyle w:val="2"/>
       </w:pPr>
-      <w:bookmarkStart w:id="33" w:name="_Toc243507636"/>
+      <w:bookmarkStart w:id="33" w:name="_Toc243509808"/>
       <w:r>
         <w:lastRenderedPageBreak/>
         <w:t xml:space="preserve">8.2 2 </w:t>
@@ -12790,7 +13346,7 @@
       <w:pPr>
         <w:pStyle w:val="2"/>
       </w:pPr>
-      <w:bookmarkStart w:id="34" w:name="_Toc243507637"/>
+      <w:bookmarkStart w:id="34" w:name="_Toc243509809"/>
       <w:r>
         <w:t xml:space="preserve">8.3 </w:t>
       </w:r>
@@ -13061,7 +13617,7 @@
         <w:pStyle w:val="1"/>
         <w:pageBreakBefore/>
       </w:pPr>
-      <w:bookmarkStart w:id="35" w:name="_Toc243507638"/>
+      <w:bookmarkStart w:id="35" w:name="_Toc243509810"/>
       <w:r>
         <w:lastRenderedPageBreak/>
         <w:t xml:space="preserve">9. </w:t>
@@ -13075,7 +13631,7 @@
       <w:pPr>
         <w:pStyle w:val="2"/>
       </w:pPr>
-      <w:bookmarkStart w:id="36" w:name="_Toc243507639"/>
+      <w:bookmarkStart w:id="36" w:name="_Toc243509811"/>
       <w:r>
         <w:t xml:space="preserve">9.1 </w:t>
       </w:r>
@@ -13155,7 +13711,7 @@
       <w:pPr>
         <w:pStyle w:val="2"/>
       </w:pPr>
-      <w:bookmarkStart w:id="37" w:name="_Toc243507640"/>
+      <w:bookmarkStart w:id="37" w:name="_Toc243509812"/>
       <w:r>
         <w:t xml:space="preserve">9.2 </w:t>
       </w:r>
@@ -13858,7 +14414,7 @@
       <w:pPr>
         <w:pStyle w:val="2"/>
       </w:pPr>
-      <w:bookmarkStart w:id="38" w:name="_Toc243507641"/>
+      <w:bookmarkStart w:id="38" w:name="_Toc243509813"/>
       <w:r>
         <w:lastRenderedPageBreak/>
         <w:t xml:space="preserve">9.3 </w:t>
@@ -13974,7 +14530,7 @@
         <w:pStyle w:val="1"/>
         <w:pageBreakBefore/>
       </w:pPr>
-      <w:bookmarkStart w:id="39" w:name="_Toc243507642"/>
+      <w:bookmarkStart w:id="39" w:name="_Toc243509814"/>
       <w:r>
         <w:lastRenderedPageBreak/>
         <w:t xml:space="preserve">10. </w:t>
@@ -13988,7 +14544,7 @@
       <w:pPr>
         <w:pStyle w:val="2"/>
       </w:pPr>
-      <w:bookmarkStart w:id="40" w:name="_Toc243507643"/>
+      <w:bookmarkStart w:id="40" w:name="_Toc243509815"/>
       <w:r>
         <w:t xml:space="preserve">10.1 </w:t>
       </w:r>
@@ -14119,7 +14675,7 @@
       <w:pPr>
         <w:pStyle w:val="2"/>
       </w:pPr>
-      <w:bookmarkStart w:id="41" w:name="_Toc243507644"/>
+      <w:bookmarkStart w:id="41" w:name="_Toc243509816"/>
       <w:r>
         <w:t xml:space="preserve">10.2 </w:t>
       </w:r>
@@ -14383,7 +14939,7 @@
       <w:pPr>
         <w:pStyle w:val="2"/>
       </w:pPr>
-      <w:bookmarkStart w:id="42" w:name="_Toc243507645"/>
+      <w:bookmarkStart w:id="42" w:name="_Toc243509817"/>
       <w:r>
         <w:t xml:space="preserve">10.3 </w:t>
       </w:r>
@@ -14437,7 +14993,7 @@
       <w:pPr>
         <w:pStyle w:val="2"/>
       </w:pPr>
-      <w:bookmarkStart w:id="43" w:name="_Toc243507646"/>
+      <w:bookmarkStart w:id="43" w:name="_Toc243509818"/>
       <w:r>
         <w:t xml:space="preserve">10.4 </w:t>
       </w:r>
@@ -14595,10 +15151,10 @@
 <file path=word/numbering.xml><?xml version="1.0" encoding="utf-8"?>
 <w:numbering xmlns:wpc="http://schemas.microsoft.com/office/word/2010/wordprocessingCanvas" xmlns:cx="http://schemas.microsoft.com/office/drawing/2014/chartex" xmlns:cx1="http://schemas.microsoft.com/office/drawing/2015/9/8/chartex" xmlns:cx2="http://schemas.microsoft.com/office/drawing/2015/10/21/chartex" xmlns:cx3="http://schemas.microsoft.com/office/drawing/2016/5/9/chartex" xmlns:cx4="http://schemas.microsoft.com/office/drawing/2016/5/10/chartex" xmlns:cx5="http://schemas.microsoft.com/office/drawing/2016/5/11/chartex" xmlns:cx6="http://schemas.microsoft.com/office/drawing/2016/5/12/chartex" xmlns:cx7="http://schemas.microsoft.com/office/drawing/2016/5/13/chartex" xmlns:cx8="http://schemas.microsoft.com/office/drawing/2016/5/14/chartex" xmlns:mc="http://schemas.openxmlformats.org/markup-compatibility/2006" xmlns:aink="http://schemas.microsoft.com/office/drawing/2016/ink" xmlns:am3d="http://schemas.microsoft.com/office/drawing/2017/model3d" xmlns:o="urn:schemas-microsoft-com:office:office" xmlns:oel="http://schemas.microsoft.com/office/2019/extlst" xmlns:r="http://schemas.openxmlformats.org/officeDocument/2006/relationships" xmlns:m="http://schemas.openxmlformats.org/officeDocument/2006/math" xmlns:v="urn:schemas-microsoft-com:vml" xmlns:wp14="http://schemas.microsoft.com/office/word/2010/wordprocessingDrawing" xmlns:wp="http://schemas.openxmlformats.org/drawingml/2006/wordprocessingDrawing" xmlns:w10="urn:schemas-microsoft-com:office:word" xmlns:w="http://schemas.openxmlformats.org/wordprocessingml/2006/main" xmlns:w14="http://schemas.microsoft.com/office/word/2010/wordml" xmlns:w15="http://schemas.microsoft.com/office/word/2012/wordml" xmlns:w16cex="http://schemas.microsoft.com/office/word/2018/wordml/cex" xmlns:w16cid="http://schemas.microsoft.com/office/word/2016/wordml/cid" xmlns:w16="http://schemas.microsoft.com/office/word/2018/wordml" xmlns:w16du="http://schemas.microsoft.com/office/word/2023/wordml/word16du" xmlns:w16sdtdh="http://schemas.microsoft.com/office/word/2020/wordml/sdtdatahash" xmlns:w16sdtfl="http://schemas.microsoft.com/office/word/2024/wordml/sdtformatlock" xmlns:w16se="http://schemas.microsoft.com/office/word/2015/wordml/symex" xmlns:wpg="http://schemas.microsoft.com/office/word/2010/wordprocessingGroup" xmlns:wpi="http://schemas.microsoft.com/office/word/2010/wordprocessingInk" xmlns:wne="http://schemas.microsoft.com/office/word/2006/wordml" xmlns:wps="http://schemas.microsoft.com/office/word/2010/wordprocessingShape" mc:Ignorable="w14 w15 w16se w16cid w16 w16cex w16sdtdh w16sdtfl w16du wp14">
   <w:abstractNum w:abstractNumId="0" w15:restartNumberingAfterBreak="0">
-    <w:nsid w:val="07416B0B"/>
+    <w:nsid w:val="0CBC3F48"/>
     <w:multiLevelType w:val="hybridMultilevel"/>
-    <w:tmpl w:val="C3C88BA4"/>
-    <w:lvl w:ilvl="0" w:tplc="B03682EC">
+    <w:tmpl w:val="E76A71F0"/>
+    <w:lvl w:ilvl="0" w:tplc="82F2E1E4">
       <w:start w:val="1"/>
       <w:numFmt w:val="decimal"/>
       <w:lvlText w:val="%1."/>
@@ -14607,52 +15163,52 @@
         <w:ind w:left="480" w:hanging="360"/>
       </w:pPr>
     </w:lvl>
-    <w:lvl w:ilvl="1" w:tplc="0A88438E">
+    <w:lvl w:ilvl="1" w:tplc="A9E2C95E">
       <w:numFmt w:val="decimal"/>
       <w:lvlText w:val=""/>
       <w:lvlJc w:val="left"/>
     </w:lvl>
-    <w:lvl w:ilvl="2" w:tplc="FB5CAA40">
+    <w:lvl w:ilvl="2" w:tplc="A412F472">
       <w:numFmt w:val="decimal"/>
       <w:lvlText w:val=""/>
       <w:lvlJc w:val="left"/>
     </w:lvl>
-    <w:lvl w:ilvl="3" w:tplc="F15E2B5E">
+    <w:lvl w:ilvl="3" w:tplc="63D8CD5E">
       <w:numFmt w:val="decimal"/>
       <w:lvlText w:val=""/>
       <w:lvlJc w:val="left"/>
     </w:lvl>
-    <w:lvl w:ilvl="4" w:tplc="F8EC3196">
+    <w:lvl w:ilvl="4" w:tplc="46BE5FA8">
       <w:numFmt w:val="decimal"/>
       <w:lvlText w:val=""/>
       <w:lvlJc w:val="left"/>
     </w:lvl>
-    <w:lvl w:ilvl="5" w:tplc="AC8E77AA">
+    <w:lvl w:ilvl="5" w:tplc="28C8F328">
       <w:numFmt w:val="decimal"/>
       <w:lvlText w:val=""/>
       <w:lvlJc w:val="left"/>
     </w:lvl>
-    <w:lvl w:ilvl="6" w:tplc="29D8D184">
+    <w:lvl w:ilvl="6" w:tplc="FB36CF0A">
       <w:numFmt w:val="decimal"/>
       <w:lvlText w:val=""/>
       <w:lvlJc w:val="left"/>
     </w:lvl>
-    <w:lvl w:ilvl="7" w:tplc="573C1D88">
+    <w:lvl w:ilvl="7" w:tplc="2C7AB5FE">
       <w:numFmt w:val="decimal"/>
       <w:lvlText w:val=""/>
       <w:lvlJc w:val="left"/>
     </w:lvl>
-    <w:lvl w:ilvl="8" w:tplc="45DA2C36">
+    <w:lvl w:ilvl="8" w:tplc="60EEE79A">
       <w:numFmt w:val="decimal"/>
       <w:lvlText w:val=""/>
       <w:lvlJc w:val="left"/>
     </w:lvl>
   </w:abstractNum>
   <w:abstractNum w:abstractNumId="1" w15:restartNumberingAfterBreak="0">
-    <w:nsid w:val="1F967168"/>
+    <w:nsid w:val="25E56EC0"/>
     <w:multiLevelType w:val="hybridMultilevel"/>
-    <w:tmpl w:val="DA407DEA"/>
-    <w:lvl w:ilvl="0" w:tplc="1ACC7A92">
+    <w:tmpl w:val="36ACCA04"/>
+    <w:lvl w:ilvl="0" w:tplc="AB0A16E4">
       <w:start w:val="1"/>
       <w:numFmt w:val="bullet"/>
       <w:lvlText w:val="●"/>
@@ -14666,7 +15222,7 @@
         <w:szCs w:val="14"/>
       </w:rPr>
     </w:lvl>
-    <w:lvl w:ilvl="1" w:tplc="C6F431A2">
+    <w:lvl w:ilvl="1" w:tplc="AD5C41A2">
       <w:start w:val="1"/>
       <w:numFmt w:val="bullet"/>
       <w:lvlText w:val="○"/>
@@ -14675,47 +15231,47 @@
         <w:ind w:left="900" w:hanging="300"/>
       </w:pPr>
     </w:lvl>
-    <w:lvl w:ilvl="2" w:tplc="9AA05502">
+    <w:lvl w:ilvl="2" w:tplc="5BA652F8">
       <w:numFmt w:val="decimal"/>
       <w:lvlText w:val=""/>
       <w:lvlJc w:val="left"/>
     </w:lvl>
-    <w:lvl w:ilvl="3" w:tplc="914EDFC8">
+    <w:lvl w:ilvl="3" w:tplc="8F52C5FE">
       <w:numFmt w:val="decimal"/>
       <w:lvlText w:val=""/>
       <w:lvlJc w:val="left"/>
     </w:lvl>
-    <w:lvl w:ilvl="4" w:tplc="9B5EE30A">
+    <w:lvl w:ilvl="4" w:tplc="17706DB2">
       <w:numFmt w:val="decimal"/>
       <w:lvlText w:val=""/>
       <w:lvlJc w:val="left"/>
     </w:lvl>
-    <w:lvl w:ilvl="5" w:tplc="8C202DF8">
+    <w:lvl w:ilvl="5" w:tplc="D254696E">
       <w:numFmt w:val="decimal"/>
       <w:lvlText w:val=""/>
       <w:lvlJc w:val="left"/>
     </w:lvl>
-    <w:lvl w:ilvl="6" w:tplc="F5066F4A">
+    <w:lvl w:ilvl="6" w:tplc="04DA57C8">
       <w:numFmt w:val="decimal"/>
       <w:lvlText w:val=""/>
       <w:lvlJc w:val="left"/>
     </w:lvl>
-    <w:lvl w:ilvl="7" w:tplc="FDA2FE1E">
+    <w:lvl w:ilvl="7" w:tplc="1FF09B12">
       <w:numFmt w:val="decimal"/>
       <w:lvlText w:val=""/>
       <w:lvlJc w:val="left"/>
     </w:lvl>
-    <w:lvl w:ilvl="8" w:tplc="6900BF06">
+    <w:lvl w:ilvl="8" w:tplc="6A583862">
       <w:numFmt w:val="decimal"/>
       <w:lvlText w:val=""/>
       <w:lvlJc w:val="left"/>
     </w:lvl>
   </w:abstractNum>
   <w:abstractNum w:abstractNumId="2" w15:restartNumberingAfterBreak="0">
-    <w:nsid w:val="4C6F0BC5"/>
+    <w:nsid w:val="297235FE"/>
     <w:multiLevelType w:val="hybridMultilevel"/>
-    <w:tmpl w:val="50FC31C4"/>
-    <w:lvl w:ilvl="0" w:tplc="9BC2078A">
+    <w:tmpl w:val="3B549438"/>
+    <w:lvl w:ilvl="0" w:tplc="9D904AB6">
       <w:start w:val="1"/>
       <w:numFmt w:val="decimal"/>
       <w:lvlText w:val="%1."/>
@@ -14724,138 +15280,52 @@
         <w:ind w:left="480" w:hanging="360"/>
       </w:pPr>
     </w:lvl>
-    <w:lvl w:ilvl="1" w:tplc="8BFA5A22">
+    <w:lvl w:ilvl="1" w:tplc="8D3E181A">
       <w:numFmt w:val="decimal"/>
       <w:lvlText w:val=""/>
       <w:lvlJc w:val="left"/>
     </w:lvl>
-    <w:lvl w:ilvl="2" w:tplc="3148108C">
+    <w:lvl w:ilvl="2" w:tplc="F7BA540C">
       <w:numFmt w:val="decimal"/>
       <w:lvlText w:val=""/>
       <w:lvlJc w:val="left"/>
     </w:lvl>
-    <w:lvl w:ilvl="3" w:tplc="1DFEE93A">
+    <w:lvl w:ilvl="3" w:tplc="D8C81D9E">
       <w:numFmt w:val="decimal"/>
       <w:lvlText w:val=""/>
       <w:lvlJc w:val="left"/>
     </w:lvl>
-    <w:lvl w:ilvl="4" w:tplc="11181CBE">
+    <w:lvl w:ilvl="4" w:tplc="7632CA14">
       <w:numFmt w:val="decimal"/>
       <w:lvlText w:val=""/>
       <w:lvlJc w:val="left"/>
     </w:lvl>
-    <w:lvl w:ilvl="5" w:tplc="2AC6356E">
+    <w:lvl w:ilvl="5" w:tplc="DC2E87A2">
       <w:numFmt w:val="decimal"/>
       <w:lvlText w:val=""/>
       <w:lvlJc w:val="left"/>
     </w:lvl>
-    <w:lvl w:ilvl="6" w:tplc="4578668E">
+    <w:lvl w:ilvl="6" w:tplc="F336EC08">
       <w:numFmt w:val="decimal"/>
       <w:lvlText w:val=""/>
       <w:lvlJc w:val="left"/>
     </w:lvl>
-    <w:lvl w:ilvl="7" w:tplc="E2905E64">
+    <w:lvl w:ilvl="7" w:tplc="94EEF10A">
       <w:numFmt w:val="decimal"/>
       <w:lvlText w:val=""/>
       <w:lvlJc w:val="left"/>
     </w:lvl>
-    <w:lvl w:ilvl="8" w:tplc="8C484DEE">
+    <w:lvl w:ilvl="8" w:tplc="CB925DA8">
       <w:numFmt w:val="decimal"/>
       <w:lvlText w:val=""/>
       <w:lvlJc w:val="left"/>
     </w:lvl>
   </w:abstractNum>
   <w:abstractNum w:abstractNumId="3" w15:restartNumberingAfterBreak="0">
-    <w:nsid w:val="56D73D6D"/>
+    <w:nsid w:val="401D540B"/>
     <w:multiLevelType w:val="hybridMultilevel"/>
-    <w:tmpl w:val="C6B00988"/>
-    <w:lvl w:ilvl="0" w:tplc="FDE24C38">
-      <w:start w:val="1"/>
-      <w:numFmt w:val="bullet"/>
-      <w:lvlText w:val="●"/>
-      <w:lvlJc w:val="left"/>
-      <w:pPr>
-        <w:ind w:left="720" w:hanging="360"/>
-      </w:pPr>
-    </w:lvl>
-    <w:lvl w:ilvl="1" w:tplc="96FA628A">
-      <w:start w:val="1"/>
-      <w:numFmt w:val="bullet"/>
-      <w:lvlText w:val="○"/>
-      <w:lvlJc w:val="left"/>
-      <w:pPr>
-        <w:ind w:left="1440" w:hanging="360"/>
-      </w:pPr>
-    </w:lvl>
-    <w:lvl w:ilvl="2" w:tplc="A1CA717C">
-      <w:start w:val="1"/>
-      <w:numFmt w:val="bullet"/>
-      <w:lvlText w:val="■"/>
-      <w:lvlJc w:val="left"/>
-      <w:pPr>
-        <w:ind w:left="2160" w:hanging="360"/>
-      </w:pPr>
-    </w:lvl>
-    <w:lvl w:ilvl="3" w:tplc="2F505E10">
-      <w:start w:val="1"/>
-      <w:numFmt w:val="bullet"/>
-      <w:lvlText w:val="●"/>
-      <w:lvlJc w:val="left"/>
-      <w:pPr>
-        <w:ind w:left="2880" w:hanging="360"/>
-      </w:pPr>
-    </w:lvl>
-    <w:lvl w:ilvl="4" w:tplc="19CAB256">
-      <w:start w:val="1"/>
-      <w:numFmt w:val="bullet"/>
-      <w:lvlText w:val="○"/>
-      <w:lvlJc w:val="left"/>
-      <w:pPr>
-        <w:ind w:left="3600" w:hanging="360"/>
-      </w:pPr>
-    </w:lvl>
-    <w:lvl w:ilvl="5" w:tplc="3E8CDBAC">
-      <w:start w:val="1"/>
-      <w:numFmt w:val="bullet"/>
-      <w:lvlText w:val="■"/>
-      <w:lvlJc w:val="left"/>
-      <w:pPr>
-        <w:ind w:left="4320" w:hanging="360"/>
-      </w:pPr>
-    </w:lvl>
-    <w:lvl w:ilvl="6" w:tplc="F2728014">
-      <w:start w:val="1"/>
-      <w:numFmt w:val="bullet"/>
-      <w:lvlText w:val="●"/>
-      <w:lvlJc w:val="left"/>
-      <w:pPr>
-        <w:ind w:left="5040" w:hanging="360"/>
-      </w:pPr>
-    </w:lvl>
-    <w:lvl w:ilvl="7" w:tplc="ED7AF398">
-      <w:start w:val="1"/>
-      <w:numFmt w:val="bullet"/>
-      <w:lvlText w:val="●"/>
-      <w:lvlJc w:val="left"/>
-      <w:pPr>
-        <w:ind w:left="5760" w:hanging="360"/>
-      </w:pPr>
-    </w:lvl>
-    <w:lvl w:ilvl="8" w:tplc="C60A05B2">
-      <w:start w:val="1"/>
-      <w:numFmt w:val="bullet"/>
-      <w:lvlText w:val="●"/>
-      <w:lvlJc w:val="left"/>
-      <w:pPr>
-        <w:ind w:left="6480" w:hanging="360"/>
-      </w:pPr>
-    </w:lvl>
-  </w:abstractNum>
-  <w:abstractNum w:abstractNumId="4" w15:restartNumberingAfterBreak="0">
-    <w:nsid w:val="5E6A6127"/>
-    <w:multiLevelType w:val="hybridMultilevel"/>
-    <w:tmpl w:val="D63AE5E8"/>
-    <w:lvl w:ilvl="0" w:tplc="B7664638">
+    <w:tmpl w:val="BF6884AE"/>
+    <w:lvl w:ilvl="0" w:tplc="92E62F18">
       <w:start w:val="1"/>
       <w:numFmt w:val="decimal"/>
       <w:lvlText w:val="%1."/>
@@ -14864,133 +15334,219 @@
         <w:ind w:left="480" w:hanging="360"/>
       </w:pPr>
     </w:lvl>
-    <w:lvl w:ilvl="1" w:tplc="378C667A">
+    <w:lvl w:ilvl="1" w:tplc="304056D4">
       <w:numFmt w:val="decimal"/>
       <w:lvlText w:val=""/>
       <w:lvlJc w:val="left"/>
     </w:lvl>
-    <w:lvl w:ilvl="2" w:tplc="F77C0C5C">
+    <w:lvl w:ilvl="2" w:tplc="7DFCA34E">
       <w:numFmt w:val="decimal"/>
       <w:lvlText w:val=""/>
       <w:lvlJc w:val="left"/>
     </w:lvl>
-    <w:lvl w:ilvl="3" w:tplc="7C6CBE02">
+    <w:lvl w:ilvl="3" w:tplc="87A8B21C">
       <w:numFmt w:val="decimal"/>
       <w:lvlText w:val=""/>
       <w:lvlJc w:val="left"/>
     </w:lvl>
-    <w:lvl w:ilvl="4" w:tplc="E68C4242">
+    <w:lvl w:ilvl="4" w:tplc="64D81824">
       <w:numFmt w:val="decimal"/>
       <w:lvlText w:val=""/>
       <w:lvlJc w:val="left"/>
     </w:lvl>
-    <w:lvl w:ilvl="5" w:tplc="56C665DA">
+    <w:lvl w:ilvl="5" w:tplc="962A4DA4">
       <w:numFmt w:val="decimal"/>
       <w:lvlText w:val=""/>
       <w:lvlJc w:val="left"/>
     </w:lvl>
-    <w:lvl w:ilvl="6" w:tplc="EFE4C69E">
+    <w:lvl w:ilvl="6" w:tplc="25E0449E">
       <w:numFmt w:val="decimal"/>
       <w:lvlText w:val=""/>
       <w:lvlJc w:val="left"/>
     </w:lvl>
-    <w:lvl w:ilvl="7" w:tplc="4F3E7674">
+    <w:lvl w:ilvl="7" w:tplc="F78E98FC">
       <w:numFmt w:val="decimal"/>
       <w:lvlText w:val=""/>
       <w:lvlJc w:val="left"/>
     </w:lvl>
-    <w:lvl w:ilvl="8" w:tplc="AD147530">
+    <w:lvl w:ilvl="8" w:tplc="7B3AE9C2">
+      <w:numFmt w:val="decimal"/>
+      <w:lvlText w:val=""/>
+      <w:lvlJc w:val="left"/>
+    </w:lvl>
+  </w:abstractNum>
+  <w:abstractNum w:abstractNumId="4" w15:restartNumberingAfterBreak="0">
+    <w:nsid w:val="51A73B7A"/>
+    <w:multiLevelType w:val="hybridMultilevel"/>
+    <w:tmpl w:val="CE02A404"/>
+    <w:lvl w:ilvl="0" w:tplc="DD7698B8">
+      <w:start w:val="1"/>
+      <w:numFmt w:val="decimal"/>
+      <w:lvlText w:val="%1."/>
+      <w:lvlJc w:val="left"/>
+      <w:pPr>
+        <w:ind w:left="480" w:hanging="360"/>
+      </w:pPr>
+    </w:lvl>
+    <w:lvl w:ilvl="1" w:tplc="466A9DA6">
+      <w:numFmt w:val="decimal"/>
+      <w:lvlText w:val=""/>
+      <w:lvlJc w:val="left"/>
+    </w:lvl>
+    <w:lvl w:ilvl="2" w:tplc="82B00CF8">
+      <w:numFmt w:val="decimal"/>
+      <w:lvlText w:val=""/>
+      <w:lvlJc w:val="left"/>
+    </w:lvl>
+    <w:lvl w:ilvl="3" w:tplc="F9141074">
+      <w:numFmt w:val="decimal"/>
+      <w:lvlText w:val=""/>
+      <w:lvlJc w:val="left"/>
+    </w:lvl>
+    <w:lvl w:ilvl="4" w:tplc="AC1E9AE0">
+      <w:numFmt w:val="decimal"/>
+      <w:lvlText w:val=""/>
+      <w:lvlJc w:val="left"/>
+    </w:lvl>
+    <w:lvl w:ilvl="5" w:tplc="F59AA6DA">
+      <w:numFmt w:val="decimal"/>
+      <w:lvlText w:val=""/>
+      <w:lvlJc w:val="left"/>
+    </w:lvl>
+    <w:lvl w:ilvl="6" w:tplc="7EE6C260">
+      <w:numFmt w:val="decimal"/>
+      <w:lvlText w:val=""/>
+      <w:lvlJc w:val="left"/>
+    </w:lvl>
+    <w:lvl w:ilvl="7" w:tplc="6D2C9394">
+      <w:numFmt w:val="decimal"/>
+      <w:lvlText w:val=""/>
+      <w:lvlJc w:val="left"/>
+    </w:lvl>
+    <w:lvl w:ilvl="8" w:tplc="2A74172C">
       <w:numFmt w:val="decimal"/>
       <w:lvlText w:val=""/>
       <w:lvlJc w:val="left"/>
     </w:lvl>
   </w:abstractNum>
   <w:abstractNum w:abstractNumId="5" w15:restartNumberingAfterBreak="0">
-    <w:nsid w:val="6A520A60"/>
+    <w:nsid w:val="58337666"/>
     <w:multiLevelType w:val="hybridMultilevel"/>
-    <w:tmpl w:val="6C3A6528"/>
-    <w:lvl w:ilvl="0" w:tplc="439C437C">
+    <w:tmpl w:val="B562E1BC"/>
+    <w:lvl w:ilvl="0" w:tplc="A42A75AE">
       <w:start w:val="1"/>
-      <w:numFmt w:val="decimal"/>
-      <w:lvlText w:val="%1."/>
+      <w:numFmt w:val="bullet"/>
+      <w:lvlText w:val="●"/>
       <w:lvlJc w:val="left"/>
       <w:pPr>
-        <w:ind w:left="480" w:hanging="360"/>
+        <w:ind w:left="720" w:hanging="360"/>
       </w:pPr>
     </w:lvl>
-    <w:lvl w:ilvl="1" w:tplc="7D36F3AE">
-      <w:numFmt w:val="decimal"/>
-      <w:lvlText w:val=""/>
+    <w:lvl w:ilvl="1" w:tplc="045C9AB4">
+      <w:start w:val="1"/>
+      <w:numFmt w:val="bullet"/>
+      <w:lvlText w:val="○"/>
       <w:lvlJc w:val="left"/>
+      <w:pPr>
+        <w:ind w:left="1440" w:hanging="360"/>
+      </w:pPr>
     </w:lvl>
-    <w:lvl w:ilvl="2" w:tplc="F3465FCE">
-      <w:numFmt w:val="decimal"/>
-      <w:lvlText w:val=""/>
+    <w:lvl w:ilvl="2" w:tplc="7E68FDC0">
+      <w:start w:val="1"/>
+      <w:numFmt w:val="bullet"/>
+      <w:lvlText w:val="■"/>
       <w:lvlJc w:val="left"/>
+      <w:pPr>
+        <w:ind w:left="2160" w:hanging="360"/>
+      </w:pPr>
     </w:lvl>
-    <w:lvl w:ilvl="3" w:tplc="F0544CF8">
-      <w:numFmt w:val="decimal"/>
-      <w:lvlText w:val=""/>
+    <w:lvl w:ilvl="3" w:tplc="4F665A54">
+      <w:start w:val="1"/>
+      <w:numFmt w:val="bullet"/>
+      <w:lvlText w:val="●"/>
       <w:lvlJc w:val="left"/>
+      <w:pPr>
+        <w:ind w:left="2880" w:hanging="360"/>
+      </w:pPr>
     </w:lvl>
-    <w:lvl w:ilvl="4" w:tplc="40CC4824">
-      <w:numFmt w:val="decimal"/>
-      <w:lvlText w:val=""/>
+    <w:lvl w:ilvl="4" w:tplc="BEB22A3C">
+      <w:start w:val="1"/>
+      <w:numFmt w:val="bullet"/>
+      <w:lvlText w:val="○"/>
       <w:lvlJc w:val="left"/>
+      <w:pPr>
+        <w:ind w:left="3600" w:hanging="360"/>
+      </w:pPr>
     </w:lvl>
-    <w:lvl w:ilvl="5" w:tplc="F9A02722">
-      <w:numFmt w:val="decimal"/>
-      <w:lvlText w:val=""/>
+    <w:lvl w:ilvl="5" w:tplc="BB0C7524">
+      <w:start w:val="1"/>
+      <w:numFmt w:val="bullet"/>
+      <w:lvlText w:val="■"/>
       <w:lvlJc w:val="left"/>
+      <w:pPr>
+        <w:ind w:left="4320" w:hanging="360"/>
+      </w:pPr>
     </w:lvl>
-    <w:lvl w:ilvl="6" w:tplc="9E36F1EA">
-      <w:numFmt w:val="decimal"/>
-      <w:lvlText w:val=""/>
+    <w:lvl w:ilvl="6" w:tplc="68363C30">
+      <w:start w:val="1"/>
+      <w:numFmt w:val="bullet"/>
+      <w:lvlText w:val="●"/>
       <w:lvlJc w:val="left"/>
+      <w:pPr>
+        <w:ind w:left="5040" w:hanging="360"/>
+      </w:pPr>
     </w:lvl>
-    <w:lvl w:ilvl="7" w:tplc="3FF2B640">
-      <w:numFmt w:val="decimal"/>
-      <w:lvlText w:val=""/>
+    <w:lvl w:ilvl="7" w:tplc="45A64670">
+      <w:start w:val="1"/>
+      <w:numFmt w:val="bullet"/>
+      <w:lvlText w:val="●"/>
       <w:lvlJc w:val="left"/>
+      <w:pPr>
+        <w:ind w:left="5760" w:hanging="360"/>
+      </w:pPr>
     </w:lvl>
-    <w:lvl w:ilvl="8" w:tplc="5A00390E">
-      <w:numFmt w:val="decimal"/>
-      <w:lvlText w:val=""/>
+    <w:lvl w:ilvl="8" w:tplc="A126DA64">
+      <w:start w:val="1"/>
+      <w:numFmt w:val="bullet"/>
+      <w:lvlText w:val="●"/>
       <w:lvlJc w:val="left"/>
+      <w:pPr>
+        <w:ind w:left="6480" w:hanging="360"/>
+      </w:pPr>
     </w:lvl>
   </w:abstractNum>
-  <w:num w:numId="1" w16cid:durableId="787744296">
-    <w:abstractNumId w:val="3"/>
+  <w:num w:numId="1" w16cid:durableId="1128277569">
+    <w:abstractNumId w:val="5"/>
     <w:lvlOverride w:ilvl="0">
       <w:startOverride w:val="1"/>
     </w:lvlOverride>
   </w:num>
-  <w:num w:numId="2" w16cid:durableId="400644328">
+  <w:num w:numId="2" w16cid:durableId="670645916">
     <w:abstractNumId w:val="1"/>
     <w:lvlOverride w:ilvl="0">
       <w:startOverride w:val="1"/>
     </w:lvlOverride>
   </w:num>
-  <w:num w:numId="3" w16cid:durableId="335228438">
+  <w:num w:numId="3" w16cid:durableId="1275134112">
     <w:abstractNumId w:val="0"/>
     <w:lvlOverride w:ilvl="0">
       <w:startOverride w:val="1"/>
     </w:lvlOverride>
   </w:num>
-  <w:num w:numId="4" w16cid:durableId="808281755">
+  <w:num w:numId="4" w16cid:durableId="298649298">
     <w:abstractNumId w:val="4"/>
     <w:lvlOverride w:ilvl="0">
       <w:startOverride w:val="1"/>
     </w:lvlOverride>
   </w:num>
-  <w:num w:numId="5" w16cid:durableId="1594319217">
+  <w:num w:numId="5" w16cid:durableId="1646666753">
     <w:abstractNumId w:val="2"/>
     <w:lvlOverride w:ilvl="0">
       <w:startOverride w:val="1"/>
     </w:lvlOverride>
   </w:num>
-  <w:num w:numId="6" w16cid:durableId="1357273063">
-    <w:abstractNumId w:val="5"/>
+  <w:num w:numId="6" w16cid:durableId="869880612">
+    <w:abstractNumId w:val="3"/>
     <w:lvlOverride w:ilvl="0">
       <w:startOverride w:val="1"/>
     </w:lvlOverride>
@@ -15610,7 +16166,7 @@
     <w:link w:val="aa"/>
     <w:uiPriority w:val="99"/>
     <w:unhideWhenUsed/>
-    <w:rsid w:val="005C2E56"/>
+    <w:rsid w:val="00424BAB"/>
     <w:pPr>
       <w:tabs>
         <w:tab w:val="center" w:pos="4252"/>
@@ -15624,7 +16180,7 @@
     <w:basedOn w:val="a0"/>
     <w:link w:val="a9"/>
     <w:uiPriority w:val="99"/>
-    <w:rsid w:val="005C2E56"/>
+    <w:rsid w:val="00424BAB"/>
   </w:style>
   <w:style w:type="paragraph" w:styleId="ab">
     <w:name w:val="footer"/>
@@ -15632,7 +16188,7 @@
     <w:link w:val="ac"/>
     <w:uiPriority w:val="99"/>
     <w:unhideWhenUsed/>
-    <w:rsid w:val="005C2E56"/>
+    <w:rsid w:val="00424BAB"/>
     <w:pPr>
       <w:tabs>
         <w:tab w:val="center" w:pos="4252"/>
@@ -15646,7 +16202,7 @@
     <w:basedOn w:val="a0"/>
     <w:link w:val="ab"/>
     <w:uiPriority w:val="99"/>
-    <w:rsid w:val="005C2E56"/>
+    <w:rsid w:val="00424BAB"/>
   </w:style>
 </w:styles>
 </file>

</xml_diff>